<commit_message>
adjust workflow and paper
</commit_message>
<xml_diff>
--- a/projects/2026-summer-assignment/solutions/problem-b-cold-chain-routing/paper/paper.docx
+++ b/projects/2026-summer-assignment/solutions/problem-b-cold-chain-routing/paper/paper.docx
@@ -2,7 +2,7 @@
 <file path=word/document.xml><?xml version="1.0" encoding="utf-8"?>
 <w:document xmlns:w="http://schemas.openxmlformats.org/wordprocessingml/2006/main" xmlns:m="http://schemas.openxmlformats.org/officeDocument/2006/math" xmlns:r="http://schemas.openxmlformats.org/officeDocument/2006/relationships" xmlns:o="urn:schemas-microsoft-com:office:office" xmlns:v="urn:schemas-microsoft-com:vml" xmlns:w10="urn:schemas-microsoft-com:office:word" xmlns:a="http://schemas.openxmlformats.org/drawingml/2006/main" xmlns:pic="http://schemas.openxmlformats.org/drawingml/2006/picture" xmlns:wp="http://schemas.openxmlformats.org/drawingml/2006/wordprocessingDrawing">
   <w:body>
-    <w:bookmarkStart w:id="57" w:name="固定分区与严格保鲜优先下的冷链配送路径优化"/>
+    <w:bookmarkStart w:id="58" w:name="固定分区与严格保鲜优先下的冷链配送路径优化"/>
     <w:p>
       <w:pPr>
         <w:pStyle w:val="Heading1"/>
@@ -627,7 +627,7 @@
       </w:r>
     </w:p>
     <w:bookmarkEnd w:id="26"/>
-    <w:bookmarkStart w:id="33" w:name="二问题分析"/>
+    <w:bookmarkStart w:id="34" w:name="二问题分析"/>
     <w:p>
       <w:pPr>
         <w:pStyle w:val="Heading2"/>
@@ -788,6 +788,49 @@
           <w:sz w:val="24"/>
         </w:rPr>
         <w:t xml:space="preserve"> 8。</w:t>
+      </w:r>
+    </w:p>
+    <w:p>
+      <w:pPr>
+        <w:pStyle w:val="BodyText"/>
+        <w:spacing w:line="360" w:lineRule="auto" w:before="0" w:after="0"/>
+        <w:ind w:firstLine="480"/>
+        <w:jc w:val="both"/>
+      </w:pPr>
+      <w:r>
+        <w:rPr>
+          <w:rFonts w:hint="eastAsia" w:ascii="Times New Roman" w:hAnsi="Times New Roman" w:eastAsia="宋体"/>
+          <w:sz w:val="24"/>
+        </w:rPr>
+        <w:t xml:space="preserve">若沿用一般</w:t>
+      </w:r>
+      <w:r>
+        <w:rPr>
+          <w:rFonts w:ascii="Times New Roman" w:hAnsi="Times New Roman" w:eastAsia="宋体"/>
+          <w:sz w:val="24"/>
+        </w:rPr>
+        <w:t xml:space="preserve"> VRPTW </w:t>
+      </w:r>
+      <w:r>
+        <w:rPr>
+          <w:rFonts w:hint="eastAsia" w:ascii="Times New Roman" w:hAnsi="Times New Roman" w:eastAsia="宋体"/>
+          <w:sz w:val="24"/>
+        </w:rPr>
+        <w:t xml:space="preserve">的逐弧变量，需要同时处理弧选择、流平衡、时间递推和大常数联结；但在本题已固定“中央厨房—配送站—两家门店—中央厨房”的结构后，每辆车的全部许可路径只有两种门店排列。路线型模型直接把一条完整许可路线作为选择对象，既保留容量、前序、返厨和时间窗含义，又避免为</w:t>
+      </w:r>
+      <w:r>
+        <w:rPr>
+          <w:rFonts w:ascii="Times New Roman" w:hAnsi="Times New Roman" w:eastAsia="宋体"/>
+          <w:sz w:val="24"/>
+        </w:rPr>
+        <w:t xml:space="preserve"> 8 </w:t>
+      </w:r>
+      <w:r>
+        <w:rPr>
+          <w:rFonts w:hint="eastAsia" w:ascii="Times New Roman" w:hAnsi="Times New Roman" w:eastAsia="宋体"/>
+          <w:sz w:val="24"/>
+        </w:rPr>
+        <w:t xml:space="preserve">个组合引入不必要的大常数约束。其精确性来自候选集完整覆盖所有许可排列，而不是通过删去困难约束换取简化。</w:t>
       </w:r>
     </w:p>
     <w:bookmarkEnd w:id="27"/>
@@ -1116,8 +1159,2948 @@
       </w:r>
     </w:p>
     <w:bookmarkEnd w:id="32"/>
+    <w:bookmarkStart w:id="33" w:name="数据整理与约束尺度"/>
+    <w:p>
+      <w:pPr>
+        <w:pStyle w:val="Heading3"/>
+        <w:spacing w:line="240" w:lineRule="auto" w:before="50" w:after="50"/>
+        <w:ind w:firstLine="0"/>
+        <w:jc w:val="left"/>
+      </w:pPr>
+      <w:r>
+        <w:rPr>
+          <w:rFonts w:ascii="Times New Roman" w:hAnsi="Times New Roman" w:eastAsia="宋体"/>
+          <w:b/>
+          <w:sz w:val="24"/>
+        </w:rPr>
+        <w:t xml:space="preserve">2.4 </w:t>
+      </w:r>
+      <w:r>
+        <w:rPr>
+          <w:rFonts w:hint="eastAsia" w:ascii="Times New Roman" w:hAnsi="Times New Roman" w:eastAsia="宋体"/>
+          <w:b/>
+          <w:sz w:val="24"/>
+        </w:rPr>
+        <w:t xml:space="preserve">数据整理与约束尺度</w:t>
+      </w:r>
+    </w:p>
+    <w:p>
+      <w:pPr>
+        <w:pStyle w:val="FirstParagraph"/>
+        <w:spacing w:line="360" w:lineRule="auto" w:before="0" w:after="0"/>
+        <w:ind w:firstLine="480"/>
+        <w:jc w:val="both"/>
+      </w:pPr>
+      <w:r>
+        <w:rPr>
+          <w:rFonts w:hint="eastAsia" w:ascii="Times New Roman" w:hAnsi="Times New Roman" w:eastAsia="宋体"/>
+          <w:sz w:val="24"/>
+        </w:rPr>
+        <w:t xml:space="preserve">建模所用节点数据见表</w:t>
+      </w:r>
+      <w:r>
+        <w:rPr>
+          <w:rFonts w:ascii="Times New Roman" w:hAnsi="Times New Roman" w:eastAsia="宋体"/>
+          <w:sz w:val="24"/>
+        </w:rPr>
+        <w:t xml:space="preserve"> </w:t>
+      </w:r>
+      <w:r>
+        <w:rPr>
+          <w:rFonts w:hint="eastAsia" w:ascii="Times New Roman" w:hAnsi="Times New Roman" w:eastAsia="宋体"/>
+          <w:sz w:val="24"/>
+        </w:rPr>
+        <w:t xml:space="preserve">1。节点</w:t>
+      </w:r>
+      <w:r>
+        <w:rPr>
+          <w:rFonts w:ascii="Times New Roman" w:hAnsi="Times New Roman" w:eastAsia="宋体"/>
+          <w:sz w:val="24"/>
+        </w:rPr>
+        <w:t xml:space="preserve"> 0 </w:t>
+      </w:r>
+      <w:r>
+        <w:rPr>
+          <w:rFonts w:hint="eastAsia" w:ascii="Times New Roman" w:hAnsi="Times New Roman" w:eastAsia="宋体"/>
+          <w:sz w:val="24"/>
+        </w:rPr>
+        <w:t xml:space="preserve">为中央厨房，节点</w:t>
+      </w:r>
+      <w:r>
+        <w:rPr>
+          <w:rFonts w:ascii="Times New Roman" w:hAnsi="Times New Roman" w:eastAsia="宋体"/>
+          <w:sz w:val="24"/>
+        </w:rPr>
+        <w:t xml:space="preserve"> 1—3 </w:t>
+      </w:r>
+      <w:r>
+        <w:rPr>
+          <w:rFonts w:hint="eastAsia" w:ascii="Times New Roman" w:hAnsi="Times New Roman" w:eastAsia="宋体"/>
+          <w:sz w:val="24"/>
+        </w:rPr>
+        <w:t xml:space="preserve">为配送站，节点</w:t>
+      </w:r>
+      <w:r>
+        <w:rPr>
+          <w:rFonts w:ascii="Times New Roman" w:hAnsi="Times New Roman" w:eastAsia="宋体"/>
+          <w:sz w:val="24"/>
+        </w:rPr>
+        <w:t xml:space="preserve"> 4—9 </w:t>
+      </w:r>
+      <w:r>
+        <w:rPr>
+          <w:rFonts w:hint="eastAsia" w:ascii="Times New Roman" w:hAnsi="Times New Roman" w:eastAsia="宋体"/>
+          <w:sz w:val="24"/>
+        </w:rPr>
+        <w:t xml:space="preserve">为门店。门店归属把一般多车路径问题分解为三个两点排序子问题；坐标单位为</w:t>
+      </w:r>
+      <w:r>
+        <w:rPr>
+          <w:rFonts w:ascii="Times New Roman" w:hAnsi="Times New Roman" w:eastAsia="宋体"/>
+          <w:sz w:val="24"/>
+        </w:rPr>
+        <w:t xml:space="preserve"> </w:t>
+      </w:r>
+      <w:r>
+        <w:rPr>
+          <w:rFonts w:hint="eastAsia" w:ascii="Times New Roman" w:hAnsi="Times New Roman" w:eastAsia="宋体"/>
+          <w:sz w:val="24"/>
+        </w:rPr>
+        <w:t xml:space="preserve">km，因此欧氏距离可直接作为当前缺少道路矩阵时的距离代理。</w:t>
+      </w:r>
+    </w:p>
+    <w:p>
+      <w:pPr>
+        <w:pStyle w:val="BodyText"/>
+        <w:keepNext/>
+        <w:spacing w:line="360" w:lineRule="auto"/>
+        <w:ind w:firstLine="0"/>
+        <w:jc w:val="center"/>
+      </w:pPr>
+      <w:r>
+        <w:rPr>
+          <w:rFonts w:hint="eastAsia" w:ascii="Times New Roman" w:hAnsi="Times New Roman" w:eastAsia="宋体"/>
+          <w:sz w:val="21"/>
+        </w:rPr>
+        <w:t xml:space="preserve">表</w:t>
+      </w:r>
+      <w:r>
+        <w:rPr>
+          <w:rFonts w:ascii="Times New Roman" w:hAnsi="Times New Roman" w:eastAsia="宋体"/>
+          <w:sz w:val="21"/>
+        </w:rPr>
+        <w:t xml:space="preserve"> 1 </w:t>
+      </w:r>
+      <w:r>
+        <w:rPr>
+          <w:rFonts w:hint="eastAsia" w:ascii="Times New Roman" w:hAnsi="Times New Roman" w:eastAsia="宋体"/>
+          <w:sz w:val="21"/>
+        </w:rPr>
+        <w:t xml:space="preserve">节点、需求与时间窗数据</w:t>
+      </w:r>
+    </w:p>
+    <w:tbl>
+      <w:tblPr>
+        <w:tblStyle w:val="Table"/>
+        <w:tblW w:type="dxa" w:w="8950"/>
+        <w:jc w:val="center"/>
+        <w:tblLayout w:type="fixed"/>
+        <w:tblLook w:firstRow="1" w:lastRow="0" w:firstColumn="0" w:lastColumn="0" w:noHBand="0" w:noVBand="0" w:val="0020"/>
+      </w:tblPr>
+      <w:tblGrid>
+        <w:gridCol w:w="627"/>
+        <w:gridCol w:w="1164"/>
+        <w:gridCol w:w="1432"/>
+        <w:gridCol w:w="984"/>
+        <w:gridCol w:w="1700"/>
+        <w:gridCol w:w="3043"/>
+      </w:tblGrid>
+      <w:tr>
+        <w:trPr>
+          <w:tblHeader w:val="on"/>
+          <w:cantSplit/>
+        </w:trPr>
+        <w:tc>
+          <w:tcPr>
+            <w:tcW w:w="627" w:type="dxa"/>
+            <w:tcBorders>
+              <w:top w:val="single" w:sz="10" w:color="000000"/>
+              <w:start w:val="nil"/>
+              <w:bottom w:val="single" w:sz="4" w:color="000000"/>
+              <w:end w:val="nil"/>
+              <w:insideH w:val="nil"/>
+              <w:insideV w:val="nil"/>
+            </w:tcBorders>
+            <w:tcMar>
+              <w:top w:w="55" w:type="dxa"/>
+              <w:start w:w="70" w:type="dxa"/>
+              <w:bottom w:w="55" w:type="dxa"/>
+              <w:end w:w="70" w:type="dxa"/>
+            </w:tcMar>
+            <w:vAlign w:val="center"/>
+          </w:tcPr>
+          <w:p>
+            <w:pPr>
+              <w:keepNext/>
+              <w:spacing w:line="276" w:lineRule="auto" w:before="0" w:after="0"/>
+              <w:ind w:firstLine="0"/>
+              <w:jc w:val="center"/>
+            </w:pPr>
+            <w:r>
+              <w:rPr>
+                <w:rFonts w:hint="eastAsia" w:ascii="Times New Roman" w:hAnsi="Times New Roman" w:eastAsia="宋体"/>
+                <w:b/>
+                <w:sz w:val="20"/>
+              </w:rPr>
+              <w:t xml:space="preserve">节点</w:t>
+            </w:r>
+          </w:p>
+        </w:tc>
+        <w:tc>
+          <w:tcPr>
+            <w:tcW w:w="1164" w:type="dxa"/>
+            <w:tcBorders>
+              <w:top w:val="single" w:sz="10" w:color="000000"/>
+              <w:start w:val="nil"/>
+              <w:bottom w:val="single" w:sz="4" w:color="000000"/>
+              <w:end w:val="nil"/>
+              <w:insideH w:val="nil"/>
+              <w:insideV w:val="nil"/>
+            </w:tcBorders>
+            <w:tcMar>
+              <w:top w:w="55" w:type="dxa"/>
+              <w:start w:w="70" w:type="dxa"/>
+              <w:bottom w:w="55" w:type="dxa"/>
+              <w:end w:w="70" w:type="dxa"/>
+            </w:tcMar>
+            <w:vAlign w:val="center"/>
+          </w:tcPr>
+          <w:p>
+            <w:pPr>
+              <w:keepNext/>
+              <w:spacing w:line="276" w:lineRule="auto" w:before="0" w:after="0"/>
+              <w:ind w:firstLine="0"/>
+              <w:jc w:val="center"/>
+            </w:pPr>
+            <w:r>
+              <w:rPr>
+                <w:rFonts w:hint="eastAsia" w:ascii="Times New Roman" w:hAnsi="Times New Roman" w:eastAsia="宋体"/>
+                <w:b/>
+                <w:sz w:val="20"/>
+              </w:rPr>
+              <w:t xml:space="preserve">类型</w:t>
+            </w:r>
+          </w:p>
+        </w:tc>
+        <w:tc>
+          <w:tcPr>
+            <w:tcW w:w="1432" w:type="dxa"/>
+            <w:tcBorders>
+              <w:top w:val="single" w:sz="10" w:color="000000"/>
+              <w:start w:val="nil"/>
+              <w:bottom w:val="single" w:sz="4" w:color="000000"/>
+              <w:end w:val="nil"/>
+              <w:insideH w:val="nil"/>
+              <w:insideV w:val="nil"/>
+            </w:tcBorders>
+            <w:tcMar>
+              <w:top w:w="55" w:type="dxa"/>
+              <w:start w:w="70" w:type="dxa"/>
+              <w:bottom w:w="55" w:type="dxa"/>
+              <w:end w:w="70" w:type="dxa"/>
+            </w:tcMar>
+            <w:vAlign w:val="center"/>
+          </w:tcPr>
+          <w:p>
+            <w:pPr>
+              <w:keepNext/>
+              <w:spacing w:line="276" w:lineRule="auto" w:before="0" w:after="0"/>
+              <w:ind w:firstLine="0"/>
+              <w:jc w:val="center"/>
+            </w:pPr>
+            <w:r>
+              <w:rPr>
+                <w:rFonts w:hint="eastAsia" w:ascii="Times New Roman" w:hAnsi="Times New Roman" w:eastAsia="宋体"/>
+                <w:b/>
+                <w:sz w:val="20"/>
+              </w:rPr>
+              <w:t xml:space="preserve">坐标/km</w:t>
+            </w:r>
+          </w:p>
+        </w:tc>
+        <w:tc>
+          <w:tcPr>
+            <w:tcW w:w="984" w:type="dxa"/>
+            <w:tcBorders>
+              <w:top w:val="single" w:sz="10" w:color="000000"/>
+              <w:start w:val="nil"/>
+              <w:bottom w:val="single" w:sz="4" w:color="000000"/>
+              <w:end w:val="nil"/>
+              <w:insideH w:val="nil"/>
+              <w:insideV w:val="nil"/>
+            </w:tcBorders>
+            <w:tcMar>
+              <w:top w:w="55" w:type="dxa"/>
+              <w:start w:w="70" w:type="dxa"/>
+              <w:bottom w:w="55" w:type="dxa"/>
+              <w:end w:w="70" w:type="dxa"/>
+            </w:tcMar>
+            <w:vAlign w:val="center"/>
+          </w:tcPr>
+          <w:p>
+            <w:pPr>
+              <w:keepNext/>
+              <w:spacing w:line="276" w:lineRule="auto" w:before="0" w:after="0"/>
+              <w:ind w:firstLine="0"/>
+              <w:jc w:val="center"/>
+            </w:pPr>
+            <w:r>
+              <w:rPr>
+                <w:rFonts w:hint="eastAsia" w:ascii="Times New Roman" w:hAnsi="Times New Roman" w:eastAsia="宋体"/>
+                <w:b/>
+                <w:sz w:val="20"/>
+              </w:rPr>
+              <w:t xml:space="preserve">需求/箱</w:t>
+            </w:r>
+          </w:p>
+        </w:tc>
+        <w:tc>
+          <w:tcPr>
+            <w:tcW w:w="1700" w:type="dxa"/>
+            <w:tcBorders>
+              <w:top w:val="single" w:sz="10" w:color="000000"/>
+              <w:start w:val="nil"/>
+              <w:bottom w:val="single" w:sz="4" w:color="000000"/>
+              <w:end w:val="nil"/>
+              <w:insideH w:val="nil"/>
+              <w:insideV w:val="nil"/>
+            </w:tcBorders>
+            <w:tcMar>
+              <w:top w:w="55" w:type="dxa"/>
+              <w:start w:w="70" w:type="dxa"/>
+              <w:bottom w:w="55" w:type="dxa"/>
+              <w:end w:w="70" w:type="dxa"/>
+            </w:tcMar>
+            <w:vAlign w:val="center"/>
+          </w:tcPr>
+          <w:p>
+            <w:pPr>
+              <w:keepNext/>
+              <w:spacing w:line="276" w:lineRule="auto" w:before="0" w:after="0"/>
+              <w:ind w:firstLine="0"/>
+              <w:jc w:val="center"/>
+            </w:pPr>
+            <w:r>
+              <w:rPr>
+                <w:rFonts w:hint="eastAsia" w:ascii="Times New Roman" w:hAnsi="Times New Roman" w:eastAsia="宋体"/>
+                <w:b/>
+                <w:sz w:val="20"/>
+              </w:rPr>
+              <w:t xml:space="preserve">时间窗</w:t>
+            </w:r>
+          </w:p>
+        </w:tc>
+        <w:tc>
+          <w:tcPr>
+            <w:tcW w:w="3043" w:type="dxa"/>
+            <w:tcBorders>
+              <w:top w:val="single" w:sz="10" w:color="000000"/>
+              <w:start w:val="nil"/>
+              <w:bottom w:val="single" w:sz="4" w:color="000000"/>
+              <w:end w:val="nil"/>
+              <w:insideH w:val="nil"/>
+              <w:insideV w:val="nil"/>
+            </w:tcBorders>
+            <w:tcMar>
+              <w:top w:w="55" w:type="dxa"/>
+              <w:start w:w="70" w:type="dxa"/>
+              <w:bottom w:w="55" w:type="dxa"/>
+              <w:end w:w="70" w:type="dxa"/>
+            </w:tcMar>
+            <w:vAlign w:val="center"/>
+          </w:tcPr>
+          <w:p>
+            <w:pPr>
+              <w:keepNext/>
+              <w:spacing w:line="276" w:lineRule="auto" w:before="0" w:after="0"/>
+              <w:ind w:firstLine="0"/>
+              <w:jc w:val="center"/>
+            </w:pPr>
+            <w:r>
+              <w:rPr>
+                <w:rFonts w:hint="eastAsia" w:ascii="Times New Roman" w:hAnsi="Times New Roman" w:eastAsia="宋体"/>
+                <w:b/>
+                <w:sz w:val="20"/>
+              </w:rPr>
+              <w:t xml:space="preserve">归属或作用</w:t>
+            </w:r>
+          </w:p>
+        </w:tc>
+      </w:tr>
+      <w:tr>
+        <w:trPr>
+          <w:cantSplit/>
+        </w:trPr>
+        <w:tc>
+          <w:tcPr>
+            <w:tcW w:w="627" w:type="dxa"/>
+            <w:tcBorders>
+              <w:top w:val="nil"/>
+              <w:start w:val="nil"/>
+              <w:bottom w:val="nil"/>
+              <w:end w:val="nil"/>
+              <w:insideH w:val="nil"/>
+              <w:insideV w:val="nil"/>
+            </w:tcBorders>
+            <w:tcMar>
+              <w:top w:w="55" w:type="dxa"/>
+              <w:start w:w="70" w:type="dxa"/>
+              <w:bottom w:w="55" w:type="dxa"/>
+              <w:end w:w="70" w:type="dxa"/>
+            </w:tcMar>
+            <w:vAlign w:val="center"/>
+          </w:tcPr>
+          <w:p>
+            <w:pPr>
+              <w:keepNext/>
+              <w:spacing w:line="276" w:lineRule="auto" w:before="0" w:after="0"/>
+              <w:ind w:firstLine="0"/>
+              <w:jc w:val="center"/>
+            </w:pPr>
+            <w:r>
+              <w:rPr>
+                <w:rFonts w:ascii="Times New Roman" w:hAnsi="Times New Roman" w:eastAsia="宋体"/>
+                <w:b w:val="0"/>
+                <w:sz w:val="20"/>
+              </w:rPr>
+              <w:t xml:space="preserve">0</w:t>
+            </w:r>
+          </w:p>
+        </w:tc>
+        <w:tc>
+          <w:tcPr>
+            <w:tcW w:w="1164" w:type="dxa"/>
+            <w:tcBorders>
+              <w:top w:val="nil"/>
+              <w:start w:val="nil"/>
+              <w:bottom w:val="nil"/>
+              <w:end w:val="nil"/>
+              <w:insideH w:val="nil"/>
+              <w:insideV w:val="nil"/>
+            </w:tcBorders>
+            <w:tcMar>
+              <w:top w:w="55" w:type="dxa"/>
+              <w:start w:w="70" w:type="dxa"/>
+              <w:bottom w:w="55" w:type="dxa"/>
+              <w:end w:w="70" w:type="dxa"/>
+            </w:tcMar>
+            <w:vAlign w:val="center"/>
+          </w:tcPr>
+          <w:p>
+            <w:pPr>
+              <w:keepNext/>
+              <w:spacing w:line="276" w:lineRule="auto" w:before="0" w:after="0"/>
+              <w:ind w:firstLine="0"/>
+              <w:jc w:val="center"/>
+            </w:pPr>
+            <w:r>
+              <w:rPr>
+                <w:rFonts w:hint="eastAsia" w:ascii="Times New Roman" w:hAnsi="Times New Roman" w:eastAsia="宋体"/>
+                <w:b w:val="0"/>
+                <w:sz w:val="20"/>
+              </w:rPr>
+              <w:t xml:space="preserve">中央厨房</w:t>
+            </w:r>
+          </w:p>
+        </w:tc>
+        <w:tc>
+          <w:tcPr>
+            <w:tcW w:w="1432" w:type="dxa"/>
+            <w:tcBorders>
+              <w:top w:val="nil"/>
+              <w:start w:val="nil"/>
+              <w:bottom w:val="nil"/>
+              <w:end w:val="nil"/>
+              <w:insideH w:val="nil"/>
+              <w:insideV w:val="nil"/>
+            </w:tcBorders>
+            <w:tcMar>
+              <w:top w:w="55" w:type="dxa"/>
+              <w:start w:w="70" w:type="dxa"/>
+              <w:bottom w:w="55" w:type="dxa"/>
+              <w:end w:w="70" w:type="dxa"/>
+            </w:tcMar>
+            <w:vAlign w:val="center"/>
+          </w:tcPr>
+          <w:p>
+            <w:pPr>
+              <w:keepNext/>
+              <w:spacing w:line="276" w:lineRule="auto" w:before="0" w:after="0"/>
+              <w:ind w:firstLine="0"/>
+              <w:jc w:val="center"/>
+            </w:pPr>
+            <m:oMath>
+              <m:r>
+                <m:rPr>
+                  <m:sty m:val="p"/>
+                </m:rPr>
+                <m:t>(</m:t>
+              </m:r>
+              <m:r>
+                <m:t>0</m:t>
+              </m:r>
+              <m:r>
+                <m:rPr>
+                  <m:sty m:val="p"/>
+                </m:rPr>
+                <m:t>,</m:t>
+              </m:r>
+              <m:r>
+                <m:t>0</m:t>
+              </m:r>
+              <m:r>
+                <m:rPr>
+                  <m:sty m:val="p"/>
+                </m:rPr>
+                <m:t>)</m:t>
+              </m:r>
+            </m:oMath>
+          </w:p>
+        </w:tc>
+        <w:tc>
+          <w:tcPr>
+            <w:tcW w:w="984" w:type="dxa"/>
+            <w:tcBorders>
+              <w:top w:val="nil"/>
+              <w:start w:val="nil"/>
+              <w:bottom w:val="nil"/>
+              <w:end w:val="nil"/>
+              <w:insideH w:val="nil"/>
+              <w:insideV w:val="nil"/>
+            </w:tcBorders>
+            <w:tcMar>
+              <w:top w:w="55" w:type="dxa"/>
+              <w:start w:w="70" w:type="dxa"/>
+              <w:bottom w:w="55" w:type="dxa"/>
+              <w:end w:w="70" w:type="dxa"/>
+            </w:tcMar>
+            <w:vAlign w:val="center"/>
+          </w:tcPr>
+          <w:p>
+            <w:pPr>
+              <w:keepNext/>
+              <w:spacing w:line="276" w:lineRule="auto" w:before="0" w:after="0"/>
+              <w:ind w:firstLine="0"/>
+              <w:jc w:val="center"/>
+            </w:pPr>
+            <w:r>
+              <w:rPr>
+                <w:rFonts w:ascii="Times New Roman" w:hAnsi="Times New Roman" w:eastAsia="宋体"/>
+                <w:b w:val="0"/>
+                <w:sz w:val="20"/>
+              </w:rPr>
+              <w:t xml:space="preserve">—</w:t>
+            </w:r>
+          </w:p>
+        </w:tc>
+        <w:tc>
+          <w:tcPr>
+            <w:tcW w:w="1700" w:type="dxa"/>
+            <w:tcBorders>
+              <w:top w:val="nil"/>
+              <w:start w:val="nil"/>
+              <w:bottom w:val="nil"/>
+              <w:end w:val="nil"/>
+              <w:insideH w:val="nil"/>
+              <w:insideV w:val="nil"/>
+            </w:tcBorders>
+            <w:tcMar>
+              <w:top w:w="55" w:type="dxa"/>
+              <w:start w:w="70" w:type="dxa"/>
+              <w:bottom w:w="55" w:type="dxa"/>
+              <w:end w:w="70" w:type="dxa"/>
+            </w:tcMar>
+            <w:vAlign w:val="center"/>
+          </w:tcPr>
+          <w:p>
+            <w:pPr>
+              <w:keepNext/>
+              <w:spacing w:line="276" w:lineRule="auto" w:before="0" w:after="0"/>
+              <w:ind w:firstLine="0"/>
+              <w:jc w:val="center"/>
+            </w:pPr>
+            <w:r>
+              <w:rPr>
+                <w:rFonts w:ascii="Times New Roman" w:hAnsi="Times New Roman" w:eastAsia="宋体"/>
+                <w:b w:val="0"/>
+                <w:sz w:val="20"/>
+              </w:rPr>
+              <w:t xml:space="preserve">04:30 </w:t>
+            </w:r>
+            <w:r>
+              <w:rPr>
+                <w:rFonts w:hint="eastAsia" w:ascii="Times New Roman" w:hAnsi="Times New Roman" w:eastAsia="宋体"/>
+                <w:b w:val="0"/>
+                <w:sz w:val="20"/>
+              </w:rPr>
+              <w:t xml:space="preserve">发车</w:t>
+            </w:r>
+          </w:p>
+        </w:tc>
+        <w:tc>
+          <w:tcPr>
+            <w:tcW w:w="3043" w:type="dxa"/>
+            <w:tcBorders>
+              <w:top w:val="nil"/>
+              <w:start w:val="nil"/>
+              <w:bottom w:val="nil"/>
+              <w:end w:val="nil"/>
+              <w:insideH w:val="nil"/>
+              <w:insideV w:val="nil"/>
+            </w:tcBorders>
+            <w:tcMar>
+              <w:top w:w="55" w:type="dxa"/>
+              <w:start w:w="70" w:type="dxa"/>
+              <w:bottom w:w="55" w:type="dxa"/>
+              <w:end w:w="70" w:type="dxa"/>
+            </w:tcMar>
+            <w:vAlign w:val="center"/>
+          </w:tcPr>
+          <w:p>
+            <w:pPr>
+              <w:keepNext/>
+              <w:spacing w:line="276" w:lineRule="auto" w:before="0" w:after="0"/>
+              <w:ind w:firstLine="0"/>
+              <w:jc w:val="center"/>
+            </w:pPr>
+            <w:r>
+              <w:rPr>
+                <w:rFonts w:hint="eastAsia" w:ascii="Times New Roman" w:hAnsi="Times New Roman" w:eastAsia="宋体"/>
+                <w:b w:val="0"/>
+                <w:sz w:val="20"/>
+              </w:rPr>
+              <w:t xml:space="preserve">统一起终点</w:t>
+            </w:r>
+          </w:p>
+        </w:tc>
+      </w:tr>
+      <w:tr>
+        <w:trPr>
+          <w:cantSplit/>
+        </w:trPr>
+        <w:tc>
+          <w:tcPr>
+            <w:tcW w:w="627" w:type="dxa"/>
+            <w:tcBorders>
+              <w:top w:val="nil"/>
+              <w:start w:val="nil"/>
+              <w:bottom w:val="nil"/>
+              <w:end w:val="nil"/>
+              <w:insideH w:val="nil"/>
+              <w:insideV w:val="nil"/>
+            </w:tcBorders>
+            <w:tcMar>
+              <w:top w:w="55" w:type="dxa"/>
+              <w:start w:w="70" w:type="dxa"/>
+              <w:bottom w:w="55" w:type="dxa"/>
+              <w:end w:w="70" w:type="dxa"/>
+            </w:tcMar>
+            <w:vAlign w:val="center"/>
+          </w:tcPr>
+          <w:p>
+            <w:pPr>
+              <w:keepNext/>
+              <w:spacing w:line="276" w:lineRule="auto" w:before="0" w:after="0"/>
+              <w:ind w:firstLine="0"/>
+              <w:jc w:val="center"/>
+            </w:pPr>
+            <w:r>
+              <w:rPr>
+                <w:rFonts w:ascii="Times New Roman" w:hAnsi="Times New Roman" w:eastAsia="宋体"/>
+                <w:b w:val="0"/>
+                <w:sz w:val="20"/>
+              </w:rPr>
+              <w:t xml:space="preserve">1</w:t>
+            </w:r>
+          </w:p>
+        </w:tc>
+        <w:tc>
+          <w:tcPr>
+            <w:tcW w:w="1164" w:type="dxa"/>
+            <w:tcBorders>
+              <w:top w:val="nil"/>
+              <w:start w:val="nil"/>
+              <w:bottom w:val="nil"/>
+              <w:end w:val="nil"/>
+              <w:insideH w:val="nil"/>
+              <w:insideV w:val="nil"/>
+            </w:tcBorders>
+            <w:tcMar>
+              <w:top w:w="55" w:type="dxa"/>
+              <w:start w:w="70" w:type="dxa"/>
+              <w:bottom w:w="55" w:type="dxa"/>
+              <w:end w:w="70" w:type="dxa"/>
+            </w:tcMar>
+            <w:vAlign w:val="center"/>
+          </w:tcPr>
+          <w:p>
+            <w:pPr>
+              <w:keepNext/>
+              <w:spacing w:line="276" w:lineRule="auto" w:before="0" w:after="0"/>
+              <w:ind w:firstLine="0"/>
+              <w:jc w:val="center"/>
+            </w:pPr>
+            <w:r>
+              <w:rPr>
+                <w:rFonts w:hint="eastAsia" w:ascii="Times New Roman" w:hAnsi="Times New Roman" w:eastAsia="宋体"/>
+                <w:b w:val="0"/>
+                <w:sz w:val="20"/>
+              </w:rPr>
+              <w:t xml:space="preserve">配送站</w:t>
+            </w:r>
+            <w:r>
+              <w:rPr>
+                <w:rFonts w:ascii="Times New Roman" w:hAnsi="Times New Roman" w:eastAsia="宋体"/>
+                <w:b w:val="0"/>
+                <w:sz w:val="20"/>
+              </w:rPr>
+              <w:t xml:space="preserve"> A</w:t>
+            </w:r>
+          </w:p>
+        </w:tc>
+        <w:tc>
+          <w:tcPr>
+            <w:tcW w:w="1432" w:type="dxa"/>
+            <w:tcBorders>
+              <w:top w:val="nil"/>
+              <w:start w:val="nil"/>
+              <w:bottom w:val="nil"/>
+              <w:end w:val="nil"/>
+              <w:insideH w:val="nil"/>
+              <w:insideV w:val="nil"/>
+            </w:tcBorders>
+            <w:tcMar>
+              <w:top w:w="55" w:type="dxa"/>
+              <w:start w:w="70" w:type="dxa"/>
+              <w:bottom w:w="55" w:type="dxa"/>
+              <w:end w:w="70" w:type="dxa"/>
+            </w:tcMar>
+            <w:vAlign w:val="center"/>
+          </w:tcPr>
+          <w:p>
+            <w:pPr>
+              <w:keepNext/>
+              <w:spacing w:line="276" w:lineRule="auto" w:before="0" w:after="0"/>
+              <w:ind w:firstLine="0"/>
+              <w:jc w:val="center"/>
+            </w:pPr>
+            <m:oMath>
+              <m:r>
+                <m:rPr>
+                  <m:sty m:val="p"/>
+                </m:rPr>
+                <m:t>(</m:t>
+              </m:r>
+              <m:r>
+                <m:t>6</m:t>
+              </m:r>
+              <m:r>
+                <m:rPr>
+                  <m:sty m:val="p"/>
+                </m:rPr>
+                <m:t>,</m:t>
+              </m:r>
+              <m:r>
+                <m:t>8</m:t>
+              </m:r>
+              <m:r>
+                <m:rPr>
+                  <m:sty m:val="p"/>
+                </m:rPr>
+                <m:t>)</m:t>
+              </m:r>
+            </m:oMath>
+          </w:p>
+        </w:tc>
+        <w:tc>
+          <w:tcPr>
+            <w:tcW w:w="984" w:type="dxa"/>
+            <w:tcBorders>
+              <w:top w:val="nil"/>
+              <w:start w:val="nil"/>
+              <w:bottom w:val="nil"/>
+              <w:end w:val="nil"/>
+              <w:insideH w:val="nil"/>
+              <w:insideV w:val="nil"/>
+            </w:tcBorders>
+            <w:tcMar>
+              <w:top w:w="55" w:type="dxa"/>
+              <w:start w:w="70" w:type="dxa"/>
+              <w:bottom w:w="55" w:type="dxa"/>
+              <w:end w:w="70" w:type="dxa"/>
+            </w:tcMar>
+            <w:vAlign w:val="center"/>
+          </w:tcPr>
+          <w:p>
+            <w:pPr>
+              <w:keepNext/>
+              <w:spacing w:line="276" w:lineRule="auto" w:before="0" w:after="0"/>
+              <w:ind w:firstLine="0"/>
+              <w:jc w:val="center"/>
+            </w:pPr>
+            <w:r>
+              <w:rPr>
+                <w:rFonts w:ascii="Times New Roman" w:hAnsi="Times New Roman" w:eastAsia="宋体"/>
+                <w:b w:val="0"/>
+                <w:sz w:val="20"/>
+              </w:rPr>
+              <w:t xml:space="preserve">—</w:t>
+            </w:r>
+          </w:p>
+        </w:tc>
+        <w:tc>
+          <w:tcPr>
+            <w:tcW w:w="1700" w:type="dxa"/>
+            <w:tcBorders>
+              <w:top w:val="nil"/>
+              <w:start w:val="nil"/>
+              <w:bottom w:val="nil"/>
+              <w:end w:val="nil"/>
+              <w:insideH w:val="nil"/>
+              <w:insideV w:val="nil"/>
+            </w:tcBorders>
+            <w:tcMar>
+              <w:top w:w="55" w:type="dxa"/>
+              <w:start w:w="70" w:type="dxa"/>
+              <w:bottom w:w="55" w:type="dxa"/>
+              <w:end w:w="70" w:type="dxa"/>
+            </w:tcMar>
+            <w:vAlign w:val="center"/>
+          </w:tcPr>
+          <w:p>
+            <w:pPr>
+              <w:keepNext/>
+              <w:spacing w:line="276" w:lineRule="auto" w:before="0" w:after="0"/>
+              <w:ind w:firstLine="0"/>
+              <w:jc w:val="center"/>
+            </w:pPr>
+            <w:r>
+              <w:rPr>
+                <w:rFonts w:ascii="Times New Roman" w:hAnsi="Times New Roman" w:eastAsia="宋体"/>
+                <w:b w:val="0"/>
+                <w:sz w:val="20"/>
+              </w:rPr>
+              <w:t xml:space="preserve">—</w:t>
+            </w:r>
+          </w:p>
+        </w:tc>
+        <w:tc>
+          <w:tcPr>
+            <w:tcW w:w="3043" w:type="dxa"/>
+            <w:tcBorders>
+              <w:top w:val="nil"/>
+              <w:start w:val="nil"/>
+              <w:bottom w:val="nil"/>
+              <w:end w:val="nil"/>
+              <w:insideH w:val="nil"/>
+              <w:insideV w:val="nil"/>
+            </w:tcBorders>
+            <w:tcMar>
+              <w:top w:w="55" w:type="dxa"/>
+              <w:start w:w="70" w:type="dxa"/>
+              <w:bottom w:w="55" w:type="dxa"/>
+              <w:end w:w="70" w:type="dxa"/>
+            </w:tcMar>
+            <w:vAlign w:val="center"/>
+          </w:tcPr>
+          <w:p>
+            <w:pPr>
+              <w:keepNext/>
+              <w:spacing w:line="276" w:lineRule="auto" w:before="0" w:after="0"/>
+              <w:ind w:firstLine="0"/>
+              <w:jc w:val="center"/>
+            </w:pPr>
+            <w:r>
+              <w:rPr>
+                <w:rFonts w:hint="eastAsia" w:ascii="Times New Roman" w:hAnsi="Times New Roman" w:eastAsia="宋体"/>
+                <w:b w:val="0"/>
+                <w:sz w:val="20"/>
+              </w:rPr>
+              <w:t xml:space="preserve">服务门店</w:t>
+            </w:r>
+            <w:r>
+              <w:rPr>
+                <w:rFonts w:ascii="Times New Roman" w:hAnsi="Times New Roman" w:eastAsia="宋体"/>
+                <w:b w:val="0"/>
+                <w:sz w:val="20"/>
+              </w:rPr>
+              <w:t xml:space="preserve"> 1、3</w:t>
+            </w:r>
+          </w:p>
+        </w:tc>
+      </w:tr>
+      <w:tr>
+        <w:trPr>
+          <w:cantSplit/>
+        </w:trPr>
+        <w:tc>
+          <w:tcPr>
+            <w:tcW w:w="627" w:type="dxa"/>
+            <w:tcBorders>
+              <w:top w:val="nil"/>
+              <w:start w:val="nil"/>
+              <w:bottom w:val="nil"/>
+              <w:end w:val="nil"/>
+              <w:insideH w:val="nil"/>
+              <w:insideV w:val="nil"/>
+            </w:tcBorders>
+            <w:tcMar>
+              <w:top w:w="55" w:type="dxa"/>
+              <w:start w:w="70" w:type="dxa"/>
+              <w:bottom w:w="55" w:type="dxa"/>
+              <w:end w:w="70" w:type="dxa"/>
+            </w:tcMar>
+            <w:vAlign w:val="center"/>
+          </w:tcPr>
+          <w:p>
+            <w:pPr>
+              <w:keepNext/>
+              <w:spacing w:line="276" w:lineRule="auto" w:before="0" w:after="0"/>
+              <w:ind w:firstLine="0"/>
+              <w:jc w:val="center"/>
+            </w:pPr>
+            <w:r>
+              <w:rPr>
+                <w:rFonts w:ascii="Times New Roman" w:hAnsi="Times New Roman" w:eastAsia="宋体"/>
+                <w:b w:val="0"/>
+                <w:sz w:val="20"/>
+              </w:rPr>
+              <w:t xml:space="preserve">2</w:t>
+            </w:r>
+          </w:p>
+        </w:tc>
+        <w:tc>
+          <w:tcPr>
+            <w:tcW w:w="1164" w:type="dxa"/>
+            <w:tcBorders>
+              <w:top w:val="nil"/>
+              <w:start w:val="nil"/>
+              <w:bottom w:val="nil"/>
+              <w:end w:val="nil"/>
+              <w:insideH w:val="nil"/>
+              <w:insideV w:val="nil"/>
+            </w:tcBorders>
+            <w:tcMar>
+              <w:top w:w="55" w:type="dxa"/>
+              <w:start w:w="70" w:type="dxa"/>
+              <w:bottom w:w="55" w:type="dxa"/>
+              <w:end w:w="70" w:type="dxa"/>
+            </w:tcMar>
+            <w:vAlign w:val="center"/>
+          </w:tcPr>
+          <w:p>
+            <w:pPr>
+              <w:keepNext/>
+              <w:spacing w:line="276" w:lineRule="auto" w:before="0" w:after="0"/>
+              <w:ind w:firstLine="0"/>
+              <w:jc w:val="center"/>
+            </w:pPr>
+            <w:r>
+              <w:rPr>
+                <w:rFonts w:hint="eastAsia" w:ascii="Times New Roman" w:hAnsi="Times New Roman" w:eastAsia="宋体"/>
+                <w:b w:val="0"/>
+                <w:sz w:val="20"/>
+              </w:rPr>
+              <w:t xml:space="preserve">配送站</w:t>
+            </w:r>
+            <w:r>
+              <w:rPr>
+                <w:rFonts w:ascii="Times New Roman" w:hAnsi="Times New Roman" w:eastAsia="宋体"/>
+                <w:b w:val="0"/>
+                <w:sz w:val="20"/>
+              </w:rPr>
+              <w:t xml:space="preserve"> B</w:t>
+            </w:r>
+          </w:p>
+        </w:tc>
+        <w:tc>
+          <w:tcPr>
+            <w:tcW w:w="1432" w:type="dxa"/>
+            <w:tcBorders>
+              <w:top w:val="nil"/>
+              <w:start w:val="nil"/>
+              <w:bottom w:val="nil"/>
+              <w:end w:val="nil"/>
+              <w:insideH w:val="nil"/>
+              <w:insideV w:val="nil"/>
+            </w:tcBorders>
+            <w:tcMar>
+              <w:top w:w="55" w:type="dxa"/>
+              <w:start w:w="70" w:type="dxa"/>
+              <w:bottom w:w="55" w:type="dxa"/>
+              <w:end w:w="70" w:type="dxa"/>
+            </w:tcMar>
+            <w:vAlign w:val="center"/>
+          </w:tcPr>
+          <w:p>
+            <w:pPr>
+              <w:keepNext/>
+              <w:spacing w:line="276" w:lineRule="auto" w:before="0" w:after="0"/>
+              <w:ind w:firstLine="0"/>
+              <w:jc w:val="center"/>
+            </w:pPr>
+            <m:oMath>
+              <m:r>
+                <m:rPr>
+                  <m:sty m:val="p"/>
+                </m:rPr>
+                <m:t>(</m:t>
+              </m:r>
+              <m:r>
+                <m:t>10</m:t>
+              </m:r>
+              <m:r>
+                <m:rPr>
+                  <m:sty m:val="p"/>
+                </m:rPr>
+                <m:t>,</m:t>
+              </m:r>
+              <m:r>
+                <m:t>4</m:t>
+              </m:r>
+              <m:r>
+                <m:rPr>
+                  <m:sty m:val="p"/>
+                </m:rPr>
+                <m:t>)</m:t>
+              </m:r>
+            </m:oMath>
+          </w:p>
+        </w:tc>
+        <w:tc>
+          <w:tcPr>
+            <w:tcW w:w="984" w:type="dxa"/>
+            <w:tcBorders>
+              <w:top w:val="nil"/>
+              <w:start w:val="nil"/>
+              <w:bottom w:val="nil"/>
+              <w:end w:val="nil"/>
+              <w:insideH w:val="nil"/>
+              <w:insideV w:val="nil"/>
+            </w:tcBorders>
+            <w:tcMar>
+              <w:top w:w="55" w:type="dxa"/>
+              <w:start w:w="70" w:type="dxa"/>
+              <w:bottom w:w="55" w:type="dxa"/>
+              <w:end w:w="70" w:type="dxa"/>
+            </w:tcMar>
+            <w:vAlign w:val="center"/>
+          </w:tcPr>
+          <w:p>
+            <w:pPr>
+              <w:keepNext/>
+              <w:spacing w:line="276" w:lineRule="auto" w:before="0" w:after="0"/>
+              <w:ind w:firstLine="0"/>
+              <w:jc w:val="center"/>
+            </w:pPr>
+            <w:r>
+              <w:rPr>
+                <w:rFonts w:ascii="Times New Roman" w:hAnsi="Times New Roman" w:eastAsia="宋体"/>
+                <w:b w:val="0"/>
+                <w:sz w:val="20"/>
+              </w:rPr>
+              <w:t xml:space="preserve">—</w:t>
+            </w:r>
+          </w:p>
+        </w:tc>
+        <w:tc>
+          <w:tcPr>
+            <w:tcW w:w="1700" w:type="dxa"/>
+            <w:tcBorders>
+              <w:top w:val="nil"/>
+              <w:start w:val="nil"/>
+              <w:bottom w:val="nil"/>
+              <w:end w:val="nil"/>
+              <w:insideH w:val="nil"/>
+              <w:insideV w:val="nil"/>
+            </w:tcBorders>
+            <w:tcMar>
+              <w:top w:w="55" w:type="dxa"/>
+              <w:start w:w="70" w:type="dxa"/>
+              <w:bottom w:w="55" w:type="dxa"/>
+              <w:end w:w="70" w:type="dxa"/>
+            </w:tcMar>
+            <w:vAlign w:val="center"/>
+          </w:tcPr>
+          <w:p>
+            <w:pPr>
+              <w:keepNext/>
+              <w:spacing w:line="276" w:lineRule="auto" w:before="0" w:after="0"/>
+              <w:ind w:firstLine="0"/>
+              <w:jc w:val="center"/>
+            </w:pPr>
+            <w:r>
+              <w:rPr>
+                <w:rFonts w:ascii="Times New Roman" w:hAnsi="Times New Roman" w:eastAsia="宋体"/>
+                <w:b w:val="0"/>
+                <w:sz w:val="20"/>
+              </w:rPr>
+              <w:t xml:space="preserve">—</w:t>
+            </w:r>
+          </w:p>
+        </w:tc>
+        <w:tc>
+          <w:tcPr>
+            <w:tcW w:w="3043" w:type="dxa"/>
+            <w:tcBorders>
+              <w:top w:val="nil"/>
+              <w:start w:val="nil"/>
+              <w:bottom w:val="nil"/>
+              <w:end w:val="nil"/>
+              <w:insideH w:val="nil"/>
+              <w:insideV w:val="nil"/>
+            </w:tcBorders>
+            <w:tcMar>
+              <w:top w:w="55" w:type="dxa"/>
+              <w:start w:w="70" w:type="dxa"/>
+              <w:bottom w:w="55" w:type="dxa"/>
+              <w:end w:w="70" w:type="dxa"/>
+            </w:tcMar>
+            <w:vAlign w:val="center"/>
+          </w:tcPr>
+          <w:p>
+            <w:pPr>
+              <w:keepNext/>
+              <w:spacing w:line="276" w:lineRule="auto" w:before="0" w:after="0"/>
+              <w:ind w:firstLine="0"/>
+              <w:jc w:val="center"/>
+            </w:pPr>
+            <w:r>
+              <w:rPr>
+                <w:rFonts w:hint="eastAsia" w:ascii="Times New Roman" w:hAnsi="Times New Roman" w:eastAsia="宋体"/>
+                <w:b w:val="0"/>
+                <w:sz w:val="20"/>
+              </w:rPr>
+              <w:t xml:space="preserve">服务门店</w:t>
+            </w:r>
+            <w:r>
+              <w:rPr>
+                <w:rFonts w:ascii="Times New Roman" w:hAnsi="Times New Roman" w:eastAsia="宋体"/>
+                <w:b w:val="0"/>
+                <w:sz w:val="20"/>
+              </w:rPr>
+              <w:t xml:space="preserve"> 2、5</w:t>
+            </w:r>
+          </w:p>
+        </w:tc>
+      </w:tr>
+      <w:tr>
+        <w:trPr>
+          <w:cantSplit/>
+        </w:trPr>
+        <w:tc>
+          <w:tcPr>
+            <w:tcW w:w="627" w:type="dxa"/>
+            <w:tcBorders>
+              <w:top w:val="nil"/>
+              <w:start w:val="nil"/>
+              <w:bottom w:val="nil"/>
+              <w:end w:val="nil"/>
+              <w:insideH w:val="nil"/>
+              <w:insideV w:val="nil"/>
+            </w:tcBorders>
+            <w:tcMar>
+              <w:top w:w="55" w:type="dxa"/>
+              <w:start w:w="70" w:type="dxa"/>
+              <w:bottom w:w="55" w:type="dxa"/>
+              <w:end w:w="70" w:type="dxa"/>
+            </w:tcMar>
+            <w:vAlign w:val="center"/>
+          </w:tcPr>
+          <w:p>
+            <w:pPr>
+              <w:keepNext/>
+              <w:spacing w:line="276" w:lineRule="auto" w:before="0" w:after="0"/>
+              <w:ind w:firstLine="0"/>
+              <w:jc w:val="center"/>
+            </w:pPr>
+            <w:r>
+              <w:rPr>
+                <w:rFonts w:ascii="Times New Roman" w:hAnsi="Times New Roman" w:eastAsia="宋体"/>
+                <w:b w:val="0"/>
+                <w:sz w:val="20"/>
+              </w:rPr>
+              <w:t xml:space="preserve">3</w:t>
+            </w:r>
+          </w:p>
+        </w:tc>
+        <w:tc>
+          <w:tcPr>
+            <w:tcW w:w="1164" w:type="dxa"/>
+            <w:tcBorders>
+              <w:top w:val="nil"/>
+              <w:start w:val="nil"/>
+              <w:bottom w:val="nil"/>
+              <w:end w:val="nil"/>
+              <w:insideH w:val="nil"/>
+              <w:insideV w:val="nil"/>
+            </w:tcBorders>
+            <w:tcMar>
+              <w:top w:w="55" w:type="dxa"/>
+              <w:start w:w="70" w:type="dxa"/>
+              <w:bottom w:w="55" w:type="dxa"/>
+              <w:end w:w="70" w:type="dxa"/>
+            </w:tcMar>
+            <w:vAlign w:val="center"/>
+          </w:tcPr>
+          <w:p>
+            <w:pPr>
+              <w:keepNext/>
+              <w:spacing w:line="276" w:lineRule="auto" w:before="0" w:after="0"/>
+              <w:ind w:firstLine="0"/>
+              <w:jc w:val="center"/>
+            </w:pPr>
+            <w:r>
+              <w:rPr>
+                <w:rFonts w:hint="eastAsia" w:ascii="Times New Roman" w:hAnsi="Times New Roman" w:eastAsia="宋体"/>
+                <w:b w:val="0"/>
+                <w:sz w:val="20"/>
+              </w:rPr>
+              <w:t xml:space="preserve">配送站</w:t>
+            </w:r>
+            <w:r>
+              <w:rPr>
+                <w:rFonts w:ascii="Times New Roman" w:hAnsi="Times New Roman" w:eastAsia="宋体"/>
+                <w:b w:val="0"/>
+                <w:sz w:val="20"/>
+              </w:rPr>
+              <w:t xml:space="preserve"> C</w:t>
+            </w:r>
+          </w:p>
+        </w:tc>
+        <w:tc>
+          <w:tcPr>
+            <w:tcW w:w="1432" w:type="dxa"/>
+            <w:tcBorders>
+              <w:top w:val="nil"/>
+              <w:start w:val="nil"/>
+              <w:bottom w:val="nil"/>
+              <w:end w:val="nil"/>
+              <w:insideH w:val="nil"/>
+              <w:insideV w:val="nil"/>
+            </w:tcBorders>
+            <w:tcMar>
+              <w:top w:w="55" w:type="dxa"/>
+              <w:start w:w="70" w:type="dxa"/>
+              <w:bottom w:w="55" w:type="dxa"/>
+              <w:end w:w="70" w:type="dxa"/>
+            </w:tcMar>
+            <w:vAlign w:val="center"/>
+          </w:tcPr>
+          <w:p>
+            <w:pPr>
+              <w:keepNext/>
+              <w:spacing w:line="276" w:lineRule="auto" w:before="0" w:after="0"/>
+              <w:ind w:firstLine="0"/>
+              <w:jc w:val="center"/>
+            </w:pPr>
+            <m:oMath>
+              <m:r>
+                <m:rPr>
+                  <m:sty m:val="p"/>
+                </m:rPr>
+                <m:t>(</m:t>
+              </m:r>
+              <m:r>
+                <m:t>5</m:t>
+              </m:r>
+              <m:r>
+                <m:rPr>
+                  <m:sty m:val="p"/>
+                </m:rPr>
+                <m:t>,</m:t>
+              </m:r>
+              <m:r>
+                <m:rPr>
+                  <m:sty m:val="p"/>
+                </m:rPr>
+                <m:t>−</m:t>
+              </m:r>
+              <m:r>
+                <m:t>5</m:t>
+              </m:r>
+              <m:r>
+                <m:rPr>
+                  <m:sty m:val="p"/>
+                </m:rPr>
+                <m:t>)</m:t>
+              </m:r>
+            </m:oMath>
+          </w:p>
+        </w:tc>
+        <w:tc>
+          <w:tcPr>
+            <w:tcW w:w="984" w:type="dxa"/>
+            <w:tcBorders>
+              <w:top w:val="nil"/>
+              <w:start w:val="nil"/>
+              <w:bottom w:val="nil"/>
+              <w:end w:val="nil"/>
+              <w:insideH w:val="nil"/>
+              <w:insideV w:val="nil"/>
+            </w:tcBorders>
+            <w:tcMar>
+              <w:top w:w="55" w:type="dxa"/>
+              <w:start w:w="70" w:type="dxa"/>
+              <w:bottom w:w="55" w:type="dxa"/>
+              <w:end w:w="70" w:type="dxa"/>
+            </w:tcMar>
+            <w:vAlign w:val="center"/>
+          </w:tcPr>
+          <w:p>
+            <w:pPr>
+              <w:keepNext/>
+              <w:spacing w:line="276" w:lineRule="auto" w:before="0" w:after="0"/>
+              <w:ind w:firstLine="0"/>
+              <w:jc w:val="center"/>
+            </w:pPr>
+            <w:r>
+              <w:rPr>
+                <w:rFonts w:ascii="Times New Roman" w:hAnsi="Times New Roman" w:eastAsia="宋体"/>
+                <w:b w:val="0"/>
+                <w:sz w:val="20"/>
+              </w:rPr>
+              <w:t xml:space="preserve">—</w:t>
+            </w:r>
+          </w:p>
+        </w:tc>
+        <w:tc>
+          <w:tcPr>
+            <w:tcW w:w="1700" w:type="dxa"/>
+            <w:tcBorders>
+              <w:top w:val="nil"/>
+              <w:start w:val="nil"/>
+              <w:bottom w:val="nil"/>
+              <w:end w:val="nil"/>
+              <w:insideH w:val="nil"/>
+              <w:insideV w:val="nil"/>
+            </w:tcBorders>
+            <w:tcMar>
+              <w:top w:w="55" w:type="dxa"/>
+              <w:start w:w="70" w:type="dxa"/>
+              <w:bottom w:w="55" w:type="dxa"/>
+              <w:end w:w="70" w:type="dxa"/>
+            </w:tcMar>
+            <w:vAlign w:val="center"/>
+          </w:tcPr>
+          <w:p>
+            <w:pPr>
+              <w:keepNext/>
+              <w:spacing w:line="276" w:lineRule="auto" w:before="0" w:after="0"/>
+              <w:ind w:firstLine="0"/>
+              <w:jc w:val="center"/>
+            </w:pPr>
+            <w:r>
+              <w:rPr>
+                <w:rFonts w:ascii="Times New Roman" w:hAnsi="Times New Roman" w:eastAsia="宋体"/>
+                <w:b w:val="0"/>
+                <w:sz w:val="20"/>
+              </w:rPr>
+              <w:t xml:space="preserve">—</w:t>
+            </w:r>
+          </w:p>
+        </w:tc>
+        <w:tc>
+          <w:tcPr>
+            <w:tcW w:w="3043" w:type="dxa"/>
+            <w:tcBorders>
+              <w:top w:val="nil"/>
+              <w:start w:val="nil"/>
+              <w:bottom w:val="nil"/>
+              <w:end w:val="nil"/>
+              <w:insideH w:val="nil"/>
+              <w:insideV w:val="nil"/>
+            </w:tcBorders>
+            <w:tcMar>
+              <w:top w:w="55" w:type="dxa"/>
+              <w:start w:w="70" w:type="dxa"/>
+              <w:bottom w:w="55" w:type="dxa"/>
+              <w:end w:w="70" w:type="dxa"/>
+            </w:tcMar>
+            <w:vAlign w:val="center"/>
+          </w:tcPr>
+          <w:p>
+            <w:pPr>
+              <w:keepNext/>
+              <w:spacing w:line="276" w:lineRule="auto" w:before="0" w:after="0"/>
+              <w:ind w:firstLine="0"/>
+              <w:jc w:val="center"/>
+            </w:pPr>
+            <w:r>
+              <w:rPr>
+                <w:rFonts w:hint="eastAsia" w:ascii="Times New Roman" w:hAnsi="Times New Roman" w:eastAsia="宋体"/>
+                <w:b w:val="0"/>
+                <w:sz w:val="20"/>
+              </w:rPr>
+              <w:t xml:space="preserve">服务门店</w:t>
+            </w:r>
+            <w:r>
+              <w:rPr>
+                <w:rFonts w:ascii="Times New Roman" w:hAnsi="Times New Roman" w:eastAsia="宋体"/>
+                <w:b w:val="0"/>
+                <w:sz w:val="20"/>
+              </w:rPr>
+              <w:t xml:space="preserve"> 4、6</w:t>
+            </w:r>
+          </w:p>
+        </w:tc>
+      </w:tr>
+      <w:tr>
+        <w:trPr>
+          <w:cantSplit/>
+        </w:trPr>
+        <w:tc>
+          <w:tcPr>
+            <w:tcW w:w="627" w:type="dxa"/>
+            <w:tcBorders>
+              <w:top w:val="nil"/>
+              <w:start w:val="nil"/>
+              <w:bottom w:val="nil"/>
+              <w:end w:val="nil"/>
+              <w:insideH w:val="nil"/>
+              <w:insideV w:val="nil"/>
+            </w:tcBorders>
+            <w:tcMar>
+              <w:top w:w="55" w:type="dxa"/>
+              <w:start w:w="70" w:type="dxa"/>
+              <w:bottom w:w="55" w:type="dxa"/>
+              <w:end w:w="70" w:type="dxa"/>
+            </w:tcMar>
+            <w:vAlign w:val="center"/>
+          </w:tcPr>
+          <w:p>
+            <w:pPr>
+              <w:keepNext/>
+              <w:spacing w:line="276" w:lineRule="auto" w:before="0" w:after="0"/>
+              <w:ind w:firstLine="0"/>
+              <w:jc w:val="center"/>
+            </w:pPr>
+            <w:r>
+              <w:rPr>
+                <w:rFonts w:ascii="Times New Roman" w:hAnsi="Times New Roman" w:eastAsia="宋体"/>
+                <w:b w:val="0"/>
+                <w:sz w:val="20"/>
+              </w:rPr>
+              <w:t xml:space="preserve">4</w:t>
+            </w:r>
+          </w:p>
+        </w:tc>
+        <w:tc>
+          <w:tcPr>
+            <w:tcW w:w="1164" w:type="dxa"/>
+            <w:tcBorders>
+              <w:top w:val="nil"/>
+              <w:start w:val="nil"/>
+              <w:bottom w:val="nil"/>
+              <w:end w:val="nil"/>
+              <w:insideH w:val="nil"/>
+              <w:insideV w:val="nil"/>
+            </w:tcBorders>
+            <w:tcMar>
+              <w:top w:w="55" w:type="dxa"/>
+              <w:start w:w="70" w:type="dxa"/>
+              <w:bottom w:w="55" w:type="dxa"/>
+              <w:end w:w="70" w:type="dxa"/>
+            </w:tcMar>
+            <w:vAlign w:val="center"/>
+          </w:tcPr>
+          <w:p>
+            <w:pPr>
+              <w:keepNext/>
+              <w:spacing w:line="276" w:lineRule="auto" w:before="0" w:after="0"/>
+              <w:ind w:firstLine="0"/>
+              <w:jc w:val="center"/>
+            </w:pPr>
+            <w:r>
+              <w:rPr>
+                <w:rFonts w:hint="eastAsia" w:ascii="Times New Roman" w:hAnsi="Times New Roman" w:eastAsia="宋体"/>
+                <w:b w:val="0"/>
+                <w:sz w:val="20"/>
+              </w:rPr>
+              <w:t xml:space="preserve">门店</w:t>
+            </w:r>
+            <w:r>
+              <w:rPr>
+                <w:rFonts w:ascii="Times New Roman" w:hAnsi="Times New Roman" w:eastAsia="宋体"/>
+                <w:b w:val="0"/>
+                <w:sz w:val="20"/>
+              </w:rPr>
+              <w:t xml:space="preserve"> 1</w:t>
+            </w:r>
+          </w:p>
+        </w:tc>
+        <w:tc>
+          <w:tcPr>
+            <w:tcW w:w="1432" w:type="dxa"/>
+            <w:tcBorders>
+              <w:top w:val="nil"/>
+              <w:start w:val="nil"/>
+              <w:bottom w:val="nil"/>
+              <w:end w:val="nil"/>
+              <w:insideH w:val="nil"/>
+              <w:insideV w:val="nil"/>
+            </w:tcBorders>
+            <w:tcMar>
+              <w:top w:w="55" w:type="dxa"/>
+              <w:start w:w="70" w:type="dxa"/>
+              <w:bottom w:w="55" w:type="dxa"/>
+              <w:end w:w="70" w:type="dxa"/>
+            </w:tcMar>
+            <w:vAlign w:val="center"/>
+          </w:tcPr>
+          <w:p>
+            <w:pPr>
+              <w:keepNext/>
+              <w:spacing w:line="276" w:lineRule="auto" w:before="0" w:after="0"/>
+              <w:ind w:firstLine="0"/>
+              <w:jc w:val="center"/>
+            </w:pPr>
+            <m:oMath>
+              <m:r>
+                <m:rPr>
+                  <m:sty m:val="p"/>
+                </m:rPr>
+                <m:t>(</m:t>
+              </m:r>
+              <m:r>
+                <m:t>8</m:t>
+              </m:r>
+              <m:r>
+                <m:rPr>
+                  <m:sty m:val="p"/>
+                </m:rPr>
+                <m:t>,</m:t>
+              </m:r>
+              <m:r>
+                <m:t>10</m:t>
+              </m:r>
+              <m:r>
+                <m:rPr>
+                  <m:sty m:val="p"/>
+                </m:rPr>
+                <m:t>)</m:t>
+              </m:r>
+            </m:oMath>
+          </w:p>
+        </w:tc>
+        <w:tc>
+          <w:tcPr>
+            <w:tcW w:w="984" w:type="dxa"/>
+            <w:tcBorders>
+              <w:top w:val="nil"/>
+              <w:start w:val="nil"/>
+              <w:bottom w:val="nil"/>
+              <w:end w:val="nil"/>
+              <w:insideH w:val="nil"/>
+              <w:insideV w:val="nil"/>
+            </w:tcBorders>
+            <w:tcMar>
+              <w:top w:w="55" w:type="dxa"/>
+              <w:start w:w="70" w:type="dxa"/>
+              <w:bottom w:w="55" w:type="dxa"/>
+              <w:end w:w="70" w:type="dxa"/>
+            </w:tcMar>
+            <w:vAlign w:val="center"/>
+          </w:tcPr>
+          <w:p>
+            <w:pPr>
+              <w:keepNext/>
+              <w:spacing w:line="276" w:lineRule="auto" w:before="0" w:after="0"/>
+              <w:ind w:firstLine="0"/>
+              <w:jc w:val="center"/>
+            </w:pPr>
+            <w:r>
+              <w:rPr>
+                <w:rFonts w:ascii="Times New Roman" w:hAnsi="Times New Roman" w:eastAsia="宋体"/>
+                <w:b w:val="0"/>
+                <w:sz w:val="20"/>
+              </w:rPr>
+              <w:t xml:space="preserve">15</w:t>
+            </w:r>
+          </w:p>
+        </w:tc>
+        <w:tc>
+          <w:tcPr>
+            <w:tcW w:w="1700" w:type="dxa"/>
+            <w:tcBorders>
+              <w:top w:val="nil"/>
+              <w:start w:val="nil"/>
+              <w:bottom w:val="nil"/>
+              <w:end w:val="nil"/>
+              <w:insideH w:val="nil"/>
+              <w:insideV w:val="nil"/>
+            </w:tcBorders>
+            <w:tcMar>
+              <w:top w:w="55" w:type="dxa"/>
+              <w:start w:w="70" w:type="dxa"/>
+              <w:bottom w:w="55" w:type="dxa"/>
+              <w:end w:w="70" w:type="dxa"/>
+            </w:tcMar>
+            <w:vAlign w:val="center"/>
+          </w:tcPr>
+          <w:p>
+            <w:pPr>
+              <w:keepNext/>
+              <w:spacing w:line="276" w:lineRule="auto" w:before="0" w:after="0"/>
+              <w:ind w:firstLine="0"/>
+              <w:jc w:val="center"/>
+            </w:pPr>
+            <w:r>
+              <w:rPr>
+                <w:rFonts w:ascii="Times New Roman" w:hAnsi="Times New Roman" w:eastAsia="宋体"/>
+                <w:b w:val="0"/>
+                <w:sz w:val="20"/>
+              </w:rPr>
+              <w:t xml:space="preserve">04:30–05:30</w:t>
+            </w:r>
+          </w:p>
+        </w:tc>
+        <w:tc>
+          <w:tcPr>
+            <w:tcW w:w="3043" w:type="dxa"/>
+            <w:tcBorders>
+              <w:top w:val="nil"/>
+              <w:start w:val="nil"/>
+              <w:bottom w:val="nil"/>
+              <w:end w:val="nil"/>
+              <w:insideH w:val="nil"/>
+              <w:insideV w:val="nil"/>
+            </w:tcBorders>
+            <w:tcMar>
+              <w:top w:w="55" w:type="dxa"/>
+              <w:start w:w="70" w:type="dxa"/>
+              <w:bottom w:w="55" w:type="dxa"/>
+              <w:end w:w="70" w:type="dxa"/>
+            </w:tcMar>
+            <w:vAlign w:val="center"/>
+          </w:tcPr>
+          <w:p>
+            <w:pPr>
+              <w:keepNext/>
+              <w:spacing w:line="276" w:lineRule="auto" w:before="0" w:after="0"/>
+              <w:ind w:firstLine="0"/>
+              <w:jc w:val="center"/>
+            </w:pPr>
+            <w:r>
+              <w:rPr>
+                <w:rFonts w:ascii="Times New Roman" w:hAnsi="Times New Roman" w:eastAsia="宋体"/>
+                <w:b w:val="0"/>
+                <w:sz w:val="20"/>
+              </w:rPr>
+              <w:t xml:space="preserve">A </w:t>
+            </w:r>
+            <w:r>
+              <w:rPr>
+                <w:rFonts w:hint="eastAsia" w:ascii="Times New Roman" w:hAnsi="Times New Roman" w:eastAsia="宋体"/>
+                <w:b w:val="0"/>
+                <w:sz w:val="20"/>
+              </w:rPr>
+              <w:t xml:space="preserve">区</w:t>
+            </w:r>
+          </w:p>
+        </w:tc>
+      </w:tr>
+      <w:tr>
+        <w:trPr>
+          <w:cantSplit/>
+        </w:trPr>
+        <w:tc>
+          <w:tcPr>
+            <w:tcW w:w="627" w:type="dxa"/>
+            <w:tcBorders>
+              <w:top w:val="nil"/>
+              <w:start w:val="nil"/>
+              <w:bottom w:val="nil"/>
+              <w:end w:val="nil"/>
+              <w:insideH w:val="nil"/>
+              <w:insideV w:val="nil"/>
+            </w:tcBorders>
+            <w:tcMar>
+              <w:top w:w="55" w:type="dxa"/>
+              <w:start w:w="70" w:type="dxa"/>
+              <w:bottom w:w="55" w:type="dxa"/>
+              <w:end w:w="70" w:type="dxa"/>
+            </w:tcMar>
+            <w:vAlign w:val="center"/>
+          </w:tcPr>
+          <w:p>
+            <w:pPr>
+              <w:keepNext/>
+              <w:spacing w:line="276" w:lineRule="auto" w:before="0" w:after="0"/>
+              <w:ind w:firstLine="0"/>
+              <w:jc w:val="center"/>
+            </w:pPr>
+            <w:r>
+              <w:rPr>
+                <w:rFonts w:ascii="Times New Roman" w:hAnsi="Times New Roman" w:eastAsia="宋体"/>
+                <w:b w:val="0"/>
+                <w:sz w:val="20"/>
+              </w:rPr>
+              <w:t xml:space="preserve">5</w:t>
+            </w:r>
+          </w:p>
+        </w:tc>
+        <w:tc>
+          <w:tcPr>
+            <w:tcW w:w="1164" w:type="dxa"/>
+            <w:tcBorders>
+              <w:top w:val="nil"/>
+              <w:start w:val="nil"/>
+              <w:bottom w:val="nil"/>
+              <w:end w:val="nil"/>
+              <w:insideH w:val="nil"/>
+              <w:insideV w:val="nil"/>
+            </w:tcBorders>
+            <w:tcMar>
+              <w:top w:w="55" w:type="dxa"/>
+              <w:start w:w="70" w:type="dxa"/>
+              <w:bottom w:w="55" w:type="dxa"/>
+              <w:end w:w="70" w:type="dxa"/>
+            </w:tcMar>
+            <w:vAlign w:val="center"/>
+          </w:tcPr>
+          <w:p>
+            <w:pPr>
+              <w:keepNext/>
+              <w:spacing w:line="276" w:lineRule="auto" w:before="0" w:after="0"/>
+              <w:ind w:firstLine="0"/>
+              <w:jc w:val="center"/>
+            </w:pPr>
+            <w:r>
+              <w:rPr>
+                <w:rFonts w:hint="eastAsia" w:ascii="Times New Roman" w:hAnsi="Times New Roman" w:eastAsia="宋体"/>
+                <w:b w:val="0"/>
+                <w:sz w:val="20"/>
+              </w:rPr>
+              <w:t xml:space="preserve">门店</w:t>
+            </w:r>
+            <w:r>
+              <w:rPr>
+                <w:rFonts w:ascii="Times New Roman" w:hAnsi="Times New Roman" w:eastAsia="宋体"/>
+                <w:b w:val="0"/>
+                <w:sz w:val="20"/>
+              </w:rPr>
+              <w:t xml:space="preserve"> 2</w:t>
+            </w:r>
+          </w:p>
+        </w:tc>
+        <w:tc>
+          <w:tcPr>
+            <w:tcW w:w="1432" w:type="dxa"/>
+            <w:tcBorders>
+              <w:top w:val="nil"/>
+              <w:start w:val="nil"/>
+              <w:bottom w:val="nil"/>
+              <w:end w:val="nil"/>
+              <w:insideH w:val="nil"/>
+              <w:insideV w:val="nil"/>
+            </w:tcBorders>
+            <w:tcMar>
+              <w:top w:w="55" w:type="dxa"/>
+              <w:start w:w="70" w:type="dxa"/>
+              <w:bottom w:w="55" w:type="dxa"/>
+              <w:end w:w="70" w:type="dxa"/>
+            </w:tcMar>
+            <w:vAlign w:val="center"/>
+          </w:tcPr>
+          <w:p>
+            <w:pPr>
+              <w:keepNext/>
+              <w:spacing w:line="276" w:lineRule="auto" w:before="0" w:after="0"/>
+              <w:ind w:firstLine="0"/>
+              <w:jc w:val="center"/>
+            </w:pPr>
+            <m:oMath>
+              <m:r>
+                <m:rPr>
+                  <m:sty m:val="p"/>
+                </m:rPr>
+                <m:t>(</m:t>
+              </m:r>
+              <m:r>
+                <m:t>12</m:t>
+              </m:r>
+              <m:r>
+                <m:rPr>
+                  <m:sty m:val="p"/>
+                </m:rPr>
+                <m:t>,</m:t>
+              </m:r>
+              <m:r>
+                <m:t>5</m:t>
+              </m:r>
+              <m:r>
+                <m:rPr>
+                  <m:sty m:val="p"/>
+                </m:rPr>
+                <m:t>)</m:t>
+              </m:r>
+            </m:oMath>
+          </w:p>
+        </w:tc>
+        <w:tc>
+          <w:tcPr>
+            <w:tcW w:w="984" w:type="dxa"/>
+            <w:tcBorders>
+              <w:top w:val="nil"/>
+              <w:start w:val="nil"/>
+              <w:bottom w:val="nil"/>
+              <w:end w:val="nil"/>
+              <w:insideH w:val="nil"/>
+              <w:insideV w:val="nil"/>
+            </w:tcBorders>
+            <w:tcMar>
+              <w:top w:w="55" w:type="dxa"/>
+              <w:start w:w="70" w:type="dxa"/>
+              <w:bottom w:w="55" w:type="dxa"/>
+              <w:end w:w="70" w:type="dxa"/>
+            </w:tcMar>
+            <w:vAlign w:val="center"/>
+          </w:tcPr>
+          <w:p>
+            <w:pPr>
+              <w:keepNext/>
+              <w:spacing w:line="276" w:lineRule="auto" w:before="0" w:after="0"/>
+              <w:ind w:firstLine="0"/>
+              <w:jc w:val="center"/>
+            </w:pPr>
+            <w:r>
+              <w:rPr>
+                <w:rFonts w:ascii="Times New Roman" w:hAnsi="Times New Roman" w:eastAsia="宋体"/>
+                <w:b w:val="0"/>
+                <w:sz w:val="20"/>
+              </w:rPr>
+              <w:t xml:space="preserve">18</w:t>
+            </w:r>
+          </w:p>
+        </w:tc>
+        <w:tc>
+          <w:tcPr>
+            <w:tcW w:w="1700" w:type="dxa"/>
+            <w:tcBorders>
+              <w:top w:val="nil"/>
+              <w:start w:val="nil"/>
+              <w:bottom w:val="nil"/>
+              <w:end w:val="nil"/>
+              <w:insideH w:val="nil"/>
+              <w:insideV w:val="nil"/>
+            </w:tcBorders>
+            <w:tcMar>
+              <w:top w:w="55" w:type="dxa"/>
+              <w:start w:w="70" w:type="dxa"/>
+              <w:bottom w:w="55" w:type="dxa"/>
+              <w:end w:w="70" w:type="dxa"/>
+            </w:tcMar>
+            <w:vAlign w:val="center"/>
+          </w:tcPr>
+          <w:p>
+            <w:pPr>
+              <w:keepNext/>
+              <w:spacing w:line="276" w:lineRule="auto" w:before="0" w:after="0"/>
+              <w:ind w:firstLine="0"/>
+              <w:jc w:val="center"/>
+            </w:pPr>
+            <w:r>
+              <w:rPr>
+                <w:rFonts w:ascii="Times New Roman" w:hAnsi="Times New Roman" w:eastAsia="宋体"/>
+                <w:b w:val="0"/>
+                <w:sz w:val="20"/>
+              </w:rPr>
+              <w:t xml:space="preserve">04:45–05:45</w:t>
+            </w:r>
+          </w:p>
+        </w:tc>
+        <w:tc>
+          <w:tcPr>
+            <w:tcW w:w="3043" w:type="dxa"/>
+            <w:tcBorders>
+              <w:top w:val="nil"/>
+              <w:start w:val="nil"/>
+              <w:bottom w:val="nil"/>
+              <w:end w:val="nil"/>
+              <w:insideH w:val="nil"/>
+              <w:insideV w:val="nil"/>
+            </w:tcBorders>
+            <w:tcMar>
+              <w:top w:w="55" w:type="dxa"/>
+              <w:start w:w="70" w:type="dxa"/>
+              <w:bottom w:w="55" w:type="dxa"/>
+              <w:end w:w="70" w:type="dxa"/>
+            </w:tcMar>
+            <w:vAlign w:val="center"/>
+          </w:tcPr>
+          <w:p>
+            <w:pPr>
+              <w:keepNext/>
+              <w:spacing w:line="276" w:lineRule="auto" w:before="0" w:after="0"/>
+              <w:ind w:firstLine="0"/>
+              <w:jc w:val="center"/>
+            </w:pPr>
+            <w:r>
+              <w:rPr>
+                <w:rFonts w:ascii="Times New Roman" w:hAnsi="Times New Roman" w:eastAsia="宋体"/>
+                <w:b w:val="0"/>
+                <w:sz w:val="20"/>
+              </w:rPr>
+              <w:t xml:space="preserve">B </w:t>
+            </w:r>
+            <w:r>
+              <w:rPr>
+                <w:rFonts w:hint="eastAsia" w:ascii="Times New Roman" w:hAnsi="Times New Roman" w:eastAsia="宋体"/>
+                <w:b w:val="0"/>
+                <w:sz w:val="20"/>
+              </w:rPr>
+              <w:t xml:space="preserve">区</w:t>
+            </w:r>
+          </w:p>
+        </w:tc>
+      </w:tr>
+      <w:tr>
+        <w:trPr>
+          <w:cantSplit/>
+        </w:trPr>
+        <w:tc>
+          <w:tcPr>
+            <w:tcW w:w="627" w:type="dxa"/>
+            <w:tcBorders>
+              <w:top w:val="nil"/>
+              <w:start w:val="nil"/>
+              <w:bottom w:val="nil"/>
+              <w:end w:val="nil"/>
+              <w:insideH w:val="nil"/>
+              <w:insideV w:val="nil"/>
+            </w:tcBorders>
+            <w:tcMar>
+              <w:top w:w="55" w:type="dxa"/>
+              <w:start w:w="70" w:type="dxa"/>
+              <w:bottom w:w="55" w:type="dxa"/>
+              <w:end w:w="70" w:type="dxa"/>
+            </w:tcMar>
+            <w:vAlign w:val="center"/>
+          </w:tcPr>
+          <w:p>
+            <w:pPr>
+              <w:keepNext/>
+              <w:spacing w:line="276" w:lineRule="auto" w:before="0" w:after="0"/>
+              <w:ind w:firstLine="0"/>
+              <w:jc w:val="center"/>
+            </w:pPr>
+            <w:r>
+              <w:rPr>
+                <w:rFonts w:ascii="Times New Roman" w:hAnsi="Times New Roman" w:eastAsia="宋体"/>
+                <w:b w:val="0"/>
+                <w:sz w:val="20"/>
+              </w:rPr>
+              <w:t xml:space="preserve">6</w:t>
+            </w:r>
+          </w:p>
+        </w:tc>
+        <w:tc>
+          <w:tcPr>
+            <w:tcW w:w="1164" w:type="dxa"/>
+            <w:tcBorders>
+              <w:top w:val="nil"/>
+              <w:start w:val="nil"/>
+              <w:bottom w:val="nil"/>
+              <w:end w:val="nil"/>
+              <w:insideH w:val="nil"/>
+              <w:insideV w:val="nil"/>
+            </w:tcBorders>
+            <w:tcMar>
+              <w:top w:w="55" w:type="dxa"/>
+              <w:start w:w="70" w:type="dxa"/>
+              <w:bottom w:w="55" w:type="dxa"/>
+              <w:end w:w="70" w:type="dxa"/>
+            </w:tcMar>
+            <w:vAlign w:val="center"/>
+          </w:tcPr>
+          <w:p>
+            <w:pPr>
+              <w:keepNext/>
+              <w:spacing w:line="276" w:lineRule="auto" w:before="0" w:after="0"/>
+              <w:ind w:firstLine="0"/>
+              <w:jc w:val="center"/>
+            </w:pPr>
+            <w:r>
+              <w:rPr>
+                <w:rFonts w:hint="eastAsia" w:ascii="Times New Roman" w:hAnsi="Times New Roman" w:eastAsia="宋体"/>
+                <w:b w:val="0"/>
+                <w:sz w:val="20"/>
+              </w:rPr>
+              <w:t xml:space="preserve">门店</w:t>
+            </w:r>
+            <w:r>
+              <w:rPr>
+                <w:rFonts w:ascii="Times New Roman" w:hAnsi="Times New Roman" w:eastAsia="宋体"/>
+                <w:b w:val="0"/>
+                <w:sz w:val="20"/>
+              </w:rPr>
+              <w:t xml:space="preserve"> 3</w:t>
+            </w:r>
+          </w:p>
+        </w:tc>
+        <w:tc>
+          <w:tcPr>
+            <w:tcW w:w="1432" w:type="dxa"/>
+            <w:tcBorders>
+              <w:top w:val="nil"/>
+              <w:start w:val="nil"/>
+              <w:bottom w:val="nil"/>
+              <w:end w:val="nil"/>
+              <w:insideH w:val="nil"/>
+              <w:insideV w:val="nil"/>
+            </w:tcBorders>
+            <w:tcMar>
+              <w:top w:w="55" w:type="dxa"/>
+              <w:start w:w="70" w:type="dxa"/>
+              <w:bottom w:w="55" w:type="dxa"/>
+              <w:end w:w="70" w:type="dxa"/>
+            </w:tcMar>
+            <w:vAlign w:val="center"/>
+          </w:tcPr>
+          <w:p>
+            <w:pPr>
+              <w:keepNext/>
+              <w:spacing w:line="276" w:lineRule="auto" w:before="0" w:after="0"/>
+              <w:ind w:firstLine="0"/>
+              <w:jc w:val="center"/>
+            </w:pPr>
+            <m:oMath>
+              <m:r>
+                <m:rPr>
+                  <m:sty m:val="p"/>
+                </m:rPr>
+                <m:t>(</m:t>
+              </m:r>
+              <m:r>
+                <m:t>4</m:t>
+              </m:r>
+              <m:r>
+                <m:rPr>
+                  <m:sty m:val="p"/>
+                </m:rPr>
+                <m:t>,</m:t>
+              </m:r>
+              <m:r>
+                <m:t>12</m:t>
+              </m:r>
+              <m:r>
+                <m:rPr>
+                  <m:sty m:val="p"/>
+                </m:rPr>
+                <m:t>)</m:t>
+              </m:r>
+            </m:oMath>
+          </w:p>
+        </w:tc>
+        <w:tc>
+          <w:tcPr>
+            <w:tcW w:w="984" w:type="dxa"/>
+            <w:tcBorders>
+              <w:top w:val="nil"/>
+              <w:start w:val="nil"/>
+              <w:bottom w:val="nil"/>
+              <w:end w:val="nil"/>
+              <w:insideH w:val="nil"/>
+              <w:insideV w:val="nil"/>
+            </w:tcBorders>
+            <w:tcMar>
+              <w:top w:w="55" w:type="dxa"/>
+              <w:start w:w="70" w:type="dxa"/>
+              <w:bottom w:w="55" w:type="dxa"/>
+              <w:end w:w="70" w:type="dxa"/>
+            </w:tcMar>
+            <w:vAlign w:val="center"/>
+          </w:tcPr>
+          <w:p>
+            <w:pPr>
+              <w:keepNext/>
+              <w:spacing w:line="276" w:lineRule="auto" w:before="0" w:after="0"/>
+              <w:ind w:firstLine="0"/>
+              <w:jc w:val="center"/>
+            </w:pPr>
+            <w:r>
+              <w:rPr>
+                <w:rFonts w:ascii="Times New Roman" w:hAnsi="Times New Roman" w:eastAsia="宋体"/>
+                <w:b w:val="0"/>
+                <w:sz w:val="20"/>
+              </w:rPr>
+              <w:t xml:space="preserve">12</w:t>
+            </w:r>
+          </w:p>
+        </w:tc>
+        <w:tc>
+          <w:tcPr>
+            <w:tcW w:w="1700" w:type="dxa"/>
+            <w:tcBorders>
+              <w:top w:val="nil"/>
+              <w:start w:val="nil"/>
+              <w:bottom w:val="nil"/>
+              <w:end w:val="nil"/>
+              <w:insideH w:val="nil"/>
+              <w:insideV w:val="nil"/>
+            </w:tcBorders>
+            <w:tcMar>
+              <w:top w:w="55" w:type="dxa"/>
+              <w:start w:w="70" w:type="dxa"/>
+              <w:bottom w:w="55" w:type="dxa"/>
+              <w:end w:w="70" w:type="dxa"/>
+            </w:tcMar>
+            <w:vAlign w:val="center"/>
+          </w:tcPr>
+          <w:p>
+            <w:pPr>
+              <w:keepNext/>
+              <w:spacing w:line="276" w:lineRule="auto" w:before="0" w:after="0"/>
+              <w:ind w:firstLine="0"/>
+              <w:jc w:val="center"/>
+            </w:pPr>
+            <w:r>
+              <w:rPr>
+                <w:rFonts w:ascii="Times New Roman" w:hAnsi="Times New Roman" w:eastAsia="宋体"/>
+                <w:b w:val="0"/>
+                <w:sz w:val="20"/>
+              </w:rPr>
+              <w:t xml:space="preserve">04:30–05:30</w:t>
+            </w:r>
+          </w:p>
+        </w:tc>
+        <w:tc>
+          <w:tcPr>
+            <w:tcW w:w="3043" w:type="dxa"/>
+            <w:tcBorders>
+              <w:top w:val="nil"/>
+              <w:start w:val="nil"/>
+              <w:bottom w:val="nil"/>
+              <w:end w:val="nil"/>
+              <w:insideH w:val="nil"/>
+              <w:insideV w:val="nil"/>
+            </w:tcBorders>
+            <w:tcMar>
+              <w:top w:w="55" w:type="dxa"/>
+              <w:start w:w="70" w:type="dxa"/>
+              <w:bottom w:w="55" w:type="dxa"/>
+              <w:end w:w="70" w:type="dxa"/>
+            </w:tcMar>
+            <w:vAlign w:val="center"/>
+          </w:tcPr>
+          <w:p>
+            <w:pPr>
+              <w:keepNext/>
+              <w:spacing w:line="276" w:lineRule="auto" w:before="0" w:after="0"/>
+              <w:ind w:firstLine="0"/>
+              <w:jc w:val="center"/>
+            </w:pPr>
+            <w:r>
+              <w:rPr>
+                <w:rFonts w:ascii="Times New Roman" w:hAnsi="Times New Roman" w:eastAsia="宋体"/>
+                <w:b w:val="0"/>
+                <w:sz w:val="20"/>
+              </w:rPr>
+              <w:t xml:space="preserve">A </w:t>
+            </w:r>
+            <w:r>
+              <w:rPr>
+                <w:rFonts w:hint="eastAsia" w:ascii="Times New Roman" w:hAnsi="Times New Roman" w:eastAsia="宋体"/>
+                <w:b w:val="0"/>
+                <w:sz w:val="20"/>
+              </w:rPr>
+              <w:t xml:space="preserve">区</w:t>
+            </w:r>
+          </w:p>
+        </w:tc>
+      </w:tr>
+      <w:tr>
+        <w:trPr>
+          <w:cantSplit/>
+        </w:trPr>
+        <w:tc>
+          <w:tcPr>
+            <w:tcW w:w="627" w:type="dxa"/>
+            <w:tcBorders>
+              <w:top w:val="nil"/>
+              <w:start w:val="nil"/>
+              <w:bottom w:val="nil"/>
+              <w:end w:val="nil"/>
+              <w:insideH w:val="nil"/>
+              <w:insideV w:val="nil"/>
+            </w:tcBorders>
+            <w:tcMar>
+              <w:top w:w="55" w:type="dxa"/>
+              <w:start w:w="70" w:type="dxa"/>
+              <w:bottom w:w="55" w:type="dxa"/>
+              <w:end w:w="70" w:type="dxa"/>
+            </w:tcMar>
+            <w:vAlign w:val="center"/>
+          </w:tcPr>
+          <w:p>
+            <w:pPr>
+              <w:keepNext/>
+              <w:spacing w:line="276" w:lineRule="auto" w:before="0" w:after="0"/>
+              <w:ind w:firstLine="0"/>
+              <w:jc w:val="center"/>
+            </w:pPr>
+            <w:r>
+              <w:rPr>
+                <w:rFonts w:ascii="Times New Roman" w:hAnsi="Times New Roman" w:eastAsia="宋体"/>
+                <w:b w:val="0"/>
+                <w:sz w:val="20"/>
+              </w:rPr>
+              <w:t xml:space="preserve">7</w:t>
+            </w:r>
+          </w:p>
+        </w:tc>
+        <w:tc>
+          <w:tcPr>
+            <w:tcW w:w="1164" w:type="dxa"/>
+            <w:tcBorders>
+              <w:top w:val="nil"/>
+              <w:start w:val="nil"/>
+              <w:bottom w:val="nil"/>
+              <w:end w:val="nil"/>
+              <w:insideH w:val="nil"/>
+              <w:insideV w:val="nil"/>
+            </w:tcBorders>
+            <w:tcMar>
+              <w:top w:w="55" w:type="dxa"/>
+              <w:start w:w="70" w:type="dxa"/>
+              <w:bottom w:w="55" w:type="dxa"/>
+              <w:end w:w="70" w:type="dxa"/>
+            </w:tcMar>
+            <w:vAlign w:val="center"/>
+          </w:tcPr>
+          <w:p>
+            <w:pPr>
+              <w:keepNext/>
+              <w:spacing w:line="276" w:lineRule="auto" w:before="0" w:after="0"/>
+              <w:ind w:firstLine="0"/>
+              <w:jc w:val="center"/>
+            </w:pPr>
+            <w:r>
+              <w:rPr>
+                <w:rFonts w:hint="eastAsia" w:ascii="Times New Roman" w:hAnsi="Times New Roman" w:eastAsia="宋体"/>
+                <w:b w:val="0"/>
+                <w:sz w:val="20"/>
+              </w:rPr>
+              <w:t xml:space="preserve">门店</w:t>
+            </w:r>
+            <w:r>
+              <w:rPr>
+                <w:rFonts w:ascii="Times New Roman" w:hAnsi="Times New Roman" w:eastAsia="宋体"/>
+                <w:b w:val="0"/>
+                <w:sz w:val="20"/>
+              </w:rPr>
+              <w:t xml:space="preserve"> 4</w:t>
+            </w:r>
+          </w:p>
+        </w:tc>
+        <w:tc>
+          <w:tcPr>
+            <w:tcW w:w="1432" w:type="dxa"/>
+            <w:tcBorders>
+              <w:top w:val="nil"/>
+              <w:start w:val="nil"/>
+              <w:bottom w:val="nil"/>
+              <w:end w:val="nil"/>
+              <w:insideH w:val="nil"/>
+              <w:insideV w:val="nil"/>
+            </w:tcBorders>
+            <w:tcMar>
+              <w:top w:w="55" w:type="dxa"/>
+              <w:start w:w="70" w:type="dxa"/>
+              <w:bottom w:w="55" w:type="dxa"/>
+              <w:end w:w="70" w:type="dxa"/>
+            </w:tcMar>
+            <w:vAlign w:val="center"/>
+          </w:tcPr>
+          <w:p>
+            <w:pPr>
+              <w:keepNext/>
+              <w:spacing w:line="276" w:lineRule="auto" w:before="0" w:after="0"/>
+              <w:ind w:firstLine="0"/>
+              <w:jc w:val="center"/>
+            </w:pPr>
+            <m:oMath>
+              <m:r>
+                <m:rPr>
+                  <m:sty m:val="p"/>
+                </m:rPr>
+                <m:t>(</m:t>
+              </m:r>
+              <m:r>
+                <m:t>14</m:t>
+              </m:r>
+              <m:r>
+                <m:rPr>
+                  <m:sty m:val="p"/>
+                </m:rPr>
+                <m:t>,</m:t>
+              </m:r>
+              <m:r>
+                <m:t>2</m:t>
+              </m:r>
+              <m:r>
+                <m:rPr>
+                  <m:sty m:val="p"/>
+                </m:rPr>
+                <m:t>)</m:t>
+              </m:r>
+            </m:oMath>
+          </w:p>
+        </w:tc>
+        <w:tc>
+          <w:tcPr>
+            <w:tcW w:w="984" w:type="dxa"/>
+            <w:tcBorders>
+              <w:top w:val="nil"/>
+              <w:start w:val="nil"/>
+              <w:bottom w:val="nil"/>
+              <w:end w:val="nil"/>
+              <w:insideH w:val="nil"/>
+              <w:insideV w:val="nil"/>
+            </w:tcBorders>
+            <w:tcMar>
+              <w:top w:w="55" w:type="dxa"/>
+              <w:start w:w="70" w:type="dxa"/>
+              <w:bottom w:w="55" w:type="dxa"/>
+              <w:end w:w="70" w:type="dxa"/>
+            </w:tcMar>
+            <w:vAlign w:val="center"/>
+          </w:tcPr>
+          <w:p>
+            <w:pPr>
+              <w:keepNext/>
+              <w:spacing w:line="276" w:lineRule="auto" w:before="0" w:after="0"/>
+              <w:ind w:firstLine="0"/>
+              <w:jc w:val="center"/>
+            </w:pPr>
+            <w:r>
+              <w:rPr>
+                <w:rFonts w:ascii="Times New Roman" w:hAnsi="Times New Roman" w:eastAsia="宋体"/>
+                <w:b w:val="0"/>
+                <w:sz w:val="20"/>
+              </w:rPr>
+              <w:t xml:space="preserve">20</w:t>
+            </w:r>
+          </w:p>
+        </w:tc>
+        <w:tc>
+          <w:tcPr>
+            <w:tcW w:w="1700" w:type="dxa"/>
+            <w:tcBorders>
+              <w:top w:val="nil"/>
+              <w:start w:val="nil"/>
+              <w:bottom w:val="nil"/>
+              <w:end w:val="nil"/>
+              <w:insideH w:val="nil"/>
+              <w:insideV w:val="nil"/>
+            </w:tcBorders>
+            <w:tcMar>
+              <w:top w:w="55" w:type="dxa"/>
+              <w:start w:w="70" w:type="dxa"/>
+              <w:bottom w:w="55" w:type="dxa"/>
+              <w:end w:w="70" w:type="dxa"/>
+            </w:tcMar>
+            <w:vAlign w:val="center"/>
+          </w:tcPr>
+          <w:p>
+            <w:pPr>
+              <w:keepNext/>
+              <w:spacing w:line="276" w:lineRule="auto" w:before="0" w:after="0"/>
+              <w:ind w:firstLine="0"/>
+              <w:jc w:val="center"/>
+            </w:pPr>
+            <w:r>
+              <w:rPr>
+                <w:rFonts w:ascii="Times New Roman" w:hAnsi="Times New Roman" w:eastAsia="宋体"/>
+                <w:b w:val="0"/>
+                <w:sz w:val="20"/>
+              </w:rPr>
+              <w:t xml:space="preserve">04:45–05:45</w:t>
+            </w:r>
+          </w:p>
+        </w:tc>
+        <w:tc>
+          <w:tcPr>
+            <w:tcW w:w="3043" w:type="dxa"/>
+            <w:tcBorders>
+              <w:top w:val="nil"/>
+              <w:start w:val="nil"/>
+              <w:bottom w:val="nil"/>
+              <w:end w:val="nil"/>
+              <w:insideH w:val="nil"/>
+              <w:insideV w:val="nil"/>
+            </w:tcBorders>
+            <w:tcMar>
+              <w:top w:w="55" w:type="dxa"/>
+              <w:start w:w="70" w:type="dxa"/>
+              <w:bottom w:w="55" w:type="dxa"/>
+              <w:end w:w="70" w:type="dxa"/>
+            </w:tcMar>
+            <w:vAlign w:val="center"/>
+          </w:tcPr>
+          <w:p>
+            <w:pPr>
+              <w:keepNext/>
+              <w:spacing w:line="276" w:lineRule="auto" w:before="0" w:after="0"/>
+              <w:ind w:firstLine="0"/>
+              <w:jc w:val="center"/>
+            </w:pPr>
+            <w:r>
+              <w:rPr>
+                <w:rFonts w:ascii="Times New Roman" w:hAnsi="Times New Roman" w:eastAsia="宋体"/>
+                <w:b w:val="0"/>
+                <w:sz w:val="20"/>
+              </w:rPr>
+              <w:t xml:space="preserve">C </w:t>
+            </w:r>
+            <w:r>
+              <w:rPr>
+                <w:rFonts w:hint="eastAsia" w:ascii="Times New Roman" w:hAnsi="Times New Roman" w:eastAsia="宋体"/>
+                <w:b w:val="0"/>
+                <w:sz w:val="20"/>
+              </w:rPr>
+              <w:t xml:space="preserve">区</w:t>
+            </w:r>
+          </w:p>
+        </w:tc>
+      </w:tr>
+      <w:tr>
+        <w:trPr>
+          <w:cantSplit/>
+        </w:trPr>
+        <w:tc>
+          <w:tcPr>
+            <w:tcW w:w="627" w:type="dxa"/>
+            <w:tcBorders>
+              <w:top w:val="nil"/>
+              <w:start w:val="nil"/>
+              <w:bottom w:val="nil"/>
+              <w:end w:val="nil"/>
+              <w:insideH w:val="nil"/>
+              <w:insideV w:val="nil"/>
+            </w:tcBorders>
+            <w:tcMar>
+              <w:top w:w="55" w:type="dxa"/>
+              <w:start w:w="70" w:type="dxa"/>
+              <w:bottom w:w="55" w:type="dxa"/>
+              <w:end w:w="70" w:type="dxa"/>
+            </w:tcMar>
+            <w:vAlign w:val="center"/>
+          </w:tcPr>
+          <w:p>
+            <w:pPr>
+              <w:keepNext/>
+              <w:spacing w:line="276" w:lineRule="auto" w:before="0" w:after="0"/>
+              <w:ind w:firstLine="0"/>
+              <w:jc w:val="center"/>
+            </w:pPr>
+            <w:r>
+              <w:rPr>
+                <w:rFonts w:ascii="Times New Roman" w:hAnsi="Times New Roman" w:eastAsia="宋体"/>
+                <w:b w:val="0"/>
+                <w:sz w:val="20"/>
+              </w:rPr>
+              <w:t xml:space="preserve">8</w:t>
+            </w:r>
+          </w:p>
+        </w:tc>
+        <w:tc>
+          <w:tcPr>
+            <w:tcW w:w="1164" w:type="dxa"/>
+            <w:tcBorders>
+              <w:top w:val="nil"/>
+              <w:start w:val="nil"/>
+              <w:bottom w:val="nil"/>
+              <w:end w:val="nil"/>
+              <w:insideH w:val="nil"/>
+              <w:insideV w:val="nil"/>
+            </w:tcBorders>
+            <w:tcMar>
+              <w:top w:w="55" w:type="dxa"/>
+              <w:start w:w="70" w:type="dxa"/>
+              <w:bottom w:w="55" w:type="dxa"/>
+              <w:end w:w="70" w:type="dxa"/>
+            </w:tcMar>
+            <w:vAlign w:val="center"/>
+          </w:tcPr>
+          <w:p>
+            <w:pPr>
+              <w:keepNext/>
+              <w:spacing w:line="276" w:lineRule="auto" w:before="0" w:after="0"/>
+              <w:ind w:firstLine="0"/>
+              <w:jc w:val="center"/>
+            </w:pPr>
+            <w:r>
+              <w:rPr>
+                <w:rFonts w:hint="eastAsia" w:ascii="Times New Roman" w:hAnsi="Times New Roman" w:eastAsia="宋体"/>
+                <w:b w:val="0"/>
+                <w:sz w:val="20"/>
+              </w:rPr>
+              <w:t xml:space="preserve">门店</w:t>
+            </w:r>
+            <w:r>
+              <w:rPr>
+                <w:rFonts w:ascii="Times New Roman" w:hAnsi="Times New Roman" w:eastAsia="宋体"/>
+                <w:b w:val="0"/>
+                <w:sz w:val="20"/>
+              </w:rPr>
+              <w:t xml:space="preserve"> 5</w:t>
+            </w:r>
+          </w:p>
+        </w:tc>
+        <w:tc>
+          <w:tcPr>
+            <w:tcW w:w="1432" w:type="dxa"/>
+            <w:tcBorders>
+              <w:top w:val="nil"/>
+              <w:start w:val="nil"/>
+              <w:bottom w:val="nil"/>
+              <w:end w:val="nil"/>
+              <w:insideH w:val="nil"/>
+              <w:insideV w:val="nil"/>
+            </w:tcBorders>
+            <w:tcMar>
+              <w:top w:w="55" w:type="dxa"/>
+              <w:start w:w="70" w:type="dxa"/>
+              <w:bottom w:w="55" w:type="dxa"/>
+              <w:end w:w="70" w:type="dxa"/>
+            </w:tcMar>
+            <w:vAlign w:val="center"/>
+          </w:tcPr>
+          <w:p>
+            <w:pPr>
+              <w:keepNext/>
+              <w:spacing w:line="276" w:lineRule="auto" w:before="0" w:after="0"/>
+              <w:ind w:firstLine="0"/>
+              <w:jc w:val="center"/>
+            </w:pPr>
+            <m:oMath>
+              <m:r>
+                <m:rPr>
+                  <m:sty m:val="p"/>
+                </m:rPr>
+                <m:t>(</m:t>
+              </m:r>
+              <m:r>
+                <m:rPr>
+                  <m:sty m:val="p"/>
+                </m:rPr>
+                <m:t>−</m:t>
+              </m:r>
+              <m:r>
+                <m:t>6</m:t>
+              </m:r>
+              <m:r>
+                <m:rPr>
+                  <m:sty m:val="p"/>
+                </m:rPr>
+                <m:t>,</m:t>
+              </m:r>
+              <m:r>
+                <m:t>8</m:t>
+              </m:r>
+              <m:r>
+                <m:rPr>
+                  <m:sty m:val="p"/>
+                </m:rPr>
+                <m:t>)</m:t>
+              </m:r>
+            </m:oMath>
+          </w:p>
+        </w:tc>
+        <w:tc>
+          <w:tcPr>
+            <w:tcW w:w="984" w:type="dxa"/>
+            <w:tcBorders>
+              <w:top w:val="nil"/>
+              <w:start w:val="nil"/>
+              <w:bottom w:val="nil"/>
+              <w:end w:val="nil"/>
+              <w:insideH w:val="nil"/>
+              <w:insideV w:val="nil"/>
+            </w:tcBorders>
+            <w:tcMar>
+              <w:top w:w="55" w:type="dxa"/>
+              <w:start w:w="70" w:type="dxa"/>
+              <w:bottom w:w="55" w:type="dxa"/>
+              <w:end w:w="70" w:type="dxa"/>
+            </w:tcMar>
+            <w:vAlign w:val="center"/>
+          </w:tcPr>
+          <w:p>
+            <w:pPr>
+              <w:keepNext/>
+              <w:spacing w:line="276" w:lineRule="auto" w:before="0" w:after="0"/>
+              <w:ind w:firstLine="0"/>
+              <w:jc w:val="center"/>
+            </w:pPr>
+            <w:r>
+              <w:rPr>
+                <w:rFonts w:ascii="Times New Roman" w:hAnsi="Times New Roman" w:eastAsia="宋体"/>
+                <w:b w:val="0"/>
+                <w:sz w:val="20"/>
+              </w:rPr>
+              <w:t xml:space="preserve">14</w:t>
+            </w:r>
+          </w:p>
+        </w:tc>
+        <w:tc>
+          <w:tcPr>
+            <w:tcW w:w="1700" w:type="dxa"/>
+            <w:tcBorders>
+              <w:top w:val="nil"/>
+              <w:start w:val="nil"/>
+              <w:bottom w:val="nil"/>
+              <w:end w:val="nil"/>
+              <w:insideH w:val="nil"/>
+              <w:insideV w:val="nil"/>
+            </w:tcBorders>
+            <w:tcMar>
+              <w:top w:w="55" w:type="dxa"/>
+              <w:start w:w="70" w:type="dxa"/>
+              <w:bottom w:w="55" w:type="dxa"/>
+              <w:end w:w="70" w:type="dxa"/>
+            </w:tcMar>
+            <w:vAlign w:val="center"/>
+          </w:tcPr>
+          <w:p>
+            <w:pPr>
+              <w:keepNext/>
+              <w:spacing w:line="276" w:lineRule="auto" w:before="0" w:after="0"/>
+              <w:ind w:firstLine="0"/>
+              <w:jc w:val="center"/>
+            </w:pPr>
+            <w:r>
+              <w:rPr>
+                <w:rFonts w:ascii="Times New Roman" w:hAnsi="Times New Roman" w:eastAsia="宋体"/>
+                <w:b w:val="0"/>
+                <w:sz w:val="20"/>
+              </w:rPr>
+              <w:t xml:space="preserve">04:45–05:45</w:t>
+            </w:r>
+          </w:p>
+        </w:tc>
+        <w:tc>
+          <w:tcPr>
+            <w:tcW w:w="3043" w:type="dxa"/>
+            <w:tcBorders>
+              <w:top w:val="nil"/>
+              <w:start w:val="nil"/>
+              <w:bottom w:val="nil"/>
+              <w:end w:val="nil"/>
+              <w:insideH w:val="nil"/>
+              <w:insideV w:val="nil"/>
+            </w:tcBorders>
+            <w:tcMar>
+              <w:top w:w="55" w:type="dxa"/>
+              <w:start w:w="70" w:type="dxa"/>
+              <w:bottom w:w="55" w:type="dxa"/>
+              <w:end w:w="70" w:type="dxa"/>
+            </w:tcMar>
+            <w:vAlign w:val="center"/>
+          </w:tcPr>
+          <w:p>
+            <w:pPr>
+              <w:keepNext/>
+              <w:spacing w:line="276" w:lineRule="auto" w:before="0" w:after="0"/>
+              <w:ind w:firstLine="0"/>
+              <w:jc w:val="center"/>
+            </w:pPr>
+            <w:r>
+              <w:rPr>
+                <w:rFonts w:ascii="Times New Roman" w:hAnsi="Times New Roman" w:eastAsia="宋体"/>
+                <w:b w:val="0"/>
+                <w:sz w:val="20"/>
+              </w:rPr>
+              <w:t xml:space="preserve">B </w:t>
+            </w:r>
+            <w:r>
+              <w:rPr>
+                <w:rFonts w:hint="eastAsia" w:ascii="Times New Roman" w:hAnsi="Times New Roman" w:eastAsia="宋体"/>
+                <w:b w:val="0"/>
+                <w:sz w:val="20"/>
+              </w:rPr>
+              <w:t xml:space="preserve">区</w:t>
+            </w:r>
+          </w:p>
+        </w:tc>
+      </w:tr>
+      <w:tr>
+        <w:trPr>
+          <w:cantSplit/>
+        </w:trPr>
+        <w:tc>
+          <w:tcPr>
+            <w:tcW w:w="627" w:type="dxa"/>
+            <w:tcBorders>
+              <w:top w:val="nil"/>
+              <w:start w:val="nil"/>
+              <w:bottom w:val="single" w:sz="10" w:color="000000"/>
+              <w:end w:val="nil"/>
+              <w:insideH w:val="nil"/>
+              <w:insideV w:val="nil"/>
+            </w:tcBorders>
+            <w:tcMar>
+              <w:top w:w="55" w:type="dxa"/>
+              <w:start w:w="70" w:type="dxa"/>
+              <w:bottom w:w="55" w:type="dxa"/>
+              <w:end w:w="70" w:type="dxa"/>
+            </w:tcMar>
+            <w:vAlign w:val="center"/>
+          </w:tcPr>
+          <w:p>
+            <w:pPr>
+              <w:keepNext w:val="0"/>
+              <w:spacing w:line="276" w:lineRule="auto" w:before="0" w:after="0"/>
+              <w:ind w:firstLine="0"/>
+              <w:jc w:val="center"/>
+            </w:pPr>
+            <w:r>
+              <w:rPr>
+                <w:rFonts w:ascii="Times New Roman" w:hAnsi="Times New Roman" w:eastAsia="宋体"/>
+                <w:b w:val="0"/>
+                <w:sz w:val="20"/>
+              </w:rPr>
+              <w:t xml:space="preserve">9</w:t>
+            </w:r>
+          </w:p>
+        </w:tc>
+        <w:tc>
+          <w:tcPr>
+            <w:tcW w:w="1164" w:type="dxa"/>
+            <w:tcBorders>
+              <w:top w:val="nil"/>
+              <w:start w:val="nil"/>
+              <w:bottom w:val="single" w:sz="10" w:color="000000"/>
+              <w:end w:val="nil"/>
+              <w:insideH w:val="nil"/>
+              <w:insideV w:val="nil"/>
+            </w:tcBorders>
+            <w:tcMar>
+              <w:top w:w="55" w:type="dxa"/>
+              <w:start w:w="70" w:type="dxa"/>
+              <w:bottom w:w="55" w:type="dxa"/>
+              <w:end w:w="70" w:type="dxa"/>
+            </w:tcMar>
+            <w:vAlign w:val="center"/>
+          </w:tcPr>
+          <w:p>
+            <w:pPr>
+              <w:keepNext w:val="0"/>
+              <w:spacing w:line="276" w:lineRule="auto" w:before="0" w:after="0"/>
+              <w:ind w:firstLine="0"/>
+              <w:jc w:val="center"/>
+            </w:pPr>
+            <w:r>
+              <w:rPr>
+                <w:rFonts w:hint="eastAsia" w:ascii="Times New Roman" w:hAnsi="Times New Roman" w:eastAsia="宋体"/>
+                <w:b w:val="0"/>
+                <w:sz w:val="20"/>
+              </w:rPr>
+              <w:t xml:space="preserve">门店</w:t>
+            </w:r>
+            <w:r>
+              <w:rPr>
+                <w:rFonts w:ascii="Times New Roman" w:hAnsi="Times New Roman" w:eastAsia="宋体"/>
+                <w:b w:val="0"/>
+                <w:sz w:val="20"/>
+              </w:rPr>
+              <w:t xml:space="preserve"> 6</w:t>
+            </w:r>
+          </w:p>
+        </w:tc>
+        <w:tc>
+          <w:tcPr>
+            <w:tcW w:w="1432" w:type="dxa"/>
+            <w:tcBorders>
+              <w:top w:val="nil"/>
+              <w:start w:val="nil"/>
+              <w:bottom w:val="single" w:sz="10" w:color="000000"/>
+              <w:end w:val="nil"/>
+              <w:insideH w:val="nil"/>
+              <w:insideV w:val="nil"/>
+            </w:tcBorders>
+            <w:tcMar>
+              <w:top w:w="55" w:type="dxa"/>
+              <w:start w:w="70" w:type="dxa"/>
+              <w:bottom w:w="55" w:type="dxa"/>
+              <w:end w:w="70" w:type="dxa"/>
+            </w:tcMar>
+            <w:vAlign w:val="center"/>
+          </w:tcPr>
+          <w:p>
+            <w:pPr>
+              <w:keepNext w:val="0"/>
+              <w:spacing w:line="276" w:lineRule="auto" w:before="0" w:after="0"/>
+              <w:ind w:firstLine="0"/>
+              <w:jc w:val="center"/>
+            </w:pPr>
+            <m:oMath>
+              <m:r>
+                <m:rPr>
+                  <m:sty m:val="p"/>
+                </m:rPr>
+                <m:t>(</m:t>
+              </m:r>
+              <m:r>
+                <m:t>8</m:t>
+              </m:r>
+              <m:r>
+                <m:rPr>
+                  <m:sty m:val="p"/>
+                </m:rPr>
+                <m:t>,</m:t>
+              </m:r>
+              <m:r>
+                <m:rPr>
+                  <m:sty m:val="p"/>
+                </m:rPr>
+                <m:t>−</m:t>
+              </m:r>
+              <m:r>
+                <m:t>2</m:t>
+              </m:r>
+              <m:r>
+                <m:rPr>
+                  <m:sty m:val="p"/>
+                </m:rPr>
+                <m:t>)</m:t>
+              </m:r>
+            </m:oMath>
+          </w:p>
+        </w:tc>
+        <w:tc>
+          <w:tcPr>
+            <w:tcW w:w="984" w:type="dxa"/>
+            <w:tcBorders>
+              <w:top w:val="nil"/>
+              <w:start w:val="nil"/>
+              <w:bottom w:val="single" w:sz="10" w:color="000000"/>
+              <w:end w:val="nil"/>
+              <w:insideH w:val="nil"/>
+              <w:insideV w:val="nil"/>
+            </w:tcBorders>
+            <w:tcMar>
+              <w:top w:w="55" w:type="dxa"/>
+              <w:start w:w="70" w:type="dxa"/>
+              <w:bottom w:w="55" w:type="dxa"/>
+              <w:end w:w="70" w:type="dxa"/>
+            </w:tcMar>
+            <w:vAlign w:val="center"/>
+          </w:tcPr>
+          <w:p>
+            <w:pPr>
+              <w:keepNext w:val="0"/>
+              <w:spacing w:line="276" w:lineRule="auto" w:before="0" w:after="0"/>
+              <w:ind w:firstLine="0"/>
+              <w:jc w:val="center"/>
+            </w:pPr>
+            <w:r>
+              <w:rPr>
+                <w:rFonts w:ascii="Times New Roman" w:hAnsi="Times New Roman" w:eastAsia="宋体"/>
+                <w:b w:val="0"/>
+                <w:sz w:val="20"/>
+              </w:rPr>
+              <w:t xml:space="preserve">16</w:t>
+            </w:r>
+          </w:p>
+        </w:tc>
+        <w:tc>
+          <w:tcPr>
+            <w:tcW w:w="1700" w:type="dxa"/>
+            <w:tcBorders>
+              <w:top w:val="nil"/>
+              <w:start w:val="nil"/>
+              <w:bottom w:val="single" w:sz="10" w:color="000000"/>
+              <w:end w:val="nil"/>
+              <w:insideH w:val="nil"/>
+              <w:insideV w:val="nil"/>
+            </w:tcBorders>
+            <w:tcMar>
+              <w:top w:w="55" w:type="dxa"/>
+              <w:start w:w="70" w:type="dxa"/>
+              <w:bottom w:w="55" w:type="dxa"/>
+              <w:end w:w="70" w:type="dxa"/>
+            </w:tcMar>
+            <w:vAlign w:val="center"/>
+          </w:tcPr>
+          <w:p>
+            <w:pPr>
+              <w:keepNext w:val="0"/>
+              <w:spacing w:line="276" w:lineRule="auto" w:before="0" w:after="0"/>
+              <w:ind w:firstLine="0"/>
+              <w:jc w:val="center"/>
+            </w:pPr>
+            <w:r>
+              <w:rPr>
+                <w:rFonts w:ascii="Times New Roman" w:hAnsi="Times New Roman" w:eastAsia="宋体"/>
+                <w:b w:val="0"/>
+                <w:sz w:val="20"/>
+              </w:rPr>
+              <w:t xml:space="preserve">04:30–05:30</w:t>
+            </w:r>
+          </w:p>
+        </w:tc>
+        <w:tc>
+          <w:tcPr>
+            <w:tcW w:w="3043" w:type="dxa"/>
+            <w:tcBorders>
+              <w:top w:val="nil"/>
+              <w:start w:val="nil"/>
+              <w:bottom w:val="single" w:sz="10" w:color="000000"/>
+              <w:end w:val="nil"/>
+              <w:insideH w:val="nil"/>
+              <w:insideV w:val="nil"/>
+            </w:tcBorders>
+            <w:tcMar>
+              <w:top w:w="55" w:type="dxa"/>
+              <w:start w:w="70" w:type="dxa"/>
+              <w:bottom w:w="55" w:type="dxa"/>
+              <w:end w:w="70" w:type="dxa"/>
+            </w:tcMar>
+            <w:vAlign w:val="center"/>
+          </w:tcPr>
+          <w:p>
+            <w:pPr>
+              <w:keepNext w:val="0"/>
+              <w:spacing w:line="276" w:lineRule="auto" w:before="0" w:after="0"/>
+              <w:ind w:firstLine="0"/>
+              <w:jc w:val="center"/>
+            </w:pPr>
+            <w:r>
+              <w:rPr>
+                <w:rFonts w:ascii="Times New Roman" w:hAnsi="Times New Roman" w:eastAsia="宋体"/>
+                <w:b w:val="0"/>
+                <w:sz w:val="20"/>
+              </w:rPr>
+              <w:t xml:space="preserve">C </w:t>
+            </w:r>
+            <w:r>
+              <w:rPr>
+                <w:rFonts w:hint="eastAsia" w:ascii="Times New Roman" w:hAnsi="Times New Roman" w:eastAsia="宋体"/>
+                <w:b w:val="0"/>
+                <w:sz w:val="20"/>
+              </w:rPr>
+              <w:t xml:space="preserve">区</w:t>
+            </w:r>
+          </w:p>
+        </w:tc>
+      </w:tr>
+    </w:tbl>
     <w:bookmarkEnd w:id="33"/>
-    <w:bookmarkStart w:id="34" w:name="三模型假设"/>
+    <w:bookmarkEnd w:id="34"/>
+    <w:bookmarkStart w:id="35" w:name="三模型假设"/>
     <w:p>
       <w:pPr>
         <w:pStyle w:val="Heading2"/>
@@ -1386,8 +4369,23 @@
         <w:t xml:space="preserve">，并按发车前已知封路处理。</w:t>
       </w:r>
     </w:p>
-    <w:bookmarkEnd w:id="34"/>
-    <w:bookmarkStart w:id="35" w:name="四符号说明"/>
+    <w:p>
+      <w:pPr>
+        <w:pStyle w:val="FirstParagraph"/>
+        <w:spacing w:line="360" w:lineRule="auto" w:before="0" w:after="0"/>
+        <w:ind w:firstLine="480"/>
+        <w:jc w:val="both"/>
+      </w:pPr>
+      <w:r>
+        <w:rPr>
+          <w:rFonts w:hint="eastAsia" w:ascii="Times New Roman" w:hAnsi="Times New Roman" w:eastAsia="宋体"/>
+          <w:sz w:val="24"/>
+        </w:rPr>
+        <w:t xml:space="preserve">这些假设影响不同层面的结论：固定分区和站点必经限定了可行域，因此“全局最优”只对该合同成立；欧氏距离与恒速决定路线和时刻的数值，真实道路矩阵可能改变排序；零服务时长只影响后续门店到达时刻，故需用阈值分析界定其适用范围；恒温假设只能证明题给温度门槛可行，不能推出制冷能耗；发车前已知封路则把任务三限定为静态重优化，不能代表在途车辆的动态改道。</w:t>
+      </w:r>
+    </w:p>
+    <w:bookmarkEnd w:id="35"/>
+    <w:bookmarkStart w:id="36" w:name="四符号说明"/>
     <w:p>
       <w:pPr>
         <w:pStyle w:val="Heading2"/>
@@ -1423,7 +4421,7 @@
           <w:rFonts w:ascii="Times New Roman" w:hAnsi="Times New Roman" w:eastAsia="宋体"/>
           <w:sz w:val="24"/>
         </w:rPr>
-        <w:t xml:space="preserve"> 1。</w:t>
+        <w:t xml:space="preserve"> 2。</w:t>
       </w:r>
     </w:p>
     <w:p>
@@ -1446,7 +4444,7 @@
           <w:rFonts w:ascii="Times New Roman" w:hAnsi="Times New Roman" w:eastAsia="宋体"/>
           <w:sz w:val="21"/>
         </w:rPr>
-        <w:t xml:space="preserve"> 1 </w:t>
+        <w:t xml:space="preserve"> 2 </w:t>
       </w:r>
       <w:r>
         <w:rPr>
@@ -1495,7 +4493,7 @@
           </w:tcPr>
           <w:p>
             <w:pPr>
-              <w:keepNext/>
+              <w:keepNext w:val="0"/>
               <w:spacing w:line="276" w:lineRule="auto" w:before="0" w:after="0"/>
               <w:ind w:firstLine="0"/>
               <w:jc w:val="center"/>
@@ -1531,7 +4529,7 @@
           </w:tcPr>
           <w:p>
             <w:pPr>
-              <w:keepNext/>
+              <w:keepNext w:val="0"/>
               <w:spacing w:line="276" w:lineRule="auto" w:before="0" w:after="0"/>
               <w:ind w:firstLine="0"/>
               <w:jc w:val="center"/>
@@ -1567,7 +4565,7 @@
           </w:tcPr>
           <w:p>
             <w:pPr>
-              <w:keepNext/>
+              <w:keepNext w:val="0"/>
               <w:spacing w:line="276" w:lineRule="auto" w:before="0" w:after="0"/>
               <w:ind w:firstLine="0"/>
               <w:jc w:val="center"/>
@@ -1608,7 +4606,7 @@
           </w:tcPr>
           <w:p>
             <w:pPr>
-              <w:keepNext/>
+              <w:keepNext w:val="0"/>
               <w:spacing w:line="276" w:lineRule="auto" w:before="0" w:after="0"/>
               <w:ind w:firstLine="0"/>
               <w:jc w:val="center"/>
@@ -1641,7 +4639,7 @@
           </w:tcPr>
           <w:p>
             <w:pPr>
-              <w:keepNext/>
+              <w:keepNext w:val="0"/>
               <w:spacing w:line="276" w:lineRule="auto" w:before="0" w:after="0"/>
               <w:ind w:firstLine="0"/>
               <w:jc w:val="center"/>
@@ -1721,7 +4719,7 @@
           </w:tcPr>
           <w:p>
             <w:pPr>
-              <w:keepNext/>
+              <w:keepNext w:val="0"/>
               <w:spacing w:line="276" w:lineRule="auto" w:before="0" w:after="0"/>
               <w:ind w:firstLine="0"/>
               <w:jc w:val="center"/>
@@ -1762,7 +4760,7 @@
           </w:tcPr>
           <w:p>
             <w:pPr>
-              <w:keepNext/>
+              <w:keepNext w:val="0"/>
               <w:spacing w:line="276" w:lineRule="auto" w:before="0" w:after="0"/>
               <w:ind w:firstLine="0"/>
               <w:jc w:val="center"/>
@@ -1804,7 +4802,7 @@
           </w:tcPr>
           <w:p>
             <w:pPr>
-              <w:keepNext/>
+              <w:keepNext w:val="0"/>
               <w:spacing w:line="276" w:lineRule="auto" w:before="0" w:after="0"/>
               <w:ind w:firstLine="0"/>
               <w:jc w:val="center"/>
@@ -1869,7 +4867,7 @@
           </w:tcPr>
           <w:p>
             <w:pPr>
-              <w:keepNext/>
+              <w:keepNext w:val="0"/>
               <w:spacing w:line="276" w:lineRule="auto" w:before="0" w:after="0"/>
               <w:ind w:firstLine="0"/>
               <w:jc w:val="center"/>
@@ -1910,7 +4908,7 @@
           </w:tcPr>
           <w:p>
             <w:pPr>
-              <w:keepNext/>
+              <w:keepNext w:val="0"/>
               <w:spacing w:line="276" w:lineRule="auto" w:before="0" w:after="0"/>
               <w:ind w:firstLine="0"/>
               <w:jc w:val="center"/>
@@ -1952,7 +4950,7 @@
           </w:tcPr>
           <w:p>
             <w:pPr>
-              <w:keepNext/>
+              <w:keepNext w:val="0"/>
               <w:spacing w:line="276" w:lineRule="auto" w:before="0" w:after="0"/>
               <w:ind w:firstLine="0"/>
               <w:jc w:val="center"/>
@@ -2017,7 +5015,7 @@
           </w:tcPr>
           <w:p>
             <w:pPr>
-              <w:keepNext/>
+              <w:keepNext w:val="0"/>
               <w:spacing w:line="276" w:lineRule="auto" w:before="0" w:after="0"/>
               <w:ind w:firstLine="0"/>
               <w:jc w:val="center"/>
@@ -2058,7 +5056,7 @@
           </w:tcPr>
           <w:p>
             <w:pPr>
-              <w:keepNext/>
+              <w:keepNext w:val="0"/>
               <w:spacing w:line="276" w:lineRule="auto" w:before="0" w:after="0"/>
               <w:ind w:firstLine="0"/>
               <w:jc w:val="center"/>
@@ -2100,7 +5098,7 @@
           </w:tcPr>
           <w:p>
             <w:pPr>
-              <w:keepNext/>
+              <w:keepNext w:val="0"/>
               <w:spacing w:line="276" w:lineRule="auto" w:before="0" w:after="0"/>
               <w:ind w:firstLine="0"/>
               <w:jc w:val="center"/>
@@ -2165,7 +5163,7 @@
           </w:tcPr>
           <w:p>
             <w:pPr>
-              <w:keepNext/>
+              <w:keepNext w:val="0"/>
               <w:spacing w:line="276" w:lineRule="auto" w:before="0" w:after="0"/>
               <w:ind w:firstLine="0"/>
               <w:jc w:val="center"/>
@@ -2206,7 +5204,7 @@
           </w:tcPr>
           <w:p>
             <w:pPr>
-              <w:keepNext/>
+              <w:keepNext w:val="0"/>
               <w:spacing w:line="276" w:lineRule="auto" w:before="0" w:after="0"/>
               <w:ind w:firstLine="0"/>
               <w:jc w:val="center"/>
@@ -2254,7 +5252,7 @@
           </w:tcPr>
           <w:p>
             <w:pPr>
-              <w:keepNext/>
+              <w:keepNext w:val="0"/>
               <w:spacing w:line="276" w:lineRule="auto" w:before="0" w:after="0"/>
               <w:ind w:firstLine="0"/>
               <w:jc w:val="center"/>
@@ -2348,7 +5346,7 @@
           </w:tcPr>
           <w:p>
             <w:pPr>
-              <w:keepNext/>
+              <w:keepNext w:val="0"/>
               <w:spacing w:line="276" w:lineRule="auto" w:before="0" w:after="0"/>
               <w:ind w:firstLine="0"/>
               <w:jc w:val="center"/>
@@ -2389,7 +5387,7 @@
           </w:tcPr>
           <w:p>
             <w:pPr>
-              <w:keepNext/>
+              <w:keepNext w:val="0"/>
               <w:spacing w:line="276" w:lineRule="auto" w:before="0" w:after="0"/>
               <w:ind w:firstLine="0"/>
               <w:jc w:val="center"/>
@@ -2434,7 +5432,7 @@
           </w:tcPr>
           <w:p>
             <w:pPr>
-              <w:keepNext/>
+              <w:keepNext w:val="0"/>
               <w:spacing w:line="276" w:lineRule="auto" w:before="0" w:after="0"/>
               <w:ind w:firstLine="0"/>
               <w:jc w:val="center"/>
@@ -2512,7 +5510,7 @@
           </w:tcPr>
           <w:p>
             <w:pPr>
-              <w:keepNext/>
+              <w:keepNext w:val="0"/>
               <w:spacing w:line="276" w:lineRule="auto" w:before="0" w:after="0"/>
               <w:ind w:firstLine="0"/>
               <w:jc w:val="center"/>
@@ -2553,7 +5551,7 @@
           </w:tcPr>
           <w:p>
             <w:pPr>
-              <w:keepNext/>
+              <w:keepNext w:val="0"/>
               <w:spacing w:line="276" w:lineRule="auto" w:before="0" w:after="0"/>
               <w:ind w:firstLine="0"/>
               <w:jc w:val="center"/>
@@ -2595,7 +5593,7 @@
           </w:tcPr>
           <w:p>
             <w:pPr>
-              <w:keepNext/>
+              <w:keepNext w:val="0"/>
               <w:spacing w:line="276" w:lineRule="auto" w:before="0" w:after="0"/>
               <w:ind w:firstLine="0"/>
               <w:jc w:val="center"/>
@@ -2660,7 +5658,7 @@
           </w:tcPr>
           <w:p>
             <w:pPr>
-              <w:keepNext/>
+              <w:keepNext w:val="0"/>
               <w:spacing w:line="276" w:lineRule="auto" w:before="0" w:after="0"/>
               <w:ind w:firstLine="0"/>
               <w:jc w:val="center"/>
@@ -2701,7 +5699,7 @@
           </w:tcPr>
           <w:p>
             <w:pPr>
-              <w:keepNext/>
+              <w:keepNext w:val="0"/>
               <w:spacing w:line="276" w:lineRule="auto" w:before="0" w:after="0"/>
               <w:ind w:firstLine="0"/>
               <w:jc w:val="center"/>
@@ -2746,7 +5744,7 @@
           </w:tcPr>
           <w:p>
             <w:pPr>
-              <w:keepNext/>
+              <w:keepNext w:val="0"/>
               <w:spacing w:line="276" w:lineRule="auto" w:before="0" w:after="0"/>
               <w:ind w:firstLine="0"/>
               <w:jc w:val="center"/>
@@ -2840,7 +5838,7 @@
           </w:tcPr>
           <w:p>
             <w:pPr>
-              <w:keepNext/>
+              <w:keepNext w:val="0"/>
               <w:spacing w:line="276" w:lineRule="auto" w:before="0" w:after="0"/>
               <w:ind w:firstLine="0"/>
               <w:jc w:val="center"/>
@@ -2881,7 +5879,7 @@
           </w:tcPr>
           <w:p>
             <w:pPr>
-              <w:keepNext/>
+              <w:keepNext w:val="0"/>
               <w:spacing w:line="276" w:lineRule="auto" w:before="0" w:after="0"/>
               <w:ind w:firstLine="0"/>
               <w:jc w:val="center"/>
@@ -2926,7 +5924,7 @@
           </w:tcPr>
           <w:p>
             <w:pPr>
-              <w:keepNext/>
+              <w:keepNext w:val="0"/>
               <w:spacing w:line="276" w:lineRule="auto" w:before="0" w:after="0"/>
               <w:ind w:firstLine="0"/>
               <w:jc w:val="center"/>
@@ -3020,7 +6018,7 @@
           </w:tcPr>
           <w:p>
             <w:pPr>
-              <w:keepNext/>
+              <w:keepNext w:val="0"/>
               <w:spacing w:line="276" w:lineRule="auto" w:before="0" w:after="0"/>
               <w:ind w:firstLine="0"/>
               <w:jc w:val="center"/>
@@ -3061,7 +6059,7 @@
           </w:tcPr>
           <w:p>
             <w:pPr>
-              <w:keepNext/>
+              <w:keepNext w:val="0"/>
               <w:spacing w:line="276" w:lineRule="auto" w:before="0" w:after="0"/>
               <w:ind w:firstLine="0"/>
               <w:jc w:val="center"/>
@@ -3133,7 +6131,7 @@
           </w:tcPr>
           <w:p>
             <w:pPr>
-              <w:keepNext/>
+              <w:keepNext w:val="0"/>
               <w:spacing w:line="276" w:lineRule="auto" w:before="0" w:after="0"/>
               <w:ind w:firstLine="0"/>
               <w:jc w:val="center"/>
@@ -3198,7 +6196,7 @@
           </w:tcPr>
           <w:p>
             <w:pPr>
-              <w:keepNext/>
+              <w:keepNext w:val="0"/>
               <w:spacing w:line="276" w:lineRule="auto" w:before="0" w:after="0"/>
               <w:ind w:firstLine="0"/>
               <w:jc w:val="center"/>
@@ -3239,7 +6237,7 @@
           </w:tcPr>
           <w:p>
             <w:pPr>
-              <w:keepNext/>
+              <w:keepNext w:val="0"/>
               <w:spacing w:line="276" w:lineRule="auto" w:before="0" w:after="0"/>
               <w:ind w:firstLine="0"/>
               <w:jc w:val="center"/>
@@ -3325,7 +6323,7 @@
           </w:tcPr>
           <w:p>
             <w:pPr>
-              <w:keepNext/>
+              <w:keepNext w:val="0"/>
               <w:spacing w:line="276" w:lineRule="auto" w:before="0" w:after="0"/>
               <w:ind w:firstLine="0"/>
               <w:jc w:val="center"/>
@@ -3361,7 +6359,7 @@
           </w:tcPr>
           <w:p>
             <w:pPr>
-              <w:keepNext/>
+              <w:keepNext w:val="0"/>
               <w:spacing w:line="276" w:lineRule="auto" w:before="0" w:after="0"/>
               <w:ind w:firstLine="0"/>
               <w:jc w:val="center"/>
@@ -3402,7 +6400,7 @@
           </w:tcPr>
           <w:p>
             <w:pPr>
-              <w:keepNext/>
+              <w:keepNext w:val="0"/>
               <w:spacing w:line="276" w:lineRule="auto" w:before="0" w:after="0"/>
               <w:ind w:firstLine="0"/>
               <w:jc w:val="center"/>
@@ -3488,7 +6486,7 @@
           </w:tcPr>
           <w:p>
             <w:pPr>
-              <w:keepNext/>
+              <w:keepNext w:val="0"/>
               <w:spacing w:line="276" w:lineRule="auto" w:before="0" w:after="0"/>
               <w:ind w:firstLine="0"/>
               <w:jc w:val="center"/>
@@ -3524,7 +6522,7 @@
           </w:tcPr>
           <w:p>
             <w:pPr>
-              <w:keepNext/>
+              <w:keepNext w:val="0"/>
               <w:spacing w:line="276" w:lineRule="auto" w:before="0" w:after="0"/>
               <w:ind w:firstLine="0"/>
               <w:jc w:val="center"/>
@@ -3565,7 +6563,7 @@
           </w:tcPr>
           <w:p>
             <w:pPr>
-              <w:keepNext/>
+              <w:keepNext w:val="0"/>
               <w:spacing w:line="276" w:lineRule="auto" w:before="0" w:after="0"/>
               <w:ind w:firstLine="0"/>
               <w:jc w:val="center"/>
@@ -3631,7 +6629,7 @@
           </w:tcPr>
           <w:p>
             <w:pPr>
-              <w:keepNext/>
+              <w:keepNext w:val="0"/>
               <w:spacing w:line="276" w:lineRule="auto" w:before="0" w:after="0"/>
               <w:ind w:firstLine="0"/>
               <w:jc w:val="center"/>
@@ -3667,7 +6665,7 @@
           </w:tcPr>
           <w:p>
             <w:pPr>
-              <w:keepNext/>
+              <w:keepNext w:val="0"/>
               <w:spacing w:line="276" w:lineRule="auto" w:before="0" w:after="0"/>
               <w:ind w:firstLine="0"/>
               <w:jc w:val="center"/>
@@ -3708,7 +6706,7 @@
           </w:tcPr>
           <w:p>
             <w:pPr>
-              <w:keepNext/>
+              <w:keepNext w:val="0"/>
               <w:spacing w:line="276" w:lineRule="auto" w:before="0" w:after="0"/>
               <w:ind w:firstLine="0"/>
               <w:jc w:val="center"/>
@@ -3758,7 +6756,7 @@
           </w:tcPr>
           <w:p>
             <w:pPr>
-              <w:keepNext/>
+              <w:keepNext w:val="0"/>
               <w:spacing w:line="276" w:lineRule="auto" w:before="0" w:after="0"/>
               <w:ind w:firstLine="0"/>
               <w:jc w:val="center"/>
@@ -3823,7 +6821,7 @@
           </w:tcPr>
           <w:p>
             <w:pPr>
-              <w:keepNext/>
+              <w:keepNext w:val="0"/>
               <w:spacing w:line="276" w:lineRule="auto" w:before="0" w:after="0"/>
               <w:ind w:firstLine="0"/>
               <w:jc w:val="center"/>
@@ -3864,7 +6862,7 @@
           </w:tcPr>
           <w:p>
             <w:pPr>
-              <w:keepNext/>
+              <w:keepNext w:val="0"/>
               <w:spacing w:line="276" w:lineRule="auto" w:before="0" w:after="0"/>
               <w:ind w:firstLine="0"/>
               <w:jc w:val="center"/>
@@ -3934,7 +6932,7 @@
           </w:tcPr>
           <w:p>
             <w:pPr>
-              <w:keepNext/>
+              <w:keepNext w:val="0"/>
               <w:spacing w:line="276" w:lineRule="auto" w:before="0" w:after="0"/>
               <w:ind w:firstLine="0"/>
               <w:jc w:val="center"/>
@@ -3991,7 +6989,7 @@
           </w:tcPr>
           <w:p>
             <w:pPr>
-              <w:keepNext/>
+              <w:keepNext w:val="0"/>
               <w:spacing w:line="276" w:lineRule="auto" w:before="0" w:after="0"/>
               <w:ind w:firstLine="0"/>
               <w:jc w:val="center"/>
@@ -4032,7 +7030,7 @@
           </w:tcPr>
           <w:p>
             <w:pPr>
-              <w:keepNext/>
+              <w:keepNext w:val="0"/>
               <w:spacing w:line="276" w:lineRule="auto" w:before="0" w:after="0"/>
               <w:ind w:firstLine="0"/>
               <w:jc w:val="center"/>
@@ -4102,7 +7100,7 @@
           </w:tcPr>
           <w:p>
             <w:pPr>
-              <w:keepNext/>
+              <w:keepNext w:val="0"/>
               <w:spacing w:line="276" w:lineRule="auto" w:before="0" w:after="0"/>
               <w:ind w:firstLine="0"/>
               <w:jc w:val="center"/>
@@ -4138,7 +7136,7 @@
           </w:tcPr>
           <w:p>
             <w:pPr>
-              <w:keepNext/>
+              <w:keepNext w:val="0"/>
               <w:spacing w:line="276" w:lineRule="auto" w:before="0" w:after="0"/>
               <w:ind w:firstLine="0"/>
               <w:jc w:val="center"/>
@@ -4179,7 +7177,7 @@
           </w:tcPr>
           <w:p>
             <w:pPr>
-              <w:keepNext/>
+              <w:keepNext w:val="0"/>
               <w:spacing w:line="276" w:lineRule="auto" w:before="0" w:after="0"/>
               <w:ind w:firstLine="0"/>
               <w:jc w:val="center"/>
@@ -4227,7 +7225,7 @@
           </w:tcPr>
           <w:p>
             <w:pPr>
-              <w:keepNext/>
+              <w:keepNext w:val="0"/>
               <w:spacing w:line="276" w:lineRule="auto" w:before="0" w:after="0"/>
               <w:ind w:firstLine="0"/>
               <w:jc w:val="center"/>
@@ -4292,7 +7290,7 @@
           </w:tcPr>
           <w:p>
             <w:pPr>
-              <w:keepNext/>
+              <w:keepNext w:val="0"/>
               <w:spacing w:line="276" w:lineRule="auto" w:before="0" w:after="0"/>
               <w:ind w:firstLine="0"/>
               <w:jc w:val="center"/>
@@ -4333,7 +7331,7 @@
           </w:tcPr>
           <w:p>
             <w:pPr>
-              <w:keepNext/>
+              <w:keepNext w:val="0"/>
               <w:spacing w:line="276" w:lineRule="auto" w:before="0" w:after="0"/>
               <w:ind w:firstLine="0"/>
               <w:jc w:val="center"/>
@@ -4381,7 +7379,7 @@
           </w:tcPr>
           <w:p>
             <w:pPr>
-              <w:keepNext/>
+              <w:keepNext w:val="0"/>
               <w:spacing w:line="276" w:lineRule="auto" w:before="0" w:after="0"/>
               <w:ind w:firstLine="0"/>
               <w:jc w:val="center"/>
@@ -4446,7 +7444,7 @@
           </w:tcPr>
           <w:p>
             <w:pPr>
-              <w:keepNext/>
+              <w:keepNext w:val="0"/>
               <w:spacing w:line="276" w:lineRule="auto" w:before="0" w:after="0"/>
               <w:ind w:firstLine="0"/>
               <w:jc w:val="center"/>
@@ -4588,8 +7586,8 @@
         </w:tc>
       </w:tr>
     </w:tbl>
-    <w:bookmarkEnd w:id="35"/>
-    <w:bookmarkStart w:id="41" w:name="五任务一固定分区-vrptw-模型"/>
+    <w:bookmarkEnd w:id="36"/>
+    <w:bookmarkStart w:id="42" w:name="五任务一固定分区-vrptw-模型"/>
     <w:p>
       <w:pPr>
         <w:pStyle w:val="Heading2"/>
@@ -4622,7 +7620,7 @@
         <w:t xml:space="preserve">模型</w:t>
       </w:r>
     </w:p>
-    <w:bookmarkStart w:id="36" w:name="候选路线与路线级时刻"/>
+    <w:bookmarkStart w:id="37" w:name="候选路线与路线级时刻"/>
     <w:p>
       <w:pPr>
         <w:pStyle w:val="Heading3"/>
@@ -6827,8 +9825,8 @@
         </m:oMath>
       </m:oMathPara>
     </w:p>
-    <w:bookmarkEnd w:id="36"/>
-    <w:bookmarkStart w:id="37" w:name="路线选择与时刻联结"/>
+    <w:bookmarkEnd w:id="37"/>
+    <w:bookmarkStart w:id="38" w:name="路线选择与时刻联结"/>
     <w:p>
       <w:pPr>
         <w:pStyle w:val="Heading3"/>
@@ -8024,8 +11022,8 @@
         <w:t xml:space="preserve">自动为二元值。固定候选集还同时保证每店恰好服务一次、需求不可拆分、配送站先于门店访问且车辆最终返厨。</w:t>
       </w:r>
     </w:p>
-    <w:bookmarkEnd w:id="37"/>
-    <w:bookmarkStart w:id="38" w:name="容量里程封路与冷链可行性"/>
+    <w:bookmarkEnd w:id="38"/>
+    <w:bookmarkStart w:id="39" w:name="容量里程封路与冷链可行性"/>
     <w:p>
       <w:pPr>
         <w:pStyle w:val="Heading3"/>
@@ -8591,8 +11589,8 @@
         <w:t xml:space="preserve">℃；该条件不区分两条候选路线。</w:t>
       </w:r>
     </w:p>
-    <w:bookmarkEnd w:id="38"/>
-    <w:bookmarkStart w:id="39" w:name="词典序目标"/>
+    <w:bookmarkEnd w:id="39"/>
+    <w:bookmarkStart w:id="40" w:name="词典序目标"/>
     <w:p>
       <w:pPr>
         <w:pStyle w:val="Heading3"/>
@@ -9255,8 +12253,8 @@
         <w:t xml:space="preserve">元/次计入；在固定的最少迟到数内，该项为常数但仍保留题目成本口径。该写法避免用任意大权重近似优先级。</w:t>
       </w:r>
     </w:p>
-    <w:bookmarkEnd w:id="39"/>
-    <w:bookmarkStart w:id="40" w:name="精确求解方法"/>
+    <w:bookmarkEnd w:id="40"/>
+    <w:bookmarkStart w:id="41" w:name="精确求解方法"/>
     <w:p>
       <w:pPr>
         <w:pStyle w:val="Heading3"/>
@@ -9804,9 +12802,9 @@
         <w:t xml:space="preserve">求解器。</w:t>
       </w:r>
     </w:p>
-    <w:bookmarkEnd w:id="40"/>
     <w:bookmarkEnd w:id="41"/>
-    <w:bookmarkStart w:id="48" w:name="六任务二正常配送方案"/>
+    <w:bookmarkEnd w:id="42"/>
+    <w:bookmarkStart w:id="49" w:name="六任务二正常配送方案"/>
     <w:p>
       <w:pPr>
         <w:pStyle w:val="Heading2"/>
@@ -9849,7 +12847,7 @@
           <w:rFonts w:hint="eastAsia" w:ascii="Times New Roman" w:hAnsi="Times New Roman" w:eastAsia="宋体"/>
           <w:sz w:val="24"/>
         </w:rPr>
-        <w:t xml:space="preserve">个组合均满足容量、里程和禁弧以外的结构约束，其中</w:t>
+        <w:t xml:space="preserve">个组合均满足容量、里程和结构约束，其中</w:t>
       </w:r>
       <w:r>
         <w:rPr>
@@ -9863,21 +12861,209 @@
           <w:rFonts w:hint="eastAsia" w:ascii="Times New Roman" w:hAnsi="Times New Roman" w:eastAsia="宋体"/>
           <w:sz w:val="24"/>
         </w:rPr>
-        <w:t xml:space="preserve">个组合达到零迟到。词典序比较得到表</w:t>
-      </w:r>
-      <w:r>
-        <w:rPr>
-          <w:rFonts w:ascii="Times New Roman" w:hAnsi="Times New Roman" w:eastAsia="宋体"/>
-          <w:sz w:val="24"/>
-        </w:rPr>
-        <w:t xml:space="preserve"> 2 </w:t>
-      </w:r>
-      <w:r>
-        <w:rPr>
-          <w:rFonts w:hint="eastAsia" w:ascii="Times New Roman" w:hAnsi="Times New Roman" w:eastAsia="宋体"/>
-          <w:sz w:val="24"/>
-        </w:rPr>
-        <w:t xml:space="preserve">所示最优方案。</w:t>
+        <w:t xml:space="preserve">个组合达到零迟到。B</w:t>
+      </w:r>
+      <w:r>
+        <w:rPr>
+          <w:rFonts w:ascii="Times New Roman" w:hAnsi="Times New Roman" w:eastAsia="宋体"/>
+          <w:sz w:val="24"/>
+        </w:rPr>
+        <w:t xml:space="preserve"> </w:t>
+      </w:r>
+      <w:r>
+        <w:rPr>
+          <w:rFonts w:hint="eastAsia" w:ascii="Times New Roman" w:hAnsi="Times New Roman" w:eastAsia="宋体"/>
+          <w:sz w:val="24"/>
+        </w:rPr>
+        <w:t xml:space="preserve">车采用</w:t>
+      </w:r>
+      <w:r>
+        <w:rPr>
+          <w:rFonts w:ascii="Times New Roman" w:hAnsi="Times New Roman" w:eastAsia="宋体"/>
+          <w:sz w:val="24"/>
+        </w:rPr>
+        <w:t xml:space="preserve"> </w:t>
+      </w:r>
+      <m:oMath>
+        <m:r>
+          <m:t>0</m:t>
+        </m:r>
+        <m:r>
+          <m:rPr>
+            <m:sty m:val="p"/>
+          </m:rPr>
+          <m:t>→</m:t>
+        </m:r>
+        <m:r>
+          <m:t>2</m:t>
+        </m:r>
+        <m:r>
+          <m:rPr>
+            <m:sty m:val="p"/>
+          </m:rPr>
+          <m:t>→</m:t>
+        </m:r>
+        <m:r>
+          <m:t>5</m:t>
+        </m:r>
+        <m:r>
+          <m:rPr>
+            <m:sty m:val="p"/>
+          </m:rPr>
+          <m:t>→</m:t>
+        </m:r>
+        <m:r>
+          <m:t>8</m:t>
+        </m:r>
+        <m:r>
+          <m:rPr>
+            <m:sty m:val="p"/>
+          </m:rPr>
+          <m:t>→</m:t>
+        </m:r>
+        <m:r>
+          <m:t>0</m:t>
+        </m:r>
+      </m:oMath>
+      <w:r>
+        <w:rPr>
+          <w:rFonts w:ascii="Times New Roman" w:hAnsi="Times New Roman" w:eastAsia="宋体"/>
+          <w:sz w:val="24"/>
+        </w:rPr>
+        <w:t xml:space="preserve"> </w:t>
+      </w:r>
+      <w:r>
+        <w:rPr>
+          <w:rFonts w:hint="eastAsia" w:ascii="Times New Roman" w:hAnsi="Times New Roman" w:eastAsia="宋体"/>
+          <w:sz w:val="24"/>
+        </w:rPr>
+        <w:t xml:space="preserve">时形成这</w:t>
+      </w:r>
+      <w:r>
+        <w:rPr>
+          <w:rFonts w:ascii="Times New Roman" w:hAnsi="Times New Roman" w:eastAsia="宋体"/>
+          <w:sz w:val="24"/>
+        </w:rPr>
+        <w:t xml:space="preserve"> 4 </w:t>
+      </w:r>
+      <w:r>
+        <w:rPr>
+          <w:rFonts w:hint="eastAsia" w:ascii="Times New Roman" w:hAnsi="Times New Roman" w:eastAsia="宋体"/>
+          <w:sz w:val="24"/>
+        </w:rPr>
+        <w:t xml:space="preserve">个零迟到组合，其综合成本分别为</w:t>
+      </w:r>
+      <w:r>
+        <w:rPr>
+          <w:rFonts w:ascii="Times New Roman" w:hAnsi="Times New Roman" w:eastAsia="宋体"/>
+          <w:sz w:val="24"/>
+        </w:rPr>
+        <w:t xml:space="preserve"> 420.5380、415.4852、427.7414 </w:t>
+      </w:r>
+      <w:r>
+        <w:rPr>
+          <w:rFonts w:hint="eastAsia" w:ascii="Times New Roman" w:hAnsi="Times New Roman" w:eastAsia="宋体"/>
+          <w:sz w:val="24"/>
+        </w:rPr>
+        <w:t xml:space="preserve">和</w:t>
+      </w:r>
+      <w:r>
+        <w:rPr>
+          <w:rFonts w:ascii="Times New Roman" w:hAnsi="Times New Roman" w:eastAsia="宋体"/>
+          <w:sz w:val="24"/>
+        </w:rPr>
+        <w:t xml:space="preserve"> 422.6886 </w:t>
+      </w:r>
+      <w:r>
+        <w:rPr>
+          <w:rFonts w:hint="eastAsia" w:ascii="Times New Roman" w:hAnsi="Times New Roman" w:eastAsia="宋体"/>
+          <w:sz w:val="24"/>
+        </w:rPr>
+        <w:t xml:space="preserve">元；B</w:t>
+      </w:r>
+      <w:r>
+        <w:rPr>
+          <w:rFonts w:ascii="Times New Roman" w:hAnsi="Times New Roman" w:eastAsia="宋体"/>
+          <w:sz w:val="24"/>
+        </w:rPr>
+        <w:t xml:space="preserve"> </w:t>
+      </w:r>
+      <w:r>
+        <w:rPr>
+          <w:rFonts w:hint="eastAsia" w:ascii="Times New Roman" w:hAnsi="Times New Roman" w:eastAsia="宋体"/>
+          <w:sz w:val="24"/>
+        </w:rPr>
+        <w:t xml:space="preserve">车反向访问两店时，4</w:t>
+      </w:r>
+      <w:r>
+        <w:rPr>
+          <w:rFonts w:ascii="Times New Roman" w:hAnsi="Times New Roman" w:eastAsia="宋体"/>
+          <w:sz w:val="24"/>
+        </w:rPr>
+        <w:t xml:space="preserve"> </w:t>
+      </w:r>
+      <w:r>
+        <w:rPr>
+          <w:rFonts w:hint="eastAsia" w:ascii="Times New Roman" w:hAnsi="Times New Roman" w:eastAsia="宋体"/>
+          <w:sz w:val="24"/>
+        </w:rPr>
+        <w:t xml:space="preserve">个组合均迟到</w:t>
+      </w:r>
+      <w:r>
+        <w:rPr>
+          <w:rFonts w:ascii="Times New Roman" w:hAnsi="Times New Roman" w:eastAsia="宋体"/>
+          <w:sz w:val="24"/>
+        </w:rPr>
+        <w:t xml:space="preserve"> 1 </w:t>
+      </w:r>
+      <w:r>
+        <w:rPr>
+          <w:rFonts w:hint="eastAsia" w:ascii="Times New Roman" w:hAnsi="Times New Roman" w:eastAsia="宋体"/>
+          <w:sz w:val="24"/>
+        </w:rPr>
+        <w:t xml:space="preserve">店，综合成本介于</w:t>
+      </w:r>
+      <w:r>
+        <w:rPr>
+          <w:rFonts w:ascii="Times New Roman" w:hAnsi="Times New Roman" w:eastAsia="宋体"/>
+          <w:sz w:val="24"/>
+        </w:rPr>
+        <w:t xml:space="preserve"> 564.5106—576.7668 </w:t>
+      </w:r>
+      <w:r>
+        <w:rPr>
+          <w:rFonts w:hint="eastAsia" w:ascii="Times New Roman" w:hAnsi="Times New Roman" w:eastAsia="宋体"/>
+          <w:sz w:val="24"/>
+        </w:rPr>
+        <w:t xml:space="preserve">元。词典序第一层先排除所有迟到组合，第二层再从</w:t>
+      </w:r>
+      <w:r>
+        <w:rPr>
+          <w:rFonts w:ascii="Times New Roman" w:hAnsi="Times New Roman" w:eastAsia="宋体"/>
+          <w:sz w:val="24"/>
+        </w:rPr>
+        <w:t xml:space="preserve"> 4 </w:t>
+      </w:r>
+      <w:r>
+        <w:rPr>
+          <w:rFonts w:hint="eastAsia" w:ascii="Times New Roman" w:hAnsi="Times New Roman" w:eastAsia="宋体"/>
+          <w:sz w:val="24"/>
+        </w:rPr>
+        <w:t xml:space="preserve">个零迟到方案中选出成本最低者，得到表</w:t>
+      </w:r>
+      <w:r>
+        <w:rPr>
+          <w:rFonts w:ascii="Times New Roman" w:hAnsi="Times New Roman" w:eastAsia="宋体"/>
+          <w:sz w:val="24"/>
+        </w:rPr>
+        <w:t xml:space="preserve"> 3 </w:t>
+      </w:r>
+      <w:r>
+        <w:rPr>
+          <w:rFonts w:hint="eastAsia" w:ascii="Times New Roman" w:hAnsi="Times New Roman" w:eastAsia="宋体"/>
+          <w:sz w:val="24"/>
+        </w:rPr>
+        <w:t xml:space="preserve">所示方案。这组候选层证据同时说明最优路线不是从单一可行方案直接报告，而是经过全部许可组合比较得到。</w:t>
       </w:r>
     </w:p>
     <w:p>
@@ -9900,7 +13086,7 @@
           <w:rFonts w:ascii="Times New Roman" w:hAnsi="Times New Roman" w:eastAsia="宋体"/>
           <w:sz w:val="21"/>
         </w:rPr>
-        <w:t xml:space="preserve"> 2 </w:t>
+        <w:t xml:space="preserve"> 3 </w:t>
       </w:r>
       <w:r>
         <w:rPr>
@@ -11653,18 +14839,18 @@
           <wp:inline>
             <wp:extent cx="4832604" cy="3355975"/>
             <wp:effectExtent b="0" l="0" r="0" t="0"/>
-            <wp:docPr descr="" title="" id="43" name="Picture"/>
+            <wp:docPr descr="" title="" id="44" name="Picture"/>
             <a:graphic>
               <a:graphicData uri="http://schemas.openxmlformats.org/drawingml/2006/picture">
                 <pic:pic>
                   <pic:nvPicPr>
-                    <pic:cNvPr descr="../figures/fig2_optimal_routes.png" id="44" name="Picture"/>
+                    <pic:cNvPr descr="../figures/fig2_optimal_routes.png" id="45" name="Picture"/>
                     <pic:cNvPicPr>
                       <a:picLocks noChangeArrowheads="1" noChangeAspect="1"/>
                     </pic:cNvPicPr>
                   </pic:nvPicPr>
                   <pic:blipFill>
-                    <a:blip r:embed="rId42"/>
+                    <a:blip r:embed="rId43"/>
                     <a:stretch>
                       <a:fillRect/>
                     </a:stretch>
@@ -11754,7 +14940,7 @@
           <w:rFonts w:hint="eastAsia" w:ascii="Times New Roman" w:hAnsi="Times New Roman" w:eastAsia="宋体"/>
           <w:sz w:val="24"/>
         </w:rPr>
-        <w:t xml:space="preserve">3。各到达时刻均落在题给时间窗内，所以车辆无需等待，早到与迟到事件数均为</w:t>
+        <w:t xml:space="preserve">4。各到达时刻均落在题给时间窗内，所以车辆无需等待，早到与迟到事件数均为</w:t>
       </w:r>
       <w:r>
         <w:rPr>
@@ -11784,7 +14970,7 @@
           <w:rFonts w:ascii="Times New Roman" w:hAnsi="Times New Roman" w:eastAsia="宋体"/>
           <w:sz w:val="21"/>
         </w:rPr>
-        <w:t xml:space="preserve"> 3 </w:t>
+        <w:t xml:space="preserve"> 4 </w:t>
       </w:r>
       <w:r>
         <w:rPr>
@@ -13563,6 +16749,147 @@
           <w:rFonts w:hint="eastAsia" w:ascii="Times New Roman" w:hAnsi="Times New Roman" w:eastAsia="宋体"/>
           <w:sz w:val="24"/>
         </w:rPr>
+        <w:t xml:space="preserve">容量和里程约束在该实例中均不紧。最大载货量为</w:t>
+      </w:r>
+      <w:r>
+        <w:rPr>
+          <w:rFonts w:ascii="Times New Roman" w:hAnsi="Times New Roman" w:eastAsia="宋体"/>
+          <w:sz w:val="24"/>
+        </w:rPr>
+        <w:t xml:space="preserve"> C </w:t>
+      </w:r>
+      <w:r>
+        <w:rPr>
+          <w:rFonts w:hint="eastAsia" w:ascii="Times New Roman" w:hAnsi="Times New Roman" w:eastAsia="宋体"/>
+          <w:sz w:val="24"/>
+        </w:rPr>
+        <w:t xml:space="preserve">车的</w:t>
+      </w:r>
+      <w:r>
+        <w:rPr>
+          <w:rFonts w:ascii="Times New Roman" w:hAnsi="Times New Roman" w:eastAsia="宋体"/>
+          <w:sz w:val="24"/>
+        </w:rPr>
+        <w:t xml:space="preserve"> 36 </w:t>
+      </w:r>
+      <w:r>
+        <w:rPr>
+          <w:rFonts w:hint="eastAsia" w:ascii="Times New Roman" w:hAnsi="Times New Roman" w:eastAsia="宋体"/>
+          <w:sz w:val="24"/>
+        </w:rPr>
+        <w:t xml:space="preserve">箱，只使用</w:t>
+      </w:r>
+      <w:r>
+        <w:rPr>
+          <w:rFonts w:ascii="Times New Roman" w:hAnsi="Times New Roman" w:eastAsia="宋体"/>
+          <w:sz w:val="24"/>
+        </w:rPr>
+        <w:t xml:space="preserve"> 60% </w:t>
+      </w:r>
+      <w:r>
+        <w:rPr>
+          <w:rFonts w:hint="eastAsia" w:ascii="Times New Roman" w:hAnsi="Times New Roman" w:eastAsia="宋体"/>
+          <w:sz w:val="24"/>
+        </w:rPr>
+        <w:t xml:space="preserve">容量，仍余</w:t>
+      </w:r>
+      <w:r>
+        <w:rPr>
+          <w:rFonts w:ascii="Times New Roman" w:hAnsi="Times New Roman" w:eastAsia="宋体"/>
+          <w:sz w:val="24"/>
+        </w:rPr>
+        <w:t xml:space="preserve"> 24 </w:t>
+      </w:r>
+      <w:r>
+        <w:rPr>
+          <w:rFonts w:hint="eastAsia" w:ascii="Times New Roman" w:hAnsi="Times New Roman" w:eastAsia="宋体"/>
+          <w:sz w:val="24"/>
+        </w:rPr>
+        <w:t xml:space="preserve">箱；最大路线里程为</w:t>
+      </w:r>
+      <w:r>
+        <w:rPr>
+          <w:rFonts w:ascii="Times New Roman" w:hAnsi="Times New Roman" w:eastAsia="宋体"/>
+          <w:sz w:val="24"/>
+        </w:rPr>
+        <w:t xml:space="preserve"> B </w:t>
+      </w:r>
+      <w:r>
+        <w:rPr>
+          <w:rFonts w:hint="eastAsia" w:ascii="Times New Roman" w:hAnsi="Times New Roman" w:eastAsia="宋体"/>
+          <w:sz w:val="24"/>
+        </w:rPr>
+        <w:t xml:space="preserve">车的</w:t>
+      </w:r>
+      <w:r>
+        <w:rPr>
+          <w:rFonts w:ascii="Times New Roman" w:hAnsi="Times New Roman" w:eastAsia="宋体"/>
+          <w:sz w:val="24"/>
+        </w:rPr>
+        <w:t xml:space="preserve"> 41.2547 </w:t>
+      </w:r>
+      <w:r>
+        <w:rPr>
+          <w:rFonts w:hint="eastAsia" w:ascii="Times New Roman" w:hAnsi="Times New Roman" w:eastAsia="宋体"/>
+          <w:sz w:val="24"/>
+        </w:rPr>
+        <w:t xml:space="preserve">km，只使用约</w:t>
+      </w:r>
+      <w:r>
+        <w:rPr>
+          <w:rFonts w:ascii="Times New Roman" w:hAnsi="Times New Roman" w:eastAsia="宋体"/>
+          <w:sz w:val="24"/>
+        </w:rPr>
+        <w:t xml:space="preserve"> 22.92% </w:t>
+      </w:r>
+      <w:r>
+        <w:rPr>
+          <w:rFonts w:hint="eastAsia" w:ascii="Times New Roman" w:hAnsi="Times New Roman" w:eastAsia="宋体"/>
+          <w:sz w:val="24"/>
+        </w:rPr>
+        <w:t xml:space="preserve">的里程上限，仍余</w:t>
+      </w:r>
+      <w:r>
+        <w:rPr>
+          <w:rFonts w:ascii="Times New Roman" w:hAnsi="Times New Roman" w:eastAsia="宋体"/>
+          <w:sz w:val="24"/>
+        </w:rPr>
+        <w:t xml:space="preserve"> 138.7453 </w:t>
+      </w:r>
+      <w:r>
+        <w:rPr>
+          <w:rFonts w:hint="eastAsia" w:ascii="Times New Roman" w:hAnsi="Times New Roman" w:eastAsia="宋体"/>
+          <w:sz w:val="24"/>
+        </w:rPr>
+        <w:t xml:space="preserve">km。相较之下，B</w:t>
+      </w:r>
+      <w:r>
+        <w:rPr>
+          <w:rFonts w:ascii="Times New Roman" w:hAnsi="Times New Roman" w:eastAsia="宋体"/>
+          <w:sz w:val="24"/>
+        </w:rPr>
+        <w:t xml:space="preserve"> </w:t>
+      </w:r>
+      <w:r>
+        <w:rPr>
+          <w:rFonts w:hint="eastAsia" w:ascii="Times New Roman" w:hAnsi="Times New Roman" w:eastAsia="宋体"/>
+          <w:sz w:val="24"/>
+        </w:rPr>
+        <w:t xml:space="preserve">车第二个门店的到达时刻距窗口上界最近，因此结论对装卸服务时长的敏感性主要来自时间窗而非容量或里程，后文据此只分析会改变零迟到结论的服务时长阈值。</w:t>
+      </w:r>
+    </w:p>
+    <w:p>
+      <w:pPr>
+        <w:pStyle w:val="BodyText"/>
+        <w:spacing w:line="360" w:lineRule="auto" w:before="0" w:after="0"/>
+        <w:ind w:firstLine="480"/>
+        <w:jc w:val="both"/>
+      </w:pPr>
+      <w:r>
+        <w:rPr>
+          <w:rFonts w:hint="eastAsia" w:ascii="Times New Roman" w:hAnsi="Times New Roman" w:eastAsia="宋体"/>
+          <w:sz w:val="24"/>
+        </w:rPr>
         <w:t xml:space="preserve">各门店到达时刻相对时间窗的位置见图</w:t>
       </w:r>
       <w:r>
@@ -13586,18 +16913,18 @@
           <wp:inline>
             <wp:extent cx="5062728" cy="3023573"/>
             <wp:effectExtent b="0" l="0" r="0" t="0"/>
-            <wp:docPr descr="" title="" id="46" name="Picture"/>
+            <wp:docPr descr="" title="" id="47" name="Picture"/>
             <a:graphic>
               <a:graphicData uri="http://schemas.openxmlformats.org/drawingml/2006/picture">
                 <pic:pic>
                   <pic:nvPicPr>
-                    <pic:cNvPr descr="../figures/fig3_time_windows.png" id="47" name="Picture"/>
+                    <pic:cNvPr descr="../figures/fig3_time_windows.png" id="48" name="Picture"/>
                     <pic:cNvPicPr>
                       <a:picLocks noChangeArrowheads="1" noChangeAspect="1"/>
                     </pic:cNvPicPr>
                   </pic:nvPicPr>
                   <pic:blipFill>
-                    <a:blip r:embed="rId45"/>
+                    <a:blip r:embed="rId46"/>
                     <a:stretch>
                       <a:fillRect/>
                     </a:stretch>
@@ -13654,8 +16981,8 @@
         <w:t xml:space="preserve">最优方案到达时刻与门店时间窗</w:t>
       </w:r>
     </w:p>
-    <w:bookmarkEnd w:id="48"/>
-    <w:bookmarkStart w:id="49" w:name="七任务三封闭弧下的重优化"/>
+    <w:bookmarkEnd w:id="49"/>
+    <w:bookmarkStart w:id="50" w:name="七任务三封闭弧下的重优化"/>
     <w:p>
       <w:pPr>
         <w:pStyle w:val="Heading2"/>
@@ -14064,7 +17391,7 @@
           <w:rFonts w:ascii="Times New Roman" w:hAnsi="Times New Roman" w:eastAsia="宋体"/>
           <w:sz w:val="24"/>
         </w:rPr>
-        <w:t xml:space="preserve"> 4。</w:t>
+        <w:t xml:space="preserve"> 5。</w:t>
       </w:r>
     </w:p>
     <w:p>
@@ -14087,7 +17414,7 @@
           <w:rFonts w:ascii="Times New Roman" w:hAnsi="Times New Roman" w:eastAsia="宋体"/>
           <w:sz w:val="21"/>
         </w:rPr>
-        <w:t xml:space="preserve"> 4 </w:t>
+        <w:t xml:space="preserve"> 5 </w:t>
       </w:r>
       <w:r>
         <w:rPr>
@@ -15206,8 +18533,162 @@
         <w:t xml:space="preserve">或双向道路，则属于另一个模型情景，需要新的权威信息才能计算，本文不据此改写任务三。</w:t>
       </w:r>
     </w:p>
-    <w:bookmarkEnd w:id="49"/>
-    <w:bookmarkStart w:id="52" w:name="八敏感性与验证"/>
+    <w:p>
+      <w:pPr>
+        <w:pStyle w:val="BodyText"/>
+        <w:spacing w:line="360" w:lineRule="auto" w:before="0" w:after="0"/>
+        <w:ind w:firstLine="480"/>
+        <w:jc w:val="both"/>
+      </w:pPr>
+      <w:r>
+        <w:rPr>
+          <w:rFonts w:hint="eastAsia" w:ascii="Times New Roman" w:hAnsi="Times New Roman" w:eastAsia="宋体"/>
+          <w:sz w:val="24"/>
+        </w:rPr>
+        <w:t xml:space="preserve">零增量并不表示禁弧约束没有作用：它把可行完整组合从</w:t>
+      </w:r>
+      <w:r>
+        <w:rPr>
+          <w:rFonts w:ascii="Times New Roman" w:hAnsi="Times New Roman" w:eastAsia="宋体"/>
+          <w:sz w:val="24"/>
+        </w:rPr>
+        <w:t xml:space="preserve"> 8 </w:t>
+      </w:r>
+      <w:r>
+        <w:rPr>
+          <w:rFonts w:hint="eastAsia" w:ascii="Times New Roman" w:hAnsi="Times New Roman" w:eastAsia="宋体"/>
+          <w:sz w:val="24"/>
+        </w:rPr>
+        <w:t xml:space="preserve">个减为</w:t>
+      </w:r>
+      <w:r>
+        <w:rPr>
+          <w:rFonts w:ascii="Times New Roman" w:hAnsi="Times New Roman" w:eastAsia="宋体"/>
+          <w:sz w:val="24"/>
+        </w:rPr>
+        <w:t xml:space="preserve"> 4 </w:t>
+      </w:r>
+      <w:r>
+        <w:rPr>
+          <w:rFonts w:hint="eastAsia" w:ascii="Times New Roman" w:hAnsi="Times New Roman" w:eastAsia="宋体"/>
+          <w:sz w:val="24"/>
+        </w:rPr>
+        <w:t xml:space="preserve">个。被删除的</w:t>
+      </w:r>
+      <w:r>
+        <w:rPr>
+          <w:rFonts w:ascii="Times New Roman" w:hAnsi="Times New Roman" w:eastAsia="宋体"/>
+          <w:sz w:val="24"/>
+        </w:rPr>
+        <w:t xml:space="preserve"> 4 </w:t>
+      </w:r>
+      <w:r>
+        <w:rPr>
+          <w:rFonts w:hint="eastAsia" w:ascii="Times New Roman" w:hAnsi="Times New Roman" w:eastAsia="宋体"/>
+          <w:sz w:val="24"/>
+        </w:rPr>
+        <w:t xml:space="preserve">个组合都采用</w:t>
+      </w:r>
+      <w:r>
+        <w:rPr>
+          <w:rFonts w:ascii="Times New Roman" w:hAnsi="Times New Roman" w:eastAsia="宋体"/>
+          <w:sz w:val="24"/>
+        </w:rPr>
+        <w:t xml:space="preserve"> B </w:t>
+      </w:r>
+      <w:r>
+        <w:rPr>
+          <w:rFonts w:hint="eastAsia" w:ascii="Times New Roman" w:hAnsi="Times New Roman" w:eastAsia="宋体"/>
+          <w:sz w:val="24"/>
+        </w:rPr>
+        <w:t xml:space="preserve">线</w:t>
+      </w:r>
+      <w:r>
+        <w:rPr>
+          <w:rFonts w:ascii="Times New Roman" w:hAnsi="Times New Roman" w:eastAsia="宋体"/>
+          <w:sz w:val="24"/>
+        </w:rPr>
+        <w:t xml:space="preserve"> </w:t>
+      </w:r>
+      <m:oMath>
+        <m:r>
+          <m:t>0</m:t>
+        </m:r>
+        <m:r>
+          <m:rPr>
+            <m:sty m:val="p"/>
+          </m:rPr>
+          <m:t>→</m:t>
+        </m:r>
+        <m:r>
+          <m:t>2</m:t>
+        </m:r>
+        <m:r>
+          <m:rPr>
+            <m:sty m:val="p"/>
+          </m:rPr>
+          <m:t>→</m:t>
+        </m:r>
+        <m:r>
+          <m:t>8</m:t>
+        </m:r>
+        <m:r>
+          <m:rPr>
+            <m:sty m:val="p"/>
+          </m:rPr>
+          <m:t>→</m:t>
+        </m:r>
+        <m:r>
+          <m:t>5</m:t>
+        </m:r>
+        <m:r>
+          <m:rPr>
+            <m:sty m:val="p"/>
+          </m:rPr>
+          <m:t>→</m:t>
+        </m:r>
+        <m:r>
+          <m:t>0</m:t>
+        </m:r>
+      </m:oMath>
+      <w:r>
+        <w:rPr>
+          <w:rFonts w:hint="eastAsia" w:ascii="Times New Roman" w:hAnsi="Times New Roman" w:eastAsia="宋体"/>
+          <w:sz w:val="24"/>
+        </w:rPr>
+        <w:t xml:space="preserve">，在正常场景下本就迟到</w:t>
+      </w:r>
+      <w:r>
+        <w:rPr>
+          <w:rFonts w:ascii="Times New Roman" w:hAnsi="Times New Roman" w:eastAsia="宋体"/>
+          <w:sz w:val="24"/>
+        </w:rPr>
+        <w:t xml:space="preserve"> 1 </w:t>
+      </w:r>
+      <w:r>
+        <w:rPr>
+          <w:rFonts w:hint="eastAsia" w:ascii="Times New Roman" w:hAnsi="Times New Roman" w:eastAsia="宋体"/>
+          <w:sz w:val="24"/>
+        </w:rPr>
+        <w:t xml:space="preserve">店，已被词典序第一层支配；保留下来的</w:t>
+      </w:r>
+      <w:r>
+        <w:rPr>
+          <w:rFonts w:ascii="Times New Roman" w:hAnsi="Times New Roman" w:eastAsia="宋体"/>
+          <w:sz w:val="24"/>
+        </w:rPr>
+        <w:t xml:space="preserve"> 4 </w:t>
+      </w:r>
+      <w:r>
+        <w:rPr>
+          <w:rFonts w:hint="eastAsia" w:ascii="Times New Roman" w:hAnsi="Times New Roman" w:eastAsia="宋体"/>
+          <w:sz w:val="24"/>
+        </w:rPr>
+        <w:t xml:space="preserve">个组合恰为全部零迟到组合，并包含正常最优解。因此这次扰动改变了可行域，却没有改变最优目标值。该机制解释只适用于当前有向弧、坐标距离和固定分区合同，不能外推为“施工封路通常没有成本”。</w:t>
+      </w:r>
+    </w:p>
+    <w:bookmarkEnd w:id="50"/>
+    <w:bookmarkStart w:id="53" w:name="八敏感性与验证"/>
     <w:p>
       <w:pPr>
         <w:pStyle w:val="Heading2"/>
@@ -15224,7 +18705,7 @@
         <w:t xml:space="preserve">八、敏感性与验证</w:t>
       </w:r>
     </w:p>
-    <w:bookmarkStart w:id="50" w:name="服务时长阈值"/>
+    <w:bookmarkStart w:id="51" w:name="服务时长阈值"/>
     <w:p>
       <w:pPr>
         <w:pStyle w:val="Heading3"/>
@@ -15426,21 +18907,21 @@
           <w:rFonts w:hint="eastAsia" w:ascii="Times New Roman" w:hAnsi="Times New Roman" w:eastAsia="宋体"/>
           <w:sz w:val="24"/>
         </w:rPr>
-        <w:t xml:space="preserve">车第二个门店的时间窗上界控制。只要统一服务时长不超过约</w:t>
-      </w:r>
-      <w:r>
-        <w:rPr>
-          <w:rFonts w:ascii="Times New Roman" w:hAnsi="Times New Roman" w:eastAsia="宋体"/>
-          <w:sz w:val="24"/>
-        </w:rPr>
-        <w:t xml:space="preserve"> 21.421 </w:t>
-      </w:r>
-      <w:r>
-        <w:rPr>
-          <w:rFonts w:hint="eastAsia" w:ascii="Times New Roman" w:hAnsi="Times New Roman" w:eastAsia="宋体"/>
-          <w:sz w:val="24"/>
-        </w:rPr>
-        <w:t xml:space="preserve">分钟，正常与施工场景仍采用同一零迟到路线，任务三成本增量仍为</w:t>
+        <w:t xml:space="preserve">车第二个门店，即节点</w:t>
+      </w:r>
+      <w:r>
+        <w:rPr>
+          <w:rFonts w:ascii="Times New Roman" w:hAnsi="Times New Roman" w:eastAsia="宋体"/>
+          <w:sz w:val="24"/>
+        </w:rPr>
+        <w:t xml:space="preserve"> 8 </w:t>
+      </w:r>
+      <w:r>
+        <w:rPr>
+          <w:rFonts w:hint="eastAsia" w:ascii="Times New Roman" w:hAnsi="Times New Roman" w:eastAsia="宋体"/>
+          <w:sz w:val="24"/>
+        </w:rPr>
+        <w:t xml:space="preserve">的时间窗上界控制。在最优路线</w:t>
       </w:r>
       <w:r>
         <w:rPr>
@@ -15449,39 +18930,208 @@
         </w:rPr>
         <w:t xml:space="preserve"> </w:t>
       </w:r>
-      <w:r>
-        <w:rPr>
-          <w:rFonts w:hint="eastAsia" w:ascii="Times New Roman" w:hAnsi="Times New Roman" w:eastAsia="宋体"/>
-          <w:sz w:val="24"/>
-        </w:rPr>
-        <w:t xml:space="preserve">0。超过该阈值后，迟到数和路线可能改变，本文不把阈值之外的结论外推为已验证事实。</w:t>
+      <m:oMath>
+        <m:r>
+          <m:t>0</m:t>
+        </m:r>
+        <m:r>
+          <m:rPr>
+            <m:sty m:val="p"/>
+          </m:rPr>
+          <m:t>→</m:t>
+        </m:r>
+        <m:r>
+          <m:t>2</m:t>
+        </m:r>
+        <m:r>
+          <m:rPr>
+            <m:sty m:val="p"/>
+          </m:rPr>
+          <m:t>→</m:t>
+        </m:r>
+        <m:r>
+          <m:t>5</m:t>
+        </m:r>
+        <m:r>
+          <m:rPr>
+            <m:sty m:val="p"/>
+          </m:rPr>
+          <m:t>→</m:t>
+        </m:r>
+        <m:r>
+          <m:t>8</m:t>
+        </m:r>
+        <m:r>
+          <m:rPr>
+            <m:sty m:val="p"/>
+          </m:rPr>
+          <m:t>→</m:t>
+        </m:r>
+        <m:r>
+          <m:t>0</m:t>
+        </m:r>
+      </m:oMath>
+      <w:r>
+        <w:rPr>
+          <w:rFonts w:ascii="Times New Roman" w:hAnsi="Times New Roman" w:eastAsia="宋体"/>
+          <w:sz w:val="24"/>
+        </w:rPr>
+        <w:t xml:space="preserve"> </w:t>
+      </w:r>
+      <w:r>
+        <w:rPr>
+          <w:rFonts w:hint="eastAsia" w:ascii="Times New Roman" w:hAnsi="Times New Roman" w:eastAsia="宋体"/>
+          <w:sz w:val="24"/>
+        </w:rPr>
+        <w:t xml:space="preserve">上，只有前一门店节点</w:t>
+      </w:r>
+      <w:r>
+        <w:rPr>
+          <w:rFonts w:ascii="Times New Roman" w:hAnsi="Times New Roman" w:eastAsia="宋体"/>
+          <w:sz w:val="24"/>
+        </w:rPr>
+        <w:t xml:space="preserve"> 5 </w:t>
+      </w:r>
+      <w:r>
+        <w:rPr>
+          <w:rFonts w:hint="eastAsia" w:ascii="Times New Roman" w:hAnsi="Times New Roman" w:eastAsia="宋体"/>
+          <w:sz w:val="24"/>
+        </w:rPr>
+        <w:t xml:space="preserve">的服务会推迟节点</w:t>
+      </w:r>
+      <w:r>
+        <w:rPr>
+          <w:rFonts w:ascii="Times New Roman" w:hAnsi="Times New Roman" w:eastAsia="宋体"/>
+          <w:sz w:val="24"/>
+        </w:rPr>
+        <w:t xml:space="preserve"> 8 </w:t>
+      </w:r>
+      <w:r>
+        <w:rPr>
+          <w:rFonts w:hint="eastAsia" w:ascii="Times New Roman" w:hAnsi="Times New Roman" w:eastAsia="宋体"/>
+          <w:sz w:val="24"/>
+        </w:rPr>
+        <w:t xml:space="preserve">的到达，因此</w:t>
       </w:r>
     </w:p>
-    <w:bookmarkEnd w:id="50"/>
-    <w:bookmarkStart w:id="51" w:name="最优性与数值核验"/>
     <w:p>
       <w:pPr>
-        <w:pStyle w:val="Heading3"/>
-        <w:spacing w:line="240" w:lineRule="auto" w:before="50" w:after="50"/>
+        <w:pStyle w:val="BodyText"/>
         <w:ind w:firstLine="0"/>
-        <w:jc w:val="left"/>
+        <w:jc w:val="center"/>
       </w:pPr>
-      <w:r>
-        <w:rPr>
-          <w:rFonts w:ascii="Times New Roman" w:hAnsi="Times New Roman" w:eastAsia="宋体"/>
-          <w:b/>
-          <w:sz w:val="24"/>
-        </w:rPr>
-        <w:t xml:space="preserve">8.2 </w:t>
-      </w:r>
-      <w:r>
-        <w:rPr>
-          <w:rFonts w:hint="eastAsia" w:ascii="Times New Roman" w:hAnsi="Times New Roman" w:eastAsia="宋体"/>
-          <w:b/>
-          <w:sz w:val="24"/>
-        </w:rPr>
-        <w:t xml:space="preserve">最优性与数值核验</w:t>
-      </w:r>
+      <m:oMathPara>
+        <m:oMathParaPr>
+          <m:jc m:val="center"/>
+        </m:oMathParaPr>
+        <m:oMath>
+          <m:sSub>
+            <m:e>
+              <m:r>
+                <m:t>A</m:t>
+              </m:r>
+            </m:e>
+            <m:sub>
+              <m:r>
+                <m:t>8</m:t>
+              </m:r>
+            </m:sub>
+          </m:sSub>
+          <m:r>
+            <m:rPr>
+              <m:sty m:val="p"/>
+            </m:rPr>
+            <m:t>(</m:t>
+          </m:r>
+          <m:r>
+            <m:t>s</m:t>
+          </m:r>
+          <m:r>
+            <m:rPr>
+              <m:sty m:val="p"/>
+            </m:rPr>
+            <m:t>)</m:t>
+          </m:r>
+          <m:r>
+            <m:rPr>
+              <m:sty m:val="p"/>
+            </m:rPr>
+            <m:t>=</m:t>
+          </m:r>
+          <m:r>
+            <m:t>270</m:t>
+          </m:r>
+          <m:r>
+            <m:rPr>
+              <m:sty m:val="p"/>
+            </m:rPr>
+            <m:t>+</m:t>
+          </m:r>
+          <m:sSub>
+            <m:e>
+              <m:r>
+                <m:t>τ</m:t>
+              </m:r>
+            </m:e>
+            <m:sub>
+              <m:r>
+                <m:t>02</m:t>
+              </m:r>
+            </m:sub>
+          </m:sSub>
+          <m:r>
+            <m:rPr>
+              <m:sty m:val="p"/>
+            </m:rPr>
+            <m:t>+</m:t>
+          </m:r>
+          <m:sSub>
+            <m:e>
+              <m:r>
+                <m:t>τ</m:t>
+              </m:r>
+            </m:e>
+            <m:sub>
+              <m:r>
+                <m:t>25</m:t>
+              </m:r>
+            </m:sub>
+          </m:sSub>
+          <m:r>
+            <m:rPr>
+              <m:sty m:val="p"/>
+            </m:rPr>
+            <m:t>+</m:t>
+          </m:r>
+          <m:r>
+            <m:t>s</m:t>
+          </m:r>
+          <m:r>
+            <m:rPr>
+              <m:sty m:val="p"/>
+            </m:rPr>
+            <m:t>+</m:t>
+          </m:r>
+          <m:sSub>
+            <m:e>
+              <m:r>
+                <m:t>τ</m:t>
+              </m:r>
+            </m:e>
+            <m:sub>
+              <m:r>
+                <m:t>58</m:t>
+              </m:r>
+            </m:sub>
+          </m:sSub>
+          <m:r>
+            <m:rPr>
+              <m:sty m:val="p"/>
+            </m:rPr>
+            <m:t>.</m:t>
+          </m:r>
+        </m:oMath>
+      </m:oMathPara>
     </w:p>
     <w:p>
       <w:pPr>
@@ -15495,6 +19145,173 @@
           <w:rFonts w:hint="eastAsia" w:ascii="Times New Roman" w:hAnsi="Times New Roman" w:eastAsia="宋体"/>
           <w:sz w:val="24"/>
         </w:rPr>
+        <w:t xml:space="preserve">令</w:t>
+      </w:r>
+      <w:r>
+        <w:rPr>
+          <w:rFonts w:ascii="Times New Roman" w:hAnsi="Times New Roman" w:eastAsia="宋体"/>
+          <w:sz w:val="24"/>
+        </w:rPr>
+        <w:t xml:space="preserve"> </w:t>
+      </w:r>
+      <m:oMath>
+        <m:sSub>
+          <m:e>
+            <m:r>
+              <m:t>A</m:t>
+            </m:r>
+          </m:e>
+          <m:sub>
+            <m:r>
+              <m:t>8</m:t>
+            </m:r>
+          </m:sub>
+        </m:sSub>
+        <m:r>
+          <m:rPr>
+            <m:sty m:val="p"/>
+          </m:rPr>
+          <m:t>(</m:t>
+        </m:r>
+        <m:r>
+          <m:t>s</m:t>
+        </m:r>
+        <m:r>
+          <m:rPr>
+            <m:sty m:val="p"/>
+          </m:rPr>
+          <m:t>)</m:t>
+        </m:r>
+        <m:r>
+          <m:rPr>
+            <m:sty m:val="p"/>
+          </m:rPr>
+          <m:t>≤</m:t>
+        </m:r>
+        <m:sSub>
+          <m:e>
+            <m:r>
+              <m:t>b</m:t>
+            </m:r>
+          </m:e>
+          <m:sub>
+            <m:r>
+              <m:t>8</m:t>
+            </m:r>
+          </m:sub>
+        </m:sSub>
+        <m:r>
+          <m:rPr>
+            <m:sty m:val="p"/>
+          </m:rPr>
+          <m:t>=</m:t>
+        </m:r>
+        <m:r>
+          <m:t>345</m:t>
+        </m:r>
+      </m:oMath>
+      <w:r>
+        <w:rPr>
+          <w:rFonts w:ascii="Times New Roman" w:hAnsi="Times New Roman" w:eastAsia="宋体"/>
+          <w:sz w:val="24"/>
+        </w:rPr>
+        <w:t xml:space="preserve"> </w:t>
+      </w:r>
+      <w:r>
+        <w:rPr>
+          <w:rFonts w:ascii="Times New Roman" w:hAnsi="Times New Roman" w:eastAsia="宋体"/>
+          <w:sz w:val="24"/>
+        </w:rPr>
+        <w:t xml:space="preserve">min </w:t>
+      </w:r>
+      <w:r>
+        <w:rPr>
+          <w:rFonts w:hint="eastAsia" w:ascii="Times New Roman" w:hAnsi="Times New Roman" w:eastAsia="宋体"/>
+          <w:sz w:val="24"/>
+        </w:rPr>
+        <w:t xml:space="preserve">即得到上述上限；其余车辆和门店在该上限处仍有更大时间余量。正常与施工场景保留同一条</w:t>
+      </w:r>
+      <w:r>
+        <w:rPr>
+          <w:rFonts w:ascii="Times New Roman" w:hAnsi="Times New Roman" w:eastAsia="宋体"/>
+          <w:sz w:val="24"/>
+        </w:rPr>
+        <w:t xml:space="preserve"> B </w:t>
+      </w:r>
+      <w:r>
+        <w:rPr>
+          <w:rFonts w:hint="eastAsia" w:ascii="Times New Roman" w:hAnsi="Times New Roman" w:eastAsia="宋体"/>
+          <w:sz w:val="24"/>
+        </w:rPr>
+        <w:t xml:space="preserve">车最优路线，所以二者阈值相同。只要统一服务时长不超过约</w:t>
+      </w:r>
+      <w:r>
+        <w:rPr>
+          <w:rFonts w:ascii="Times New Roman" w:hAnsi="Times New Roman" w:eastAsia="宋体"/>
+          <w:sz w:val="24"/>
+        </w:rPr>
+        <w:t xml:space="preserve"> 21.421 </w:t>
+      </w:r>
+      <w:r>
+        <w:rPr>
+          <w:rFonts w:hint="eastAsia" w:ascii="Times New Roman" w:hAnsi="Times New Roman" w:eastAsia="宋体"/>
+          <w:sz w:val="24"/>
+        </w:rPr>
+        <w:t xml:space="preserve">分钟，正常与施工场景仍采用同一零迟到路线，任务三成本增量仍为</w:t>
+      </w:r>
+      <w:r>
+        <w:rPr>
+          <w:rFonts w:ascii="Times New Roman" w:hAnsi="Times New Roman" w:eastAsia="宋体"/>
+          <w:sz w:val="24"/>
+        </w:rPr>
+        <w:t xml:space="preserve"> </w:t>
+      </w:r>
+      <w:r>
+        <w:rPr>
+          <w:rFonts w:hint="eastAsia" w:ascii="Times New Roman" w:hAnsi="Times New Roman" w:eastAsia="宋体"/>
+          <w:sz w:val="24"/>
+        </w:rPr>
+        <w:t xml:space="preserve">0。超过该阈值后，迟到数和路线可能改变，本文不把阈值之外的结论外推为已验证事实。</w:t>
+      </w:r>
+    </w:p>
+    <w:bookmarkEnd w:id="51"/>
+    <w:bookmarkStart w:id="52" w:name="最优性与数值核验"/>
+    <w:p>
+      <w:pPr>
+        <w:pStyle w:val="Heading3"/>
+        <w:spacing w:line="240" w:lineRule="auto" w:before="50" w:after="50"/>
+        <w:ind w:firstLine="0"/>
+        <w:jc w:val="left"/>
+      </w:pPr>
+      <w:r>
+        <w:rPr>
+          <w:rFonts w:ascii="Times New Roman" w:hAnsi="Times New Roman" w:eastAsia="宋体"/>
+          <w:b/>
+          <w:sz w:val="24"/>
+        </w:rPr>
+        <w:t xml:space="preserve">8.2 </w:t>
+      </w:r>
+      <w:r>
+        <w:rPr>
+          <w:rFonts w:hint="eastAsia" w:ascii="Times New Roman" w:hAnsi="Times New Roman" w:eastAsia="宋体"/>
+          <w:b/>
+          <w:sz w:val="24"/>
+        </w:rPr>
+        <w:t xml:space="preserve">最优性与数值核验</w:t>
+      </w:r>
+    </w:p>
+    <w:p>
+      <w:pPr>
+        <w:pStyle w:val="FirstParagraph"/>
+        <w:spacing w:line="360" w:lineRule="auto" w:before="0" w:after="0"/>
+        <w:ind w:firstLine="480"/>
+        <w:jc w:val="both"/>
+      </w:pPr>
+      <w:r>
+        <w:rPr>
+          <w:rFonts w:hint="eastAsia" w:ascii="Times New Roman" w:hAnsi="Times New Roman" w:eastAsia="宋体"/>
+          <w:sz w:val="24"/>
+        </w:rPr>
         <w:t xml:space="preserve">程序实际枚举正常场景全部</w:t>
       </w:r>
       <w:r>
@@ -15693,9 +19510,9 @@
         <w:t xml:space="preserve">元，与路线成本之和一致；到达时刻全部位于相应窗口内。上述检查覆盖了本题结论依赖的容量、里程、时间递推、目标排序和扰动边界。</w:t>
       </w:r>
     </w:p>
-    <w:bookmarkEnd w:id="51"/>
     <w:bookmarkEnd w:id="52"/>
-    <w:bookmarkStart w:id="53" w:name="九模型评价与适用边界"/>
+    <w:bookmarkEnd w:id="53"/>
+    <w:bookmarkStart w:id="54" w:name="九模型评价与适用边界"/>
     <w:p>
       <w:pPr>
         <w:pStyle w:val="Heading2"/>
@@ -15806,8 +19623,8 @@
         <w:t xml:space="preserve">求解器，而不再进行全枚举。</w:t>
       </w:r>
     </w:p>
-    <w:bookmarkEnd w:id="53"/>
-    <w:bookmarkStart w:id="54" w:name="十结论"/>
+    <w:bookmarkEnd w:id="54"/>
+    <w:bookmarkStart w:id="55" w:name="十结论"/>
     <w:p>
       <w:pPr>
         <w:pStyle w:val="Heading2"/>
@@ -15945,8 +19762,8 @@
         <w:t xml:space="preserve">因此，本题的关键不在于设计复杂的元启发式算法，而在于正确处理固定分区、保鲜优先级以及“封闭弧未命中最优路线”的数据事实。若企业期望得到真实施工绕路方案，必须补充与封路一致的道路邻接和方向信息。</w:t>
       </w:r>
     </w:p>
-    <w:bookmarkEnd w:id="54"/>
-    <w:bookmarkStart w:id="55" w:name="参考文献"/>
+    <w:bookmarkEnd w:id="55"/>
+    <w:bookmarkStart w:id="56" w:name="参考文献"/>
     <w:p>
       <w:pPr>
         <w:pStyle w:val="Heading2"/>
@@ -16038,8 +19855,8 @@
         <w:t xml:space="preserve">[5] POTVIN J Y, ROUSSEAU J M. A parallel route building algorithm for the vehicle routing and scheduling problem with time windows[J]. European Journal of Operational Research, 1993, 66(3): 331-340. DOI: 10.1016/0377-2217(93)90221-8.</w:t>
       </w:r>
     </w:p>
-    <w:bookmarkEnd w:id="55"/>
-    <w:bookmarkStart w:id="56" w:name="附录复现入口"/>
+    <w:bookmarkEnd w:id="56"/>
+    <w:bookmarkStart w:id="57" w:name="附录复现入口"/>
     <w:p>
       <w:pPr>
         <w:pStyle w:val="Heading2"/>
@@ -16656,8 +20473,8 @@
         <w:t xml:space="preserve">渲染环境。</w:t>
       </w:r>
     </w:p>
-    <w:bookmarkEnd w:id="56"/>
     <w:bookmarkEnd w:id="57"/>
+    <w:bookmarkEnd w:id="58"/>
     <w:sectPr>
       <w:headerReference r:id="rId3" w:type="default"/>
       <w:headerReference r:id="rId4" w:type="first"/>

</xml_diff>

<commit_message>
update Problem B paper formatting and docx post-processing
- Update paper.md and regenerate paper.docx via postprocess script
- Record paper format decisions in decisions.md
- Sync state.md and model playbook
</commit_message>
<xml_diff>
--- a/projects/2026-summer-assignment/solutions/problem-b-cold-chain-routing/paper/paper.docx
+++ b/projects/2026-summer-assignment/solutions/problem-b-cold-chain-routing/paper/paper.docx
@@ -428,7 +428,23 @@
           <w:color w:val="000000"/>
           <w:sz w:val="24"/>
         </w:rPr>
-        <w:t xml:space="preserve">家门店均按时到达。任务三严格禁用有向弧</w:t>
+        <w:t xml:space="preserve">家门店均按时到达。任务三因题面缺少封路发现时刻和在途车辆状态，将“4:30</w:t>
+      </w:r>
+      <w:r>
+        <w:rPr>
+          <w:rFonts w:ascii="Times New Roman" w:hAnsi="Times New Roman" w:eastAsia="宋体"/>
+          <w:color w:val="000000"/>
+          <w:sz w:val="24"/>
+        </w:rPr>
+        <w:t xml:space="preserve"> </w:t>
+      </w:r>
+      <w:r>
+        <w:rPr>
+          <w:rFonts w:hint="eastAsia" w:ascii="Times New Roman" w:hAnsi="Times New Roman" w:eastAsia="宋体"/>
+          <w:color w:val="000000"/>
+          <w:sz w:val="24"/>
+        </w:rPr>
+        <w:t xml:space="preserve">发车前已知有向弧</w:t>
       </w:r>
       <w:r>
         <w:rPr>
@@ -454,11 +470,35 @@
       </m:oMath>
       <w:r>
         <w:rPr>
-          <w:rFonts w:hint="eastAsia" w:ascii="Times New Roman" w:hAnsi="Times New Roman" w:eastAsia="宋体"/>
-          <w:color w:val="000000"/>
-          <w:sz w:val="24"/>
-        </w:rPr>
-        <w:t xml:space="preserve">，但正常最优路线未使用该弧；重优化后路线和成本不变，增量为</w:t>
+          <w:rFonts w:ascii="Times New Roman" w:hAnsi="Times New Roman" w:eastAsia="宋体"/>
+          <w:color w:val="000000"/>
+          <w:sz w:val="24"/>
+        </w:rPr>
+        <w:t xml:space="preserve"> </w:t>
+      </w:r>
+      <w:r>
+        <w:rPr>
+          <w:rFonts w:hint="eastAsia" w:ascii="Times New Roman" w:hAnsi="Times New Roman" w:eastAsia="宋体"/>
+          <w:color w:val="000000"/>
+          <w:sz w:val="24"/>
+        </w:rPr>
+        <w:t xml:space="preserve">封闭”定义为可复现的静态主场景。完整枚举表明封路删除</w:t>
+      </w:r>
+      <w:r>
+        <w:rPr>
+          <w:rFonts w:ascii="Times New Roman" w:hAnsi="Times New Roman" w:eastAsia="宋体"/>
+          <w:color w:val="000000"/>
+          <w:sz w:val="24"/>
+        </w:rPr>
+        <w:t xml:space="preserve"> 4 </w:t>
+      </w:r>
+      <w:r>
+        <w:rPr>
+          <w:rFonts w:hint="eastAsia" w:ascii="Times New Roman" w:hAnsi="Times New Roman" w:eastAsia="宋体"/>
+          <w:color w:val="000000"/>
+          <w:sz w:val="24"/>
+        </w:rPr>
+        <w:t xml:space="preserve">个本已迟到的组合，而正常最优路线未使用该弧；重优化后路线和成本不变，增量为</w:t>
       </w:r>
       <w:r>
         <w:rPr>
@@ -503,7 +543,7 @@
           <w:color w:val="000000"/>
           <w:sz w:val="24"/>
         </w:rPr>
-        <w:t xml:space="preserve">分钟/店时，该零增量结论保持成立。模型使用欧氏距离、恒定车速和发车前静态重优化，实际应用时需以道路行程时间和真实装卸时长重新标定。</w:t>
+        <w:t xml:space="preserve">分钟/店时，该零增量结论保持成立。该结论仅适用于上述信息状态；真正的在途动态重路由需要额外事件时刻和车辆状态数据。</w:t>
       </w:r>
     </w:p>
     <w:p>
@@ -1087,7 +1127,23 @@
           <w:color w:val="000000"/>
           <w:sz w:val="24"/>
         </w:rPr>
-        <w:t xml:space="preserve">。因此任务三应先检查正常最优路线是否使用该弧，再在禁弧后的同一可行域上重优化。不能为了得到非零绕路成本而把封闭方向改为</w:t>
+        <w:t xml:space="preserve">，但没有给出封路发现时刻和车辆在途位置、已服务节点或剩余载荷。因此本文把“4:30</w:t>
+      </w:r>
+      <w:r>
+        <w:rPr>
+          <w:rFonts w:ascii="Times New Roman" w:hAnsi="Times New Roman" w:eastAsia="宋体"/>
+          <w:color w:val="000000"/>
+          <w:sz w:val="24"/>
+        </w:rPr>
+        <w:t xml:space="preserve"> </w:t>
+      </w:r>
+      <w:r>
+        <w:rPr>
+          <w:rFonts w:hint="eastAsia" w:ascii="Times New Roman" w:hAnsi="Times New Roman" w:eastAsia="宋体"/>
+          <w:color w:val="000000"/>
+          <w:sz w:val="24"/>
+        </w:rPr>
+        <w:t xml:space="preserve">发车前已知该弧封闭，并在发车前重新选择三条完整路线”定义为可复现的静态主场景；这是为闭合任务三采用的建模假设，不是题面事实。在该信息状态下，应先检查正常最优路线是否使用封闭弧，再在禁弧后的候选集中按相同目标重优化。不能为了得到非零绕路成本而把封闭方向改为</w:t>
       </w:r>
       <w:r>
         <w:rPr>
@@ -1147,23 +1203,7 @@
           <w:color w:val="000000"/>
           <w:sz w:val="24"/>
         </w:rPr>
-        <w:t xml:space="preserve">。由于题目未给封路发现时刻和车辆实时位置，本文按</w:t>
-      </w:r>
-      <w:r>
-        <w:rPr>
-          <w:rFonts w:ascii="Times New Roman" w:hAnsi="Times New Roman" w:eastAsia="宋体"/>
-          <w:color w:val="000000"/>
-          <w:sz w:val="24"/>
-        </w:rPr>
-        <w:t xml:space="preserve"> 4:30 </w:t>
-      </w:r>
-      <w:r>
-        <w:rPr>
-          <w:rFonts w:hint="eastAsia" w:ascii="Times New Roman" w:hAnsi="Times New Roman" w:eastAsia="宋体"/>
-          <w:color w:val="000000"/>
-          <w:sz w:val="24"/>
-        </w:rPr>
-        <w:t xml:space="preserve">发车前已知施工信息进行静态重优化。节点空间关系、固定分区和封闭方向见图</w:t>
+        <w:t xml:space="preserve">。真正的在途动态重路由需要事件时刻和车辆状态，本文不补造这些数据。节点空间关系、固定分区和封闭方向见图</w:t>
       </w:r>
       <w:r>
         <w:rPr>
@@ -4588,7 +4628,23 @@
           <w:color w:val="000000"/>
           <w:sz w:val="24"/>
         </w:rPr>
-        <w:t xml:space="preserve">，并按发车前已知封路处理。</w:t>
+        <w:t xml:space="preserve">，并把“4:30</w:t>
+      </w:r>
+      <w:r>
+        <w:rPr>
+          <w:rFonts w:ascii="Times New Roman" w:hAnsi="Times New Roman" w:eastAsia="宋体"/>
+          <w:color w:val="000000"/>
+          <w:sz w:val="24"/>
+        </w:rPr>
+        <w:t xml:space="preserve"> </w:t>
+      </w:r>
+      <w:r>
+        <w:rPr>
+          <w:rFonts w:hint="eastAsia" w:ascii="Times New Roman" w:hAnsi="Times New Roman" w:eastAsia="宋体"/>
+          <w:color w:val="000000"/>
+          <w:sz w:val="24"/>
+        </w:rPr>
+        <w:t xml:space="preserve">发车前已知封路、发车前重选完整路线”作为可复现的静态主场景；该信息状态是建模假设而非题面事实。</w:t>
       </w:r>
     </w:p>
     <w:p>
@@ -4604,7 +4660,7 @@
           <w:color w:val="000000"/>
           <w:sz w:val="24"/>
         </w:rPr>
-        <w:t xml:space="preserve">这些假设影响不同层面的结论：固定分区和站点必经限定了可行域，因此“全局最优”只对该合同成立；欧氏距离与恒速决定路线和时刻的数值，真实道路矩阵可能改变排序；零服务时长只影响后续门店到达时刻，故需用阈值分析界定其适用范围；恒温假设只能证明题给温度门槛可行，不能推出制冷能耗；发车前已知封路则把任务三限定为静态重优化，不能代表在途车辆的动态改道。</w:t>
+        <w:t xml:space="preserve">这些假设影响不同层面的结论：固定分区和站点必经限定了可行域，因此“全局最优”只对该合同成立；欧氏距离与恒速决定路线和时刻的数值，真实道路矩阵可能改变排序；零服务时长只影响后续门店到达时刻，故需用阈值分析界定其适用范围；恒温假设只能证明题给温度门槛可行，不能推出制冷能耗；发车前已知封路则把任务三限定为条件性的静态重优化，当前零增量结果不能外推到在途车辆的动态改道。</w:t>
       </w:r>
     </w:p>
     <w:bookmarkEnd w:id="19"/>
@@ -11477,7 +11533,7 @@
           <w:color w:val="000000"/>
           <w:sz w:val="24"/>
         </w:rPr>
-        <w:t xml:space="preserve">，其中不含任何弧；施工情景的封闭弧集为</w:t>
+        <w:t xml:space="preserve">，其中不含任何弧；在发车前已知封路的静态施工情景中，封闭弧集为</w:t>
       </w:r>
       <w:r>
         <w:rPr>
@@ -13306,248 +13362,23 @@
           <w:color w:val="000000"/>
           <w:sz w:val="24"/>
         </w:rPr>
-        <w:t xml:space="preserve">个组合均满足容量、里程和结构约束，其中</w:t>
-      </w:r>
-      <w:r>
-        <w:rPr>
-          <w:rFonts w:ascii="Times New Roman" w:hAnsi="Times New Roman" w:eastAsia="宋体"/>
-          <w:color w:val="000000"/>
-          <w:sz w:val="24"/>
-        </w:rPr>
-        <w:t xml:space="preserve"> 4 </w:t>
-      </w:r>
-      <w:r>
-        <w:rPr>
-          <w:rFonts w:hint="eastAsia" w:ascii="Times New Roman" w:hAnsi="Times New Roman" w:eastAsia="宋体"/>
-          <w:color w:val="000000"/>
-          <w:sz w:val="24"/>
-        </w:rPr>
-        <w:t xml:space="preserve">个组合达到零迟到。B</w:t>
-      </w:r>
-      <w:r>
-        <w:rPr>
-          <w:rFonts w:ascii="Times New Roman" w:hAnsi="Times New Roman" w:eastAsia="宋体"/>
-          <w:color w:val="000000"/>
-          <w:sz w:val="24"/>
-        </w:rPr>
-        <w:t xml:space="preserve"> </w:t>
-      </w:r>
-      <w:r>
-        <w:rPr>
-          <w:rFonts w:hint="eastAsia" w:ascii="Times New Roman" w:hAnsi="Times New Roman" w:eastAsia="宋体"/>
-          <w:color w:val="000000"/>
-          <w:sz w:val="24"/>
-        </w:rPr>
-        <w:t xml:space="preserve">车采用</w:t>
-      </w:r>
-      <w:r>
-        <w:rPr>
-          <w:rFonts w:ascii="Times New Roman" w:hAnsi="Times New Roman" w:eastAsia="宋体"/>
-          <w:color w:val="000000"/>
-          <w:sz w:val="24"/>
-        </w:rPr>
-        <w:t xml:space="preserve"> </w:t>
-      </w:r>
-      <m:oMath>
-        <m:r>
-          <m:t>0</m:t>
-        </m:r>
-        <m:r>
-          <m:rPr>
-            <m:sty m:val="p"/>
-          </m:rPr>
-          <m:t>→</m:t>
-        </m:r>
-        <m:r>
-          <m:t>2</m:t>
-        </m:r>
-        <m:r>
-          <m:rPr>
-            <m:sty m:val="p"/>
-          </m:rPr>
-          <m:t>→</m:t>
-        </m:r>
-        <m:r>
-          <m:t>5</m:t>
-        </m:r>
-        <m:r>
-          <m:rPr>
-            <m:sty m:val="p"/>
-          </m:rPr>
-          <m:t>→</m:t>
-        </m:r>
-        <m:r>
-          <m:t>8</m:t>
-        </m:r>
-        <m:r>
-          <m:rPr>
-            <m:sty m:val="p"/>
-          </m:rPr>
-          <m:t>→</m:t>
-        </m:r>
-        <m:r>
-          <m:t>0</m:t>
-        </m:r>
-      </m:oMath>
-      <w:r>
-        <w:rPr>
-          <w:rFonts w:ascii="Times New Roman" w:hAnsi="Times New Roman" w:eastAsia="宋体"/>
-          <w:color w:val="000000"/>
-          <w:sz w:val="24"/>
-        </w:rPr>
-        <w:t xml:space="preserve"> </w:t>
-      </w:r>
-      <w:r>
-        <w:rPr>
-          <w:rFonts w:hint="eastAsia" w:ascii="Times New Roman" w:hAnsi="Times New Roman" w:eastAsia="宋体"/>
-          <w:color w:val="000000"/>
-          <w:sz w:val="24"/>
-        </w:rPr>
-        <w:t xml:space="preserve">时形成这</w:t>
-      </w:r>
-      <w:r>
-        <w:rPr>
-          <w:rFonts w:ascii="Times New Roman" w:hAnsi="Times New Roman" w:eastAsia="宋体"/>
-          <w:color w:val="000000"/>
-          <w:sz w:val="24"/>
-        </w:rPr>
-        <w:t xml:space="preserve"> 4 </w:t>
-      </w:r>
-      <w:r>
-        <w:rPr>
-          <w:rFonts w:hint="eastAsia" w:ascii="Times New Roman" w:hAnsi="Times New Roman" w:eastAsia="宋体"/>
-          <w:color w:val="000000"/>
-          <w:sz w:val="24"/>
-        </w:rPr>
-        <w:t xml:space="preserve">个零迟到组合，其综合成本分别为</w:t>
-      </w:r>
-      <w:r>
-        <w:rPr>
-          <w:rFonts w:ascii="Times New Roman" w:hAnsi="Times New Roman" w:eastAsia="宋体"/>
-          <w:color w:val="000000"/>
-          <w:sz w:val="24"/>
-        </w:rPr>
-        <w:t xml:space="preserve"> 420.5380、415.4852、427.7414 </w:t>
-      </w:r>
-      <w:r>
-        <w:rPr>
-          <w:rFonts w:hint="eastAsia" w:ascii="Times New Roman" w:hAnsi="Times New Roman" w:eastAsia="宋体"/>
-          <w:color w:val="000000"/>
-          <w:sz w:val="24"/>
-        </w:rPr>
-        <w:t xml:space="preserve">和</w:t>
-      </w:r>
-      <w:r>
-        <w:rPr>
-          <w:rFonts w:ascii="Times New Roman" w:hAnsi="Times New Roman" w:eastAsia="宋体"/>
-          <w:color w:val="000000"/>
-          <w:sz w:val="24"/>
-        </w:rPr>
-        <w:t xml:space="preserve"> 422.6886 </w:t>
-      </w:r>
-      <w:r>
-        <w:rPr>
-          <w:rFonts w:hint="eastAsia" w:ascii="Times New Roman" w:hAnsi="Times New Roman" w:eastAsia="宋体"/>
-          <w:color w:val="000000"/>
-          <w:sz w:val="24"/>
-        </w:rPr>
-        <w:t xml:space="preserve">元；B</w:t>
-      </w:r>
-      <w:r>
-        <w:rPr>
-          <w:rFonts w:ascii="Times New Roman" w:hAnsi="Times New Roman" w:eastAsia="宋体"/>
-          <w:color w:val="000000"/>
-          <w:sz w:val="24"/>
-        </w:rPr>
-        <w:t xml:space="preserve"> </w:t>
-      </w:r>
-      <w:r>
-        <w:rPr>
-          <w:rFonts w:hint="eastAsia" w:ascii="Times New Roman" w:hAnsi="Times New Roman" w:eastAsia="宋体"/>
-          <w:color w:val="000000"/>
-          <w:sz w:val="24"/>
-        </w:rPr>
-        <w:t xml:space="preserve">车反向访问两店时，4</w:t>
-      </w:r>
-      <w:r>
-        <w:rPr>
-          <w:rFonts w:ascii="Times New Roman" w:hAnsi="Times New Roman" w:eastAsia="宋体"/>
-          <w:color w:val="000000"/>
-          <w:sz w:val="24"/>
-        </w:rPr>
-        <w:t xml:space="preserve"> </w:t>
-      </w:r>
-      <w:r>
-        <w:rPr>
-          <w:rFonts w:hint="eastAsia" w:ascii="Times New Roman" w:hAnsi="Times New Roman" w:eastAsia="宋体"/>
-          <w:color w:val="000000"/>
-          <w:sz w:val="24"/>
-        </w:rPr>
-        <w:t xml:space="preserve">个组合均迟到</w:t>
-      </w:r>
-      <w:r>
-        <w:rPr>
-          <w:rFonts w:ascii="Times New Roman" w:hAnsi="Times New Roman" w:eastAsia="宋体"/>
-          <w:color w:val="000000"/>
-          <w:sz w:val="24"/>
-        </w:rPr>
-        <w:t xml:space="preserve"> 1 </w:t>
-      </w:r>
-      <w:r>
-        <w:rPr>
-          <w:rFonts w:hint="eastAsia" w:ascii="Times New Roman" w:hAnsi="Times New Roman" w:eastAsia="宋体"/>
-          <w:color w:val="000000"/>
-          <w:sz w:val="24"/>
-        </w:rPr>
-        <w:t xml:space="preserve">店，综合成本介于</w:t>
-      </w:r>
-      <w:r>
-        <w:rPr>
-          <w:rFonts w:ascii="Times New Roman" w:hAnsi="Times New Roman" w:eastAsia="宋体"/>
-          <w:color w:val="000000"/>
-          <w:sz w:val="24"/>
-        </w:rPr>
-        <w:t xml:space="preserve"> 564.5106—576.7668 </w:t>
-      </w:r>
-      <w:r>
-        <w:rPr>
-          <w:rFonts w:hint="eastAsia" w:ascii="Times New Roman" w:hAnsi="Times New Roman" w:eastAsia="宋体"/>
-          <w:color w:val="000000"/>
-          <w:sz w:val="24"/>
-        </w:rPr>
-        <w:t xml:space="preserve">元。词典序第一层先排除所有迟到组合，第二层再从</w:t>
-      </w:r>
-      <w:r>
-        <w:rPr>
-          <w:rFonts w:ascii="Times New Roman" w:hAnsi="Times New Roman" w:eastAsia="宋体"/>
-          <w:color w:val="000000"/>
-          <w:sz w:val="24"/>
-        </w:rPr>
-        <w:t xml:space="preserve"> 4 </w:t>
-      </w:r>
-      <w:r>
-        <w:rPr>
-          <w:rFonts w:hint="eastAsia" w:ascii="Times New Roman" w:hAnsi="Times New Roman" w:eastAsia="宋体"/>
-          <w:color w:val="000000"/>
-          <w:sz w:val="24"/>
-        </w:rPr>
-        <w:t xml:space="preserve">个零迟到方案中选出成本最低者，得到表</w:t>
-      </w:r>
-      <w:r>
-        <w:rPr>
-          <w:rFonts w:ascii="Times New Roman" w:hAnsi="Times New Roman" w:eastAsia="宋体"/>
-          <w:color w:val="000000"/>
-          <w:sz w:val="24"/>
-        </w:rPr>
-        <w:t xml:space="preserve"> 3 </w:t>
-      </w:r>
-      <w:r>
-        <w:rPr>
-          <w:rFonts w:hint="eastAsia" w:ascii="Times New Roman" w:hAnsi="Times New Roman" w:eastAsia="宋体"/>
-          <w:color w:val="000000"/>
-          <w:sz w:val="24"/>
-        </w:rPr>
-        <w:t xml:space="preserve">所示方案。这组候选层证据同时说明最优路线不是从单一可行方案直接报告，而是经过全部许可组合比较得到。</w:t>
+        <w:t xml:space="preserve">个组合均满足容量、里程和结构约束，完整比较见表</w:t>
+      </w:r>
+      <w:r>
+        <w:rPr>
+          <w:rFonts w:ascii="Times New Roman" w:hAnsi="Times New Roman" w:eastAsia="宋体"/>
+          <w:color w:val="000000"/>
+          <w:sz w:val="24"/>
+        </w:rPr>
+        <w:t xml:space="preserve"> 3。A、B、C </w:t>
+      </w:r>
+      <w:r>
+        <w:rPr>
+          <w:rFonts w:hint="eastAsia" w:ascii="Times New Roman" w:hAnsi="Times New Roman" w:eastAsia="宋体"/>
+          <w:color w:val="000000"/>
+          <w:sz w:val="24"/>
+        </w:rPr>
+        <w:t xml:space="preserve">顺序只列所属配送站之后两家门店的访问次序；综合成本包含运输费和时间窗事件罚。</w:t>
       </w:r>
     </w:p>
     <w:p>
@@ -13573,6 +13404,3096 @@
           <w:sz w:val="21"/>
         </w:rPr>
         <w:t xml:space="preserve"> 3 </w:t>
+      </w:r>
+      <w:r>
+        <w:rPr>
+          <w:rFonts w:hint="eastAsia" w:ascii="Times New Roman" w:hAnsi="Times New Roman" w:eastAsia="宋体"/>
+          <w:color w:val="000000"/>
+          <w:sz w:val="21"/>
+        </w:rPr>
+        <w:t xml:space="preserve">正常场景</w:t>
+      </w:r>
+      <w:r>
+        <w:rPr>
+          <w:rFonts w:ascii="Times New Roman" w:hAnsi="Times New Roman" w:eastAsia="宋体"/>
+          <w:color w:val="000000"/>
+          <w:sz w:val="21"/>
+        </w:rPr>
+        <w:t xml:space="preserve"> 8 </w:t>
+      </w:r>
+      <w:r>
+        <w:rPr>
+          <w:rFonts w:hint="eastAsia" w:ascii="Times New Roman" w:hAnsi="Times New Roman" w:eastAsia="宋体"/>
+          <w:color w:val="000000"/>
+          <w:sz w:val="21"/>
+        </w:rPr>
+        <w:t xml:space="preserve">个完整候选方案及封路影响</w:t>
+      </w:r>
+    </w:p>
+    <w:tbl>
+      <w:tblPr>
+        <w:tblStyle w:val="Table"/>
+        <w:tblW w:type="dxa" w:w="8952"/>
+        <w:jc w:val="center"/>
+        <w:tblLayout w:type="fixed"/>
+        <w:tblLook w:firstRow="1" w:lastRow="0" w:firstColumn="0" w:lastColumn="0" w:noHBand="0" w:noVBand="0" w:val="0020"/>
+      </w:tblPr>
+      <w:tblGrid>
+        <w:gridCol w:w="627"/>
+        <w:gridCol w:w="1074"/>
+        <w:gridCol w:w="1074"/>
+        <w:gridCol w:w="1074"/>
+        <w:gridCol w:w="895"/>
+        <w:gridCol w:w="1701"/>
+        <w:gridCol w:w="1164"/>
+        <w:gridCol w:w="1343"/>
+      </w:tblGrid>
+      <w:tr>
+        <w:trPr>
+          <w:tblHeader w:val="on"/>
+          <w:cantSplit/>
+        </w:trPr>
+        <w:tc>
+          <w:tcPr>
+            <w:tcW w:w="627" w:type="dxa"/>
+            <w:tcBorders>
+              <w:top w:val="single" w:sz="10" w:color="000000"/>
+              <w:start w:val="nil"/>
+              <w:bottom w:val="single" w:sz="4" w:color="000000"/>
+              <w:end w:val="nil"/>
+              <w:insideH w:val="nil"/>
+              <w:insideV w:val="nil"/>
+            </w:tcBorders>
+            <w:tcMar>
+              <w:top w:w="55" w:type="dxa"/>
+              <w:start w:w="70" w:type="dxa"/>
+              <w:bottom w:w="55" w:type="dxa"/>
+              <w:end w:w="70" w:type="dxa"/>
+            </w:tcMar>
+            <w:vAlign w:val="center"/>
+          </w:tcPr>
+          <w:p>
+            <w:pPr>
+              <w:keepNext/>
+              <w:spacing w:line="276" w:lineRule="auto" w:before="0" w:after="0"/>
+              <w:ind w:firstLine="0"/>
+              <w:jc w:val="center"/>
+            </w:pPr>
+            <w:r>
+              <w:rPr>
+                <w:rFonts w:hint="eastAsia" w:ascii="Times New Roman" w:hAnsi="Times New Roman" w:eastAsia="宋体"/>
+                <w:b/>
+                <w:color w:val="000000"/>
+                <w:sz w:val="20"/>
+              </w:rPr>
+              <w:t xml:space="preserve">方案</w:t>
+            </w:r>
+          </w:p>
+        </w:tc>
+        <w:tc>
+          <w:tcPr>
+            <w:tcW w:w="1074" w:type="dxa"/>
+            <w:tcBorders>
+              <w:top w:val="single" w:sz="10" w:color="000000"/>
+              <w:start w:val="nil"/>
+              <w:bottom w:val="single" w:sz="4" w:color="000000"/>
+              <w:end w:val="nil"/>
+              <w:insideH w:val="nil"/>
+              <w:insideV w:val="nil"/>
+            </w:tcBorders>
+            <w:tcMar>
+              <w:top w:w="55" w:type="dxa"/>
+              <w:start w:w="70" w:type="dxa"/>
+              <w:bottom w:w="55" w:type="dxa"/>
+              <w:end w:w="70" w:type="dxa"/>
+            </w:tcMar>
+            <w:vAlign w:val="center"/>
+          </w:tcPr>
+          <w:p>
+            <w:pPr>
+              <w:keepNext/>
+              <w:spacing w:line="276" w:lineRule="auto" w:before="0" w:after="0"/>
+              <w:ind w:firstLine="0"/>
+              <w:jc w:val="center"/>
+            </w:pPr>
+            <w:r>
+              <w:rPr>
+                <w:rFonts w:ascii="Times New Roman" w:hAnsi="Times New Roman" w:eastAsia="宋体"/>
+                <w:b/>
+                <w:color w:val="000000"/>
+                <w:sz w:val="20"/>
+              </w:rPr>
+              <w:t xml:space="preserve">A </w:t>
+            </w:r>
+            <w:r>
+              <w:rPr>
+                <w:rFonts w:hint="eastAsia" w:ascii="Times New Roman" w:hAnsi="Times New Roman" w:eastAsia="宋体"/>
+                <w:b/>
+                <w:color w:val="000000"/>
+                <w:sz w:val="20"/>
+              </w:rPr>
+              <w:t xml:space="preserve">顺序</w:t>
+            </w:r>
+          </w:p>
+        </w:tc>
+        <w:tc>
+          <w:tcPr>
+            <w:tcW w:w="1074" w:type="dxa"/>
+            <w:tcBorders>
+              <w:top w:val="single" w:sz="10" w:color="000000"/>
+              <w:start w:val="nil"/>
+              <w:bottom w:val="single" w:sz="4" w:color="000000"/>
+              <w:end w:val="nil"/>
+              <w:insideH w:val="nil"/>
+              <w:insideV w:val="nil"/>
+            </w:tcBorders>
+            <w:tcMar>
+              <w:top w:w="55" w:type="dxa"/>
+              <w:start w:w="70" w:type="dxa"/>
+              <w:bottom w:w="55" w:type="dxa"/>
+              <w:end w:w="70" w:type="dxa"/>
+            </w:tcMar>
+            <w:vAlign w:val="center"/>
+          </w:tcPr>
+          <w:p>
+            <w:pPr>
+              <w:keepNext/>
+              <w:spacing w:line="276" w:lineRule="auto" w:before="0" w:after="0"/>
+              <w:ind w:firstLine="0"/>
+              <w:jc w:val="center"/>
+            </w:pPr>
+            <w:r>
+              <w:rPr>
+                <w:rFonts w:ascii="Times New Roman" w:hAnsi="Times New Roman" w:eastAsia="宋体"/>
+                <w:b/>
+                <w:color w:val="000000"/>
+                <w:sz w:val="20"/>
+              </w:rPr>
+              <w:t xml:space="preserve">B </w:t>
+            </w:r>
+            <w:r>
+              <w:rPr>
+                <w:rFonts w:hint="eastAsia" w:ascii="Times New Roman" w:hAnsi="Times New Roman" w:eastAsia="宋体"/>
+                <w:b/>
+                <w:color w:val="000000"/>
+                <w:sz w:val="20"/>
+              </w:rPr>
+              <w:t xml:space="preserve">顺序</w:t>
+            </w:r>
+          </w:p>
+        </w:tc>
+        <w:tc>
+          <w:tcPr>
+            <w:tcW w:w="1074" w:type="dxa"/>
+            <w:tcBorders>
+              <w:top w:val="single" w:sz="10" w:color="000000"/>
+              <w:start w:val="nil"/>
+              <w:bottom w:val="single" w:sz="4" w:color="000000"/>
+              <w:end w:val="nil"/>
+              <w:insideH w:val="nil"/>
+              <w:insideV w:val="nil"/>
+            </w:tcBorders>
+            <w:tcMar>
+              <w:top w:w="55" w:type="dxa"/>
+              <w:start w:w="70" w:type="dxa"/>
+              <w:bottom w:w="55" w:type="dxa"/>
+              <w:end w:w="70" w:type="dxa"/>
+            </w:tcMar>
+            <w:vAlign w:val="center"/>
+          </w:tcPr>
+          <w:p>
+            <w:pPr>
+              <w:keepNext/>
+              <w:spacing w:line="276" w:lineRule="auto" w:before="0" w:after="0"/>
+              <w:ind w:firstLine="0"/>
+              <w:jc w:val="center"/>
+            </w:pPr>
+            <w:r>
+              <w:rPr>
+                <w:rFonts w:ascii="Times New Roman" w:hAnsi="Times New Roman" w:eastAsia="宋体"/>
+                <w:b/>
+                <w:color w:val="000000"/>
+                <w:sz w:val="20"/>
+              </w:rPr>
+              <w:t xml:space="preserve">C </w:t>
+            </w:r>
+            <w:r>
+              <w:rPr>
+                <w:rFonts w:hint="eastAsia" w:ascii="Times New Roman" w:hAnsi="Times New Roman" w:eastAsia="宋体"/>
+                <w:b/>
+                <w:color w:val="000000"/>
+                <w:sz w:val="20"/>
+              </w:rPr>
+              <w:t xml:space="preserve">顺序</w:t>
+            </w:r>
+          </w:p>
+        </w:tc>
+        <w:tc>
+          <w:tcPr>
+            <w:tcW w:w="895" w:type="dxa"/>
+            <w:tcBorders>
+              <w:top w:val="single" w:sz="10" w:color="000000"/>
+              <w:start w:val="nil"/>
+              <w:bottom w:val="single" w:sz="4" w:color="000000"/>
+              <w:end w:val="nil"/>
+              <w:insideH w:val="nil"/>
+              <w:insideV w:val="nil"/>
+            </w:tcBorders>
+            <w:tcMar>
+              <w:top w:w="55" w:type="dxa"/>
+              <w:start w:w="70" w:type="dxa"/>
+              <w:bottom w:w="55" w:type="dxa"/>
+              <w:end w:w="70" w:type="dxa"/>
+            </w:tcMar>
+            <w:vAlign w:val="center"/>
+          </w:tcPr>
+          <w:p>
+            <w:pPr>
+              <w:keepNext/>
+              <w:spacing w:line="276" w:lineRule="auto" w:before="0" w:after="0"/>
+              <w:ind w:firstLine="0"/>
+              <w:jc w:val="center"/>
+            </w:pPr>
+            <w:r>
+              <w:rPr>
+                <w:rFonts w:hint="eastAsia" w:ascii="Times New Roman" w:hAnsi="Times New Roman" w:eastAsia="宋体"/>
+                <w:b/>
+                <w:color w:val="000000"/>
+                <w:sz w:val="20"/>
+              </w:rPr>
+              <w:t xml:space="preserve">迟到/个</w:t>
+            </w:r>
+          </w:p>
+        </w:tc>
+        <w:tc>
+          <w:tcPr>
+            <w:tcW w:w="1701" w:type="dxa"/>
+            <w:tcBorders>
+              <w:top w:val="single" w:sz="10" w:color="000000"/>
+              <w:start w:val="nil"/>
+              <w:bottom w:val="single" w:sz="4" w:color="000000"/>
+              <w:end w:val="nil"/>
+              <w:insideH w:val="nil"/>
+              <w:insideV w:val="nil"/>
+            </w:tcBorders>
+            <w:tcMar>
+              <w:top w:w="55" w:type="dxa"/>
+              <w:start w:w="70" w:type="dxa"/>
+              <w:bottom w:w="55" w:type="dxa"/>
+              <w:end w:w="70" w:type="dxa"/>
+            </w:tcMar>
+            <w:vAlign w:val="center"/>
+          </w:tcPr>
+          <w:p>
+            <w:pPr>
+              <w:keepNext/>
+              <w:spacing w:line="276" w:lineRule="auto" w:before="0" w:after="0"/>
+              <w:ind w:firstLine="0"/>
+              <w:jc w:val="center"/>
+            </w:pPr>
+            <w:r>
+              <w:rPr>
+                <w:rFonts w:hint="eastAsia" w:ascii="Times New Roman" w:hAnsi="Times New Roman" w:eastAsia="宋体"/>
+                <w:b/>
+                <w:color w:val="000000"/>
+                <w:sz w:val="20"/>
+              </w:rPr>
+              <w:t xml:space="preserve">综合成本/元</w:t>
+            </w:r>
+          </w:p>
+        </w:tc>
+        <w:tc>
+          <w:tcPr>
+            <w:tcW w:w="1164" w:type="dxa"/>
+            <w:tcBorders>
+              <w:top w:val="single" w:sz="10" w:color="000000"/>
+              <w:start w:val="nil"/>
+              <w:bottom w:val="single" w:sz="4" w:color="000000"/>
+              <w:end w:val="nil"/>
+              <w:insideH w:val="nil"/>
+              <w:insideV w:val="nil"/>
+            </w:tcBorders>
+            <w:tcMar>
+              <w:top w:w="55" w:type="dxa"/>
+              <w:start w:w="70" w:type="dxa"/>
+              <w:bottom w:w="55" w:type="dxa"/>
+              <w:end w:w="70" w:type="dxa"/>
+            </w:tcMar>
+            <w:vAlign w:val="center"/>
+          </w:tcPr>
+          <w:p>
+            <w:pPr>
+              <w:keepNext/>
+              <w:spacing w:line="276" w:lineRule="auto" w:before="0" w:after="0"/>
+              <w:ind w:firstLine="0"/>
+              <w:jc w:val="center"/>
+            </w:pPr>
+            <w:r>
+              <w:rPr>
+                <w:rFonts w:hint="eastAsia" w:ascii="Times New Roman" w:hAnsi="Times New Roman" w:eastAsia="宋体"/>
+                <w:b/>
+                <w:color w:val="000000"/>
+                <w:sz w:val="20"/>
+              </w:rPr>
+              <w:t xml:space="preserve">正常可行</w:t>
+            </w:r>
+          </w:p>
+        </w:tc>
+        <w:tc>
+          <w:tcPr>
+            <w:tcW w:w="1343" w:type="dxa"/>
+            <w:tcBorders>
+              <w:top w:val="single" w:sz="10" w:color="000000"/>
+              <w:start w:val="nil"/>
+              <w:bottom w:val="single" w:sz="4" w:color="000000"/>
+              <w:end w:val="nil"/>
+              <w:insideH w:val="nil"/>
+              <w:insideV w:val="nil"/>
+            </w:tcBorders>
+            <w:tcMar>
+              <w:top w:w="55" w:type="dxa"/>
+              <w:start w:w="70" w:type="dxa"/>
+              <w:bottom w:w="55" w:type="dxa"/>
+              <w:end w:w="70" w:type="dxa"/>
+            </w:tcMar>
+            <w:vAlign w:val="center"/>
+          </w:tcPr>
+          <w:p>
+            <w:pPr>
+              <w:keepNext/>
+              <w:spacing w:line="276" w:lineRule="auto" w:before="0" w:after="0"/>
+              <w:ind w:firstLine="0"/>
+              <w:jc w:val="center"/>
+            </w:pPr>
+            <w:r>
+              <w:rPr>
+                <w:rFonts w:hint="eastAsia" w:ascii="Times New Roman" w:hAnsi="Times New Roman" w:eastAsia="宋体"/>
+                <w:b/>
+                <w:color w:val="000000"/>
+                <w:sz w:val="20"/>
+              </w:rPr>
+              <w:t xml:space="preserve">静态封路可行</w:t>
+            </w:r>
+          </w:p>
+        </w:tc>
+      </w:tr>
+      <w:tr>
+        <w:trPr>
+          <w:cantSplit/>
+        </w:trPr>
+        <w:tc>
+          <w:tcPr>
+            <w:tcW w:w="627" w:type="dxa"/>
+            <w:tcBorders>
+              <w:top w:val="nil"/>
+              <w:start w:val="nil"/>
+              <w:bottom w:val="nil"/>
+              <w:end w:val="nil"/>
+              <w:insideH w:val="nil"/>
+              <w:insideV w:val="nil"/>
+            </w:tcBorders>
+            <w:tcMar>
+              <w:top w:w="55" w:type="dxa"/>
+              <w:start w:w="70" w:type="dxa"/>
+              <w:bottom w:w="55" w:type="dxa"/>
+              <w:end w:w="70" w:type="dxa"/>
+            </w:tcMar>
+            <w:vAlign w:val="center"/>
+          </w:tcPr>
+          <w:p>
+            <w:pPr>
+              <w:keepNext/>
+              <w:spacing w:line="276" w:lineRule="auto" w:before="0" w:after="0"/>
+              <w:ind w:firstLine="0"/>
+              <w:jc w:val="center"/>
+            </w:pPr>
+            <w:r>
+              <w:rPr>
+                <w:rFonts w:ascii="Times New Roman" w:hAnsi="Times New Roman" w:eastAsia="宋体"/>
+                <w:b w:val="0"/>
+                <w:color w:val="000000"/>
+                <w:sz w:val="20"/>
+              </w:rPr>
+              <w:t xml:space="preserve">1</w:t>
+            </w:r>
+          </w:p>
+        </w:tc>
+        <w:tc>
+          <w:tcPr>
+            <w:tcW w:w="1074" w:type="dxa"/>
+            <w:tcBorders>
+              <w:top w:val="nil"/>
+              <w:start w:val="nil"/>
+              <w:bottom w:val="nil"/>
+              <w:end w:val="nil"/>
+              <w:insideH w:val="nil"/>
+              <w:insideV w:val="nil"/>
+            </w:tcBorders>
+            <w:tcMar>
+              <w:top w:w="55" w:type="dxa"/>
+              <w:start w:w="70" w:type="dxa"/>
+              <w:bottom w:w="55" w:type="dxa"/>
+              <w:end w:w="70" w:type="dxa"/>
+            </w:tcMar>
+            <w:vAlign w:val="center"/>
+          </w:tcPr>
+          <w:p>
+            <w:pPr>
+              <w:keepNext/>
+              <w:spacing w:line="276" w:lineRule="auto" w:before="0" w:after="0"/>
+              <w:ind w:firstLine="0"/>
+              <w:jc w:val="center"/>
+            </w:pPr>
+            <m:oMath>
+              <m:r>
+                <m:t>4</m:t>
+              </m:r>
+              <m:r>
+                <m:rPr>
+                  <m:sty m:val="p"/>
+                </m:rPr>
+                <m:t>→</m:t>
+              </m:r>
+              <m:r>
+                <m:t>6</m:t>
+              </m:r>
+            </m:oMath>
+          </w:p>
+        </w:tc>
+        <w:tc>
+          <w:tcPr>
+            <w:tcW w:w="1074" w:type="dxa"/>
+            <w:tcBorders>
+              <w:top w:val="nil"/>
+              <w:start w:val="nil"/>
+              <w:bottom w:val="nil"/>
+              <w:end w:val="nil"/>
+              <w:insideH w:val="nil"/>
+              <w:insideV w:val="nil"/>
+            </w:tcBorders>
+            <w:tcMar>
+              <w:top w:w="55" w:type="dxa"/>
+              <w:start w:w="70" w:type="dxa"/>
+              <w:bottom w:w="55" w:type="dxa"/>
+              <w:end w:w="70" w:type="dxa"/>
+            </w:tcMar>
+            <w:vAlign w:val="center"/>
+          </w:tcPr>
+          <w:p>
+            <w:pPr>
+              <w:keepNext/>
+              <w:spacing w:line="276" w:lineRule="auto" w:before="0" w:after="0"/>
+              <w:ind w:firstLine="0"/>
+              <w:jc w:val="center"/>
+            </w:pPr>
+            <m:oMath>
+              <m:r>
+                <m:t>5</m:t>
+              </m:r>
+              <m:r>
+                <m:rPr>
+                  <m:sty m:val="p"/>
+                </m:rPr>
+                <m:t>→</m:t>
+              </m:r>
+              <m:r>
+                <m:t>8</m:t>
+              </m:r>
+            </m:oMath>
+          </w:p>
+        </w:tc>
+        <w:tc>
+          <w:tcPr>
+            <w:tcW w:w="1074" w:type="dxa"/>
+            <w:tcBorders>
+              <w:top w:val="nil"/>
+              <w:start w:val="nil"/>
+              <w:bottom w:val="nil"/>
+              <w:end w:val="nil"/>
+              <w:insideH w:val="nil"/>
+              <w:insideV w:val="nil"/>
+            </w:tcBorders>
+            <w:tcMar>
+              <w:top w:w="55" w:type="dxa"/>
+              <w:start w:w="70" w:type="dxa"/>
+              <w:bottom w:w="55" w:type="dxa"/>
+              <w:end w:w="70" w:type="dxa"/>
+            </w:tcMar>
+            <w:vAlign w:val="center"/>
+          </w:tcPr>
+          <w:p>
+            <w:pPr>
+              <w:keepNext/>
+              <w:spacing w:line="276" w:lineRule="auto" w:before="0" w:after="0"/>
+              <w:ind w:firstLine="0"/>
+              <w:jc w:val="center"/>
+            </w:pPr>
+            <m:oMath>
+              <m:r>
+                <m:t>7</m:t>
+              </m:r>
+              <m:r>
+                <m:rPr>
+                  <m:sty m:val="p"/>
+                </m:rPr>
+                <m:t>→</m:t>
+              </m:r>
+              <m:r>
+                <m:t>9</m:t>
+              </m:r>
+            </m:oMath>
+          </w:p>
+        </w:tc>
+        <w:tc>
+          <w:tcPr>
+            <w:tcW w:w="895" w:type="dxa"/>
+            <w:tcBorders>
+              <w:top w:val="nil"/>
+              <w:start w:val="nil"/>
+              <w:bottom w:val="nil"/>
+              <w:end w:val="nil"/>
+              <w:insideH w:val="nil"/>
+              <w:insideV w:val="nil"/>
+            </w:tcBorders>
+            <w:tcMar>
+              <w:top w:w="55" w:type="dxa"/>
+              <w:start w:w="70" w:type="dxa"/>
+              <w:bottom w:w="55" w:type="dxa"/>
+              <w:end w:w="70" w:type="dxa"/>
+            </w:tcMar>
+            <w:vAlign w:val="center"/>
+          </w:tcPr>
+          <w:p>
+            <w:pPr>
+              <w:keepNext/>
+              <w:spacing w:line="276" w:lineRule="auto" w:before="0" w:after="0"/>
+              <w:ind w:firstLine="0"/>
+              <w:jc w:val="center"/>
+            </w:pPr>
+            <w:r>
+              <w:rPr>
+                <w:rFonts w:ascii="Times New Roman" w:hAnsi="Times New Roman" w:eastAsia="宋体"/>
+                <w:b w:val="0"/>
+                <w:color w:val="000000"/>
+                <w:sz w:val="20"/>
+              </w:rPr>
+              <w:t xml:space="preserve">0</w:t>
+            </w:r>
+          </w:p>
+        </w:tc>
+        <w:tc>
+          <w:tcPr>
+            <w:tcW w:w="1701" w:type="dxa"/>
+            <w:tcBorders>
+              <w:top w:val="nil"/>
+              <w:start w:val="nil"/>
+              <w:bottom w:val="nil"/>
+              <w:end w:val="nil"/>
+              <w:insideH w:val="nil"/>
+              <w:insideV w:val="nil"/>
+            </w:tcBorders>
+            <w:tcMar>
+              <w:top w:w="55" w:type="dxa"/>
+              <w:start w:w="70" w:type="dxa"/>
+              <w:bottom w:w="55" w:type="dxa"/>
+              <w:end w:w="70" w:type="dxa"/>
+            </w:tcMar>
+            <w:vAlign w:val="center"/>
+          </w:tcPr>
+          <w:p>
+            <w:pPr>
+              <w:keepNext/>
+              <w:spacing w:line="276" w:lineRule="auto" w:before="0" w:after="0"/>
+              <w:ind w:firstLine="0"/>
+              <w:jc w:val="center"/>
+            </w:pPr>
+            <w:r>
+              <w:rPr>
+                <w:rFonts w:ascii="Times New Roman" w:hAnsi="Times New Roman" w:eastAsia="宋体"/>
+                <w:b w:val="0"/>
+                <w:color w:val="000000"/>
+                <w:sz w:val="20"/>
+              </w:rPr>
+              <w:t xml:space="preserve">420.5380</w:t>
+            </w:r>
+          </w:p>
+        </w:tc>
+        <w:tc>
+          <w:tcPr>
+            <w:tcW w:w="1164" w:type="dxa"/>
+            <w:tcBorders>
+              <w:top w:val="nil"/>
+              <w:start w:val="nil"/>
+              <w:bottom w:val="nil"/>
+              <w:end w:val="nil"/>
+              <w:insideH w:val="nil"/>
+              <w:insideV w:val="nil"/>
+            </w:tcBorders>
+            <w:tcMar>
+              <w:top w:w="55" w:type="dxa"/>
+              <w:start w:w="70" w:type="dxa"/>
+              <w:bottom w:w="55" w:type="dxa"/>
+              <w:end w:w="70" w:type="dxa"/>
+            </w:tcMar>
+            <w:vAlign w:val="center"/>
+          </w:tcPr>
+          <w:p>
+            <w:pPr>
+              <w:keepNext/>
+              <w:spacing w:line="276" w:lineRule="auto" w:before="0" w:after="0"/>
+              <w:ind w:firstLine="0"/>
+              <w:jc w:val="center"/>
+            </w:pPr>
+            <w:r>
+              <w:rPr>
+                <w:rFonts w:hint="eastAsia" w:ascii="Times New Roman" w:hAnsi="Times New Roman" w:eastAsia="宋体"/>
+                <w:b w:val="0"/>
+                <w:color w:val="000000"/>
+                <w:sz w:val="20"/>
+              </w:rPr>
+              <w:t xml:space="preserve">是</w:t>
+            </w:r>
+          </w:p>
+        </w:tc>
+        <w:tc>
+          <w:tcPr>
+            <w:tcW w:w="1343" w:type="dxa"/>
+            <w:tcBorders>
+              <w:top w:val="nil"/>
+              <w:start w:val="nil"/>
+              <w:bottom w:val="nil"/>
+              <w:end w:val="nil"/>
+              <w:insideH w:val="nil"/>
+              <w:insideV w:val="nil"/>
+            </w:tcBorders>
+            <w:tcMar>
+              <w:top w:w="55" w:type="dxa"/>
+              <w:start w:w="70" w:type="dxa"/>
+              <w:bottom w:w="55" w:type="dxa"/>
+              <w:end w:w="70" w:type="dxa"/>
+            </w:tcMar>
+            <w:vAlign w:val="center"/>
+          </w:tcPr>
+          <w:p>
+            <w:pPr>
+              <w:keepNext/>
+              <w:spacing w:line="276" w:lineRule="auto" w:before="0" w:after="0"/>
+              <w:ind w:firstLine="0"/>
+              <w:jc w:val="center"/>
+            </w:pPr>
+            <w:r>
+              <w:rPr>
+                <w:rFonts w:hint="eastAsia" w:ascii="Times New Roman" w:hAnsi="Times New Roman" w:eastAsia="宋体"/>
+                <w:b w:val="0"/>
+                <w:color w:val="000000"/>
+                <w:sz w:val="20"/>
+              </w:rPr>
+              <w:t xml:space="preserve">是</w:t>
+            </w:r>
+          </w:p>
+        </w:tc>
+      </w:tr>
+      <w:tr>
+        <w:trPr>
+          <w:cantSplit/>
+        </w:trPr>
+        <w:tc>
+          <w:tcPr>
+            <w:tcW w:w="627" w:type="dxa"/>
+            <w:tcBorders>
+              <w:top w:val="nil"/>
+              <w:start w:val="nil"/>
+              <w:bottom w:val="nil"/>
+              <w:end w:val="nil"/>
+              <w:insideH w:val="nil"/>
+              <w:insideV w:val="nil"/>
+            </w:tcBorders>
+            <w:tcMar>
+              <w:top w:w="55" w:type="dxa"/>
+              <w:start w:w="70" w:type="dxa"/>
+              <w:bottom w:w="55" w:type="dxa"/>
+              <w:end w:w="70" w:type="dxa"/>
+            </w:tcMar>
+            <w:vAlign w:val="center"/>
+          </w:tcPr>
+          <w:p>
+            <w:pPr>
+              <w:keepNext/>
+              <w:spacing w:line="276" w:lineRule="auto" w:before="0" w:after="0"/>
+              <w:ind w:firstLine="0"/>
+              <w:jc w:val="center"/>
+            </w:pPr>
+            <w:r>
+              <w:rPr>
+                <w:rFonts w:ascii="Times New Roman" w:hAnsi="Times New Roman" w:eastAsia="宋体"/>
+                <w:b w:val="0"/>
+                <w:bCs/>
+                <w:color w:val="000000"/>
+                <w:sz w:val="20"/>
+              </w:rPr>
+              <w:t xml:space="preserve">2</w:t>
+            </w:r>
+          </w:p>
+        </w:tc>
+        <w:tc>
+          <w:tcPr>
+            <w:tcW w:w="1074" w:type="dxa"/>
+            <w:tcBorders>
+              <w:top w:val="nil"/>
+              <w:start w:val="nil"/>
+              <w:bottom w:val="nil"/>
+              <w:end w:val="nil"/>
+              <w:insideH w:val="nil"/>
+              <w:insideV w:val="nil"/>
+            </w:tcBorders>
+            <w:tcMar>
+              <w:top w:w="55" w:type="dxa"/>
+              <w:start w:w="70" w:type="dxa"/>
+              <w:bottom w:w="55" w:type="dxa"/>
+              <w:end w:w="70" w:type="dxa"/>
+            </w:tcMar>
+            <w:vAlign w:val="center"/>
+          </w:tcPr>
+          <w:p>
+            <w:pPr>
+              <w:keepNext/>
+              <w:spacing w:line="276" w:lineRule="auto" w:before="0" w:after="0"/>
+              <w:ind w:firstLine="0"/>
+              <w:jc w:val="center"/>
+            </w:pPr>
+            <m:oMath>
+              <m:r>
+                <m:t>4</m:t>
+              </m:r>
+              <m:r>
+                <m:rPr>
+                  <m:sty m:val="p"/>
+                </m:rPr>
+                <m:t>→</m:t>
+              </m:r>
+              <m:r>
+                <m:t>6</m:t>
+              </m:r>
+            </m:oMath>
+          </w:p>
+        </w:tc>
+        <w:tc>
+          <w:tcPr>
+            <w:tcW w:w="1074" w:type="dxa"/>
+            <w:tcBorders>
+              <w:top w:val="nil"/>
+              <w:start w:val="nil"/>
+              <w:bottom w:val="nil"/>
+              <w:end w:val="nil"/>
+              <w:insideH w:val="nil"/>
+              <w:insideV w:val="nil"/>
+            </w:tcBorders>
+            <w:tcMar>
+              <w:top w:w="55" w:type="dxa"/>
+              <w:start w:w="70" w:type="dxa"/>
+              <w:bottom w:w="55" w:type="dxa"/>
+              <w:end w:w="70" w:type="dxa"/>
+            </w:tcMar>
+            <w:vAlign w:val="center"/>
+          </w:tcPr>
+          <w:p>
+            <w:pPr>
+              <w:keepNext/>
+              <w:spacing w:line="276" w:lineRule="auto" w:before="0" w:after="0"/>
+              <w:ind w:firstLine="0"/>
+              <w:jc w:val="center"/>
+            </w:pPr>
+            <m:oMath>
+              <m:r>
+                <m:t>5</m:t>
+              </m:r>
+              <m:r>
+                <m:rPr>
+                  <m:sty m:val="p"/>
+                </m:rPr>
+                <m:t>→</m:t>
+              </m:r>
+              <m:r>
+                <m:t>8</m:t>
+              </m:r>
+            </m:oMath>
+          </w:p>
+        </w:tc>
+        <w:tc>
+          <w:tcPr>
+            <w:tcW w:w="1074" w:type="dxa"/>
+            <w:tcBorders>
+              <w:top w:val="nil"/>
+              <w:start w:val="nil"/>
+              <w:bottom w:val="nil"/>
+              <w:end w:val="nil"/>
+              <w:insideH w:val="nil"/>
+              <w:insideV w:val="nil"/>
+            </w:tcBorders>
+            <w:tcMar>
+              <w:top w:w="55" w:type="dxa"/>
+              <w:start w:w="70" w:type="dxa"/>
+              <w:bottom w:w="55" w:type="dxa"/>
+              <w:end w:w="70" w:type="dxa"/>
+            </w:tcMar>
+            <w:vAlign w:val="center"/>
+          </w:tcPr>
+          <w:p>
+            <w:pPr>
+              <w:keepNext/>
+              <w:spacing w:line="276" w:lineRule="auto" w:before="0" w:after="0"/>
+              <w:ind w:firstLine="0"/>
+              <w:jc w:val="center"/>
+            </w:pPr>
+            <m:oMath>
+              <m:r>
+                <m:t>9</m:t>
+              </m:r>
+              <m:r>
+                <m:rPr>
+                  <m:sty m:val="p"/>
+                </m:rPr>
+                <m:t>→</m:t>
+              </m:r>
+              <m:r>
+                <m:t>7</m:t>
+              </m:r>
+            </m:oMath>
+          </w:p>
+        </w:tc>
+        <w:tc>
+          <w:tcPr>
+            <w:tcW w:w="895" w:type="dxa"/>
+            <w:tcBorders>
+              <w:top w:val="nil"/>
+              <w:start w:val="nil"/>
+              <w:bottom w:val="nil"/>
+              <w:end w:val="nil"/>
+              <w:insideH w:val="nil"/>
+              <w:insideV w:val="nil"/>
+            </w:tcBorders>
+            <w:tcMar>
+              <w:top w:w="55" w:type="dxa"/>
+              <w:start w:w="70" w:type="dxa"/>
+              <w:bottom w:w="55" w:type="dxa"/>
+              <w:end w:w="70" w:type="dxa"/>
+            </w:tcMar>
+            <w:vAlign w:val="center"/>
+          </w:tcPr>
+          <w:p>
+            <w:pPr>
+              <w:keepNext/>
+              <w:spacing w:line="276" w:lineRule="auto" w:before="0" w:after="0"/>
+              <w:ind w:firstLine="0"/>
+              <w:jc w:val="center"/>
+            </w:pPr>
+            <w:r>
+              <w:rPr>
+                <w:rFonts w:ascii="Times New Roman" w:hAnsi="Times New Roman" w:eastAsia="宋体"/>
+                <w:b w:val="0"/>
+                <w:bCs/>
+                <w:color w:val="000000"/>
+                <w:sz w:val="20"/>
+              </w:rPr>
+              <w:t xml:space="preserve">0</w:t>
+            </w:r>
+          </w:p>
+        </w:tc>
+        <w:tc>
+          <w:tcPr>
+            <w:tcW w:w="1701" w:type="dxa"/>
+            <w:tcBorders>
+              <w:top w:val="nil"/>
+              <w:start w:val="nil"/>
+              <w:bottom w:val="nil"/>
+              <w:end w:val="nil"/>
+              <w:insideH w:val="nil"/>
+              <w:insideV w:val="nil"/>
+            </w:tcBorders>
+            <w:tcMar>
+              <w:top w:w="55" w:type="dxa"/>
+              <w:start w:w="70" w:type="dxa"/>
+              <w:bottom w:w="55" w:type="dxa"/>
+              <w:end w:w="70" w:type="dxa"/>
+            </w:tcMar>
+            <w:vAlign w:val="center"/>
+          </w:tcPr>
+          <w:p>
+            <w:pPr>
+              <w:keepNext/>
+              <w:spacing w:line="276" w:lineRule="auto" w:before="0" w:after="0"/>
+              <w:ind w:firstLine="0"/>
+              <w:jc w:val="center"/>
+            </w:pPr>
+            <w:r>
+              <w:rPr>
+                <w:rFonts w:ascii="Times New Roman" w:hAnsi="Times New Roman" w:eastAsia="宋体"/>
+                <w:b w:val="0"/>
+                <w:bCs/>
+                <w:color w:val="000000"/>
+                <w:sz w:val="20"/>
+              </w:rPr>
+              <w:t xml:space="preserve">415.4852</w:t>
+            </w:r>
+          </w:p>
+        </w:tc>
+        <w:tc>
+          <w:tcPr>
+            <w:tcW w:w="1164" w:type="dxa"/>
+            <w:tcBorders>
+              <w:top w:val="nil"/>
+              <w:start w:val="nil"/>
+              <w:bottom w:val="nil"/>
+              <w:end w:val="nil"/>
+              <w:insideH w:val="nil"/>
+              <w:insideV w:val="nil"/>
+            </w:tcBorders>
+            <w:tcMar>
+              <w:top w:w="55" w:type="dxa"/>
+              <w:start w:w="70" w:type="dxa"/>
+              <w:bottom w:w="55" w:type="dxa"/>
+              <w:end w:w="70" w:type="dxa"/>
+            </w:tcMar>
+            <w:vAlign w:val="center"/>
+          </w:tcPr>
+          <w:p>
+            <w:pPr>
+              <w:keepNext/>
+              <w:spacing w:line="276" w:lineRule="auto" w:before="0" w:after="0"/>
+              <w:ind w:firstLine="0"/>
+              <w:jc w:val="center"/>
+            </w:pPr>
+            <w:r>
+              <w:rPr>
+                <w:rFonts w:hint="eastAsia" w:ascii="Times New Roman" w:hAnsi="Times New Roman" w:eastAsia="宋体"/>
+                <w:b w:val="0"/>
+                <w:bCs/>
+                <w:color w:val="000000"/>
+                <w:sz w:val="20"/>
+              </w:rPr>
+              <w:t xml:space="preserve">是</w:t>
+            </w:r>
+          </w:p>
+        </w:tc>
+        <w:tc>
+          <w:tcPr>
+            <w:tcW w:w="1343" w:type="dxa"/>
+            <w:tcBorders>
+              <w:top w:val="nil"/>
+              <w:start w:val="nil"/>
+              <w:bottom w:val="nil"/>
+              <w:end w:val="nil"/>
+              <w:insideH w:val="nil"/>
+              <w:insideV w:val="nil"/>
+            </w:tcBorders>
+            <w:tcMar>
+              <w:top w:w="55" w:type="dxa"/>
+              <w:start w:w="70" w:type="dxa"/>
+              <w:bottom w:w="55" w:type="dxa"/>
+              <w:end w:w="70" w:type="dxa"/>
+            </w:tcMar>
+            <w:vAlign w:val="center"/>
+          </w:tcPr>
+          <w:p>
+            <w:pPr>
+              <w:keepNext/>
+              <w:spacing w:line="276" w:lineRule="auto" w:before="0" w:after="0"/>
+              <w:ind w:firstLine="0"/>
+              <w:jc w:val="center"/>
+            </w:pPr>
+            <w:r>
+              <w:rPr>
+                <w:rFonts w:hint="eastAsia" w:ascii="Times New Roman" w:hAnsi="Times New Roman" w:eastAsia="宋体"/>
+                <w:b w:val="0"/>
+                <w:bCs/>
+                <w:color w:val="000000"/>
+                <w:sz w:val="20"/>
+              </w:rPr>
+              <w:t xml:space="preserve">是</w:t>
+            </w:r>
+          </w:p>
+        </w:tc>
+      </w:tr>
+      <w:tr>
+        <w:trPr>
+          <w:cantSplit/>
+        </w:trPr>
+        <w:tc>
+          <w:tcPr>
+            <w:tcW w:w="627" w:type="dxa"/>
+            <w:tcBorders>
+              <w:top w:val="nil"/>
+              <w:start w:val="nil"/>
+              <w:bottom w:val="nil"/>
+              <w:end w:val="nil"/>
+              <w:insideH w:val="nil"/>
+              <w:insideV w:val="nil"/>
+            </w:tcBorders>
+            <w:tcMar>
+              <w:top w:w="55" w:type="dxa"/>
+              <w:start w:w="70" w:type="dxa"/>
+              <w:bottom w:w="55" w:type="dxa"/>
+              <w:end w:w="70" w:type="dxa"/>
+            </w:tcMar>
+            <w:vAlign w:val="center"/>
+          </w:tcPr>
+          <w:p>
+            <w:pPr>
+              <w:keepNext/>
+              <w:spacing w:line="276" w:lineRule="auto" w:before="0" w:after="0"/>
+              <w:ind w:firstLine="0"/>
+              <w:jc w:val="center"/>
+            </w:pPr>
+            <w:r>
+              <w:rPr>
+                <w:rFonts w:ascii="Times New Roman" w:hAnsi="Times New Roman" w:eastAsia="宋体"/>
+                <w:b w:val="0"/>
+                <w:color w:val="000000"/>
+                <w:sz w:val="20"/>
+              </w:rPr>
+              <w:t xml:space="preserve">3</w:t>
+            </w:r>
+          </w:p>
+        </w:tc>
+        <w:tc>
+          <w:tcPr>
+            <w:tcW w:w="1074" w:type="dxa"/>
+            <w:tcBorders>
+              <w:top w:val="nil"/>
+              <w:start w:val="nil"/>
+              <w:bottom w:val="nil"/>
+              <w:end w:val="nil"/>
+              <w:insideH w:val="nil"/>
+              <w:insideV w:val="nil"/>
+            </w:tcBorders>
+            <w:tcMar>
+              <w:top w:w="55" w:type="dxa"/>
+              <w:start w:w="70" w:type="dxa"/>
+              <w:bottom w:w="55" w:type="dxa"/>
+              <w:end w:w="70" w:type="dxa"/>
+            </w:tcMar>
+            <w:vAlign w:val="center"/>
+          </w:tcPr>
+          <w:p>
+            <w:pPr>
+              <w:keepNext/>
+              <w:spacing w:line="276" w:lineRule="auto" w:before="0" w:after="0"/>
+              <w:ind w:firstLine="0"/>
+              <w:jc w:val="center"/>
+            </w:pPr>
+            <m:oMath>
+              <m:r>
+                <m:t>4</m:t>
+              </m:r>
+              <m:r>
+                <m:rPr>
+                  <m:sty m:val="p"/>
+                </m:rPr>
+                <m:t>→</m:t>
+              </m:r>
+              <m:r>
+                <m:t>6</m:t>
+              </m:r>
+            </m:oMath>
+          </w:p>
+        </w:tc>
+        <w:tc>
+          <w:tcPr>
+            <w:tcW w:w="1074" w:type="dxa"/>
+            <w:tcBorders>
+              <w:top w:val="nil"/>
+              <w:start w:val="nil"/>
+              <w:bottom w:val="nil"/>
+              <w:end w:val="nil"/>
+              <w:insideH w:val="nil"/>
+              <w:insideV w:val="nil"/>
+            </w:tcBorders>
+            <w:tcMar>
+              <w:top w:w="55" w:type="dxa"/>
+              <w:start w:w="70" w:type="dxa"/>
+              <w:bottom w:w="55" w:type="dxa"/>
+              <w:end w:w="70" w:type="dxa"/>
+            </w:tcMar>
+            <w:vAlign w:val="center"/>
+          </w:tcPr>
+          <w:p>
+            <w:pPr>
+              <w:keepNext/>
+              <w:spacing w:line="276" w:lineRule="auto" w:before="0" w:after="0"/>
+              <w:ind w:firstLine="0"/>
+              <w:jc w:val="center"/>
+            </w:pPr>
+            <m:oMath>
+              <m:r>
+                <m:t>8</m:t>
+              </m:r>
+              <m:r>
+                <m:rPr>
+                  <m:sty m:val="p"/>
+                </m:rPr>
+                <m:t>→</m:t>
+              </m:r>
+              <m:r>
+                <m:t>5</m:t>
+              </m:r>
+            </m:oMath>
+          </w:p>
+        </w:tc>
+        <w:tc>
+          <w:tcPr>
+            <w:tcW w:w="1074" w:type="dxa"/>
+            <w:tcBorders>
+              <w:top w:val="nil"/>
+              <w:start w:val="nil"/>
+              <w:bottom w:val="nil"/>
+              <w:end w:val="nil"/>
+              <w:insideH w:val="nil"/>
+              <w:insideV w:val="nil"/>
+            </w:tcBorders>
+            <w:tcMar>
+              <w:top w:w="55" w:type="dxa"/>
+              <w:start w:w="70" w:type="dxa"/>
+              <w:bottom w:w="55" w:type="dxa"/>
+              <w:end w:w="70" w:type="dxa"/>
+            </w:tcMar>
+            <w:vAlign w:val="center"/>
+          </w:tcPr>
+          <w:p>
+            <w:pPr>
+              <w:keepNext/>
+              <w:spacing w:line="276" w:lineRule="auto" w:before="0" w:after="0"/>
+              <w:ind w:firstLine="0"/>
+              <w:jc w:val="center"/>
+            </w:pPr>
+            <m:oMath>
+              <m:r>
+                <m:t>7</m:t>
+              </m:r>
+              <m:r>
+                <m:rPr>
+                  <m:sty m:val="p"/>
+                </m:rPr>
+                <m:t>→</m:t>
+              </m:r>
+              <m:r>
+                <m:t>9</m:t>
+              </m:r>
+            </m:oMath>
+          </w:p>
+        </w:tc>
+        <w:tc>
+          <w:tcPr>
+            <w:tcW w:w="895" w:type="dxa"/>
+            <w:tcBorders>
+              <w:top w:val="nil"/>
+              <w:start w:val="nil"/>
+              <w:bottom w:val="nil"/>
+              <w:end w:val="nil"/>
+              <w:insideH w:val="nil"/>
+              <w:insideV w:val="nil"/>
+            </w:tcBorders>
+            <w:tcMar>
+              <w:top w:w="55" w:type="dxa"/>
+              <w:start w:w="70" w:type="dxa"/>
+              <w:bottom w:w="55" w:type="dxa"/>
+              <w:end w:w="70" w:type="dxa"/>
+            </w:tcMar>
+            <w:vAlign w:val="center"/>
+          </w:tcPr>
+          <w:p>
+            <w:pPr>
+              <w:keepNext/>
+              <w:spacing w:line="276" w:lineRule="auto" w:before="0" w:after="0"/>
+              <w:ind w:firstLine="0"/>
+              <w:jc w:val="center"/>
+            </w:pPr>
+            <w:r>
+              <w:rPr>
+                <w:rFonts w:ascii="Times New Roman" w:hAnsi="Times New Roman" w:eastAsia="宋体"/>
+                <w:b w:val="0"/>
+                <w:color w:val="000000"/>
+                <w:sz w:val="20"/>
+              </w:rPr>
+              <w:t xml:space="preserve">1</w:t>
+            </w:r>
+          </w:p>
+        </w:tc>
+        <w:tc>
+          <w:tcPr>
+            <w:tcW w:w="1701" w:type="dxa"/>
+            <w:tcBorders>
+              <w:top w:val="nil"/>
+              <w:start w:val="nil"/>
+              <w:bottom w:val="nil"/>
+              <w:end w:val="nil"/>
+              <w:insideH w:val="nil"/>
+              <w:insideV w:val="nil"/>
+            </w:tcBorders>
+            <w:tcMar>
+              <w:top w:w="55" w:type="dxa"/>
+              <w:start w:w="70" w:type="dxa"/>
+              <w:bottom w:w="55" w:type="dxa"/>
+              <w:end w:w="70" w:type="dxa"/>
+            </w:tcMar>
+            <w:vAlign w:val="center"/>
+          </w:tcPr>
+          <w:p>
+            <w:pPr>
+              <w:keepNext/>
+              <w:spacing w:line="276" w:lineRule="auto" w:before="0" w:after="0"/>
+              <w:ind w:firstLine="0"/>
+              <w:jc w:val="center"/>
+            </w:pPr>
+            <w:r>
+              <w:rPr>
+                <w:rFonts w:ascii="Times New Roman" w:hAnsi="Times New Roman" w:eastAsia="宋体"/>
+                <w:b w:val="0"/>
+                <w:color w:val="000000"/>
+                <w:sz w:val="20"/>
+              </w:rPr>
+              <w:t xml:space="preserve">569.5634</w:t>
+            </w:r>
+          </w:p>
+        </w:tc>
+        <w:tc>
+          <w:tcPr>
+            <w:tcW w:w="1164" w:type="dxa"/>
+            <w:tcBorders>
+              <w:top w:val="nil"/>
+              <w:start w:val="nil"/>
+              <w:bottom w:val="nil"/>
+              <w:end w:val="nil"/>
+              <w:insideH w:val="nil"/>
+              <w:insideV w:val="nil"/>
+            </w:tcBorders>
+            <w:tcMar>
+              <w:top w:w="55" w:type="dxa"/>
+              <w:start w:w="70" w:type="dxa"/>
+              <w:bottom w:w="55" w:type="dxa"/>
+              <w:end w:w="70" w:type="dxa"/>
+            </w:tcMar>
+            <w:vAlign w:val="center"/>
+          </w:tcPr>
+          <w:p>
+            <w:pPr>
+              <w:keepNext/>
+              <w:spacing w:line="276" w:lineRule="auto" w:before="0" w:after="0"/>
+              <w:ind w:firstLine="0"/>
+              <w:jc w:val="center"/>
+            </w:pPr>
+            <w:r>
+              <w:rPr>
+                <w:rFonts w:hint="eastAsia" w:ascii="Times New Roman" w:hAnsi="Times New Roman" w:eastAsia="宋体"/>
+                <w:b w:val="0"/>
+                <w:color w:val="000000"/>
+                <w:sz w:val="20"/>
+              </w:rPr>
+              <w:t xml:space="preserve">是</w:t>
+            </w:r>
+          </w:p>
+        </w:tc>
+        <w:tc>
+          <w:tcPr>
+            <w:tcW w:w="1343" w:type="dxa"/>
+            <w:tcBorders>
+              <w:top w:val="nil"/>
+              <w:start w:val="nil"/>
+              <w:bottom w:val="nil"/>
+              <w:end w:val="nil"/>
+              <w:insideH w:val="nil"/>
+              <w:insideV w:val="nil"/>
+            </w:tcBorders>
+            <w:tcMar>
+              <w:top w:w="55" w:type="dxa"/>
+              <w:start w:w="70" w:type="dxa"/>
+              <w:bottom w:w="55" w:type="dxa"/>
+              <w:end w:w="70" w:type="dxa"/>
+            </w:tcMar>
+            <w:vAlign w:val="center"/>
+          </w:tcPr>
+          <w:p>
+            <w:pPr>
+              <w:keepNext/>
+              <w:spacing w:line="276" w:lineRule="auto" w:before="0" w:after="0"/>
+              <w:ind w:firstLine="0"/>
+              <w:jc w:val="center"/>
+            </w:pPr>
+            <w:r>
+              <w:rPr>
+                <w:rFonts w:hint="eastAsia" w:ascii="Times New Roman" w:hAnsi="Times New Roman" w:eastAsia="宋体"/>
+                <w:b w:val="0"/>
+                <w:color w:val="000000"/>
+                <w:sz w:val="20"/>
+              </w:rPr>
+              <w:t xml:space="preserve">否</w:t>
+            </w:r>
+          </w:p>
+        </w:tc>
+      </w:tr>
+      <w:tr>
+        <w:trPr>
+          <w:cantSplit/>
+        </w:trPr>
+        <w:tc>
+          <w:tcPr>
+            <w:tcW w:w="627" w:type="dxa"/>
+            <w:tcBorders>
+              <w:top w:val="nil"/>
+              <w:start w:val="nil"/>
+              <w:bottom w:val="nil"/>
+              <w:end w:val="nil"/>
+              <w:insideH w:val="nil"/>
+              <w:insideV w:val="nil"/>
+            </w:tcBorders>
+            <w:tcMar>
+              <w:top w:w="55" w:type="dxa"/>
+              <w:start w:w="70" w:type="dxa"/>
+              <w:bottom w:w="55" w:type="dxa"/>
+              <w:end w:w="70" w:type="dxa"/>
+            </w:tcMar>
+            <w:vAlign w:val="center"/>
+          </w:tcPr>
+          <w:p>
+            <w:pPr>
+              <w:keepNext/>
+              <w:spacing w:line="276" w:lineRule="auto" w:before="0" w:after="0"/>
+              <w:ind w:firstLine="0"/>
+              <w:jc w:val="center"/>
+            </w:pPr>
+            <w:r>
+              <w:rPr>
+                <w:rFonts w:ascii="Times New Roman" w:hAnsi="Times New Roman" w:eastAsia="宋体"/>
+                <w:b w:val="0"/>
+                <w:color w:val="000000"/>
+                <w:sz w:val="20"/>
+              </w:rPr>
+              <w:t xml:space="preserve">4</w:t>
+            </w:r>
+          </w:p>
+        </w:tc>
+        <w:tc>
+          <w:tcPr>
+            <w:tcW w:w="1074" w:type="dxa"/>
+            <w:tcBorders>
+              <w:top w:val="nil"/>
+              <w:start w:val="nil"/>
+              <w:bottom w:val="nil"/>
+              <w:end w:val="nil"/>
+              <w:insideH w:val="nil"/>
+              <w:insideV w:val="nil"/>
+            </w:tcBorders>
+            <w:tcMar>
+              <w:top w:w="55" w:type="dxa"/>
+              <w:start w:w="70" w:type="dxa"/>
+              <w:bottom w:w="55" w:type="dxa"/>
+              <w:end w:w="70" w:type="dxa"/>
+            </w:tcMar>
+            <w:vAlign w:val="center"/>
+          </w:tcPr>
+          <w:p>
+            <w:pPr>
+              <w:keepNext/>
+              <w:spacing w:line="276" w:lineRule="auto" w:before="0" w:after="0"/>
+              <w:ind w:firstLine="0"/>
+              <w:jc w:val="center"/>
+            </w:pPr>
+            <m:oMath>
+              <m:r>
+                <m:t>4</m:t>
+              </m:r>
+              <m:r>
+                <m:rPr>
+                  <m:sty m:val="p"/>
+                </m:rPr>
+                <m:t>→</m:t>
+              </m:r>
+              <m:r>
+                <m:t>6</m:t>
+              </m:r>
+            </m:oMath>
+          </w:p>
+        </w:tc>
+        <w:tc>
+          <w:tcPr>
+            <w:tcW w:w="1074" w:type="dxa"/>
+            <w:tcBorders>
+              <w:top w:val="nil"/>
+              <w:start w:val="nil"/>
+              <w:bottom w:val="nil"/>
+              <w:end w:val="nil"/>
+              <w:insideH w:val="nil"/>
+              <w:insideV w:val="nil"/>
+            </w:tcBorders>
+            <w:tcMar>
+              <w:top w:w="55" w:type="dxa"/>
+              <w:start w:w="70" w:type="dxa"/>
+              <w:bottom w:w="55" w:type="dxa"/>
+              <w:end w:w="70" w:type="dxa"/>
+            </w:tcMar>
+            <w:vAlign w:val="center"/>
+          </w:tcPr>
+          <w:p>
+            <w:pPr>
+              <w:keepNext/>
+              <w:spacing w:line="276" w:lineRule="auto" w:before="0" w:after="0"/>
+              <w:ind w:firstLine="0"/>
+              <w:jc w:val="center"/>
+            </w:pPr>
+            <m:oMath>
+              <m:r>
+                <m:t>8</m:t>
+              </m:r>
+              <m:r>
+                <m:rPr>
+                  <m:sty m:val="p"/>
+                </m:rPr>
+                <m:t>→</m:t>
+              </m:r>
+              <m:r>
+                <m:t>5</m:t>
+              </m:r>
+            </m:oMath>
+          </w:p>
+        </w:tc>
+        <w:tc>
+          <w:tcPr>
+            <w:tcW w:w="1074" w:type="dxa"/>
+            <w:tcBorders>
+              <w:top w:val="nil"/>
+              <w:start w:val="nil"/>
+              <w:bottom w:val="nil"/>
+              <w:end w:val="nil"/>
+              <w:insideH w:val="nil"/>
+              <w:insideV w:val="nil"/>
+            </w:tcBorders>
+            <w:tcMar>
+              <w:top w:w="55" w:type="dxa"/>
+              <w:start w:w="70" w:type="dxa"/>
+              <w:bottom w:w="55" w:type="dxa"/>
+              <w:end w:w="70" w:type="dxa"/>
+            </w:tcMar>
+            <w:vAlign w:val="center"/>
+          </w:tcPr>
+          <w:p>
+            <w:pPr>
+              <w:keepNext/>
+              <w:spacing w:line="276" w:lineRule="auto" w:before="0" w:after="0"/>
+              <w:ind w:firstLine="0"/>
+              <w:jc w:val="center"/>
+            </w:pPr>
+            <m:oMath>
+              <m:r>
+                <m:t>9</m:t>
+              </m:r>
+              <m:r>
+                <m:rPr>
+                  <m:sty m:val="p"/>
+                </m:rPr>
+                <m:t>→</m:t>
+              </m:r>
+              <m:r>
+                <m:t>7</m:t>
+              </m:r>
+            </m:oMath>
+          </w:p>
+        </w:tc>
+        <w:tc>
+          <w:tcPr>
+            <w:tcW w:w="895" w:type="dxa"/>
+            <w:tcBorders>
+              <w:top w:val="nil"/>
+              <w:start w:val="nil"/>
+              <w:bottom w:val="nil"/>
+              <w:end w:val="nil"/>
+              <w:insideH w:val="nil"/>
+              <w:insideV w:val="nil"/>
+            </w:tcBorders>
+            <w:tcMar>
+              <w:top w:w="55" w:type="dxa"/>
+              <w:start w:w="70" w:type="dxa"/>
+              <w:bottom w:w="55" w:type="dxa"/>
+              <w:end w:w="70" w:type="dxa"/>
+            </w:tcMar>
+            <w:vAlign w:val="center"/>
+          </w:tcPr>
+          <w:p>
+            <w:pPr>
+              <w:keepNext/>
+              <w:spacing w:line="276" w:lineRule="auto" w:before="0" w:after="0"/>
+              <w:ind w:firstLine="0"/>
+              <w:jc w:val="center"/>
+            </w:pPr>
+            <w:r>
+              <w:rPr>
+                <w:rFonts w:ascii="Times New Roman" w:hAnsi="Times New Roman" w:eastAsia="宋体"/>
+                <w:b w:val="0"/>
+                <w:color w:val="000000"/>
+                <w:sz w:val="20"/>
+              </w:rPr>
+              <w:t xml:space="preserve">1</w:t>
+            </w:r>
+          </w:p>
+        </w:tc>
+        <w:tc>
+          <w:tcPr>
+            <w:tcW w:w="1701" w:type="dxa"/>
+            <w:tcBorders>
+              <w:top w:val="nil"/>
+              <w:start w:val="nil"/>
+              <w:bottom w:val="nil"/>
+              <w:end w:val="nil"/>
+              <w:insideH w:val="nil"/>
+              <w:insideV w:val="nil"/>
+            </w:tcBorders>
+            <w:tcMar>
+              <w:top w:w="55" w:type="dxa"/>
+              <w:start w:w="70" w:type="dxa"/>
+              <w:bottom w:w="55" w:type="dxa"/>
+              <w:end w:w="70" w:type="dxa"/>
+            </w:tcMar>
+            <w:vAlign w:val="center"/>
+          </w:tcPr>
+          <w:p>
+            <w:pPr>
+              <w:keepNext/>
+              <w:spacing w:line="276" w:lineRule="auto" w:before="0" w:after="0"/>
+              <w:ind w:firstLine="0"/>
+              <w:jc w:val="center"/>
+            </w:pPr>
+            <w:r>
+              <w:rPr>
+                <w:rFonts w:ascii="Times New Roman" w:hAnsi="Times New Roman" w:eastAsia="宋体"/>
+                <w:b w:val="0"/>
+                <w:color w:val="000000"/>
+                <w:sz w:val="20"/>
+              </w:rPr>
+              <w:t xml:space="preserve">564.5106</w:t>
+            </w:r>
+          </w:p>
+        </w:tc>
+        <w:tc>
+          <w:tcPr>
+            <w:tcW w:w="1164" w:type="dxa"/>
+            <w:tcBorders>
+              <w:top w:val="nil"/>
+              <w:start w:val="nil"/>
+              <w:bottom w:val="nil"/>
+              <w:end w:val="nil"/>
+              <w:insideH w:val="nil"/>
+              <w:insideV w:val="nil"/>
+            </w:tcBorders>
+            <w:tcMar>
+              <w:top w:w="55" w:type="dxa"/>
+              <w:start w:w="70" w:type="dxa"/>
+              <w:bottom w:w="55" w:type="dxa"/>
+              <w:end w:w="70" w:type="dxa"/>
+            </w:tcMar>
+            <w:vAlign w:val="center"/>
+          </w:tcPr>
+          <w:p>
+            <w:pPr>
+              <w:keepNext/>
+              <w:spacing w:line="276" w:lineRule="auto" w:before="0" w:after="0"/>
+              <w:ind w:firstLine="0"/>
+              <w:jc w:val="center"/>
+            </w:pPr>
+            <w:r>
+              <w:rPr>
+                <w:rFonts w:hint="eastAsia" w:ascii="Times New Roman" w:hAnsi="Times New Roman" w:eastAsia="宋体"/>
+                <w:b w:val="0"/>
+                <w:color w:val="000000"/>
+                <w:sz w:val="20"/>
+              </w:rPr>
+              <w:t xml:space="preserve">是</w:t>
+            </w:r>
+          </w:p>
+        </w:tc>
+        <w:tc>
+          <w:tcPr>
+            <w:tcW w:w="1343" w:type="dxa"/>
+            <w:tcBorders>
+              <w:top w:val="nil"/>
+              <w:start w:val="nil"/>
+              <w:bottom w:val="nil"/>
+              <w:end w:val="nil"/>
+              <w:insideH w:val="nil"/>
+              <w:insideV w:val="nil"/>
+            </w:tcBorders>
+            <w:tcMar>
+              <w:top w:w="55" w:type="dxa"/>
+              <w:start w:w="70" w:type="dxa"/>
+              <w:bottom w:w="55" w:type="dxa"/>
+              <w:end w:w="70" w:type="dxa"/>
+            </w:tcMar>
+            <w:vAlign w:val="center"/>
+          </w:tcPr>
+          <w:p>
+            <w:pPr>
+              <w:keepNext/>
+              <w:spacing w:line="276" w:lineRule="auto" w:before="0" w:after="0"/>
+              <w:ind w:firstLine="0"/>
+              <w:jc w:val="center"/>
+            </w:pPr>
+            <w:r>
+              <w:rPr>
+                <w:rFonts w:hint="eastAsia" w:ascii="Times New Roman" w:hAnsi="Times New Roman" w:eastAsia="宋体"/>
+                <w:b w:val="0"/>
+                <w:color w:val="000000"/>
+                <w:sz w:val="20"/>
+              </w:rPr>
+              <w:t xml:space="preserve">否</w:t>
+            </w:r>
+          </w:p>
+        </w:tc>
+      </w:tr>
+      <w:tr>
+        <w:trPr>
+          <w:cantSplit/>
+        </w:trPr>
+        <w:tc>
+          <w:tcPr>
+            <w:tcW w:w="627" w:type="dxa"/>
+            <w:tcBorders>
+              <w:top w:val="nil"/>
+              <w:start w:val="nil"/>
+              <w:bottom w:val="nil"/>
+              <w:end w:val="nil"/>
+              <w:insideH w:val="nil"/>
+              <w:insideV w:val="nil"/>
+            </w:tcBorders>
+            <w:tcMar>
+              <w:top w:w="55" w:type="dxa"/>
+              <w:start w:w="70" w:type="dxa"/>
+              <w:bottom w:w="55" w:type="dxa"/>
+              <w:end w:w="70" w:type="dxa"/>
+            </w:tcMar>
+            <w:vAlign w:val="center"/>
+          </w:tcPr>
+          <w:p>
+            <w:pPr>
+              <w:keepNext/>
+              <w:spacing w:line="276" w:lineRule="auto" w:before="0" w:after="0"/>
+              <w:ind w:firstLine="0"/>
+              <w:jc w:val="center"/>
+            </w:pPr>
+            <w:r>
+              <w:rPr>
+                <w:rFonts w:ascii="Times New Roman" w:hAnsi="Times New Roman" w:eastAsia="宋体"/>
+                <w:b w:val="0"/>
+                <w:color w:val="000000"/>
+                <w:sz w:val="20"/>
+              </w:rPr>
+              <w:t xml:space="preserve">5</w:t>
+            </w:r>
+          </w:p>
+        </w:tc>
+        <w:tc>
+          <w:tcPr>
+            <w:tcW w:w="1074" w:type="dxa"/>
+            <w:tcBorders>
+              <w:top w:val="nil"/>
+              <w:start w:val="nil"/>
+              <w:bottom w:val="nil"/>
+              <w:end w:val="nil"/>
+              <w:insideH w:val="nil"/>
+              <w:insideV w:val="nil"/>
+            </w:tcBorders>
+            <w:tcMar>
+              <w:top w:w="55" w:type="dxa"/>
+              <w:start w:w="70" w:type="dxa"/>
+              <w:bottom w:w="55" w:type="dxa"/>
+              <w:end w:w="70" w:type="dxa"/>
+            </w:tcMar>
+            <w:vAlign w:val="center"/>
+          </w:tcPr>
+          <w:p>
+            <w:pPr>
+              <w:keepNext/>
+              <w:spacing w:line="276" w:lineRule="auto" w:before="0" w:after="0"/>
+              <w:ind w:firstLine="0"/>
+              <w:jc w:val="center"/>
+            </w:pPr>
+            <m:oMath>
+              <m:r>
+                <m:t>6</m:t>
+              </m:r>
+              <m:r>
+                <m:rPr>
+                  <m:sty m:val="p"/>
+                </m:rPr>
+                <m:t>→</m:t>
+              </m:r>
+              <m:r>
+                <m:t>4</m:t>
+              </m:r>
+            </m:oMath>
+          </w:p>
+        </w:tc>
+        <w:tc>
+          <w:tcPr>
+            <w:tcW w:w="1074" w:type="dxa"/>
+            <w:tcBorders>
+              <w:top w:val="nil"/>
+              <w:start w:val="nil"/>
+              <w:bottom w:val="nil"/>
+              <w:end w:val="nil"/>
+              <w:insideH w:val="nil"/>
+              <w:insideV w:val="nil"/>
+            </w:tcBorders>
+            <w:tcMar>
+              <w:top w:w="55" w:type="dxa"/>
+              <w:start w:w="70" w:type="dxa"/>
+              <w:bottom w:w="55" w:type="dxa"/>
+              <w:end w:w="70" w:type="dxa"/>
+            </w:tcMar>
+            <w:vAlign w:val="center"/>
+          </w:tcPr>
+          <w:p>
+            <w:pPr>
+              <w:keepNext/>
+              <w:spacing w:line="276" w:lineRule="auto" w:before="0" w:after="0"/>
+              <w:ind w:firstLine="0"/>
+              <w:jc w:val="center"/>
+            </w:pPr>
+            <m:oMath>
+              <m:r>
+                <m:t>5</m:t>
+              </m:r>
+              <m:r>
+                <m:rPr>
+                  <m:sty m:val="p"/>
+                </m:rPr>
+                <m:t>→</m:t>
+              </m:r>
+              <m:r>
+                <m:t>8</m:t>
+              </m:r>
+            </m:oMath>
+          </w:p>
+        </w:tc>
+        <w:tc>
+          <w:tcPr>
+            <w:tcW w:w="1074" w:type="dxa"/>
+            <w:tcBorders>
+              <w:top w:val="nil"/>
+              <w:start w:val="nil"/>
+              <w:bottom w:val="nil"/>
+              <w:end w:val="nil"/>
+              <w:insideH w:val="nil"/>
+              <w:insideV w:val="nil"/>
+            </w:tcBorders>
+            <w:tcMar>
+              <w:top w:w="55" w:type="dxa"/>
+              <w:start w:w="70" w:type="dxa"/>
+              <w:bottom w:w="55" w:type="dxa"/>
+              <w:end w:w="70" w:type="dxa"/>
+            </w:tcMar>
+            <w:vAlign w:val="center"/>
+          </w:tcPr>
+          <w:p>
+            <w:pPr>
+              <w:keepNext/>
+              <w:spacing w:line="276" w:lineRule="auto" w:before="0" w:after="0"/>
+              <w:ind w:firstLine="0"/>
+              <w:jc w:val="center"/>
+            </w:pPr>
+            <m:oMath>
+              <m:r>
+                <m:t>7</m:t>
+              </m:r>
+              <m:r>
+                <m:rPr>
+                  <m:sty m:val="p"/>
+                </m:rPr>
+                <m:t>→</m:t>
+              </m:r>
+              <m:r>
+                <m:t>9</m:t>
+              </m:r>
+            </m:oMath>
+          </w:p>
+        </w:tc>
+        <w:tc>
+          <w:tcPr>
+            <w:tcW w:w="895" w:type="dxa"/>
+            <w:tcBorders>
+              <w:top w:val="nil"/>
+              <w:start w:val="nil"/>
+              <w:bottom w:val="nil"/>
+              <w:end w:val="nil"/>
+              <w:insideH w:val="nil"/>
+              <w:insideV w:val="nil"/>
+            </w:tcBorders>
+            <w:tcMar>
+              <w:top w:w="55" w:type="dxa"/>
+              <w:start w:w="70" w:type="dxa"/>
+              <w:bottom w:w="55" w:type="dxa"/>
+              <w:end w:w="70" w:type="dxa"/>
+            </w:tcMar>
+            <w:vAlign w:val="center"/>
+          </w:tcPr>
+          <w:p>
+            <w:pPr>
+              <w:keepNext/>
+              <w:spacing w:line="276" w:lineRule="auto" w:before="0" w:after="0"/>
+              <w:ind w:firstLine="0"/>
+              <w:jc w:val="center"/>
+            </w:pPr>
+            <w:r>
+              <w:rPr>
+                <w:rFonts w:ascii="Times New Roman" w:hAnsi="Times New Roman" w:eastAsia="宋体"/>
+                <w:b w:val="0"/>
+                <w:color w:val="000000"/>
+                <w:sz w:val="20"/>
+              </w:rPr>
+              <w:t xml:space="preserve">0</w:t>
+            </w:r>
+          </w:p>
+        </w:tc>
+        <w:tc>
+          <w:tcPr>
+            <w:tcW w:w="1701" w:type="dxa"/>
+            <w:tcBorders>
+              <w:top w:val="nil"/>
+              <w:start w:val="nil"/>
+              <w:bottom w:val="nil"/>
+              <w:end w:val="nil"/>
+              <w:insideH w:val="nil"/>
+              <w:insideV w:val="nil"/>
+            </w:tcBorders>
+            <w:tcMar>
+              <w:top w:w="55" w:type="dxa"/>
+              <w:start w:w="70" w:type="dxa"/>
+              <w:bottom w:w="55" w:type="dxa"/>
+              <w:end w:w="70" w:type="dxa"/>
+            </w:tcMar>
+            <w:vAlign w:val="center"/>
+          </w:tcPr>
+          <w:p>
+            <w:pPr>
+              <w:keepNext/>
+              <w:spacing w:line="276" w:lineRule="auto" w:before="0" w:after="0"/>
+              <w:ind w:firstLine="0"/>
+              <w:jc w:val="center"/>
+            </w:pPr>
+            <w:r>
+              <w:rPr>
+                <w:rFonts w:ascii="Times New Roman" w:hAnsi="Times New Roman" w:eastAsia="宋体"/>
+                <w:b w:val="0"/>
+                <w:color w:val="000000"/>
+                <w:sz w:val="20"/>
+              </w:rPr>
+              <w:t xml:space="preserve">427.7414</w:t>
+            </w:r>
+          </w:p>
+        </w:tc>
+        <w:tc>
+          <w:tcPr>
+            <w:tcW w:w="1164" w:type="dxa"/>
+            <w:tcBorders>
+              <w:top w:val="nil"/>
+              <w:start w:val="nil"/>
+              <w:bottom w:val="nil"/>
+              <w:end w:val="nil"/>
+              <w:insideH w:val="nil"/>
+              <w:insideV w:val="nil"/>
+            </w:tcBorders>
+            <w:tcMar>
+              <w:top w:w="55" w:type="dxa"/>
+              <w:start w:w="70" w:type="dxa"/>
+              <w:bottom w:w="55" w:type="dxa"/>
+              <w:end w:w="70" w:type="dxa"/>
+            </w:tcMar>
+            <w:vAlign w:val="center"/>
+          </w:tcPr>
+          <w:p>
+            <w:pPr>
+              <w:keepNext/>
+              <w:spacing w:line="276" w:lineRule="auto" w:before="0" w:after="0"/>
+              <w:ind w:firstLine="0"/>
+              <w:jc w:val="center"/>
+            </w:pPr>
+            <w:r>
+              <w:rPr>
+                <w:rFonts w:hint="eastAsia" w:ascii="Times New Roman" w:hAnsi="Times New Roman" w:eastAsia="宋体"/>
+                <w:b w:val="0"/>
+                <w:color w:val="000000"/>
+                <w:sz w:val="20"/>
+              </w:rPr>
+              <w:t xml:space="preserve">是</w:t>
+            </w:r>
+          </w:p>
+        </w:tc>
+        <w:tc>
+          <w:tcPr>
+            <w:tcW w:w="1343" w:type="dxa"/>
+            <w:tcBorders>
+              <w:top w:val="nil"/>
+              <w:start w:val="nil"/>
+              <w:bottom w:val="nil"/>
+              <w:end w:val="nil"/>
+              <w:insideH w:val="nil"/>
+              <w:insideV w:val="nil"/>
+            </w:tcBorders>
+            <w:tcMar>
+              <w:top w:w="55" w:type="dxa"/>
+              <w:start w:w="70" w:type="dxa"/>
+              <w:bottom w:w="55" w:type="dxa"/>
+              <w:end w:w="70" w:type="dxa"/>
+            </w:tcMar>
+            <w:vAlign w:val="center"/>
+          </w:tcPr>
+          <w:p>
+            <w:pPr>
+              <w:keepNext/>
+              <w:spacing w:line="276" w:lineRule="auto" w:before="0" w:after="0"/>
+              <w:ind w:firstLine="0"/>
+              <w:jc w:val="center"/>
+            </w:pPr>
+            <w:r>
+              <w:rPr>
+                <w:rFonts w:hint="eastAsia" w:ascii="Times New Roman" w:hAnsi="Times New Roman" w:eastAsia="宋体"/>
+                <w:b w:val="0"/>
+                <w:color w:val="000000"/>
+                <w:sz w:val="20"/>
+              </w:rPr>
+              <w:t xml:space="preserve">是</w:t>
+            </w:r>
+          </w:p>
+        </w:tc>
+      </w:tr>
+      <w:tr>
+        <w:trPr>
+          <w:cantSplit/>
+        </w:trPr>
+        <w:tc>
+          <w:tcPr>
+            <w:tcW w:w="627" w:type="dxa"/>
+            <w:tcBorders>
+              <w:top w:val="nil"/>
+              <w:start w:val="nil"/>
+              <w:bottom w:val="nil"/>
+              <w:end w:val="nil"/>
+              <w:insideH w:val="nil"/>
+              <w:insideV w:val="nil"/>
+            </w:tcBorders>
+            <w:tcMar>
+              <w:top w:w="55" w:type="dxa"/>
+              <w:start w:w="70" w:type="dxa"/>
+              <w:bottom w:w="55" w:type="dxa"/>
+              <w:end w:w="70" w:type="dxa"/>
+            </w:tcMar>
+            <w:vAlign w:val="center"/>
+          </w:tcPr>
+          <w:p>
+            <w:pPr>
+              <w:keepNext/>
+              <w:spacing w:line="276" w:lineRule="auto" w:before="0" w:after="0"/>
+              <w:ind w:firstLine="0"/>
+              <w:jc w:val="center"/>
+            </w:pPr>
+            <w:r>
+              <w:rPr>
+                <w:rFonts w:ascii="Times New Roman" w:hAnsi="Times New Roman" w:eastAsia="宋体"/>
+                <w:b w:val="0"/>
+                <w:color w:val="000000"/>
+                <w:sz w:val="20"/>
+              </w:rPr>
+              <w:t xml:space="preserve">6</w:t>
+            </w:r>
+          </w:p>
+        </w:tc>
+        <w:tc>
+          <w:tcPr>
+            <w:tcW w:w="1074" w:type="dxa"/>
+            <w:tcBorders>
+              <w:top w:val="nil"/>
+              <w:start w:val="nil"/>
+              <w:bottom w:val="nil"/>
+              <w:end w:val="nil"/>
+              <w:insideH w:val="nil"/>
+              <w:insideV w:val="nil"/>
+            </w:tcBorders>
+            <w:tcMar>
+              <w:top w:w="55" w:type="dxa"/>
+              <w:start w:w="70" w:type="dxa"/>
+              <w:bottom w:w="55" w:type="dxa"/>
+              <w:end w:w="70" w:type="dxa"/>
+            </w:tcMar>
+            <w:vAlign w:val="center"/>
+          </w:tcPr>
+          <w:p>
+            <w:pPr>
+              <w:keepNext/>
+              <w:spacing w:line="276" w:lineRule="auto" w:before="0" w:after="0"/>
+              <w:ind w:firstLine="0"/>
+              <w:jc w:val="center"/>
+            </w:pPr>
+            <m:oMath>
+              <m:r>
+                <m:t>6</m:t>
+              </m:r>
+              <m:r>
+                <m:rPr>
+                  <m:sty m:val="p"/>
+                </m:rPr>
+                <m:t>→</m:t>
+              </m:r>
+              <m:r>
+                <m:t>4</m:t>
+              </m:r>
+            </m:oMath>
+          </w:p>
+        </w:tc>
+        <w:tc>
+          <w:tcPr>
+            <w:tcW w:w="1074" w:type="dxa"/>
+            <w:tcBorders>
+              <w:top w:val="nil"/>
+              <w:start w:val="nil"/>
+              <w:bottom w:val="nil"/>
+              <w:end w:val="nil"/>
+              <w:insideH w:val="nil"/>
+              <w:insideV w:val="nil"/>
+            </w:tcBorders>
+            <w:tcMar>
+              <w:top w:w="55" w:type="dxa"/>
+              <w:start w:w="70" w:type="dxa"/>
+              <w:bottom w:w="55" w:type="dxa"/>
+              <w:end w:w="70" w:type="dxa"/>
+            </w:tcMar>
+            <w:vAlign w:val="center"/>
+          </w:tcPr>
+          <w:p>
+            <w:pPr>
+              <w:keepNext/>
+              <w:spacing w:line="276" w:lineRule="auto" w:before="0" w:after="0"/>
+              <w:ind w:firstLine="0"/>
+              <w:jc w:val="center"/>
+            </w:pPr>
+            <m:oMath>
+              <m:r>
+                <m:t>5</m:t>
+              </m:r>
+              <m:r>
+                <m:rPr>
+                  <m:sty m:val="p"/>
+                </m:rPr>
+                <m:t>→</m:t>
+              </m:r>
+              <m:r>
+                <m:t>8</m:t>
+              </m:r>
+            </m:oMath>
+          </w:p>
+        </w:tc>
+        <w:tc>
+          <w:tcPr>
+            <w:tcW w:w="1074" w:type="dxa"/>
+            <w:tcBorders>
+              <w:top w:val="nil"/>
+              <w:start w:val="nil"/>
+              <w:bottom w:val="nil"/>
+              <w:end w:val="nil"/>
+              <w:insideH w:val="nil"/>
+              <w:insideV w:val="nil"/>
+            </w:tcBorders>
+            <w:tcMar>
+              <w:top w:w="55" w:type="dxa"/>
+              <w:start w:w="70" w:type="dxa"/>
+              <w:bottom w:w="55" w:type="dxa"/>
+              <w:end w:w="70" w:type="dxa"/>
+            </w:tcMar>
+            <w:vAlign w:val="center"/>
+          </w:tcPr>
+          <w:p>
+            <w:pPr>
+              <w:keepNext/>
+              <w:spacing w:line="276" w:lineRule="auto" w:before="0" w:after="0"/>
+              <w:ind w:firstLine="0"/>
+              <w:jc w:val="center"/>
+            </w:pPr>
+            <m:oMath>
+              <m:r>
+                <m:t>9</m:t>
+              </m:r>
+              <m:r>
+                <m:rPr>
+                  <m:sty m:val="p"/>
+                </m:rPr>
+                <m:t>→</m:t>
+              </m:r>
+              <m:r>
+                <m:t>7</m:t>
+              </m:r>
+            </m:oMath>
+          </w:p>
+        </w:tc>
+        <w:tc>
+          <w:tcPr>
+            <w:tcW w:w="895" w:type="dxa"/>
+            <w:tcBorders>
+              <w:top w:val="nil"/>
+              <w:start w:val="nil"/>
+              <w:bottom w:val="nil"/>
+              <w:end w:val="nil"/>
+              <w:insideH w:val="nil"/>
+              <w:insideV w:val="nil"/>
+            </w:tcBorders>
+            <w:tcMar>
+              <w:top w:w="55" w:type="dxa"/>
+              <w:start w:w="70" w:type="dxa"/>
+              <w:bottom w:w="55" w:type="dxa"/>
+              <w:end w:w="70" w:type="dxa"/>
+            </w:tcMar>
+            <w:vAlign w:val="center"/>
+          </w:tcPr>
+          <w:p>
+            <w:pPr>
+              <w:keepNext/>
+              <w:spacing w:line="276" w:lineRule="auto" w:before="0" w:after="0"/>
+              <w:ind w:firstLine="0"/>
+              <w:jc w:val="center"/>
+            </w:pPr>
+            <w:r>
+              <w:rPr>
+                <w:rFonts w:ascii="Times New Roman" w:hAnsi="Times New Roman" w:eastAsia="宋体"/>
+                <w:b w:val="0"/>
+                <w:color w:val="000000"/>
+                <w:sz w:val="20"/>
+              </w:rPr>
+              <w:t xml:space="preserve">0</w:t>
+            </w:r>
+          </w:p>
+        </w:tc>
+        <w:tc>
+          <w:tcPr>
+            <w:tcW w:w="1701" w:type="dxa"/>
+            <w:tcBorders>
+              <w:top w:val="nil"/>
+              <w:start w:val="nil"/>
+              <w:bottom w:val="nil"/>
+              <w:end w:val="nil"/>
+              <w:insideH w:val="nil"/>
+              <w:insideV w:val="nil"/>
+            </w:tcBorders>
+            <w:tcMar>
+              <w:top w:w="55" w:type="dxa"/>
+              <w:start w:w="70" w:type="dxa"/>
+              <w:bottom w:w="55" w:type="dxa"/>
+              <w:end w:w="70" w:type="dxa"/>
+            </w:tcMar>
+            <w:vAlign w:val="center"/>
+          </w:tcPr>
+          <w:p>
+            <w:pPr>
+              <w:keepNext/>
+              <w:spacing w:line="276" w:lineRule="auto" w:before="0" w:after="0"/>
+              <w:ind w:firstLine="0"/>
+              <w:jc w:val="center"/>
+            </w:pPr>
+            <w:r>
+              <w:rPr>
+                <w:rFonts w:ascii="Times New Roman" w:hAnsi="Times New Roman" w:eastAsia="宋体"/>
+                <w:b w:val="0"/>
+                <w:color w:val="000000"/>
+                <w:sz w:val="20"/>
+              </w:rPr>
+              <w:t xml:space="preserve">422.6886</w:t>
+            </w:r>
+          </w:p>
+        </w:tc>
+        <w:tc>
+          <w:tcPr>
+            <w:tcW w:w="1164" w:type="dxa"/>
+            <w:tcBorders>
+              <w:top w:val="nil"/>
+              <w:start w:val="nil"/>
+              <w:bottom w:val="nil"/>
+              <w:end w:val="nil"/>
+              <w:insideH w:val="nil"/>
+              <w:insideV w:val="nil"/>
+            </w:tcBorders>
+            <w:tcMar>
+              <w:top w:w="55" w:type="dxa"/>
+              <w:start w:w="70" w:type="dxa"/>
+              <w:bottom w:w="55" w:type="dxa"/>
+              <w:end w:w="70" w:type="dxa"/>
+            </w:tcMar>
+            <w:vAlign w:val="center"/>
+          </w:tcPr>
+          <w:p>
+            <w:pPr>
+              <w:keepNext/>
+              <w:spacing w:line="276" w:lineRule="auto" w:before="0" w:after="0"/>
+              <w:ind w:firstLine="0"/>
+              <w:jc w:val="center"/>
+            </w:pPr>
+            <w:r>
+              <w:rPr>
+                <w:rFonts w:hint="eastAsia" w:ascii="Times New Roman" w:hAnsi="Times New Roman" w:eastAsia="宋体"/>
+                <w:b w:val="0"/>
+                <w:color w:val="000000"/>
+                <w:sz w:val="20"/>
+              </w:rPr>
+              <w:t xml:space="preserve">是</w:t>
+            </w:r>
+          </w:p>
+        </w:tc>
+        <w:tc>
+          <w:tcPr>
+            <w:tcW w:w="1343" w:type="dxa"/>
+            <w:tcBorders>
+              <w:top w:val="nil"/>
+              <w:start w:val="nil"/>
+              <w:bottom w:val="nil"/>
+              <w:end w:val="nil"/>
+              <w:insideH w:val="nil"/>
+              <w:insideV w:val="nil"/>
+            </w:tcBorders>
+            <w:tcMar>
+              <w:top w:w="55" w:type="dxa"/>
+              <w:start w:w="70" w:type="dxa"/>
+              <w:bottom w:w="55" w:type="dxa"/>
+              <w:end w:w="70" w:type="dxa"/>
+            </w:tcMar>
+            <w:vAlign w:val="center"/>
+          </w:tcPr>
+          <w:p>
+            <w:pPr>
+              <w:keepNext/>
+              <w:spacing w:line="276" w:lineRule="auto" w:before="0" w:after="0"/>
+              <w:ind w:firstLine="0"/>
+              <w:jc w:val="center"/>
+            </w:pPr>
+            <w:r>
+              <w:rPr>
+                <w:rFonts w:hint="eastAsia" w:ascii="Times New Roman" w:hAnsi="Times New Roman" w:eastAsia="宋体"/>
+                <w:b w:val="0"/>
+                <w:color w:val="000000"/>
+                <w:sz w:val="20"/>
+              </w:rPr>
+              <w:t xml:space="preserve">是</w:t>
+            </w:r>
+          </w:p>
+        </w:tc>
+      </w:tr>
+      <w:tr>
+        <w:trPr>
+          <w:cantSplit/>
+        </w:trPr>
+        <w:tc>
+          <w:tcPr>
+            <w:tcW w:w="627" w:type="dxa"/>
+            <w:tcBorders>
+              <w:top w:val="nil"/>
+              <w:start w:val="nil"/>
+              <w:bottom w:val="nil"/>
+              <w:end w:val="nil"/>
+              <w:insideH w:val="nil"/>
+              <w:insideV w:val="nil"/>
+            </w:tcBorders>
+            <w:tcMar>
+              <w:top w:w="55" w:type="dxa"/>
+              <w:start w:w="70" w:type="dxa"/>
+              <w:bottom w:w="55" w:type="dxa"/>
+              <w:end w:w="70" w:type="dxa"/>
+            </w:tcMar>
+            <w:vAlign w:val="center"/>
+          </w:tcPr>
+          <w:p>
+            <w:pPr>
+              <w:keepNext/>
+              <w:spacing w:line="276" w:lineRule="auto" w:before="0" w:after="0"/>
+              <w:ind w:firstLine="0"/>
+              <w:jc w:val="center"/>
+            </w:pPr>
+            <w:r>
+              <w:rPr>
+                <w:rFonts w:ascii="Times New Roman" w:hAnsi="Times New Roman" w:eastAsia="宋体"/>
+                <w:b w:val="0"/>
+                <w:color w:val="000000"/>
+                <w:sz w:val="20"/>
+              </w:rPr>
+              <w:t xml:space="preserve">7</w:t>
+            </w:r>
+          </w:p>
+        </w:tc>
+        <w:tc>
+          <w:tcPr>
+            <w:tcW w:w="1074" w:type="dxa"/>
+            <w:tcBorders>
+              <w:top w:val="nil"/>
+              <w:start w:val="nil"/>
+              <w:bottom w:val="nil"/>
+              <w:end w:val="nil"/>
+              <w:insideH w:val="nil"/>
+              <w:insideV w:val="nil"/>
+            </w:tcBorders>
+            <w:tcMar>
+              <w:top w:w="55" w:type="dxa"/>
+              <w:start w:w="70" w:type="dxa"/>
+              <w:bottom w:w="55" w:type="dxa"/>
+              <w:end w:w="70" w:type="dxa"/>
+            </w:tcMar>
+            <w:vAlign w:val="center"/>
+          </w:tcPr>
+          <w:p>
+            <w:pPr>
+              <w:keepNext/>
+              <w:spacing w:line="276" w:lineRule="auto" w:before="0" w:after="0"/>
+              <w:ind w:firstLine="0"/>
+              <w:jc w:val="center"/>
+            </w:pPr>
+            <m:oMath>
+              <m:r>
+                <m:t>6</m:t>
+              </m:r>
+              <m:r>
+                <m:rPr>
+                  <m:sty m:val="p"/>
+                </m:rPr>
+                <m:t>→</m:t>
+              </m:r>
+              <m:r>
+                <m:t>4</m:t>
+              </m:r>
+            </m:oMath>
+          </w:p>
+        </w:tc>
+        <w:tc>
+          <w:tcPr>
+            <w:tcW w:w="1074" w:type="dxa"/>
+            <w:tcBorders>
+              <w:top w:val="nil"/>
+              <w:start w:val="nil"/>
+              <w:bottom w:val="nil"/>
+              <w:end w:val="nil"/>
+              <w:insideH w:val="nil"/>
+              <w:insideV w:val="nil"/>
+            </w:tcBorders>
+            <w:tcMar>
+              <w:top w:w="55" w:type="dxa"/>
+              <w:start w:w="70" w:type="dxa"/>
+              <w:bottom w:w="55" w:type="dxa"/>
+              <w:end w:w="70" w:type="dxa"/>
+            </w:tcMar>
+            <w:vAlign w:val="center"/>
+          </w:tcPr>
+          <w:p>
+            <w:pPr>
+              <w:keepNext/>
+              <w:spacing w:line="276" w:lineRule="auto" w:before="0" w:after="0"/>
+              <w:ind w:firstLine="0"/>
+              <w:jc w:val="center"/>
+            </w:pPr>
+            <m:oMath>
+              <m:r>
+                <m:t>8</m:t>
+              </m:r>
+              <m:r>
+                <m:rPr>
+                  <m:sty m:val="p"/>
+                </m:rPr>
+                <m:t>→</m:t>
+              </m:r>
+              <m:r>
+                <m:t>5</m:t>
+              </m:r>
+            </m:oMath>
+          </w:p>
+        </w:tc>
+        <w:tc>
+          <w:tcPr>
+            <w:tcW w:w="1074" w:type="dxa"/>
+            <w:tcBorders>
+              <w:top w:val="nil"/>
+              <w:start w:val="nil"/>
+              <w:bottom w:val="nil"/>
+              <w:end w:val="nil"/>
+              <w:insideH w:val="nil"/>
+              <w:insideV w:val="nil"/>
+            </w:tcBorders>
+            <w:tcMar>
+              <w:top w:w="55" w:type="dxa"/>
+              <w:start w:w="70" w:type="dxa"/>
+              <w:bottom w:w="55" w:type="dxa"/>
+              <w:end w:w="70" w:type="dxa"/>
+            </w:tcMar>
+            <w:vAlign w:val="center"/>
+          </w:tcPr>
+          <w:p>
+            <w:pPr>
+              <w:keepNext/>
+              <w:spacing w:line="276" w:lineRule="auto" w:before="0" w:after="0"/>
+              <w:ind w:firstLine="0"/>
+              <w:jc w:val="center"/>
+            </w:pPr>
+            <m:oMath>
+              <m:r>
+                <m:t>7</m:t>
+              </m:r>
+              <m:r>
+                <m:rPr>
+                  <m:sty m:val="p"/>
+                </m:rPr>
+                <m:t>→</m:t>
+              </m:r>
+              <m:r>
+                <m:t>9</m:t>
+              </m:r>
+            </m:oMath>
+          </w:p>
+        </w:tc>
+        <w:tc>
+          <w:tcPr>
+            <w:tcW w:w="895" w:type="dxa"/>
+            <w:tcBorders>
+              <w:top w:val="nil"/>
+              <w:start w:val="nil"/>
+              <w:bottom w:val="nil"/>
+              <w:end w:val="nil"/>
+              <w:insideH w:val="nil"/>
+              <w:insideV w:val="nil"/>
+            </w:tcBorders>
+            <w:tcMar>
+              <w:top w:w="55" w:type="dxa"/>
+              <w:start w:w="70" w:type="dxa"/>
+              <w:bottom w:w="55" w:type="dxa"/>
+              <w:end w:w="70" w:type="dxa"/>
+            </w:tcMar>
+            <w:vAlign w:val="center"/>
+          </w:tcPr>
+          <w:p>
+            <w:pPr>
+              <w:keepNext/>
+              <w:spacing w:line="276" w:lineRule="auto" w:before="0" w:after="0"/>
+              <w:ind w:firstLine="0"/>
+              <w:jc w:val="center"/>
+            </w:pPr>
+            <w:r>
+              <w:rPr>
+                <w:rFonts w:ascii="Times New Roman" w:hAnsi="Times New Roman" w:eastAsia="宋体"/>
+                <w:b w:val="0"/>
+                <w:color w:val="000000"/>
+                <w:sz w:val="20"/>
+              </w:rPr>
+              <w:t xml:space="preserve">1</w:t>
+            </w:r>
+          </w:p>
+        </w:tc>
+        <w:tc>
+          <w:tcPr>
+            <w:tcW w:w="1701" w:type="dxa"/>
+            <w:tcBorders>
+              <w:top w:val="nil"/>
+              <w:start w:val="nil"/>
+              <w:bottom w:val="nil"/>
+              <w:end w:val="nil"/>
+              <w:insideH w:val="nil"/>
+              <w:insideV w:val="nil"/>
+            </w:tcBorders>
+            <w:tcMar>
+              <w:top w:w="55" w:type="dxa"/>
+              <w:start w:w="70" w:type="dxa"/>
+              <w:bottom w:w="55" w:type="dxa"/>
+              <w:end w:w="70" w:type="dxa"/>
+            </w:tcMar>
+            <w:vAlign w:val="center"/>
+          </w:tcPr>
+          <w:p>
+            <w:pPr>
+              <w:keepNext/>
+              <w:spacing w:line="276" w:lineRule="auto" w:before="0" w:after="0"/>
+              <w:ind w:firstLine="0"/>
+              <w:jc w:val="center"/>
+            </w:pPr>
+            <w:r>
+              <w:rPr>
+                <w:rFonts w:ascii="Times New Roman" w:hAnsi="Times New Roman" w:eastAsia="宋体"/>
+                <w:b w:val="0"/>
+                <w:color w:val="000000"/>
+                <w:sz w:val="20"/>
+              </w:rPr>
+              <w:t xml:space="preserve">576.7668</w:t>
+            </w:r>
+          </w:p>
+        </w:tc>
+        <w:tc>
+          <w:tcPr>
+            <w:tcW w:w="1164" w:type="dxa"/>
+            <w:tcBorders>
+              <w:top w:val="nil"/>
+              <w:start w:val="nil"/>
+              <w:bottom w:val="nil"/>
+              <w:end w:val="nil"/>
+              <w:insideH w:val="nil"/>
+              <w:insideV w:val="nil"/>
+            </w:tcBorders>
+            <w:tcMar>
+              <w:top w:w="55" w:type="dxa"/>
+              <w:start w:w="70" w:type="dxa"/>
+              <w:bottom w:w="55" w:type="dxa"/>
+              <w:end w:w="70" w:type="dxa"/>
+            </w:tcMar>
+            <w:vAlign w:val="center"/>
+          </w:tcPr>
+          <w:p>
+            <w:pPr>
+              <w:keepNext/>
+              <w:spacing w:line="276" w:lineRule="auto" w:before="0" w:after="0"/>
+              <w:ind w:firstLine="0"/>
+              <w:jc w:val="center"/>
+            </w:pPr>
+            <w:r>
+              <w:rPr>
+                <w:rFonts w:hint="eastAsia" w:ascii="Times New Roman" w:hAnsi="Times New Roman" w:eastAsia="宋体"/>
+                <w:b w:val="0"/>
+                <w:color w:val="000000"/>
+                <w:sz w:val="20"/>
+              </w:rPr>
+              <w:t xml:space="preserve">是</w:t>
+            </w:r>
+          </w:p>
+        </w:tc>
+        <w:tc>
+          <w:tcPr>
+            <w:tcW w:w="1343" w:type="dxa"/>
+            <w:tcBorders>
+              <w:top w:val="nil"/>
+              <w:start w:val="nil"/>
+              <w:bottom w:val="nil"/>
+              <w:end w:val="nil"/>
+              <w:insideH w:val="nil"/>
+              <w:insideV w:val="nil"/>
+            </w:tcBorders>
+            <w:tcMar>
+              <w:top w:w="55" w:type="dxa"/>
+              <w:start w:w="70" w:type="dxa"/>
+              <w:bottom w:w="55" w:type="dxa"/>
+              <w:end w:w="70" w:type="dxa"/>
+            </w:tcMar>
+            <w:vAlign w:val="center"/>
+          </w:tcPr>
+          <w:p>
+            <w:pPr>
+              <w:keepNext/>
+              <w:spacing w:line="276" w:lineRule="auto" w:before="0" w:after="0"/>
+              <w:ind w:firstLine="0"/>
+              <w:jc w:val="center"/>
+            </w:pPr>
+            <w:r>
+              <w:rPr>
+                <w:rFonts w:hint="eastAsia" w:ascii="Times New Roman" w:hAnsi="Times New Roman" w:eastAsia="宋体"/>
+                <w:b w:val="0"/>
+                <w:color w:val="000000"/>
+                <w:sz w:val="20"/>
+              </w:rPr>
+              <w:t xml:space="preserve">否</w:t>
+            </w:r>
+          </w:p>
+        </w:tc>
+      </w:tr>
+      <w:tr>
+        <w:trPr>
+          <w:cantSplit/>
+        </w:trPr>
+        <w:tc>
+          <w:tcPr>
+            <w:tcW w:w="627" w:type="dxa"/>
+            <w:tcBorders>
+              <w:top w:val="nil"/>
+              <w:start w:val="nil"/>
+              <w:bottom w:val="single" w:sz="10" w:color="000000"/>
+              <w:end w:val="nil"/>
+              <w:insideH w:val="nil"/>
+              <w:insideV w:val="nil"/>
+            </w:tcBorders>
+            <w:tcMar>
+              <w:top w:w="55" w:type="dxa"/>
+              <w:start w:w="70" w:type="dxa"/>
+              <w:bottom w:w="55" w:type="dxa"/>
+              <w:end w:w="70" w:type="dxa"/>
+            </w:tcMar>
+            <w:vAlign w:val="center"/>
+          </w:tcPr>
+          <w:p>
+            <w:pPr>
+              <w:keepNext w:val="0"/>
+              <w:spacing w:line="276" w:lineRule="auto" w:before="0" w:after="0"/>
+              <w:ind w:firstLine="0"/>
+              <w:jc w:val="center"/>
+            </w:pPr>
+            <w:r>
+              <w:rPr>
+                <w:rFonts w:ascii="Times New Roman" w:hAnsi="Times New Roman" w:eastAsia="宋体"/>
+                <w:b w:val="0"/>
+                <w:color w:val="000000"/>
+                <w:sz w:val="20"/>
+              </w:rPr>
+              <w:t xml:space="preserve">8</w:t>
+            </w:r>
+          </w:p>
+        </w:tc>
+        <w:tc>
+          <w:tcPr>
+            <w:tcW w:w="1074" w:type="dxa"/>
+            <w:tcBorders>
+              <w:top w:val="nil"/>
+              <w:start w:val="nil"/>
+              <w:bottom w:val="single" w:sz="10" w:color="000000"/>
+              <w:end w:val="nil"/>
+              <w:insideH w:val="nil"/>
+              <w:insideV w:val="nil"/>
+            </w:tcBorders>
+            <w:tcMar>
+              <w:top w:w="55" w:type="dxa"/>
+              <w:start w:w="70" w:type="dxa"/>
+              <w:bottom w:w="55" w:type="dxa"/>
+              <w:end w:w="70" w:type="dxa"/>
+            </w:tcMar>
+            <w:vAlign w:val="center"/>
+          </w:tcPr>
+          <w:p>
+            <w:pPr>
+              <w:keepNext w:val="0"/>
+              <w:spacing w:line="276" w:lineRule="auto" w:before="0" w:after="0"/>
+              <w:ind w:firstLine="0"/>
+              <w:jc w:val="center"/>
+            </w:pPr>
+            <m:oMath>
+              <m:r>
+                <m:t>6</m:t>
+              </m:r>
+              <m:r>
+                <m:rPr>
+                  <m:sty m:val="p"/>
+                </m:rPr>
+                <m:t>→</m:t>
+              </m:r>
+              <m:r>
+                <m:t>4</m:t>
+              </m:r>
+            </m:oMath>
+          </w:p>
+        </w:tc>
+        <w:tc>
+          <w:tcPr>
+            <w:tcW w:w="1074" w:type="dxa"/>
+            <w:tcBorders>
+              <w:top w:val="nil"/>
+              <w:start w:val="nil"/>
+              <w:bottom w:val="single" w:sz="10" w:color="000000"/>
+              <w:end w:val="nil"/>
+              <w:insideH w:val="nil"/>
+              <w:insideV w:val="nil"/>
+            </w:tcBorders>
+            <w:tcMar>
+              <w:top w:w="55" w:type="dxa"/>
+              <w:start w:w="70" w:type="dxa"/>
+              <w:bottom w:w="55" w:type="dxa"/>
+              <w:end w:w="70" w:type="dxa"/>
+            </w:tcMar>
+            <w:vAlign w:val="center"/>
+          </w:tcPr>
+          <w:p>
+            <w:pPr>
+              <w:keepNext w:val="0"/>
+              <w:spacing w:line="276" w:lineRule="auto" w:before="0" w:after="0"/>
+              <w:ind w:firstLine="0"/>
+              <w:jc w:val="center"/>
+            </w:pPr>
+            <m:oMath>
+              <m:r>
+                <m:t>8</m:t>
+              </m:r>
+              <m:r>
+                <m:rPr>
+                  <m:sty m:val="p"/>
+                </m:rPr>
+                <m:t>→</m:t>
+              </m:r>
+              <m:r>
+                <m:t>5</m:t>
+              </m:r>
+            </m:oMath>
+          </w:p>
+        </w:tc>
+        <w:tc>
+          <w:tcPr>
+            <w:tcW w:w="1074" w:type="dxa"/>
+            <w:tcBorders>
+              <w:top w:val="nil"/>
+              <w:start w:val="nil"/>
+              <w:bottom w:val="single" w:sz="10" w:color="000000"/>
+              <w:end w:val="nil"/>
+              <w:insideH w:val="nil"/>
+              <w:insideV w:val="nil"/>
+            </w:tcBorders>
+            <w:tcMar>
+              <w:top w:w="55" w:type="dxa"/>
+              <w:start w:w="70" w:type="dxa"/>
+              <w:bottom w:w="55" w:type="dxa"/>
+              <w:end w:w="70" w:type="dxa"/>
+            </w:tcMar>
+            <w:vAlign w:val="center"/>
+          </w:tcPr>
+          <w:p>
+            <w:pPr>
+              <w:keepNext w:val="0"/>
+              <w:spacing w:line="276" w:lineRule="auto" w:before="0" w:after="0"/>
+              <w:ind w:firstLine="0"/>
+              <w:jc w:val="center"/>
+            </w:pPr>
+            <m:oMath>
+              <m:r>
+                <m:t>9</m:t>
+              </m:r>
+              <m:r>
+                <m:rPr>
+                  <m:sty m:val="p"/>
+                </m:rPr>
+                <m:t>→</m:t>
+              </m:r>
+              <m:r>
+                <m:t>7</m:t>
+              </m:r>
+            </m:oMath>
+          </w:p>
+        </w:tc>
+        <w:tc>
+          <w:tcPr>
+            <w:tcW w:w="895" w:type="dxa"/>
+            <w:tcBorders>
+              <w:top w:val="nil"/>
+              <w:start w:val="nil"/>
+              <w:bottom w:val="single" w:sz="10" w:color="000000"/>
+              <w:end w:val="nil"/>
+              <w:insideH w:val="nil"/>
+              <w:insideV w:val="nil"/>
+            </w:tcBorders>
+            <w:tcMar>
+              <w:top w:w="55" w:type="dxa"/>
+              <w:start w:w="70" w:type="dxa"/>
+              <w:bottom w:w="55" w:type="dxa"/>
+              <w:end w:w="70" w:type="dxa"/>
+            </w:tcMar>
+            <w:vAlign w:val="center"/>
+          </w:tcPr>
+          <w:p>
+            <w:pPr>
+              <w:keepNext w:val="0"/>
+              <w:spacing w:line="276" w:lineRule="auto" w:before="0" w:after="0"/>
+              <w:ind w:firstLine="0"/>
+              <w:jc w:val="center"/>
+            </w:pPr>
+            <w:r>
+              <w:rPr>
+                <w:rFonts w:ascii="Times New Roman" w:hAnsi="Times New Roman" w:eastAsia="宋体"/>
+                <w:b w:val="0"/>
+                <w:color w:val="000000"/>
+                <w:sz w:val="20"/>
+              </w:rPr>
+              <w:t xml:space="preserve">1</w:t>
+            </w:r>
+          </w:p>
+        </w:tc>
+        <w:tc>
+          <w:tcPr>
+            <w:tcW w:w="1701" w:type="dxa"/>
+            <w:tcBorders>
+              <w:top w:val="nil"/>
+              <w:start w:val="nil"/>
+              <w:bottom w:val="single" w:sz="10" w:color="000000"/>
+              <w:end w:val="nil"/>
+              <w:insideH w:val="nil"/>
+              <w:insideV w:val="nil"/>
+            </w:tcBorders>
+            <w:tcMar>
+              <w:top w:w="55" w:type="dxa"/>
+              <w:start w:w="70" w:type="dxa"/>
+              <w:bottom w:w="55" w:type="dxa"/>
+              <w:end w:w="70" w:type="dxa"/>
+            </w:tcMar>
+            <w:vAlign w:val="center"/>
+          </w:tcPr>
+          <w:p>
+            <w:pPr>
+              <w:keepNext w:val="0"/>
+              <w:spacing w:line="276" w:lineRule="auto" w:before="0" w:after="0"/>
+              <w:ind w:firstLine="0"/>
+              <w:jc w:val="center"/>
+            </w:pPr>
+            <w:r>
+              <w:rPr>
+                <w:rFonts w:ascii="Times New Roman" w:hAnsi="Times New Roman" w:eastAsia="宋体"/>
+                <w:b w:val="0"/>
+                <w:color w:val="000000"/>
+                <w:sz w:val="20"/>
+              </w:rPr>
+              <w:t xml:space="preserve">571.7140</w:t>
+            </w:r>
+          </w:p>
+        </w:tc>
+        <w:tc>
+          <w:tcPr>
+            <w:tcW w:w="1164" w:type="dxa"/>
+            <w:tcBorders>
+              <w:top w:val="nil"/>
+              <w:start w:val="nil"/>
+              <w:bottom w:val="single" w:sz="10" w:color="000000"/>
+              <w:end w:val="nil"/>
+              <w:insideH w:val="nil"/>
+              <w:insideV w:val="nil"/>
+            </w:tcBorders>
+            <w:tcMar>
+              <w:top w:w="55" w:type="dxa"/>
+              <w:start w:w="70" w:type="dxa"/>
+              <w:bottom w:w="55" w:type="dxa"/>
+              <w:end w:w="70" w:type="dxa"/>
+            </w:tcMar>
+            <w:vAlign w:val="center"/>
+          </w:tcPr>
+          <w:p>
+            <w:pPr>
+              <w:keepNext w:val="0"/>
+              <w:spacing w:line="276" w:lineRule="auto" w:before="0" w:after="0"/>
+              <w:ind w:firstLine="0"/>
+              <w:jc w:val="center"/>
+            </w:pPr>
+            <w:r>
+              <w:rPr>
+                <w:rFonts w:hint="eastAsia" w:ascii="Times New Roman" w:hAnsi="Times New Roman" w:eastAsia="宋体"/>
+                <w:b w:val="0"/>
+                <w:color w:val="000000"/>
+                <w:sz w:val="20"/>
+              </w:rPr>
+              <w:t xml:space="preserve">是</w:t>
+            </w:r>
+          </w:p>
+        </w:tc>
+        <w:tc>
+          <w:tcPr>
+            <w:tcW w:w="1343" w:type="dxa"/>
+            <w:tcBorders>
+              <w:top w:val="nil"/>
+              <w:start w:val="nil"/>
+              <w:bottom w:val="single" w:sz="10" w:color="000000"/>
+              <w:end w:val="nil"/>
+              <w:insideH w:val="nil"/>
+              <w:insideV w:val="nil"/>
+            </w:tcBorders>
+            <w:tcMar>
+              <w:top w:w="55" w:type="dxa"/>
+              <w:start w:w="70" w:type="dxa"/>
+              <w:bottom w:w="55" w:type="dxa"/>
+              <w:end w:w="70" w:type="dxa"/>
+            </w:tcMar>
+            <w:vAlign w:val="center"/>
+          </w:tcPr>
+          <w:p>
+            <w:pPr>
+              <w:keepNext w:val="0"/>
+              <w:spacing w:line="276" w:lineRule="auto" w:before="0" w:after="0"/>
+              <w:ind w:firstLine="0"/>
+              <w:jc w:val="center"/>
+            </w:pPr>
+            <w:r>
+              <w:rPr>
+                <w:rFonts w:hint="eastAsia" w:ascii="Times New Roman" w:hAnsi="Times New Roman" w:eastAsia="宋体"/>
+                <w:b w:val="0"/>
+                <w:color w:val="000000"/>
+                <w:sz w:val="20"/>
+              </w:rPr>
+              <w:t xml:space="preserve">否</w:t>
+            </w:r>
+          </w:p>
+        </w:tc>
+      </w:tr>
+    </w:tbl>
+    <w:p>
+      <w:pPr>
+        <w:pStyle w:val="BodyText"/>
+        <w:spacing w:line="360" w:lineRule="auto" w:before="0" w:after="0"/>
+        <w:ind w:firstLine="480"/>
+        <w:jc w:val="both"/>
+      </w:pPr>
+      <w:r>
+        <w:rPr>
+          <w:rFonts w:hint="eastAsia" w:ascii="Times New Roman" w:hAnsi="Times New Roman" w:eastAsia="宋体"/>
+          <w:color w:val="000000"/>
+          <w:sz w:val="24"/>
+        </w:rPr>
+        <w:t xml:space="preserve">其中方案</w:t>
+      </w:r>
+      <w:r>
+        <w:rPr>
+          <w:rFonts w:ascii="Times New Roman" w:hAnsi="Times New Roman" w:eastAsia="宋体"/>
+          <w:color w:val="000000"/>
+          <w:sz w:val="24"/>
+        </w:rPr>
+        <w:t xml:space="preserve"> 1、2、5、6 </w:t>
+      </w:r>
+      <w:r>
+        <w:rPr>
+          <w:rFonts w:hint="eastAsia" w:ascii="Times New Roman" w:hAnsi="Times New Roman" w:eastAsia="宋体"/>
+          <w:color w:val="000000"/>
+          <w:sz w:val="24"/>
+        </w:rPr>
+        <w:t xml:space="preserve">达到零迟到；B</w:t>
+      </w:r>
+      <w:r>
+        <w:rPr>
+          <w:rFonts w:ascii="Times New Roman" w:hAnsi="Times New Roman" w:eastAsia="宋体"/>
+          <w:color w:val="000000"/>
+          <w:sz w:val="24"/>
+        </w:rPr>
+        <w:t xml:space="preserve"> </w:t>
+      </w:r>
+      <w:r>
+        <w:rPr>
+          <w:rFonts w:hint="eastAsia" w:ascii="Times New Roman" w:hAnsi="Times New Roman" w:eastAsia="宋体"/>
+          <w:color w:val="000000"/>
+          <w:sz w:val="24"/>
+        </w:rPr>
+        <w:t xml:space="preserve">车反向访问两店的方案</w:t>
+      </w:r>
+      <w:r>
+        <w:rPr>
+          <w:rFonts w:ascii="Times New Roman" w:hAnsi="Times New Roman" w:eastAsia="宋体"/>
+          <w:color w:val="000000"/>
+          <w:sz w:val="24"/>
+        </w:rPr>
+        <w:t xml:space="preserve"> 3、4、7、8 </w:t>
+      </w:r>
+      <w:r>
+        <w:rPr>
+          <w:rFonts w:hint="eastAsia" w:ascii="Times New Roman" w:hAnsi="Times New Roman" w:eastAsia="宋体"/>
+          <w:color w:val="000000"/>
+          <w:sz w:val="24"/>
+        </w:rPr>
+        <w:t xml:space="preserve">均迟到</w:t>
+      </w:r>
+      <w:r>
+        <w:rPr>
+          <w:rFonts w:ascii="Times New Roman" w:hAnsi="Times New Roman" w:eastAsia="宋体"/>
+          <w:color w:val="000000"/>
+          <w:sz w:val="24"/>
+        </w:rPr>
+        <w:t xml:space="preserve"> 1 </w:t>
+      </w:r>
+      <w:r>
+        <w:rPr>
+          <w:rFonts w:hint="eastAsia" w:ascii="Times New Roman" w:hAnsi="Times New Roman" w:eastAsia="宋体"/>
+          <w:color w:val="000000"/>
+          <w:sz w:val="24"/>
+        </w:rPr>
+        <w:t xml:space="preserve">店。词典序第一层先排除全部迟到组合，第二层再从</w:t>
+      </w:r>
+      <w:r>
+        <w:rPr>
+          <w:rFonts w:ascii="Times New Roman" w:hAnsi="Times New Roman" w:eastAsia="宋体"/>
+          <w:color w:val="000000"/>
+          <w:sz w:val="24"/>
+        </w:rPr>
+        <w:t xml:space="preserve"> 4 </w:t>
+      </w:r>
+      <w:r>
+        <w:rPr>
+          <w:rFonts w:hint="eastAsia" w:ascii="Times New Roman" w:hAnsi="Times New Roman" w:eastAsia="宋体"/>
+          <w:color w:val="000000"/>
+          <w:sz w:val="24"/>
+        </w:rPr>
+        <w:t xml:space="preserve">个零迟到方案中选出成本最低的方案</w:t>
+      </w:r>
+      <w:r>
+        <w:rPr>
+          <w:rFonts w:ascii="Times New Roman" w:hAnsi="Times New Roman" w:eastAsia="宋体"/>
+          <w:color w:val="000000"/>
+          <w:sz w:val="24"/>
+        </w:rPr>
+        <w:t xml:space="preserve"> </w:t>
+      </w:r>
+      <w:r>
+        <w:rPr>
+          <w:rFonts w:hint="eastAsia" w:ascii="Times New Roman" w:hAnsi="Times New Roman" w:eastAsia="宋体"/>
+          <w:color w:val="000000"/>
+          <w:sz w:val="24"/>
+        </w:rPr>
+        <w:t xml:space="preserve">2。其成本比次优零迟到方案</w:t>
+      </w:r>
+      <w:r>
+        <w:rPr>
+          <w:rFonts w:ascii="Times New Roman" w:hAnsi="Times New Roman" w:eastAsia="宋体"/>
+          <w:color w:val="000000"/>
+          <w:sz w:val="24"/>
+        </w:rPr>
+        <w:t xml:space="preserve"> 1 </w:t>
+      </w:r>
+      <w:r>
+        <w:rPr>
+          <w:rFonts w:hint="eastAsia" w:ascii="Times New Roman" w:hAnsi="Times New Roman" w:eastAsia="宋体"/>
+          <w:color w:val="000000"/>
+          <w:sz w:val="24"/>
+        </w:rPr>
+        <w:t xml:space="preserve">低</w:t>
+      </w:r>
+      <w:r>
+        <w:rPr>
+          <w:rFonts w:ascii="Times New Roman" w:hAnsi="Times New Roman" w:eastAsia="宋体"/>
+          <w:color w:val="000000"/>
+          <w:sz w:val="24"/>
+        </w:rPr>
+        <w:t xml:space="preserve"> 5.0528 </w:t>
+      </w:r>
+      <w:r>
+        <w:rPr>
+          <w:rFonts w:hint="eastAsia" w:ascii="Times New Roman" w:hAnsi="Times New Roman" w:eastAsia="宋体"/>
+          <w:color w:val="000000"/>
+          <w:sz w:val="24"/>
+        </w:rPr>
+        <w:t xml:space="preserve">元，详细路线见表</w:t>
+      </w:r>
+      <w:r>
+        <w:rPr>
+          <w:rFonts w:ascii="Times New Roman" w:hAnsi="Times New Roman" w:eastAsia="宋体"/>
+          <w:color w:val="000000"/>
+          <w:sz w:val="24"/>
+        </w:rPr>
+        <w:t xml:space="preserve"> </w:t>
+      </w:r>
+      <w:r>
+        <w:rPr>
+          <w:rFonts w:hint="eastAsia" w:ascii="Times New Roman" w:hAnsi="Times New Roman" w:eastAsia="宋体"/>
+          <w:color w:val="000000"/>
+          <w:sz w:val="24"/>
+        </w:rPr>
+        <w:t xml:space="preserve">4。由此，精确最优结论建立在全部许可组合的显式比较上，而不是从单一可行方案直接报告。</w:t>
+      </w:r>
+    </w:p>
+    <w:p>
+      <w:pPr>
+        <w:pStyle w:val="BodyText"/>
+        <w:keepNext/>
+        <w:spacing w:line="360" w:lineRule="auto" w:before="0" w:after="0"/>
+        <w:ind w:firstLine="0"/>
+        <w:jc w:val="center"/>
+      </w:pPr>
+      <w:r>
+        <w:rPr>
+          <w:rFonts w:hint="eastAsia" w:ascii="Times New Roman" w:hAnsi="Times New Roman" w:eastAsia="宋体"/>
+          <w:color w:val="000000"/>
+          <w:sz w:val="21"/>
+        </w:rPr>
+        <w:t xml:space="preserve">表</w:t>
+      </w:r>
+      <w:r>
+        <w:rPr>
+          <w:rFonts w:ascii="Times New Roman" w:hAnsi="Times New Roman" w:eastAsia="宋体"/>
+          <w:color w:val="000000"/>
+          <w:sz w:val="21"/>
+        </w:rPr>
+        <w:t xml:space="preserve"> 4 </w:t>
       </w:r>
       <w:r>
         <w:rPr>
@@ -15490,7 +18411,7 @@
           <w:color w:val="000000"/>
           <w:sz w:val="24"/>
         </w:rPr>
-        <w:t xml:space="preserve">4。各到达时刻均落在题给时间窗内，所以车辆无需等待，早到与迟到事件数均为</w:t>
+        <w:t xml:space="preserve">5。各到达时刻均落在题给时间窗内，所以车辆无需等待，早到与迟到事件数均为</w:t>
       </w:r>
       <w:r>
         <w:rPr>
@@ -15523,7 +18444,7 @@
           <w:color w:val="000000"/>
           <w:sz w:val="21"/>
         </w:rPr>
-        <w:t xml:space="preserve"> 4 </w:t>
+        <w:t xml:space="preserve"> 5 </w:t>
       </w:r>
       <w:r>
         <w:rPr>
@@ -17626,7 +20547,7 @@
       </w:r>
     </w:p>
     <w:bookmarkEnd w:id="33"/>
-    <w:bookmarkStart w:id="34" w:name="七任务三封闭弧下的重优化"/>
+    <w:bookmarkStart w:id="34" w:name="七任务三发车前已知封路的静态重优化"/>
     <w:p>
       <w:pPr>
         <w:pStyle w:val="Heading2"/>
@@ -17641,7 +20562,7 @@
           <w:color w:val="000000"/>
           <w:sz w:val="28"/>
         </w:rPr>
-        <w:t xml:space="preserve">七、任务三：封闭弧下的重优化</w:t>
+        <w:t xml:space="preserve">七、任务三：发车前已知封路的静态重优化</w:t>
       </w:r>
     </w:p>
     <w:p>
@@ -17657,7 +20578,73 @@
           <w:color w:val="000000"/>
           <w:sz w:val="24"/>
         </w:rPr>
-        <w:t xml:space="preserve">施工场景把有向弧</w:t>
+        <w:t xml:space="preserve">本节采用的施工信息状态是：4:30</w:t>
+      </w:r>
+      <w:r>
+        <w:rPr>
+          <w:rFonts w:ascii="Times New Roman" w:hAnsi="Times New Roman" w:eastAsia="宋体"/>
+          <w:color w:val="000000"/>
+          <w:sz w:val="24"/>
+        </w:rPr>
+        <w:t xml:space="preserve"> </w:t>
+      </w:r>
+      <w:r>
+        <w:rPr>
+          <w:rFonts w:hint="eastAsia" w:ascii="Times New Roman" w:hAnsi="Times New Roman" w:eastAsia="宋体"/>
+          <w:color w:val="000000"/>
+          <w:sz w:val="24"/>
+        </w:rPr>
+        <w:t xml:space="preserve">发车前已经知道有向弧</w:t>
+      </w:r>
+      <w:r>
+        <w:rPr>
+          <w:rFonts w:ascii="Times New Roman" w:hAnsi="Times New Roman" w:eastAsia="宋体"/>
+          <w:color w:val="000000"/>
+          <w:sz w:val="24"/>
+        </w:rPr>
+        <w:t xml:space="preserve"> </w:t>
+      </w:r>
+      <m:oMath>
+        <m:r>
+          <m:rPr>
+            <m:sty m:val="p"/>
+          </m:rPr>
+          <m:t>(</m:t>
+        </m:r>
+        <m:r>
+          <m:t>2</m:t>
+        </m:r>
+        <m:r>
+          <m:rPr>
+            <m:sty m:val="p"/>
+          </m:rPr>
+          <m:t>,</m:t>
+        </m:r>
+        <m:r>
+          <m:t>8</m:t>
+        </m:r>
+        <m:r>
+          <m:rPr>
+            <m:sty m:val="p"/>
+          </m:rPr>
+          <m:t>)</m:t>
+        </m:r>
+      </m:oMath>
+      <w:r>
+        <w:rPr>
+          <w:rFonts w:ascii="Times New Roman" w:hAnsi="Times New Roman" w:eastAsia="宋体"/>
+          <w:color w:val="000000"/>
+          <w:sz w:val="24"/>
+        </w:rPr>
+        <w:t xml:space="preserve"> </w:t>
+      </w:r>
+      <w:r>
+        <w:rPr>
+          <w:rFonts w:hint="eastAsia" w:ascii="Times New Roman" w:hAnsi="Times New Roman" w:eastAsia="宋体"/>
+          <w:color w:val="000000"/>
+          <w:sz w:val="24"/>
+        </w:rPr>
+        <w:t xml:space="preserve">封闭，并在发车前重新选择三辆车的完整路线。该静态主场景是为缺失事件时刻和在途车辆状态所作的建模假设。施工场景把有向弧</w:t>
       </w:r>
       <w:r>
         <w:rPr>
@@ -17927,39 +20914,39 @@
           <w:color w:val="000000"/>
           <w:sz w:val="24"/>
         </w:rPr>
-        <w:t xml:space="preserve">，故原最优方案在施工后仍可行。8</w:t>
-      </w:r>
-      <w:r>
-        <w:rPr>
-          <w:rFonts w:ascii="Times New Roman" w:hAnsi="Times New Roman" w:eastAsia="宋体"/>
-          <w:color w:val="000000"/>
-          <w:sz w:val="24"/>
-        </w:rPr>
-        <w:t xml:space="preserve"> </w:t>
-      </w:r>
-      <w:r>
-        <w:rPr>
-          <w:rFonts w:hint="eastAsia" w:ascii="Times New Roman" w:hAnsi="Times New Roman" w:eastAsia="宋体"/>
-          <w:color w:val="000000"/>
-          <w:sz w:val="24"/>
-        </w:rPr>
-        <w:t xml:space="preserve">个正常候选组合中，4</w:t>
-      </w:r>
-      <w:r>
-        <w:rPr>
-          <w:rFonts w:ascii="Times New Roman" w:hAnsi="Times New Roman" w:eastAsia="宋体"/>
-          <w:color w:val="000000"/>
-          <w:sz w:val="24"/>
-        </w:rPr>
-        <w:t xml:space="preserve"> </w:t>
-      </w:r>
-      <w:r>
-        <w:rPr>
-          <w:rFonts w:hint="eastAsia" w:ascii="Times New Roman" w:hAnsi="Times New Roman" w:eastAsia="宋体"/>
-          <w:color w:val="000000"/>
-          <w:sz w:val="24"/>
-        </w:rPr>
-        <w:t xml:space="preserve">个包含</w:t>
+        <w:t xml:space="preserve">，故原最优方案在施工后仍可行。表</w:t>
+      </w:r>
+      <w:r>
+        <w:rPr>
+          <w:rFonts w:ascii="Times New Roman" w:hAnsi="Times New Roman" w:eastAsia="宋体"/>
+          <w:color w:val="000000"/>
+          <w:sz w:val="24"/>
+        </w:rPr>
+        <w:t xml:space="preserve"> 3 </w:t>
+      </w:r>
+      <w:r>
+        <w:rPr>
+          <w:rFonts w:hint="eastAsia" w:ascii="Times New Roman" w:hAnsi="Times New Roman" w:eastAsia="宋体"/>
+          <w:color w:val="000000"/>
+          <w:sz w:val="24"/>
+        </w:rPr>
+        <w:t xml:space="preserve">中方案</w:t>
+      </w:r>
+      <w:r>
+        <w:rPr>
+          <w:rFonts w:ascii="Times New Roman" w:hAnsi="Times New Roman" w:eastAsia="宋体"/>
+          <w:color w:val="000000"/>
+          <w:sz w:val="24"/>
+        </w:rPr>
+        <w:t xml:space="preserve"> 3、4、7、8 </w:t>
+      </w:r>
+      <w:r>
+        <w:rPr>
+          <w:rFonts w:hint="eastAsia" w:ascii="Times New Roman" w:hAnsi="Times New Roman" w:eastAsia="宋体"/>
+          <w:color w:val="000000"/>
+          <w:sz w:val="24"/>
+        </w:rPr>
+        <w:t xml:space="preserve">包含</w:t>
       </w:r>
       <w:r>
         <w:rPr>
@@ -18032,31 +21019,47 @@
           <w:color w:val="000000"/>
           <w:sz w:val="24"/>
         </w:rPr>
-        <w:t xml:space="preserve">，在禁弧后被剔除；其余</w:t>
-      </w:r>
-      <w:r>
-        <w:rPr>
-          <w:rFonts w:ascii="Times New Roman" w:hAnsi="Times New Roman" w:eastAsia="宋体"/>
-          <w:color w:val="000000"/>
-          <w:sz w:val="24"/>
-        </w:rPr>
-        <w:t xml:space="preserve"> 4 </w:t>
-      </w:r>
-      <w:r>
-        <w:rPr>
-          <w:rFonts w:hint="eastAsia" w:ascii="Times New Roman" w:hAnsi="Times New Roman" w:eastAsia="宋体"/>
-          <w:color w:val="000000"/>
-          <w:sz w:val="24"/>
-        </w:rPr>
-        <w:t xml:space="preserve">个组合继续可行。对剩余组合按同一词典序目标重优化，最优路线不变。正常与施工方案的量化对比见表</w:t>
-      </w:r>
-      <w:r>
-        <w:rPr>
-          <w:rFonts w:ascii="Times New Roman" w:hAnsi="Times New Roman" w:eastAsia="宋体"/>
-          <w:color w:val="000000"/>
-          <w:sz w:val="24"/>
-        </w:rPr>
-        <w:t xml:space="preserve"> 5。</w:t>
+        <w:t xml:space="preserve">，在禁弧后被剔除；方案</w:t>
+      </w:r>
+      <w:r>
+        <w:rPr>
+          <w:rFonts w:ascii="Times New Roman" w:hAnsi="Times New Roman" w:eastAsia="宋体"/>
+          <w:color w:val="000000"/>
+          <w:sz w:val="24"/>
+        </w:rPr>
+        <w:t xml:space="preserve"> 1、2、5、6 </w:t>
+      </w:r>
+      <w:r>
+        <w:rPr>
+          <w:rFonts w:hint="eastAsia" w:ascii="Times New Roman" w:hAnsi="Times New Roman" w:eastAsia="宋体"/>
+          <w:color w:val="000000"/>
+          <w:sz w:val="24"/>
+        </w:rPr>
+        <w:t xml:space="preserve">继续可行。对剩余组合按同一词典序目标重优化，最优路线仍为方案</w:t>
+      </w:r>
+      <w:r>
+        <w:rPr>
+          <w:rFonts w:ascii="Times New Roman" w:hAnsi="Times New Roman" w:eastAsia="宋体"/>
+          <w:color w:val="000000"/>
+          <w:sz w:val="24"/>
+        </w:rPr>
+        <w:t xml:space="preserve"> </w:t>
+      </w:r>
+      <w:r>
+        <w:rPr>
+          <w:rFonts w:hint="eastAsia" w:ascii="Times New Roman" w:hAnsi="Times New Roman" w:eastAsia="宋体"/>
+          <w:color w:val="000000"/>
+          <w:sz w:val="24"/>
+        </w:rPr>
+        <w:t xml:space="preserve">2。正常与静态施工方案的量化对比见表</w:t>
+      </w:r>
+      <w:r>
+        <w:rPr>
+          <w:rFonts w:ascii="Times New Roman" w:hAnsi="Times New Roman" w:eastAsia="宋体"/>
+          <w:color w:val="000000"/>
+          <w:sz w:val="24"/>
+        </w:rPr>
+        <w:t xml:space="preserve"> 6。</w:t>
       </w:r>
     </w:p>
     <w:p>
@@ -18081,7 +21084,7 @@
           <w:color w:val="000000"/>
           <w:sz w:val="21"/>
         </w:rPr>
-        <w:t xml:space="preserve"> 5 </w:t>
+        <w:t xml:space="preserve"> 6 </w:t>
       </w:r>
       <w:r>
         <w:rPr>
@@ -18089,7 +21092,7 @@
           <w:color w:val="000000"/>
           <w:sz w:val="21"/>
         </w:rPr>
-        <w:t xml:space="preserve">正常方案与施工重优化方案比较</w:t>
+        <w:t xml:space="preserve">正常方案与施工静态重优化方案比较</w:t>
       </w:r>
     </w:p>
     <w:tbl>
@@ -19192,7 +22195,7 @@
           <w:color w:val="000000"/>
           <w:sz w:val="24"/>
         </w:rPr>
-        <w:t xml:space="preserve">题目所称“原配送路径无法通行”与给定坐标、固定分区及最优路径的联合计算结果不一致。严格保留节点编号和封闭方向时，正确结论是指定封路未击中正常最优路线，因而不存在绕路代价。若实际施工意在封闭</w:t>
+        <w:t xml:space="preserve">题目所称“原配送路径无法通行”与给定坐标、固定分区及最优路径的联合计算结果不一致。严格保留节点编号和封闭方向时，在本文发车前已知封路的信息状态下，指定封路未击中正常最优路线，因而不存在绕路代价。若实际施工意在封闭</w:t>
       </w:r>
       <w:r>
         <w:rPr>
@@ -19278,23 +22281,91 @@
           <w:color w:val="000000"/>
           <w:sz w:val="24"/>
         </w:rPr>
-        <w:t xml:space="preserve">个。被删除的</w:t>
-      </w:r>
-      <w:r>
-        <w:rPr>
-          <w:rFonts w:ascii="Times New Roman" w:hAnsi="Times New Roman" w:eastAsia="宋体"/>
-          <w:color w:val="000000"/>
-          <w:sz w:val="24"/>
-        </w:rPr>
-        <w:t xml:space="preserve"> 4 </w:t>
-      </w:r>
-      <w:r>
-        <w:rPr>
-          <w:rFonts w:hint="eastAsia" w:ascii="Times New Roman" w:hAnsi="Times New Roman" w:eastAsia="宋体"/>
-          <w:color w:val="000000"/>
-          <w:sz w:val="24"/>
-        </w:rPr>
-        <w:t xml:space="preserve">个组合都采用</w:t>
+        <w:t xml:space="preserve">个。表</w:t>
+      </w:r>
+      <w:r>
+        <w:rPr>
+          <w:rFonts w:ascii="Times New Roman" w:hAnsi="Times New Roman" w:eastAsia="宋体"/>
+          <w:color w:val="000000"/>
+          <w:sz w:val="24"/>
+        </w:rPr>
+        <w:t xml:space="preserve"> 3 </w:t>
+      </w:r>
+      <w:r>
+        <w:rPr>
+          <w:rFonts w:hint="eastAsia" w:ascii="Times New Roman" w:hAnsi="Times New Roman" w:eastAsia="宋体"/>
+          <w:color w:val="000000"/>
+          <w:sz w:val="24"/>
+        </w:rPr>
+        <w:t xml:space="preserve">明确显示，被删除集合</w:t>
+      </w:r>
+      <w:r>
+        <w:rPr>
+          <w:rFonts w:ascii="Times New Roman" w:hAnsi="Times New Roman" w:eastAsia="宋体"/>
+          <w:color w:val="000000"/>
+          <w:sz w:val="24"/>
+        </w:rPr>
+        <w:t xml:space="preserve"> </w:t>
+      </w:r>
+      <m:oMath>
+        <m:r>
+          <m:rPr>
+            <m:sty m:val="p"/>
+          </m:rPr>
+          <m:t>{</m:t>
+        </m:r>
+        <m:r>
+          <m:t>3</m:t>
+        </m:r>
+        <m:r>
+          <m:rPr>
+            <m:sty m:val="p"/>
+          </m:rPr>
+          <m:t>,</m:t>
+        </m:r>
+        <m:r>
+          <m:t>4</m:t>
+        </m:r>
+        <m:r>
+          <m:rPr>
+            <m:sty m:val="p"/>
+          </m:rPr>
+          <m:t>,</m:t>
+        </m:r>
+        <m:r>
+          <m:t>7</m:t>
+        </m:r>
+        <m:r>
+          <m:rPr>
+            <m:sty m:val="p"/>
+          </m:rPr>
+          <m:t>,</m:t>
+        </m:r>
+        <m:r>
+          <m:t>8</m:t>
+        </m:r>
+        <m:r>
+          <m:rPr>
+            <m:sty m:val="p"/>
+          </m:rPr>
+          <m:t>}</m:t>
+        </m:r>
+      </m:oMath>
+      <w:r>
+        <w:rPr>
+          <w:rFonts w:ascii="Times New Roman" w:hAnsi="Times New Roman" w:eastAsia="宋体"/>
+          <w:color w:val="000000"/>
+          <w:sz w:val="24"/>
+        </w:rPr>
+        <w:t xml:space="preserve"> </w:t>
+      </w:r>
+      <w:r>
+        <w:rPr>
+          <w:rFonts w:hint="eastAsia" w:ascii="Times New Roman" w:hAnsi="Times New Roman" w:eastAsia="宋体"/>
+          <w:color w:val="000000"/>
+          <w:sz w:val="24"/>
+        </w:rPr>
+        <w:t xml:space="preserve">都采用</w:t>
       </w:r>
       <w:r>
         <w:rPr>
@@ -19383,23 +22454,91 @@
           <w:color w:val="000000"/>
           <w:sz w:val="24"/>
         </w:rPr>
-        <w:t xml:space="preserve">店，已被词典序第一层支配；保留下来的</w:t>
-      </w:r>
-      <w:r>
-        <w:rPr>
-          <w:rFonts w:ascii="Times New Roman" w:hAnsi="Times New Roman" w:eastAsia="宋体"/>
-          <w:color w:val="000000"/>
-          <w:sz w:val="24"/>
-        </w:rPr>
-        <w:t xml:space="preserve"> 4 </w:t>
-      </w:r>
-      <w:r>
-        <w:rPr>
-          <w:rFonts w:hint="eastAsia" w:ascii="Times New Roman" w:hAnsi="Times New Roman" w:eastAsia="宋体"/>
-          <w:color w:val="000000"/>
-          <w:sz w:val="24"/>
-        </w:rPr>
-        <w:t xml:space="preserve">个组合恰为全部零迟到组合，并包含正常最优解。因此这次扰动改变了可行域，却没有改变最优目标值。该机制解释只适用于当前有向弧、坐标距离和固定分区合同，不能外推为“施工封路通常没有成本”。</w:t>
+        <w:t xml:space="preserve">店，已被词典序第一层支配；保留集合</w:t>
+      </w:r>
+      <w:r>
+        <w:rPr>
+          <w:rFonts w:ascii="Times New Roman" w:hAnsi="Times New Roman" w:eastAsia="宋体"/>
+          <w:color w:val="000000"/>
+          <w:sz w:val="24"/>
+        </w:rPr>
+        <w:t xml:space="preserve"> </w:t>
+      </w:r>
+      <m:oMath>
+        <m:r>
+          <m:rPr>
+            <m:sty m:val="p"/>
+          </m:rPr>
+          <m:t>{</m:t>
+        </m:r>
+        <m:r>
+          <m:t>1</m:t>
+        </m:r>
+        <m:r>
+          <m:rPr>
+            <m:sty m:val="p"/>
+          </m:rPr>
+          <m:t>,</m:t>
+        </m:r>
+        <m:r>
+          <m:t>2</m:t>
+        </m:r>
+        <m:r>
+          <m:rPr>
+            <m:sty m:val="p"/>
+          </m:rPr>
+          <m:t>,</m:t>
+        </m:r>
+        <m:r>
+          <m:t>5</m:t>
+        </m:r>
+        <m:r>
+          <m:rPr>
+            <m:sty m:val="p"/>
+          </m:rPr>
+          <m:t>,</m:t>
+        </m:r>
+        <m:r>
+          <m:t>6</m:t>
+        </m:r>
+        <m:r>
+          <m:rPr>
+            <m:sty m:val="p"/>
+          </m:rPr>
+          <m:t>}</m:t>
+        </m:r>
+      </m:oMath>
+      <w:r>
+        <w:rPr>
+          <w:rFonts w:ascii="Times New Roman" w:hAnsi="Times New Roman" w:eastAsia="宋体"/>
+          <w:color w:val="000000"/>
+          <w:sz w:val="24"/>
+        </w:rPr>
+        <w:t xml:space="preserve"> </w:t>
+      </w:r>
+      <w:r>
+        <w:rPr>
+          <w:rFonts w:hint="eastAsia" w:ascii="Times New Roman" w:hAnsi="Times New Roman" w:eastAsia="宋体"/>
+          <w:color w:val="000000"/>
+          <w:sz w:val="24"/>
+        </w:rPr>
+        <w:t xml:space="preserve">恰为全部零迟到组合，且最优集合中的方案</w:t>
+      </w:r>
+      <w:r>
+        <w:rPr>
+          <w:rFonts w:ascii="Times New Roman" w:hAnsi="Times New Roman" w:eastAsia="宋体"/>
+          <w:color w:val="000000"/>
+          <w:sz w:val="24"/>
+        </w:rPr>
+        <w:t xml:space="preserve"> 2 </w:t>
+      </w:r>
+      <w:r>
+        <w:rPr>
+          <w:rFonts w:hint="eastAsia" w:ascii="Times New Roman" w:hAnsi="Times New Roman" w:eastAsia="宋体"/>
+          <w:color w:val="000000"/>
+          <w:sz w:val="24"/>
+        </w:rPr>
+        <w:t xml:space="preserve">未被删除。因此这次扰动改变了可行域，却没有改变最优方案和目标值。该机制只适用于当前有向弧、坐标距离、固定分区合同和发车前静态信息状态，不能外推为“施工封路通常没有成本”，也不能推出在途动态改道仍为零增量。</w:t>
       </w:r>
     </w:p>
     <w:bookmarkEnd w:id="34"/>
@@ -20321,7 +23460,23 @@
           <w:color w:val="000000"/>
           <w:sz w:val="24"/>
         </w:rPr>
-        <w:t xml:space="preserve">模型的主要优点是语义与计算边界清楚。固定分区、配送站前序、时间窗优先级和封闭弧方向均显式进入模型；对</w:t>
+        <w:t xml:space="preserve">模型的主要优点是语义与计算边界清楚。固定分区、配送站前序、时间窗优先级和封闭弧方向均显式进入模型；表</w:t>
+      </w:r>
+      <w:r>
+        <w:rPr>
+          <w:rFonts w:ascii="Times New Roman" w:hAnsi="Times New Roman" w:eastAsia="宋体"/>
+          <w:color w:val="000000"/>
+          <w:sz w:val="24"/>
+        </w:rPr>
+        <w:t xml:space="preserve"> 3 </w:t>
+      </w:r>
+      <w:r>
+        <w:rPr>
+          <w:rFonts w:hint="eastAsia" w:ascii="Times New Roman" w:hAnsi="Times New Roman" w:eastAsia="宋体"/>
+          <w:color w:val="000000"/>
+          <w:sz w:val="24"/>
+        </w:rPr>
+        <w:t xml:space="preserve">展示全部</w:t>
       </w:r>
       <w:r>
         <w:rPr>
@@ -20337,7 +23492,7 @@
           <w:color w:val="000000"/>
           <w:sz w:val="24"/>
         </w:rPr>
-        <w:t xml:space="preserve">个组合进行穷举，能够给出当前小规模实例的全局最优性证明。任务三先检查封闭弧是否命中基线，再重优化，避免把题目叙述中的预期效果当成数值结论。服务时长阈值又给出了零服务时长假设的适用范围。</w:t>
+        <w:t xml:space="preserve">个组合及其封路可行性，能够给出当前小规模实例的全局最优性和零效应机制证据。任务三先声明发车前静态信息状态，再检查封闭弧是否命中基线并重优化，避免把题目叙述中的预期效果当成数值结论。服务时长阈值又给出了零服务时长假设的适用范围。</w:t>
       </w:r>
     </w:p>
     <w:p>
@@ -20353,15 +23508,39 @@
           <w:color w:val="000000"/>
           <w:sz w:val="24"/>
         </w:rPr>
-        <w:t xml:space="preserve">模型也有明确限制。首先，欧氏距离没有反映真实道路绕行、单行线和拥堵，因而数值路线应视为坐标网络上的规划结果。其次，恒定速度和统一服务时长没有描述交通与装卸差异。再次，冷链温度只作为阈值可行性条件，缺少温度动态和能耗数据，不能评价制冷成本。最后，任务三是发车前静态重优化，不能代表车辆已在途时的动态重路由；动态车辆路径问题还需要事件发生时刻、车辆位置和实时路网状态</w:t>
-      </w:r>
-      <w:r>
-        <w:rPr>
-          <w:rFonts w:ascii="Times New Roman" w:hAnsi="Times New Roman" w:eastAsia="宋体"/>
-          <w:color w:val="000000"/>
-          <w:sz w:val="24"/>
-        </w:rPr>
-        <w:t xml:space="preserve"> [3]。</w:t>
+        <w:t xml:space="preserve">模型也有明确限制。首先，欧氏距离没有反映真实道路绕行、单行线和拥堵，因而数值路线应视为坐标网络上的规划结果。其次，恒定速度和统一服务时长没有描述交通与装卸差异。再次，冷链温度只作为阈值可行性条件，缺少温度动态和能耗数据，不能评价制冷成本。最后，任务三把“4:30</w:t>
+      </w:r>
+      <w:r>
+        <w:rPr>
+          <w:rFonts w:ascii="Times New Roman" w:hAnsi="Times New Roman" w:eastAsia="宋体"/>
+          <w:color w:val="000000"/>
+          <w:sz w:val="24"/>
+        </w:rPr>
+        <w:t xml:space="preserve"> </w:t>
+      </w:r>
+      <w:r>
+        <w:rPr>
+          <w:rFonts w:hint="eastAsia" w:ascii="Times New Roman" w:hAnsi="Times New Roman" w:eastAsia="宋体"/>
+          <w:color w:val="000000"/>
+          <w:sz w:val="24"/>
+        </w:rPr>
+        <w:t xml:space="preserve">发车前已知封路”作为补充建模假设，只能回答发车前静态重优化；真正的在途动态重路由还需要事件发生时刻、车辆位置、已服务节点、剩余载荷和实时路网状态</w:t>
+      </w:r>
+      <w:r>
+        <w:rPr>
+          <w:rFonts w:ascii="Times New Roman" w:hAnsi="Times New Roman" w:eastAsia="宋体"/>
+          <w:color w:val="000000"/>
+          <w:sz w:val="24"/>
+        </w:rPr>
+        <w:t xml:space="preserve"> </w:t>
+      </w:r>
+      <w:r>
+        <w:rPr>
+          <w:rFonts w:hint="eastAsia" w:ascii="Times New Roman" w:hAnsi="Times New Roman" w:eastAsia="宋体"/>
+          <w:color w:val="000000"/>
+          <w:sz w:val="24"/>
+        </w:rPr>
+        <w:t xml:space="preserve">[3]。本文不补造这些状态，也不把静态零增量外推到动态情形。</w:t>
       </w:r>
     </w:p>
     <w:p>
@@ -20492,7 +23671,55 @@
           <w:color w:val="000000"/>
           <w:sz w:val="24"/>
         </w:rPr>
-        <w:t xml:space="preserve">家门店均按时到达。严格封闭题给有向弧</w:t>
+        <w:t xml:space="preserve">家门店均按时到达。全部</w:t>
+      </w:r>
+      <w:r>
+        <w:rPr>
+          <w:rFonts w:ascii="Times New Roman" w:hAnsi="Times New Roman" w:eastAsia="宋体"/>
+          <w:color w:val="000000"/>
+          <w:sz w:val="24"/>
+        </w:rPr>
+        <w:t xml:space="preserve"> 8 </w:t>
+      </w:r>
+      <w:r>
+        <w:rPr>
+          <w:rFonts w:hint="eastAsia" w:ascii="Times New Roman" w:hAnsi="Times New Roman" w:eastAsia="宋体"/>
+          <w:color w:val="000000"/>
+          <w:sz w:val="24"/>
+        </w:rPr>
+        <w:t xml:space="preserve">个许可组合的比较表明，该方案在</w:t>
+      </w:r>
+      <w:r>
+        <w:rPr>
+          <w:rFonts w:ascii="Times New Roman" w:hAnsi="Times New Roman" w:eastAsia="宋体"/>
+          <w:color w:val="000000"/>
+          <w:sz w:val="24"/>
+        </w:rPr>
+        <w:t xml:space="preserve"> 4 </w:t>
+      </w:r>
+      <w:r>
+        <w:rPr>
+          <w:rFonts w:hint="eastAsia" w:ascii="Times New Roman" w:hAnsi="Times New Roman" w:eastAsia="宋体"/>
+          <w:color w:val="000000"/>
+          <w:sz w:val="24"/>
+        </w:rPr>
+        <w:t xml:space="preserve">个零迟到组合中成本最低。对于“4:30</w:t>
+      </w:r>
+      <w:r>
+        <w:rPr>
+          <w:rFonts w:ascii="Times New Roman" w:hAnsi="Times New Roman" w:eastAsia="宋体"/>
+          <w:color w:val="000000"/>
+          <w:sz w:val="24"/>
+        </w:rPr>
+        <w:t xml:space="preserve"> </w:t>
+      </w:r>
+      <w:r>
+        <w:rPr>
+          <w:rFonts w:hint="eastAsia" w:ascii="Times New Roman" w:hAnsi="Times New Roman" w:eastAsia="宋体"/>
+          <w:color w:val="000000"/>
+          <w:sz w:val="24"/>
+        </w:rPr>
+        <w:t xml:space="preserve">发车前已经知道有向弧</w:t>
       </w:r>
       <w:r>
         <w:rPr>
@@ -20530,7 +23757,23 @@
           <w:color w:val="000000"/>
           <w:sz w:val="24"/>
         </w:rPr>
-        <w:t xml:space="preserve">后，正常最优路线仍然可行，应急重优化路线和成本均不变。该零增量结论在统一门店服务时长不超过</w:t>
+        <w:t xml:space="preserve">封闭”的静态主场景，禁弧删除</w:t>
+      </w:r>
+      <w:r>
+        <w:rPr>
+          <w:rFonts w:ascii="Times New Roman" w:hAnsi="Times New Roman" w:eastAsia="宋体"/>
+          <w:color w:val="000000"/>
+          <w:sz w:val="24"/>
+        </w:rPr>
+        <w:t xml:space="preserve"> 4 </w:t>
+      </w:r>
+      <w:r>
+        <w:rPr>
+          <w:rFonts w:hint="eastAsia" w:ascii="Times New Roman" w:hAnsi="Times New Roman" w:eastAsia="宋体"/>
+          <w:color w:val="000000"/>
+          <w:sz w:val="24"/>
+        </w:rPr>
+        <w:t xml:space="preserve">个本已迟到的组合，正常最优路线仍然可行，重优化路线和成本均不变。该零增量结论在统一门店服务时长不超过</w:t>
       </w:r>
       <w:r>
         <w:rPr>
@@ -20546,7 +23789,7 @@
           <w:color w:val="000000"/>
           <w:sz w:val="24"/>
         </w:rPr>
-        <w:t xml:space="preserve">分钟/店时保持成立。</w:t>
+        <w:t xml:space="preserve">分钟/店时保持成立，但仅适用于上述信息状态，不能代表在途动态重路由。</w:t>
       </w:r>
     </w:p>
     <w:p>
@@ -20562,7 +23805,7 @@
           <w:color w:val="000000"/>
           <w:sz w:val="24"/>
         </w:rPr>
-        <w:t xml:space="preserve">因此，本题的关键不在于设计复杂的元启发式算法，而在于正确处理固定分区、保鲜优先级以及“封闭弧未命中最优路线”的数据事实。若企业期望得到真实施工绕路方案，必须补充与封路一致的道路邻接和方向信息。</w:t>
+        <w:t xml:space="preserve">因此，本题的关键不在于设计复杂的元启发式算法，而在于正确处理固定分区、保鲜优先级、施工信息状态以及“封闭弧未命中最优路线”的数据事实。若企业期望得到真实在途施工绕路方案，必须补充与封路一致的道路邻接和方向信息，以及事件时刻和车辆实时状态。</w:t>
       </w:r>
     </w:p>
     <w:bookmarkEnd w:id="39"/>

</xml_diff>

<commit_message>
update Problem B paper content and regenerate docx
- Revise paper.md and rebuild paper.docx
</commit_message>
<xml_diff>
--- a/projects/2026-summer-assignment/solutions/problem-b-cold-chain-routing/paper/paper.docx
+++ b/projects/2026-summer-assignment/solutions/problem-b-cold-chain-routing/paper/paper.docx
@@ -2,7 +2,7 @@
 <file path=word/document.xml><?xml version="1.0" encoding="utf-8"?>
 <w:document xmlns:w="http://schemas.openxmlformats.org/wordprocessingml/2006/main" xmlns:m="http://schemas.openxmlformats.org/officeDocument/2006/math" xmlns:r="http://schemas.openxmlformats.org/officeDocument/2006/relationships" xmlns:o="urn:schemas-microsoft-com:office:office" xmlns:v="urn:schemas-microsoft-com:vml" xmlns:w10="urn:schemas-microsoft-com:office:word" xmlns:a="http://schemas.openxmlformats.org/drawingml/2006/main" xmlns:pic="http://schemas.openxmlformats.org/drawingml/2006/picture" xmlns:wp="http://schemas.openxmlformats.org/drawingml/2006/wordprocessingDrawing">
   <w:body>
-    <w:bookmarkStart w:id="42" w:name="固定分区与严格保鲜优先下的冷链配送路径优化"/>
+    <w:bookmarkStart w:id="41" w:name="固定分区与严格保鲜优先下的冷链配送路径优化"/>
     <w:p>
       <w:pPr>
         <w:pStyle w:val="Heading1"/>
@@ -101,7 +101,7 @@
           <w:color w:val="000000"/>
           <w:sz w:val="24"/>
         </w:rPr>
-        <w:t xml:space="preserve">家门店组成的冷链配送网络，本文建立固定分区、配送站必经的路线型</w:t>
+        <w:t xml:space="preserve">家门店组成的冷链配送网络，任务一建立固定分区、配送站必经的路线型</w:t>
       </w:r>
       <w:r>
         <w:rPr>
@@ -117,23 +117,7 @@
           <w:color w:val="000000"/>
           <w:sz w:val="24"/>
         </w:rPr>
-        <w:t xml:space="preserve">车辆路径模型。每条候选路线预先递推到达与服务时刻，并据此形成里程、早到、迟到和封路可行性系数；路线选择变量再把这些系数联结为实际方案。三辆车均于</w:t>
-      </w:r>
-      <w:r>
-        <w:rPr>
-          <w:rFonts w:ascii="Times New Roman" w:hAnsi="Times New Roman" w:eastAsia="宋体"/>
-          <w:color w:val="000000"/>
-          <w:sz w:val="24"/>
-        </w:rPr>
-        <w:t xml:space="preserve"> 4:30 </w:t>
-      </w:r>
-      <w:r>
-        <w:rPr>
-          <w:rFonts w:hint="eastAsia" w:ascii="Times New Roman" w:hAnsi="Times New Roman" w:eastAsia="宋体"/>
-          <w:color w:val="000000"/>
-          <w:sz w:val="24"/>
-        </w:rPr>
-        <w:t xml:space="preserve">发车并返厨；目标按词典序先最小化迟到门店数，再最小化运输成本与时间窗事件罚。固定分区后完整方案仅有</w:t>
+        <w:t xml:space="preserve">车辆路径模型，按词典序先最小化迟到门店数，再最小化运输成本与时间窗事件罚。固定分区后完整方案仅有</w:t>
       </w:r>
       <w:r>
         <w:rPr>
@@ -180,7 +164,7 @@
           <w:color w:val="000000"/>
           <w:sz w:val="24"/>
         </w:rPr>
-        <w:t xml:space="preserve">种，逐一计算即可得到当前模型下的精确最优解。</w:t>
+        <w:t xml:space="preserve">种，完整枚举可得到当前模型下的精确最优解。</w:t>
       </w:r>
     </w:p>
     <w:p>
@@ -196,7 +180,7 @@
           <w:color w:val="000000"/>
           <w:sz w:val="24"/>
         </w:rPr>
-        <w:t xml:space="preserve">正常场景的</w:t>
+        <w:t xml:space="preserve">任务二得到</w:t>
       </w:r>
       <w:r>
         <w:rPr>
@@ -428,7 +412,7 @@
           <w:color w:val="000000"/>
           <w:sz w:val="24"/>
         </w:rPr>
-        <w:t xml:space="preserve">家门店均按时到达。任务三因题面缺少封路发现时刻和在途车辆状态，将“4:30</w:t>
+        <w:t xml:space="preserve">家门店均按时到达。任务三将“4:30</w:t>
       </w:r>
       <w:r>
         <w:rPr>
@@ -482,7 +466,7 @@
           <w:color w:val="000000"/>
           <w:sz w:val="24"/>
         </w:rPr>
-        <w:t xml:space="preserve">封闭”定义为可复现的静态主场景。完整枚举表明封路删除</w:t>
+        <w:t xml:space="preserve">封闭”作为可复现的静态主场景。枚举结果表明，封路删除</w:t>
       </w:r>
       <w:r>
         <w:rPr>
@@ -543,7 +527,7 @@
           <w:color w:val="000000"/>
           <w:sz w:val="24"/>
         </w:rPr>
-        <w:t xml:space="preserve">分钟/店时，该零增量结论保持成立。该结论仅适用于上述信息状态；真正的在途动态重路由需要额外事件时刻和车辆状态数据。</w:t>
+        <w:t xml:space="preserve">分钟/店时，该结论保持成立。真正的在途动态重路由还需要事件时刻和车辆状态数据。</w:t>
       </w:r>
     </w:p>
     <w:p>
@@ -1057,7 +1041,7 @@
       </w:r>
     </w:p>
     <w:bookmarkEnd w:id="12"/>
-    <w:bookmarkStart w:id="16" w:name="施工扰动"/>
+    <w:bookmarkStart w:id="13" w:name="施工扰动"/>
     <w:p>
       <w:pPr>
         <w:pStyle w:val="Heading3"/>
@@ -1127,7 +1111,7 @@
           <w:color w:val="000000"/>
           <w:sz w:val="24"/>
         </w:rPr>
-        <w:t xml:space="preserve">，但没有给出封路发现时刻和车辆在途位置、已服务节点或剩余载荷。因此本文把“4:30</w:t>
+        <w:t xml:space="preserve">，但没有给出封路发现时刻和车辆在途位置、已服务节点或剩余载荷。为形成可复现的主分析，本文采用“4:30</w:t>
       </w:r>
       <w:r>
         <w:rPr>
@@ -1143,37 +1127,7 @@
           <w:color w:val="000000"/>
           <w:sz w:val="24"/>
         </w:rPr>
-        <w:t xml:space="preserve">发车前已知该弧封闭，并在发车前重新选择三条完整路线”定义为可复现的静态主场景；这是为闭合任务三采用的建模假设，不是题面事实。在该信息状态下，应先检查正常最优路线是否使用封闭弧，再在禁弧后的候选集中按相同目标重优化。不能为了得到非零绕路成本而把封闭方向改为</w:t>
-      </w:r>
-      <w:r>
-        <w:rPr>
-          <w:rFonts w:ascii="Times New Roman" w:hAnsi="Times New Roman" w:eastAsia="宋体"/>
-          <w:color w:val="000000"/>
-          <w:sz w:val="24"/>
-        </w:rPr>
-        <w:t xml:space="preserve"> </w:t>
-      </w:r>
-      <m:oMath>
-        <m:r>
-          <m:t>8</m:t>
-        </m:r>
-        <m:r>
-          <m:rPr>
-            <m:sty m:val="p"/>
-          </m:rPr>
-          <m:t>→</m:t>
-        </m:r>
-        <m:r>
-          <m:t>2</m:t>
-        </m:r>
-      </m:oMath>
-      <w:r>
-        <w:rPr>
-          <w:rFonts w:hint="eastAsia" w:ascii="Times New Roman" w:hAnsi="Times New Roman" w:eastAsia="宋体"/>
-          <w:color w:val="000000"/>
-          <w:sz w:val="24"/>
-        </w:rPr>
-        <w:t xml:space="preserve">，也不能强制正常方案先使用</w:t>
+        <w:t xml:space="preserve">发车前已知该弧封闭，并在发车前重新选择三条完整路线”的静态施工情景。在该信息状态下，先检查正常最优路线是否使用封闭弧，再在禁弧后的候选集中按相同目标重优化。封闭方向严格按题给</w:t>
       </w:r>
       <w:r>
         <w:rPr>
@@ -1199,11 +1153,143 @@
       </m:oMath>
       <w:r>
         <w:rPr>
-          <w:rFonts w:hint="eastAsia" w:ascii="Times New Roman" w:hAnsi="Times New Roman" w:eastAsia="宋体"/>
-          <w:color w:val="000000"/>
-          <w:sz w:val="24"/>
-        </w:rPr>
-        <w:t xml:space="preserve">。真正的在途动态重路由需要事件时刻和车辆状态，本文不补造这些数据。节点空间关系、固定分区和封闭方向见图</w:t>
+          <w:rFonts w:ascii="Times New Roman" w:hAnsi="Times New Roman" w:eastAsia="宋体"/>
+          <w:color w:val="000000"/>
+          <w:sz w:val="24"/>
+        </w:rPr>
+        <w:t xml:space="preserve"> </w:t>
+      </w:r>
+      <w:r>
+        <w:rPr>
+          <w:rFonts w:hint="eastAsia" w:ascii="Times New Roman" w:hAnsi="Times New Roman" w:eastAsia="宋体"/>
+          <w:color w:val="000000"/>
+          <w:sz w:val="24"/>
+        </w:rPr>
+        <w:t xml:space="preserve">处理；若施工在车辆出发后才被发现，则还需事件时刻和车辆状态数据，属于数据条件不同的动态重路由问题。</w:t>
+      </w:r>
+    </w:p>
+    <w:bookmarkEnd w:id="13"/>
+    <w:bookmarkStart w:id="17" w:name="数据整理与约束尺度"/>
+    <w:p>
+      <w:pPr>
+        <w:pStyle w:val="Heading3"/>
+        <w:spacing w:line="240" w:lineRule="auto" w:before="50" w:after="50"/>
+        <w:ind w:firstLine="0"/>
+        <w:jc w:val="left"/>
+      </w:pPr>
+      <w:r>
+        <w:rPr>
+          <w:rFonts w:ascii="Times New Roman" w:hAnsi="Times New Roman" w:eastAsia="宋体"/>
+          <w:b/>
+          <w:color w:val="000000"/>
+          <w:sz w:val="24"/>
+        </w:rPr>
+        <w:t xml:space="preserve">2.4 </w:t>
+      </w:r>
+      <w:r>
+        <w:rPr>
+          <w:rFonts w:hint="eastAsia" w:ascii="Times New Roman" w:hAnsi="Times New Roman" w:eastAsia="宋体"/>
+          <w:b/>
+          <w:color w:val="000000"/>
+          <w:sz w:val="24"/>
+        </w:rPr>
+        <w:t xml:space="preserve">数据整理与约束尺度</w:t>
+      </w:r>
+    </w:p>
+    <w:p>
+      <w:pPr>
+        <w:pStyle w:val="FirstParagraph"/>
+        <w:spacing w:line="360" w:lineRule="auto" w:before="0" w:after="0"/>
+        <w:ind w:firstLine="480"/>
+        <w:jc w:val="both"/>
+      </w:pPr>
+      <w:r>
+        <w:rPr>
+          <w:rFonts w:hint="eastAsia" w:ascii="Times New Roman" w:hAnsi="Times New Roman" w:eastAsia="宋体"/>
+          <w:color w:val="000000"/>
+          <w:sz w:val="24"/>
+        </w:rPr>
+        <w:t xml:space="preserve">建模所用节点数据见表</w:t>
+      </w:r>
+      <w:r>
+        <w:rPr>
+          <w:rFonts w:ascii="Times New Roman" w:hAnsi="Times New Roman" w:eastAsia="宋体"/>
+          <w:color w:val="000000"/>
+          <w:sz w:val="24"/>
+        </w:rPr>
+        <w:t xml:space="preserve"> </w:t>
+      </w:r>
+      <w:r>
+        <w:rPr>
+          <w:rFonts w:hint="eastAsia" w:ascii="Times New Roman" w:hAnsi="Times New Roman" w:eastAsia="宋体"/>
+          <w:color w:val="000000"/>
+          <w:sz w:val="24"/>
+        </w:rPr>
+        <w:t xml:space="preserve">1。节点</w:t>
+      </w:r>
+      <w:r>
+        <w:rPr>
+          <w:rFonts w:ascii="Times New Roman" w:hAnsi="Times New Roman" w:eastAsia="宋体"/>
+          <w:color w:val="000000"/>
+          <w:sz w:val="24"/>
+        </w:rPr>
+        <w:t xml:space="preserve"> 0 </w:t>
+      </w:r>
+      <w:r>
+        <w:rPr>
+          <w:rFonts w:hint="eastAsia" w:ascii="Times New Roman" w:hAnsi="Times New Roman" w:eastAsia="宋体"/>
+          <w:color w:val="000000"/>
+          <w:sz w:val="24"/>
+        </w:rPr>
+        <w:t xml:space="preserve">为中央厨房，节点</w:t>
+      </w:r>
+      <w:r>
+        <w:rPr>
+          <w:rFonts w:ascii="Times New Roman" w:hAnsi="Times New Roman" w:eastAsia="宋体"/>
+          <w:color w:val="000000"/>
+          <w:sz w:val="24"/>
+        </w:rPr>
+        <w:t xml:space="preserve"> 1—3 </w:t>
+      </w:r>
+      <w:r>
+        <w:rPr>
+          <w:rFonts w:hint="eastAsia" w:ascii="Times New Roman" w:hAnsi="Times New Roman" w:eastAsia="宋体"/>
+          <w:color w:val="000000"/>
+          <w:sz w:val="24"/>
+        </w:rPr>
+        <w:t xml:space="preserve">为配送站，节点</w:t>
+      </w:r>
+      <w:r>
+        <w:rPr>
+          <w:rFonts w:ascii="Times New Roman" w:hAnsi="Times New Roman" w:eastAsia="宋体"/>
+          <w:color w:val="000000"/>
+          <w:sz w:val="24"/>
+        </w:rPr>
+        <w:t xml:space="preserve"> 4—9 </w:t>
+      </w:r>
+      <w:r>
+        <w:rPr>
+          <w:rFonts w:hint="eastAsia" w:ascii="Times New Roman" w:hAnsi="Times New Roman" w:eastAsia="宋体"/>
+          <w:color w:val="000000"/>
+          <w:sz w:val="24"/>
+        </w:rPr>
+        <w:t xml:space="preserve">为门店。门店归属把一般多车路径问题分解为三个两点排序子问题；坐标单位为</w:t>
+      </w:r>
+      <w:r>
+        <w:rPr>
+          <w:rFonts w:ascii="Times New Roman" w:hAnsi="Times New Roman" w:eastAsia="宋体"/>
+          <w:color w:val="000000"/>
+          <w:sz w:val="24"/>
+        </w:rPr>
+        <w:t xml:space="preserve"> </w:t>
+      </w:r>
+      <w:r>
+        <w:rPr>
+          <w:rFonts w:hint="eastAsia" w:ascii="Times New Roman" w:hAnsi="Times New Roman" w:eastAsia="宋体"/>
+          <w:color w:val="000000"/>
+          <w:sz w:val="24"/>
+        </w:rPr>
+        <w:t xml:space="preserve">km，因此欧氏距离可直接作为当前缺少道路矩阵时的距离代理。节点空间关系、固定分区和封闭方向见图</w:t>
       </w:r>
       <w:r>
         <w:rPr>
@@ -1227,18 +1313,18 @@
           <wp:inline>
             <wp:extent cx="4480560" cy="3111500"/>
             <wp:effectExtent b="0" l="0" r="0" t="0"/>
-            <wp:docPr descr="" title="" id="14" name="Picture"/>
+            <wp:docPr descr="" title="" id="15" name="Picture"/>
             <a:graphic>
               <a:graphicData uri="http://schemas.openxmlformats.org/drawingml/2006/picture">
                 <pic:pic>
                   <pic:nvPicPr>
-                    <pic:cNvPr descr="../figures/fig1_assignment_network.png" id="15" name="Picture"/>
+                    <pic:cNvPr descr="../figures/fig1_assignment_network.png" id="16" name="Picture"/>
                     <pic:cNvPicPr>
                       <a:picLocks noChangeArrowheads="1" noChangeAspect="1"/>
                     </pic:cNvPicPr>
                   </pic:nvPicPr>
                   <pic:blipFill>
-                    <a:blip r:embed="rId13"/>
+                    <a:blip r:embed="rId14"/>
                     <a:stretch>
                       <a:fillRect/>
                     </a:stretch>
@@ -1298,130 +1384,6 @@
         <w:t xml:space="preserve">节点坐标、固定分区与任务三封闭弧</w:t>
       </w:r>
     </w:p>
-    <w:bookmarkEnd w:id="16"/>
-    <w:bookmarkStart w:id="17" w:name="数据整理与约束尺度"/>
-    <w:p>
-      <w:pPr>
-        <w:pStyle w:val="Heading3"/>
-        <w:spacing w:line="240" w:lineRule="auto" w:before="50" w:after="50"/>
-        <w:ind w:firstLine="0"/>
-        <w:jc w:val="left"/>
-      </w:pPr>
-      <w:r>
-        <w:rPr>
-          <w:rFonts w:ascii="Times New Roman" w:hAnsi="Times New Roman" w:eastAsia="宋体"/>
-          <w:b/>
-          <w:color w:val="000000"/>
-          <w:sz w:val="24"/>
-        </w:rPr>
-        <w:t xml:space="preserve">2.4 </w:t>
-      </w:r>
-      <w:r>
-        <w:rPr>
-          <w:rFonts w:hint="eastAsia" w:ascii="Times New Roman" w:hAnsi="Times New Roman" w:eastAsia="宋体"/>
-          <w:b/>
-          <w:color w:val="000000"/>
-          <w:sz w:val="24"/>
-        </w:rPr>
-        <w:t xml:space="preserve">数据整理与约束尺度</w:t>
-      </w:r>
-    </w:p>
-    <w:p>
-      <w:pPr>
-        <w:pStyle w:val="FirstParagraph"/>
-        <w:spacing w:line="360" w:lineRule="auto" w:before="0" w:after="0"/>
-        <w:ind w:firstLine="480"/>
-        <w:jc w:val="both"/>
-      </w:pPr>
-      <w:r>
-        <w:rPr>
-          <w:rFonts w:hint="eastAsia" w:ascii="Times New Roman" w:hAnsi="Times New Roman" w:eastAsia="宋体"/>
-          <w:color w:val="000000"/>
-          <w:sz w:val="24"/>
-        </w:rPr>
-        <w:t xml:space="preserve">建模所用节点数据见表</w:t>
-      </w:r>
-      <w:r>
-        <w:rPr>
-          <w:rFonts w:ascii="Times New Roman" w:hAnsi="Times New Roman" w:eastAsia="宋体"/>
-          <w:color w:val="000000"/>
-          <w:sz w:val="24"/>
-        </w:rPr>
-        <w:t xml:space="preserve"> </w:t>
-      </w:r>
-      <w:r>
-        <w:rPr>
-          <w:rFonts w:hint="eastAsia" w:ascii="Times New Roman" w:hAnsi="Times New Roman" w:eastAsia="宋体"/>
-          <w:color w:val="000000"/>
-          <w:sz w:val="24"/>
-        </w:rPr>
-        <w:t xml:space="preserve">1。节点</w:t>
-      </w:r>
-      <w:r>
-        <w:rPr>
-          <w:rFonts w:ascii="Times New Roman" w:hAnsi="Times New Roman" w:eastAsia="宋体"/>
-          <w:color w:val="000000"/>
-          <w:sz w:val="24"/>
-        </w:rPr>
-        <w:t xml:space="preserve"> 0 </w:t>
-      </w:r>
-      <w:r>
-        <w:rPr>
-          <w:rFonts w:hint="eastAsia" w:ascii="Times New Roman" w:hAnsi="Times New Roman" w:eastAsia="宋体"/>
-          <w:color w:val="000000"/>
-          <w:sz w:val="24"/>
-        </w:rPr>
-        <w:t xml:space="preserve">为中央厨房，节点</w:t>
-      </w:r>
-      <w:r>
-        <w:rPr>
-          <w:rFonts w:ascii="Times New Roman" w:hAnsi="Times New Roman" w:eastAsia="宋体"/>
-          <w:color w:val="000000"/>
-          <w:sz w:val="24"/>
-        </w:rPr>
-        <w:t xml:space="preserve"> 1—3 </w:t>
-      </w:r>
-      <w:r>
-        <w:rPr>
-          <w:rFonts w:hint="eastAsia" w:ascii="Times New Roman" w:hAnsi="Times New Roman" w:eastAsia="宋体"/>
-          <w:color w:val="000000"/>
-          <w:sz w:val="24"/>
-        </w:rPr>
-        <w:t xml:space="preserve">为配送站，节点</w:t>
-      </w:r>
-      <w:r>
-        <w:rPr>
-          <w:rFonts w:ascii="Times New Roman" w:hAnsi="Times New Roman" w:eastAsia="宋体"/>
-          <w:color w:val="000000"/>
-          <w:sz w:val="24"/>
-        </w:rPr>
-        <w:t xml:space="preserve"> 4—9 </w:t>
-      </w:r>
-      <w:r>
-        <w:rPr>
-          <w:rFonts w:hint="eastAsia" w:ascii="Times New Roman" w:hAnsi="Times New Roman" w:eastAsia="宋体"/>
-          <w:color w:val="000000"/>
-          <w:sz w:val="24"/>
-        </w:rPr>
-        <w:t xml:space="preserve">为门店。门店归属把一般多车路径问题分解为三个两点排序子问题；坐标单位为</w:t>
-      </w:r>
-      <w:r>
-        <w:rPr>
-          <w:rFonts w:ascii="Times New Roman" w:hAnsi="Times New Roman" w:eastAsia="宋体"/>
-          <w:color w:val="000000"/>
-          <w:sz w:val="24"/>
-        </w:rPr>
-        <w:t xml:space="preserve"> </w:t>
-      </w:r>
-      <w:r>
-        <w:rPr>
-          <w:rFonts w:hint="eastAsia" w:ascii="Times New Roman" w:hAnsi="Times New Roman" w:eastAsia="宋体"/>
-          <w:color w:val="000000"/>
-          <w:sz w:val="24"/>
-        </w:rPr>
-        <w:t xml:space="preserve">km，因此欧氏距离可直接作为当前缺少道路矩阵时的距离代理。</w:t>
-      </w:r>
-    </w:p>
     <w:p>
       <w:pPr>
         <w:pStyle w:val="BodyText"/>
@@ -4329,6 +4291,22 @@
         </w:tc>
       </w:tr>
     </w:tbl>
+    <w:p>
+      <w:pPr>
+        <w:pStyle w:val="BodyText"/>
+        <w:spacing w:line="360" w:lineRule="auto" w:before="0" w:after="0"/>
+        <w:ind w:firstLine="480"/>
+        <w:jc w:val="both"/>
+      </w:pPr>
+      <w:r>
+        <w:rPr>
+          <w:rFonts w:hint="eastAsia" w:ascii="Times New Roman" w:hAnsi="Times New Roman" w:eastAsia="宋体"/>
+          <w:color w:val="000000"/>
+          <w:sz w:val="24"/>
+        </w:rPr>
+        <w:t xml:space="preserve">三个任务依次继承同一固定分区合同和时间窗口径：任务一确定模型与目标，任务二求得正常场景基线，任务三只改变禁弧后的候选集合并按相同目标重优化。</w:t>
+      </w:r>
+    </w:p>
     <w:bookmarkEnd w:id="17"/>
     <w:bookmarkEnd w:id="18"/>
     <w:bookmarkStart w:id="19" w:name="三模型假设"/>
@@ -4628,7 +4606,7 @@
           <w:color w:val="000000"/>
           <w:sz w:val="24"/>
         </w:rPr>
-        <w:t xml:space="preserve">，并把“4:30</w:t>
+        <w:t xml:space="preserve">，并采用“4:30</w:t>
       </w:r>
       <w:r>
         <w:rPr>
@@ -4644,7 +4622,7 @@
           <w:color w:val="000000"/>
           <w:sz w:val="24"/>
         </w:rPr>
-        <w:t xml:space="preserve">发车前已知封路、发车前重选完整路线”作为可复现的静态主场景；该信息状态是建模假设而非题面事实。</w:t>
+        <w:t xml:space="preserve">发车前已知封路、发车前重选完整路线”的静态主场景；在途动态情景不在现有数据支持范围内。</w:t>
       </w:r>
     </w:p>
     <w:p>
@@ -4660,7 +4638,7 @@
           <w:color w:val="000000"/>
           <w:sz w:val="24"/>
         </w:rPr>
-        <w:t xml:space="preserve">这些假设影响不同层面的结论：固定分区和站点必经限定了可行域，因此“全局最优”只对该合同成立；欧氏距离与恒速决定路线和时刻的数值，真实道路矩阵可能改变排序；零服务时长只影响后续门店到达时刻，故需用阈值分析界定其适用范围；恒温假设只能证明题给温度门槛可行，不能推出制冷能耗；发车前已知封路则把任务三限定为条件性的静态重优化，当前零增量结果不能外推到在途车辆的动态改道。</w:t>
+        <w:t xml:space="preserve">这些假设影响不同层面的结论：固定分区和站点必经限定了可行域，因此“全局最优”只对该合同成立；欧氏距离与恒速决定路线和时刻的数值，真实道路矩阵可能改变排序；零服务时长只影响后续门店到达时刻，故需用阈值分析界定其适用范围；恒温假设只能证明题给温度门槛可行，不能推出制冷能耗；任务三的零增量结果只适用于发车前静态重优化。</w:t>
       </w:r>
     </w:p>
     <w:bookmarkEnd w:id="19"/>
@@ -6333,6 +6311,159 @@
                 <w:sz w:val="20"/>
               </w:rPr>
               <w:t xml:space="preserve">的行驶时间</w:t>
+            </w:r>
+          </w:p>
+        </w:tc>
+        <w:tc>
+          <w:tcPr>
+            <w:tcW w:w="1790" w:type="dxa"/>
+            <w:tcBorders>
+              <w:top w:val="nil"/>
+              <w:start w:val="nil"/>
+              <w:bottom w:val="nil"/>
+              <w:end w:val="nil"/>
+              <w:insideH w:val="nil"/>
+              <w:insideV w:val="nil"/>
+            </w:tcBorders>
+            <w:tcMar>
+              <w:top w:w="55" w:type="dxa"/>
+              <w:start w:w="70" w:type="dxa"/>
+              <w:bottom w:w="55" w:type="dxa"/>
+              <w:end w:w="70" w:type="dxa"/>
+            </w:tcMar>
+            <w:vAlign w:val="center"/>
+          </w:tcPr>
+          <w:p>
+            <w:pPr>
+              <w:keepNext w:val="0"/>
+              <w:spacing w:line="276" w:lineRule="auto" w:before="0" w:after="0"/>
+              <w:ind w:firstLine="0"/>
+              <w:jc w:val="center"/>
+            </w:pPr>
+            <w:r>
+              <w:rPr>
+                <w:rFonts w:ascii="Times New Roman" w:hAnsi="Times New Roman" w:eastAsia="宋体"/>
+                <w:b w:val="0"/>
+                <w:color w:val="000000"/>
+                <w:sz w:val="20"/>
+              </w:rPr>
+              <w:t xml:space="preserve">min</w:t>
+            </w:r>
+          </w:p>
+        </w:tc>
+      </w:tr>
+      <w:tr>
+        <w:trPr>
+          <w:cantSplit/>
+        </w:trPr>
+        <w:tc>
+          <w:tcPr>
+            <w:tcW w:w="1164" w:type="dxa"/>
+            <w:tcBorders>
+              <w:top w:val="nil"/>
+              <w:start w:val="nil"/>
+              <w:bottom w:val="nil"/>
+              <w:end w:val="nil"/>
+              <w:insideH w:val="nil"/>
+              <w:insideV w:val="nil"/>
+            </w:tcBorders>
+            <w:tcMar>
+              <w:top w:w="55" w:type="dxa"/>
+              <w:start w:w="70" w:type="dxa"/>
+              <w:bottom w:w="55" w:type="dxa"/>
+              <w:end w:w="70" w:type="dxa"/>
+            </w:tcMar>
+            <w:vAlign w:val="center"/>
+          </w:tcPr>
+          <w:p>
+            <w:pPr>
+              <w:keepNext w:val="0"/>
+              <w:spacing w:line="276" w:lineRule="auto" w:before="0" w:after="0"/>
+              <w:ind w:firstLine="0"/>
+              <w:jc w:val="center"/>
+            </w:pPr>
+            <m:oMath>
+              <m:sSub>
+                <m:e>
+                  <m:r>
+                    <m:t>σ</m:t>
+                  </m:r>
+                </m:e>
+                <m:sub>
+                  <m:r>
+                    <m:t>i</m:t>
+                  </m:r>
+                </m:sub>
+              </m:sSub>
+            </m:oMath>
+          </w:p>
+        </w:tc>
+        <w:tc>
+          <w:tcPr>
+            <w:tcW w:w="5998" w:type="dxa"/>
+            <w:tcBorders>
+              <w:top w:val="nil"/>
+              <w:start w:val="nil"/>
+              <w:bottom w:val="nil"/>
+              <w:end w:val="nil"/>
+              <w:insideH w:val="nil"/>
+              <w:insideV w:val="nil"/>
+            </w:tcBorders>
+            <w:tcMar>
+              <w:top w:w="55" w:type="dxa"/>
+              <w:start w:w="70" w:type="dxa"/>
+              <w:bottom w:w="55" w:type="dxa"/>
+              <w:end w:w="70" w:type="dxa"/>
+            </w:tcMar>
+            <w:vAlign w:val="center"/>
+          </w:tcPr>
+          <w:p>
+            <w:pPr>
+              <w:keepNext w:val="0"/>
+              <w:spacing w:line="276" w:lineRule="auto" w:before="0" w:after="0"/>
+              <w:ind w:firstLine="0"/>
+              <w:jc w:val="center"/>
+            </w:pPr>
+            <w:r>
+              <w:rPr>
+                <w:rFonts w:hint="eastAsia" w:ascii="Times New Roman" w:hAnsi="Times New Roman" w:eastAsia="宋体"/>
+                <w:b w:val="0"/>
+                <w:color w:val="000000"/>
+                <w:sz w:val="20"/>
+              </w:rPr>
+              <w:t xml:space="preserve">节点</w:t>
+            </w:r>
+            <w:r>
+              <w:rPr>
+                <w:rFonts w:ascii="Times New Roman" w:hAnsi="Times New Roman" w:eastAsia="宋体"/>
+                <w:b w:val="0"/>
+                <w:color w:val="000000"/>
+                <w:sz w:val="20"/>
+              </w:rPr>
+              <w:t xml:space="preserve"> </w:t>
+            </w:r>
+            <m:oMath>
+              <m:r>
+                <m:t>i</m:t>
+              </m:r>
+            </m:oMath>
+            <w:r>
+              <w:rPr>
+                <w:rFonts w:ascii="Times New Roman" w:hAnsi="Times New Roman" w:eastAsia="宋体"/>
+                <w:b w:val="0"/>
+                <w:color w:val="000000"/>
+                <w:sz w:val="20"/>
+              </w:rPr>
+              <w:t xml:space="preserve"> </w:t>
+            </w:r>
+            <w:r>
+              <w:rPr>
+                <w:rFonts w:hint="eastAsia" w:ascii="Times New Roman" w:hAnsi="Times New Roman" w:eastAsia="宋体"/>
+                <w:b w:val="0"/>
+                <w:color w:val="000000"/>
+                <w:sz w:val="20"/>
+              </w:rPr>
+              <w:t xml:space="preserve">的服务或停留时长</w:t>
             </w:r>
           </w:p>
         </w:tc>
@@ -9158,7 +9289,7 @@
           <m:sSub>
             <m:e>
               <m:r>
-                <m:t>s</m:t>
+                <m:t>σ</m:t>
               </m:r>
             </m:e>
             <m:sub>
@@ -9716,13 +9847,36 @@
         </w:rPr>
         <w:t xml:space="preserve"> </w:t>
       </w:r>
-      <w:r>
-        <w:rPr>
-          <w:rFonts w:hint="eastAsia" w:ascii="Times New Roman" w:hAnsi="Times New Roman" w:eastAsia="宋体"/>
-          <w:color w:val="000000"/>
-          <w:sz w:val="24"/>
-        </w:rPr>
-        <w:t xml:space="preserve">0，配送站和中央厨房停留时长也取</w:t>
+      <m:oMath>
+        <m:sSub>
+          <m:e>
+            <m:r>
+              <m:t>σ</m:t>
+            </m:r>
+          </m:e>
+          <m:sub>
+            <m:r>
+              <m:t>i</m:t>
+            </m:r>
+          </m:sub>
+        </m:sSub>
+        <m:r>
+          <m:rPr>
+            <m:sty m:val="p"/>
+          </m:rPr>
+          <m:t>=</m:t>
+        </m:r>
+        <m:r>
+          <m:t>0</m:t>
+        </m:r>
+      </m:oMath>
+      <w:r>
+        <w:rPr>
+          <w:rFonts w:hint="eastAsia" w:ascii="Times New Roman" w:hAnsi="Times New Roman" w:eastAsia="宋体"/>
+          <w:color w:val="000000"/>
+          <w:sz w:val="24"/>
+        </w:rPr>
+        <w:t xml:space="preserve">，配送站和中央厨房停留时长也取</w:t>
       </w:r>
       <w:r>
         <w:rPr>
@@ -10286,7 +10440,77 @@
           <w:color w:val="000000"/>
           <w:sz w:val="24"/>
         </w:rPr>
-        <w:t xml:space="preserve">令</w:t>
+        <w:t xml:space="preserve">对每个给定情景</w:t>
+      </w:r>
+      <w:r>
+        <w:rPr>
+          <w:rFonts w:ascii="Times New Roman" w:hAnsi="Times New Roman" w:eastAsia="宋体"/>
+          <w:color w:val="000000"/>
+          <w:sz w:val="24"/>
+        </w:rPr>
+        <w:t xml:space="preserve"> </w:t>
+      </w:r>
+      <m:oMath>
+        <m:r>
+          <m:t>ω</m:t>
+        </m:r>
+      </m:oMath>
+      <w:r>
+        <w:rPr>
+          <w:rFonts w:ascii="Times New Roman" w:hAnsi="Times New Roman" w:eastAsia="宋体"/>
+          <w:color w:val="000000"/>
+          <w:sz w:val="24"/>
+        </w:rPr>
+        <w:t xml:space="preserve"> </w:t>
+      </w:r>
+      <w:r>
+        <w:rPr>
+          <w:rFonts w:hint="eastAsia" w:ascii="Times New Roman" w:hAnsi="Times New Roman" w:eastAsia="宋体"/>
+          <w:color w:val="000000"/>
+          <w:sz w:val="24"/>
+        </w:rPr>
+        <w:t xml:space="preserve">独立求解。为简化记号，路线选择变量省略情景上标；不同情景中的</w:t>
+      </w:r>
+      <w:r>
+        <w:rPr>
+          <w:rFonts w:ascii="Times New Roman" w:hAnsi="Times New Roman" w:eastAsia="宋体"/>
+          <w:color w:val="000000"/>
+          <w:sz w:val="24"/>
+        </w:rPr>
+        <w:t xml:space="preserve"> </w:t>
+      </w:r>
+      <m:oMath>
+        <m:sSub>
+          <m:e>
+            <m:r>
+              <m:t>z</m:t>
+            </m:r>
+          </m:e>
+          <m:sub>
+            <m:r>
+              <m:t>k</m:t>
+            </m:r>
+            <m:r>
+              <m:t>r</m:t>
+            </m:r>
+          </m:sub>
+        </m:sSub>
+      </m:oMath>
+      <w:r>
+        <w:rPr>
+          <w:rFonts w:ascii="Times New Roman" w:hAnsi="Times New Roman" w:eastAsia="宋体"/>
+          <w:color w:val="000000"/>
+          <w:sz w:val="24"/>
+        </w:rPr>
+        <w:t xml:space="preserve"> </w:t>
+      </w:r>
+      <w:r>
+        <w:rPr>
+          <w:rFonts w:hint="eastAsia" w:ascii="Times New Roman" w:hAnsi="Times New Roman" w:eastAsia="宋体"/>
+          <w:color w:val="000000"/>
+          <w:sz w:val="24"/>
+        </w:rPr>
+        <w:t xml:space="preserve">分别由各自的可行域和目标确定。令</w:t>
       </w:r>
       <w:r>
         <w:rPr>
@@ -13378,7 +13602,7 @@
           <w:color w:val="000000"/>
           <w:sz w:val="24"/>
         </w:rPr>
-        <w:t xml:space="preserve">顺序只列所属配送站之后两家门店的访问次序；综合成本包含运输费和时间窗事件罚。</w:t>
+        <w:t xml:space="preserve">顺序只列所属配送站之后两家门店的访问次序；综合成本包含运输费和时间窗事件罚。表中的“基础约束可行”仅指结构、容量和里程可行，时间窗表现由迟到列单独评价；施工列还要求路线不经过封闭弧。</w:t>
       </w:r>
     </w:p>
     <w:p>
@@ -13735,7 +13959,7 @@
                 <w:color w:val="000000"/>
                 <w:sz w:val="20"/>
               </w:rPr>
-              <w:t xml:space="preserve">正常可行</w:t>
+              <w:t xml:space="preserve">基础约束可行</w:t>
             </w:r>
           </w:p>
         </w:tc>
@@ -13772,7 +13996,7 @@
                 <w:color w:val="000000"/>
                 <w:sz w:val="20"/>
               </w:rPr>
-              <w:t xml:space="preserve">静态封路可行</w:t>
+              <w:t xml:space="preserve">封路后基础约束可行</w:t>
             </w:r>
           </w:p>
         </w:tc>
@@ -18301,7 +18525,7 @@
       <w:r>
         <w:drawing>
           <wp:inline>
-            <wp:extent cx="4480560" cy="3111500"/>
+            <wp:extent cx="5334000" cy="3704166"/>
             <wp:effectExtent b="0" l="0" r="0" t="0"/>
             <wp:docPr descr="" title="" id="28" name="Picture"/>
             <a:graphic>
@@ -18322,7 +18546,7 @@
                   <pic:spPr bwMode="auto">
                     <a:xfrm>
                       <a:off x="0" y="0"/>
-                      <a:ext cx="4480560" cy="3111500"/>
+                      <a:ext cx="5334000" cy="3704166"/>
                     </a:xfrm>
                     <a:prstGeom prst="rect">
                       <a:avLst/>
@@ -20473,7 +20697,7 @@
       <w:r>
         <w:drawing>
           <wp:inline>
-            <wp:extent cx="4693920" cy="2803313"/>
+            <wp:extent cx="5334000" cy="3185583"/>
             <wp:effectExtent b="0" l="0" r="0" t="0"/>
             <wp:docPr descr="" title="" id="31" name="Picture"/>
             <a:graphic>
@@ -20494,7 +20718,7 @@
                   <pic:spPr bwMode="auto">
                     <a:xfrm>
                       <a:off x="0" y="0"/>
-                      <a:ext cx="4693920" cy="2803313"/>
+                      <a:ext cx="5334000" cy="3185583"/>
                     </a:xfrm>
                     <a:prstGeom prst="rect">
                       <a:avLst/>
@@ -20578,23 +20802,23 @@
           <w:color w:val="000000"/>
           <w:sz w:val="24"/>
         </w:rPr>
-        <w:t xml:space="preserve">本节采用的施工信息状态是：4:30</w:t>
-      </w:r>
-      <w:r>
-        <w:rPr>
-          <w:rFonts w:ascii="Times New Roman" w:hAnsi="Times New Roman" w:eastAsia="宋体"/>
-          <w:color w:val="000000"/>
-          <w:sz w:val="24"/>
-        </w:rPr>
-        <w:t xml:space="preserve"> </w:t>
-      </w:r>
-      <w:r>
-        <w:rPr>
-          <w:rFonts w:hint="eastAsia" w:ascii="Times New Roman" w:hAnsi="Times New Roman" w:eastAsia="宋体"/>
-          <w:color w:val="000000"/>
-          <w:sz w:val="24"/>
-        </w:rPr>
-        <w:t xml:space="preserve">发车前已经知道有向弧</w:t>
+        <w:t xml:space="preserve">按第</w:t>
+      </w:r>
+      <w:r>
+        <w:rPr>
+          <w:rFonts w:ascii="Times New Roman" w:hAnsi="Times New Roman" w:eastAsia="宋体"/>
+          <w:color w:val="000000"/>
+          <w:sz w:val="24"/>
+        </w:rPr>
+        <w:t xml:space="preserve"> 2.3 </w:t>
+      </w:r>
+      <w:r>
+        <w:rPr>
+          <w:rFonts w:hint="eastAsia" w:ascii="Times New Roman" w:hAnsi="Times New Roman" w:eastAsia="宋体"/>
+          <w:color w:val="000000"/>
+          <w:sz w:val="24"/>
+        </w:rPr>
+        <w:t xml:space="preserve">节定义的静态施工情景，发车前将有向弧</w:t>
       </w:r>
       <w:r>
         <w:rPr>
@@ -20644,57 +20868,7 @@
           <w:color w:val="000000"/>
           <w:sz w:val="24"/>
         </w:rPr>
-        <w:t xml:space="preserve">封闭，并在发车前重新选择三辆车的完整路线。该静态主场景是为缺失事件时刻和在途车辆状态所作的建模假设。施工场景把有向弧</w:t>
-      </w:r>
-      <w:r>
-        <w:rPr>
-          <w:rFonts w:ascii="Times New Roman" w:hAnsi="Times New Roman" w:eastAsia="宋体"/>
-          <w:color w:val="000000"/>
-          <w:sz w:val="24"/>
-        </w:rPr>
-        <w:t xml:space="preserve"> </w:t>
-      </w:r>
-      <m:oMath>
-        <m:r>
-          <m:rPr>
-            <m:sty m:val="p"/>
-          </m:rPr>
-          <m:t>(</m:t>
-        </m:r>
-        <m:r>
-          <m:t>2</m:t>
-        </m:r>
-        <m:r>
-          <m:rPr>
-            <m:sty m:val="p"/>
-          </m:rPr>
-          <m:t>,</m:t>
-        </m:r>
-        <m:r>
-          <m:t>8</m:t>
-        </m:r>
-        <m:r>
-          <m:rPr>
-            <m:sty m:val="p"/>
-          </m:rPr>
-          <m:t>)</m:t>
-        </m:r>
-      </m:oMath>
-      <w:r>
-        <w:rPr>
-          <w:rFonts w:ascii="Times New Roman" w:hAnsi="Times New Roman" w:eastAsia="宋体"/>
-          <w:color w:val="000000"/>
-          <w:sz w:val="24"/>
-        </w:rPr>
-        <w:t xml:space="preserve"> </w:t>
-      </w:r>
-      <w:r>
-        <w:rPr>
-          <w:rFonts w:hint="eastAsia" w:ascii="Times New Roman" w:hAnsi="Times New Roman" w:eastAsia="宋体"/>
-          <w:color w:val="000000"/>
-          <w:sz w:val="24"/>
-        </w:rPr>
-        <w:t xml:space="preserve">从可用弧集中删除。正常最优</w:t>
+        <w:t xml:space="preserve">从可用弧集中删除，再重新选择三辆车的完整路线。正常最优</w:t>
       </w:r>
       <w:r>
         <w:rPr>
@@ -22195,7 +22369,7 @@
           <w:color w:val="000000"/>
           <w:sz w:val="24"/>
         </w:rPr>
-        <w:t xml:space="preserve">题目所称“原配送路径无法通行”与给定坐标、固定分区及最优路径的联合计算结果不一致。严格保留节点编号和封闭方向时，在本文发车前已知封路的信息状态下，指定封路未击中正常最优路线，因而不存在绕路代价。若实际施工意在封闭</w:t>
+        <w:t xml:space="preserve">按题给节点编号和封闭方向计算，指定封路未经过正常最优路线，因而在当前静态情景中不产生绕路代价。若封闭方向改为</w:t>
       </w:r>
       <w:r>
         <w:rPr>
@@ -22233,7 +22407,7 @@
           <w:color w:val="000000"/>
           <w:sz w:val="24"/>
         </w:rPr>
-        <w:t xml:space="preserve">或双向道路，则属于另一个模型情景，需要新的权威信息才能计算，本文不据此改写任务三。</w:t>
+        <w:t xml:space="preserve">或道路双向封闭，可行域将不同，应作为新的施工情景另行计算。</w:t>
       </w:r>
     </w:p>
     <w:p>
@@ -22538,7 +22712,7 @@
           <w:color w:val="000000"/>
           <w:sz w:val="24"/>
         </w:rPr>
-        <w:t xml:space="preserve">未被删除。因此这次扰动改变了可行域，却没有改变最优方案和目标值。该机制只适用于当前有向弧、坐标距离、固定分区合同和发车前静态信息状态，不能外推为“施工封路通常没有成本”，也不能推出在途动态改道仍为零增量。</w:t>
+        <w:t xml:space="preserve">未被删除。因此这次扰动改变了可行域，却没有改变最优方案和目标值。该机制只适用于当前有向弧、坐标距离、固定分区合同和发车前静态情景，不能代表一般施工封路或在途动态改道的成本变化。</w:t>
       </w:r>
     </w:p>
     <w:bookmarkEnd w:id="34"/>
@@ -22628,7 +22802,7 @@
       </w:r>
       <m:oMath>
         <m:r>
-          <m:t>s</m:t>
+          <m:t>σ</m:t>
         </m:r>
       </m:oMath>
       <w:r>
@@ -22649,7 +22823,7 @@
       </w:r>
       <m:oMath>
         <m:r>
-          <m:t>s</m:t>
+          <m:t>σ</m:t>
         </m:r>
       </m:oMath>
       <w:r>
@@ -22666,7 +22840,136 @@
           <w:color w:val="000000"/>
           <w:sz w:val="24"/>
         </w:rPr>
-        <w:t xml:space="preserve">增大，后一门店的到达时刻单调推迟。对正常和封路场景分别二分搜索零迟到可行性的临界值，均得到</w:t>
+        <w:t xml:space="preserve">增大，后一门店的到达时刻单调推迟。控制边界的是</w:t>
+      </w:r>
+      <w:r>
+        <w:rPr>
+          <w:rFonts w:ascii="Times New Roman" w:hAnsi="Times New Roman" w:eastAsia="宋体"/>
+          <w:color w:val="000000"/>
+          <w:sz w:val="24"/>
+        </w:rPr>
+        <w:t xml:space="preserve"> B </w:t>
+      </w:r>
+      <w:r>
+        <w:rPr>
+          <w:rFonts w:hint="eastAsia" w:ascii="Times New Roman" w:hAnsi="Times New Roman" w:eastAsia="宋体"/>
+          <w:color w:val="000000"/>
+          <w:sz w:val="24"/>
+        </w:rPr>
+        <w:t xml:space="preserve">车第二个门店节点</w:t>
+      </w:r>
+      <w:r>
+        <w:rPr>
+          <w:rFonts w:ascii="Times New Roman" w:hAnsi="Times New Roman" w:eastAsia="宋体"/>
+          <w:color w:val="000000"/>
+          <w:sz w:val="24"/>
+        </w:rPr>
+        <w:t xml:space="preserve"> </w:t>
+      </w:r>
+      <w:r>
+        <w:rPr>
+          <w:rFonts w:hint="eastAsia" w:ascii="Times New Roman" w:hAnsi="Times New Roman" w:eastAsia="宋体"/>
+          <w:color w:val="000000"/>
+          <w:sz w:val="24"/>
+        </w:rPr>
+        <w:t xml:space="preserve">8：在最优路线</w:t>
+      </w:r>
+      <w:r>
+        <w:rPr>
+          <w:rFonts w:ascii="Times New Roman" w:hAnsi="Times New Roman" w:eastAsia="宋体"/>
+          <w:color w:val="000000"/>
+          <w:sz w:val="24"/>
+        </w:rPr>
+        <w:t xml:space="preserve"> </w:t>
+      </w:r>
+      <m:oMath>
+        <m:r>
+          <m:t>0</m:t>
+        </m:r>
+        <m:r>
+          <m:rPr>
+            <m:sty m:val="p"/>
+          </m:rPr>
+          <m:t>→</m:t>
+        </m:r>
+        <m:r>
+          <m:t>2</m:t>
+        </m:r>
+        <m:r>
+          <m:rPr>
+            <m:sty m:val="p"/>
+          </m:rPr>
+          <m:t>→</m:t>
+        </m:r>
+        <m:r>
+          <m:t>5</m:t>
+        </m:r>
+        <m:r>
+          <m:rPr>
+            <m:sty m:val="p"/>
+          </m:rPr>
+          <m:t>→</m:t>
+        </m:r>
+        <m:r>
+          <m:t>8</m:t>
+        </m:r>
+        <m:r>
+          <m:rPr>
+            <m:sty m:val="p"/>
+          </m:rPr>
+          <m:t>→</m:t>
+        </m:r>
+        <m:r>
+          <m:t>0</m:t>
+        </m:r>
+      </m:oMath>
+      <w:r>
+        <w:rPr>
+          <w:rFonts w:ascii="Times New Roman" w:hAnsi="Times New Roman" w:eastAsia="宋体"/>
+          <w:color w:val="000000"/>
+          <w:sz w:val="24"/>
+        </w:rPr>
+        <w:t xml:space="preserve"> </w:t>
+      </w:r>
+      <w:r>
+        <w:rPr>
+          <w:rFonts w:hint="eastAsia" w:ascii="Times New Roman" w:hAnsi="Times New Roman" w:eastAsia="宋体"/>
+          <w:color w:val="000000"/>
+          <w:sz w:val="24"/>
+        </w:rPr>
+        <w:t xml:space="preserve">上，只有前一门店节点</w:t>
+      </w:r>
+      <w:r>
+        <w:rPr>
+          <w:rFonts w:ascii="Times New Roman" w:hAnsi="Times New Roman" w:eastAsia="宋体"/>
+          <w:color w:val="000000"/>
+          <w:sz w:val="24"/>
+        </w:rPr>
+        <w:t xml:space="preserve"> 5 </w:t>
+      </w:r>
+      <w:r>
+        <w:rPr>
+          <w:rFonts w:hint="eastAsia" w:ascii="Times New Roman" w:hAnsi="Times New Roman" w:eastAsia="宋体"/>
+          <w:color w:val="000000"/>
+          <w:sz w:val="24"/>
+        </w:rPr>
+        <w:t xml:space="preserve">的服务会推迟节点</w:t>
+      </w:r>
+      <w:r>
+        <w:rPr>
+          <w:rFonts w:ascii="Times New Roman" w:hAnsi="Times New Roman" w:eastAsia="宋体"/>
+          <w:color w:val="000000"/>
+          <w:sz w:val="24"/>
+        </w:rPr>
+        <w:t xml:space="preserve"> 8 </w:t>
+      </w:r>
+      <w:r>
+        <w:rPr>
+          <w:rFonts w:hint="eastAsia" w:ascii="Times New Roman" w:hAnsi="Times New Roman" w:eastAsia="宋体"/>
+          <w:color w:val="000000"/>
+          <w:sz w:val="24"/>
+        </w:rPr>
+        <w:t xml:space="preserve">的到达，因此</w:t>
       </w:r>
     </w:p>
     <w:p>
@@ -22683,7 +22986,222 @@
           <m:sSub>
             <m:e>
               <m:r>
-                <m:t>s</m:t>
+                <m:t>A</m:t>
+              </m:r>
+            </m:e>
+            <m:sub>
+              <m:r>
+                <m:t>8</m:t>
+              </m:r>
+            </m:sub>
+          </m:sSub>
+          <m:r>
+            <m:rPr>
+              <m:sty m:val="p"/>
+            </m:rPr>
+            <m:t>(</m:t>
+          </m:r>
+          <m:r>
+            <m:t>σ</m:t>
+          </m:r>
+          <m:r>
+            <m:rPr>
+              <m:sty m:val="p"/>
+            </m:rPr>
+            <m:t>)</m:t>
+          </m:r>
+          <m:r>
+            <m:rPr>
+              <m:sty m:val="p"/>
+            </m:rPr>
+            <m:t>=</m:t>
+          </m:r>
+          <m:r>
+            <m:t>270</m:t>
+          </m:r>
+          <m:r>
+            <m:rPr>
+              <m:sty m:val="p"/>
+            </m:rPr>
+            <m:t>+</m:t>
+          </m:r>
+          <m:sSub>
+            <m:e>
+              <m:r>
+                <m:t>τ</m:t>
+              </m:r>
+            </m:e>
+            <m:sub>
+              <m:r>
+                <m:t>02</m:t>
+              </m:r>
+            </m:sub>
+          </m:sSub>
+          <m:r>
+            <m:rPr>
+              <m:sty m:val="p"/>
+            </m:rPr>
+            <m:t>+</m:t>
+          </m:r>
+          <m:sSub>
+            <m:e>
+              <m:r>
+                <m:t>τ</m:t>
+              </m:r>
+            </m:e>
+            <m:sub>
+              <m:r>
+                <m:t>25</m:t>
+              </m:r>
+            </m:sub>
+          </m:sSub>
+          <m:r>
+            <m:rPr>
+              <m:sty m:val="p"/>
+            </m:rPr>
+            <m:t>+</m:t>
+          </m:r>
+          <m:r>
+            <m:t>σ</m:t>
+          </m:r>
+          <m:r>
+            <m:rPr>
+              <m:sty m:val="p"/>
+            </m:rPr>
+            <m:t>+</m:t>
+          </m:r>
+          <m:sSub>
+            <m:e>
+              <m:r>
+                <m:t>τ</m:t>
+              </m:r>
+            </m:e>
+            <m:sub>
+              <m:r>
+                <m:t>58</m:t>
+              </m:r>
+            </m:sub>
+          </m:sSub>
+          <m:r>
+            <m:rPr>
+              <m:sty m:val="p"/>
+            </m:rPr>
+            <m:t>.</m:t>
+          </m:r>
+        </m:oMath>
+      </m:oMathPara>
+    </w:p>
+    <w:p>
+      <w:pPr>
+        <w:pStyle w:val="FirstParagraph"/>
+        <w:spacing w:line="360" w:lineRule="auto" w:before="0" w:after="0"/>
+        <w:ind w:firstLine="480"/>
+        <w:jc w:val="both"/>
+      </w:pPr>
+      <w:r>
+        <w:rPr>
+          <w:rFonts w:hint="eastAsia" w:ascii="Times New Roman" w:hAnsi="Times New Roman" w:eastAsia="宋体"/>
+          <w:color w:val="000000"/>
+          <w:sz w:val="24"/>
+        </w:rPr>
+        <w:t xml:space="preserve">令</w:t>
+      </w:r>
+      <w:r>
+        <w:rPr>
+          <w:rFonts w:ascii="Times New Roman" w:hAnsi="Times New Roman" w:eastAsia="宋体"/>
+          <w:color w:val="000000"/>
+          <w:sz w:val="24"/>
+        </w:rPr>
+        <w:t xml:space="preserve"> </w:t>
+      </w:r>
+      <m:oMath>
+        <m:sSub>
+          <m:e>
+            <m:r>
+              <m:t>A</m:t>
+            </m:r>
+          </m:e>
+          <m:sub>
+            <m:r>
+              <m:t>8</m:t>
+            </m:r>
+          </m:sub>
+        </m:sSub>
+        <m:r>
+          <m:rPr>
+            <m:sty m:val="p"/>
+          </m:rPr>
+          <m:t>(</m:t>
+        </m:r>
+        <m:r>
+          <m:t>σ</m:t>
+        </m:r>
+        <m:r>
+          <m:rPr>
+            <m:sty m:val="p"/>
+          </m:rPr>
+          <m:t>)</m:t>
+        </m:r>
+        <m:r>
+          <m:rPr>
+            <m:sty m:val="p"/>
+          </m:rPr>
+          <m:t>≤</m:t>
+        </m:r>
+        <m:sSub>
+          <m:e>
+            <m:r>
+              <m:t>b</m:t>
+            </m:r>
+          </m:e>
+          <m:sub>
+            <m:r>
+              <m:t>8</m:t>
+            </m:r>
+          </m:sub>
+        </m:sSub>
+        <m:r>
+          <m:rPr>
+            <m:sty m:val="p"/>
+          </m:rPr>
+          <m:t>=</m:t>
+        </m:r>
+        <m:r>
+          <m:t>345</m:t>
+        </m:r>
+      </m:oMath>
+      <w:r>
+        <w:rPr>
+          <w:rFonts w:ascii="Times New Roman" w:hAnsi="Times New Roman" w:eastAsia="宋体"/>
+          <w:color w:val="000000"/>
+          <w:sz w:val="24"/>
+        </w:rPr>
+        <w:t xml:space="preserve"> </w:t>
+      </w:r>
+      <w:r>
+        <w:rPr>
+          <w:rFonts w:hint="eastAsia" w:ascii="Times New Roman" w:hAnsi="Times New Roman" w:eastAsia="宋体"/>
+          <w:color w:val="000000"/>
+          <w:sz w:val="24"/>
+        </w:rPr>
+        <w:t xml:space="preserve">min，可直接得到解析边界</w:t>
+      </w:r>
+    </w:p>
+    <w:p>
+      <w:pPr>
+        <w:pStyle w:val="BodyText"/>
+        <w:ind w:firstLine="0"/>
+        <w:jc w:val="center"/>
+      </w:pPr>
+      <m:oMathPara>
+        <m:oMathParaPr>
+          <m:jc m:val="center"/>
+        </m:oMathParaPr>
+        <m:oMath>
+          <m:sSub>
+            <m:e>
+              <m:r>
+                <m:t>σ</m:t>
               </m:r>
             </m:e>
             <m:sub>
@@ -22759,7 +23277,7 @@
           <w:color w:val="000000"/>
           <w:sz w:val="24"/>
         </w:rPr>
-        <w:t xml:space="preserve">该阈值由</w:t>
+        <w:t xml:space="preserve">其余车辆和门店在该边界处仍有更大时间余量。再对正常和封路场景分别进行数值二分核验，均复现同一临界值；两种场景保留同一条</w:t>
       </w:r>
       <w:r>
         <w:rPr>
@@ -22775,23 +23293,23 @@
           <w:color w:val="000000"/>
           <w:sz w:val="24"/>
         </w:rPr>
-        <w:t xml:space="preserve">车第二个门店，即节点</w:t>
-      </w:r>
-      <w:r>
-        <w:rPr>
-          <w:rFonts w:ascii="Times New Roman" w:hAnsi="Times New Roman" w:eastAsia="宋体"/>
-          <w:color w:val="000000"/>
-          <w:sz w:val="24"/>
-        </w:rPr>
-        <w:t xml:space="preserve"> 8 </w:t>
-      </w:r>
-      <w:r>
-        <w:rPr>
-          <w:rFonts w:hint="eastAsia" w:ascii="Times New Roman" w:hAnsi="Times New Roman" w:eastAsia="宋体"/>
-          <w:color w:val="000000"/>
-          <w:sz w:val="24"/>
-        </w:rPr>
-        <w:t xml:space="preserve">的时间窗上界控制。在最优路线</w:t>
+        <w:t xml:space="preserve">车最优路线，所以阈值相同。只要统一服务时长不超过约</w:t>
+      </w:r>
+      <w:r>
+        <w:rPr>
+          <w:rFonts w:ascii="Times New Roman" w:hAnsi="Times New Roman" w:eastAsia="宋体"/>
+          <w:color w:val="000000"/>
+          <w:sz w:val="24"/>
+        </w:rPr>
+        <w:t xml:space="preserve"> 21.421 </w:t>
+      </w:r>
+      <w:r>
+        <w:rPr>
+          <w:rFonts w:hint="eastAsia" w:ascii="Times New Roman" w:hAnsi="Times New Roman" w:eastAsia="宋体"/>
+          <w:color w:val="000000"/>
+          <w:sz w:val="24"/>
+        </w:rPr>
+        <w:t xml:space="preserve">分钟，正常与施工场景仍采用同一零迟到路线，任务三成本增量仍为</w:t>
       </w:r>
       <w:r>
         <w:rPr>
@@ -22801,365 +23319,13 @@
         </w:rPr>
         <w:t xml:space="preserve"> </w:t>
       </w:r>
-      <m:oMath>
-        <m:r>
-          <m:t>0</m:t>
-        </m:r>
-        <m:r>
-          <m:rPr>
-            <m:sty m:val="p"/>
-          </m:rPr>
-          <m:t>→</m:t>
-        </m:r>
-        <m:r>
-          <m:t>2</m:t>
-        </m:r>
-        <m:r>
-          <m:rPr>
-            <m:sty m:val="p"/>
-          </m:rPr>
-          <m:t>→</m:t>
-        </m:r>
-        <m:r>
-          <m:t>5</m:t>
-        </m:r>
-        <m:r>
-          <m:rPr>
-            <m:sty m:val="p"/>
-          </m:rPr>
-          <m:t>→</m:t>
-        </m:r>
-        <m:r>
-          <m:t>8</m:t>
-        </m:r>
-        <m:r>
-          <m:rPr>
-            <m:sty m:val="p"/>
-          </m:rPr>
-          <m:t>→</m:t>
-        </m:r>
-        <m:r>
-          <m:t>0</m:t>
-        </m:r>
-      </m:oMath>
-      <w:r>
-        <w:rPr>
-          <w:rFonts w:ascii="Times New Roman" w:hAnsi="Times New Roman" w:eastAsia="宋体"/>
-          <w:color w:val="000000"/>
-          <w:sz w:val="24"/>
-        </w:rPr>
-        <w:t xml:space="preserve"> </w:t>
-      </w:r>
-      <w:r>
-        <w:rPr>
-          <w:rFonts w:hint="eastAsia" w:ascii="Times New Roman" w:hAnsi="Times New Roman" w:eastAsia="宋体"/>
-          <w:color w:val="000000"/>
-          <w:sz w:val="24"/>
-        </w:rPr>
-        <w:t xml:space="preserve">上，只有前一门店节点</w:t>
-      </w:r>
-      <w:r>
-        <w:rPr>
-          <w:rFonts w:ascii="Times New Roman" w:hAnsi="Times New Roman" w:eastAsia="宋体"/>
-          <w:color w:val="000000"/>
-          <w:sz w:val="24"/>
-        </w:rPr>
-        <w:t xml:space="preserve"> 5 </w:t>
-      </w:r>
-      <w:r>
-        <w:rPr>
-          <w:rFonts w:hint="eastAsia" w:ascii="Times New Roman" w:hAnsi="Times New Roman" w:eastAsia="宋体"/>
-          <w:color w:val="000000"/>
-          <w:sz w:val="24"/>
-        </w:rPr>
-        <w:t xml:space="preserve">的服务会推迟节点</w:t>
-      </w:r>
-      <w:r>
-        <w:rPr>
-          <w:rFonts w:ascii="Times New Roman" w:hAnsi="Times New Roman" w:eastAsia="宋体"/>
-          <w:color w:val="000000"/>
-          <w:sz w:val="24"/>
-        </w:rPr>
-        <w:t xml:space="preserve"> 8 </w:t>
-      </w:r>
-      <w:r>
-        <w:rPr>
-          <w:rFonts w:hint="eastAsia" w:ascii="Times New Roman" w:hAnsi="Times New Roman" w:eastAsia="宋体"/>
-          <w:color w:val="000000"/>
-          <w:sz w:val="24"/>
-        </w:rPr>
-        <w:t xml:space="preserve">的到达，因此</w:t>
-      </w:r>
-    </w:p>
-    <w:p>
-      <w:pPr>
-        <w:pStyle w:val="BodyText"/>
-        <w:ind w:firstLine="0"/>
-        <w:jc w:val="center"/>
-      </w:pPr>
-      <m:oMathPara>
-        <m:oMathParaPr>
-          <m:jc m:val="center"/>
-        </m:oMathParaPr>
-        <m:oMath>
-          <m:sSub>
-            <m:e>
-              <m:r>
-                <m:t>A</m:t>
-              </m:r>
-            </m:e>
-            <m:sub>
-              <m:r>
-                <m:t>8</m:t>
-              </m:r>
-            </m:sub>
-          </m:sSub>
-          <m:r>
-            <m:rPr>
-              <m:sty m:val="p"/>
-            </m:rPr>
-            <m:t>(</m:t>
-          </m:r>
-          <m:r>
-            <m:t>s</m:t>
-          </m:r>
-          <m:r>
-            <m:rPr>
-              <m:sty m:val="p"/>
-            </m:rPr>
-            <m:t>)</m:t>
-          </m:r>
-          <m:r>
-            <m:rPr>
-              <m:sty m:val="p"/>
-            </m:rPr>
-            <m:t>=</m:t>
-          </m:r>
-          <m:r>
-            <m:t>270</m:t>
-          </m:r>
-          <m:r>
-            <m:rPr>
-              <m:sty m:val="p"/>
-            </m:rPr>
-            <m:t>+</m:t>
-          </m:r>
-          <m:sSub>
-            <m:e>
-              <m:r>
-                <m:t>τ</m:t>
-              </m:r>
-            </m:e>
-            <m:sub>
-              <m:r>
-                <m:t>02</m:t>
-              </m:r>
-            </m:sub>
-          </m:sSub>
-          <m:r>
-            <m:rPr>
-              <m:sty m:val="p"/>
-            </m:rPr>
-            <m:t>+</m:t>
-          </m:r>
-          <m:sSub>
-            <m:e>
-              <m:r>
-                <m:t>τ</m:t>
-              </m:r>
-            </m:e>
-            <m:sub>
-              <m:r>
-                <m:t>25</m:t>
-              </m:r>
-            </m:sub>
-          </m:sSub>
-          <m:r>
-            <m:rPr>
-              <m:sty m:val="p"/>
-            </m:rPr>
-            <m:t>+</m:t>
-          </m:r>
-          <m:r>
-            <m:t>s</m:t>
-          </m:r>
-          <m:r>
-            <m:rPr>
-              <m:sty m:val="p"/>
-            </m:rPr>
-            <m:t>+</m:t>
-          </m:r>
-          <m:sSub>
-            <m:e>
-              <m:r>
-                <m:t>τ</m:t>
-              </m:r>
-            </m:e>
-            <m:sub>
-              <m:r>
-                <m:t>58</m:t>
-              </m:r>
-            </m:sub>
-          </m:sSub>
-          <m:r>
-            <m:rPr>
-              <m:sty m:val="p"/>
-            </m:rPr>
-            <m:t>.</m:t>
-          </m:r>
-        </m:oMath>
-      </m:oMathPara>
-    </w:p>
-    <w:p>
-      <w:pPr>
-        <w:pStyle w:val="FirstParagraph"/>
-        <w:spacing w:line="360" w:lineRule="auto" w:before="0" w:after="0"/>
-        <w:ind w:firstLine="480"/>
-        <w:jc w:val="both"/>
-      </w:pPr>
-      <w:r>
-        <w:rPr>
-          <w:rFonts w:hint="eastAsia" w:ascii="Times New Roman" w:hAnsi="Times New Roman" w:eastAsia="宋体"/>
-          <w:color w:val="000000"/>
-          <w:sz w:val="24"/>
-        </w:rPr>
-        <w:t xml:space="preserve">令</w:t>
-      </w:r>
-      <w:r>
-        <w:rPr>
-          <w:rFonts w:ascii="Times New Roman" w:hAnsi="Times New Roman" w:eastAsia="宋体"/>
-          <w:color w:val="000000"/>
-          <w:sz w:val="24"/>
-        </w:rPr>
-        <w:t xml:space="preserve"> </w:t>
-      </w:r>
-      <m:oMath>
-        <m:sSub>
-          <m:e>
-            <m:r>
-              <m:t>A</m:t>
-            </m:r>
-          </m:e>
-          <m:sub>
-            <m:r>
-              <m:t>8</m:t>
-            </m:r>
-          </m:sub>
-        </m:sSub>
-        <m:r>
-          <m:rPr>
-            <m:sty m:val="p"/>
-          </m:rPr>
-          <m:t>(</m:t>
-        </m:r>
-        <m:r>
-          <m:t>s</m:t>
-        </m:r>
-        <m:r>
-          <m:rPr>
-            <m:sty m:val="p"/>
-          </m:rPr>
-          <m:t>)</m:t>
-        </m:r>
-        <m:r>
-          <m:rPr>
-            <m:sty m:val="p"/>
-          </m:rPr>
-          <m:t>≤</m:t>
-        </m:r>
-        <m:sSub>
-          <m:e>
-            <m:r>
-              <m:t>b</m:t>
-            </m:r>
-          </m:e>
-          <m:sub>
-            <m:r>
-              <m:t>8</m:t>
-            </m:r>
-          </m:sub>
-        </m:sSub>
-        <m:r>
-          <m:rPr>
-            <m:sty m:val="p"/>
-          </m:rPr>
-          <m:t>=</m:t>
-        </m:r>
-        <m:r>
-          <m:t>345</m:t>
-        </m:r>
-      </m:oMath>
-      <w:r>
-        <w:rPr>
-          <w:rFonts w:ascii="Times New Roman" w:hAnsi="Times New Roman" w:eastAsia="宋体"/>
-          <w:color w:val="000000"/>
-          <w:sz w:val="24"/>
-        </w:rPr>
-        <w:t xml:space="preserve"> </w:t>
-      </w:r>
-      <w:r>
-        <w:rPr>
-          <w:rFonts w:ascii="Times New Roman" w:hAnsi="Times New Roman" w:eastAsia="宋体"/>
-          <w:color w:val="000000"/>
-          <w:sz w:val="24"/>
-        </w:rPr>
-        <w:t xml:space="preserve">min </w:t>
-      </w:r>
-      <w:r>
-        <w:rPr>
-          <w:rFonts w:hint="eastAsia" w:ascii="Times New Roman" w:hAnsi="Times New Roman" w:eastAsia="宋体"/>
-          <w:color w:val="000000"/>
-          <w:sz w:val="24"/>
-        </w:rPr>
-        <w:t xml:space="preserve">即得到上述上限；其余车辆和门店在该上限处仍有更大时间余量。正常与施工场景保留同一条</w:t>
-      </w:r>
-      <w:r>
-        <w:rPr>
-          <w:rFonts w:ascii="Times New Roman" w:hAnsi="Times New Roman" w:eastAsia="宋体"/>
-          <w:color w:val="000000"/>
-          <w:sz w:val="24"/>
-        </w:rPr>
-        <w:t xml:space="preserve"> B </w:t>
-      </w:r>
-      <w:r>
-        <w:rPr>
-          <w:rFonts w:hint="eastAsia" w:ascii="Times New Roman" w:hAnsi="Times New Roman" w:eastAsia="宋体"/>
-          <w:color w:val="000000"/>
-          <w:sz w:val="24"/>
-        </w:rPr>
-        <w:t xml:space="preserve">车最优路线，所以二者阈值相同。只要统一服务时长不超过约</w:t>
-      </w:r>
-      <w:r>
-        <w:rPr>
-          <w:rFonts w:ascii="Times New Roman" w:hAnsi="Times New Roman" w:eastAsia="宋体"/>
-          <w:color w:val="000000"/>
-          <w:sz w:val="24"/>
-        </w:rPr>
-        <w:t xml:space="preserve"> 21.421 </w:t>
-      </w:r>
-      <w:r>
-        <w:rPr>
-          <w:rFonts w:hint="eastAsia" w:ascii="Times New Roman" w:hAnsi="Times New Roman" w:eastAsia="宋体"/>
-          <w:color w:val="000000"/>
-          <w:sz w:val="24"/>
-        </w:rPr>
-        <w:t xml:space="preserve">分钟，正常与施工场景仍采用同一零迟到路线，任务三成本增量仍为</w:t>
-      </w:r>
-      <w:r>
-        <w:rPr>
-          <w:rFonts w:ascii="Times New Roman" w:hAnsi="Times New Roman" w:eastAsia="宋体"/>
-          <w:color w:val="000000"/>
-          <w:sz w:val="24"/>
-        </w:rPr>
-        <w:t xml:space="preserve"> </w:t>
-      </w:r>
-      <w:r>
-        <w:rPr>
-          <w:rFonts w:hint="eastAsia" w:ascii="Times New Roman" w:hAnsi="Times New Roman" w:eastAsia="宋体"/>
-          <w:color w:val="000000"/>
-          <w:sz w:val="24"/>
-        </w:rPr>
-        <w:t xml:space="preserve">0。超过该阈值后，迟到数和路线可能改变，本文不把阈值之外的结论外推为已验证事实。</w:t>
+      <w:r>
+        <w:rPr>
+          <w:rFonts w:hint="eastAsia" w:ascii="Times New Roman" w:hAnsi="Times New Roman" w:eastAsia="宋体"/>
+          <w:color w:val="000000"/>
+          <w:sz w:val="24"/>
+        </w:rPr>
+        <w:t xml:space="preserve">0。超过该阈值后，迟到数和路线可能改变，本文不将边界之外的结论视为已验证结果。</w:t>
       </w:r>
     </w:p>
     <w:bookmarkEnd w:id="35"/>
@@ -23193,23 +23359,40 @@
     <w:p>
       <w:pPr>
         <w:pStyle w:val="FirstParagraph"/>
+        <w:keepNext/>
         <w:spacing w:line="360" w:lineRule="auto" w:before="0" w:after="0"/>
-        <w:ind w:firstLine="480"/>
-        <w:jc w:val="both"/>
+        <w:ind w:firstLine="0"/>
+        <w:jc w:val="center"/>
       </w:pPr>
       <w:r>
         <w:rPr>
           <w:rFonts w:hint="eastAsia" w:ascii="Times New Roman" w:hAnsi="Times New Roman" w:eastAsia="宋体"/>
           <w:color w:val="000000"/>
-          <w:sz w:val="24"/>
-        </w:rPr>
-        <w:t xml:space="preserve">程序实际枚举正常场景全部</w:t>
-      </w:r>
-      <w:r>
-        <w:rPr>
-          <w:rFonts w:ascii="Times New Roman" w:hAnsi="Times New Roman" w:eastAsia="宋体"/>
-          <w:color w:val="000000"/>
-          <w:sz w:val="24"/>
+          <w:sz w:val="21"/>
+        </w:rPr>
+        <w:t xml:space="preserve">表</w:t>
+      </w:r>
+      <w:r>
+        <w:rPr>
+          <w:rFonts w:ascii="Times New Roman" w:hAnsi="Times New Roman" w:eastAsia="宋体"/>
+          <w:color w:val="000000"/>
+          <w:sz w:val="21"/>
+        </w:rPr>
+        <w:t xml:space="preserve"> 3 </w:t>
+      </w:r>
+      <w:r>
+        <w:rPr>
+          <w:rFonts w:hint="eastAsia" w:ascii="Times New Roman" w:hAnsi="Times New Roman" w:eastAsia="宋体"/>
+          <w:color w:val="000000"/>
+          <w:sz w:val="21"/>
+        </w:rPr>
+        <w:t xml:space="preserve">给出了正常场景全部</w:t>
+      </w:r>
+      <w:r>
+        <w:rPr>
+          <w:rFonts w:ascii="Times New Roman" w:hAnsi="Times New Roman" w:eastAsia="宋体"/>
+          <w:color w:val="000000"/>
+          <w:sz w:val="21"/>
         </w:rPr>
         <w:t xml:space="preserve"> 8 </w:t>
       </w:r>
@@ -23217,31 +23400,79 @@
         <w:rPr>
           <w:rFonts w:hint="eastAsia" w:ascii="Times New Roman" w:hAnsi="Times New Roman" w:eastAsia="宋体"/>
           <w:color w:val="000000"/>
-          <w:sz w:val="24"/>
-        </w:rPr>
-        <w:t xml:space="preserve">个组合，并逐项输出候选路线、迟到数、里程和成本。独立测试验证了原题</w:t>
-      </w:r>
-      <w:r>
-        <w:rPr>
-          <w:rFonts w:ascii="Times New Roman" w:hAnsi="Times New Roman" w:eastAsia="宋体"/>
-          <w:color w:val="000000"/>
-          <w:sz w:val="24"/>
-        </w:rPr>
-        <w:t xml:space="preserve"> DOCX </w:t>
-      </w:r>
-      <w:r>
-        <w:rPr>
-          <w:rFonts w:hint="eastAsia" w:ascii="Times New Roman" w:hAnsi="Times New Roman" w:eastAsia="宋体"/>
-          <w:color w:val="000000"/>
-          <w:sz w:val="24"/>
-        </w:rPr>
-        <w:t xml:space="preserve">的</w:t>
-      </w:r>
-      <w:r>
-        <w:rPr>
-          <w:rFonts w:ascii="Times New Roman" w:hAnsi="Times New Roman" w:eastAsia="宋体"/>
-          <w:color w:val="000000"/>
-          <w:sz w:val="24"/>
+          <w:sz w:val="21"/>
+        </w:rPr>
+        <w:t xml:space="preserve">个组合的路线、迟到数和成本，并同时标出禁弧后的保留集合。三条最优路线的几何距离分别复算为</w:t>
+      </w:r>
+      <w:r>
+        <w:rPr>
+          <w:rFonts w:ascii="Times New Roman" w:hAnsi="Times New Roman" w:eastAsia="宋体"/>
+          <w:color w:val="000000"/>
+          <w:sz w:val="21"/>
+        </w:rPr>
+        <w:t xml:space="preserve"> 29.9497、41.2547 </w:t>
+      </w:r>
+      <w:r>
+        <w:rPr>
+          <w:rFonts w:hint="eastAsia" w:ascii="Times New Roman" w:hAnsi="Times New Roman" w:eastAsia="宋体"/>
+          <w:color w:val="000000"/>
+          <w:sz w:val="21"/>
+        </w:rPr>
+        <w:t xml:space="preserve">和</w:t>
+      </w:r>
+      <w:r>
+        <w:rPr>
+          <w:rFonts w:ascii="Times New Roman" w:hAnsi="Times New Roman" w:eastAsia="宋体"/>
+          <w:color w:val="000000"/>
+          <w:sz w:val="21"/>
+        </w:rPr>
+        <w:t xml:space="preserve"> 32.6669 </w:t>
+      </w:r>
+      <w:r>
+        <w:rPr>
+          <w:rFonts w:hint="eastAsia" w:ascii="Times New Roman" w:hAnsi="Times New Roman" w:eastAsia="宋体"/>
+          <w:color w:val="000000"/>
+          <w:sz w:val="21"/>
+        </w:rPr>
+        <w:t xml:space="preserve">km，与表</w:t>
+      </w:r>
+      <w:r>
+        <w:rPr>
+          <w:rFonts w:ascii="Times New Roman" w:hAnsi="Times New Roman" w:eastAsia="宋体"/>
+          <w:color w:val="000000"/>
+          <w:sz w:val="21"/>
+        </w:rPr>
+        <w:t xml:space="preserve"> 4 </w:t>
+      </w:r>
+      <w:r>
+        <w:rPr>
+          <w:rFonts w:hint="eastAsia" w:ascii="Times New Roman" w:hAnsi="Times New Roman" w:eastAsia="宋体"/>
+          <w:color w:val="000000"/>
+          <w:sz w:val="21"/>
+        </w:rPr>
+        <w:t xml:space="preserve">一致；总里程乘以</w:t>
+      </w:r>
+      <w:r>
+        <w:rPr>
+          <w:rFonts w:ascii="Times New Roman" w:hAnsi="Times New Roman" w:eastAsia="宋体"/>
+          <w:color w:val="000000"/>
+          <w:sz w:val="21"/>
+        </w:rPr>
+        <w:t xml:space="preserve"> 4 </w:t>
+      </w:r>
+      <w:r>
+        <w:rPr>
+          <w:rFonts w:hint="eastAsia" w:ascii="Times New Roman" w:hAnsi="Times New Roman" w:eastAsia="宋体"/>
+          <w:color w:val="000000"/>
+          <w:sz w:val="21"/>
+        </w:rPr>
+        <w:t xml:space="preserve">元/km</w:t>
+      </w:r>
+      <w:r>
+        <w:rPr>
+          <w:rFonts w:ascii="Times New Roman" w:hAnsi="Times New Roman" w:eastAsia="宋体"/>
+          <w:color w:val="000000"/>
+          <w:sz w:val="21"/>
         </w:rPr>
         <w:t xml:space="preserve"> </w:t>
       </w:r>
@@ -23249,41 +23480,38 @@
         <w:rPr>
           <w:rFonts w:hint="eastAsia" w:ascii="Times New Roman" w:hAnsi="Times New Roman" w:eastAsia="宋体"/>
           <w:color w:val="000000"/>
-          <w:sz w:val="24"/>
-        </w:rPr>
-        <w:t xml:space="preserve">SHA-256、三条最优路线的手算距离、B</w:t>
-      </w:r>
-      <w:r>
-        <w:rPr>
-          <w:rFonts w:ascii="Times New Roman" w:hAnsi="Times New Roman" w:eastAsia="宋体"/>
-          <w:color w:val="000000"/>
-          <w:sz w:val="24"/>
+          <w:sz w:val="21"/>
+        </w:rPr>
+        <w:t xml:space="preserve">得</w:t>
+      </w:r>
+      <w:r>
+        <w:rPr>
+          <w:rFonts w:ascii="Times New Roman" w:hAnsi="Times New Roman" w:eastAsia="宋体"/>
+          <w:color w:val="000000"/>
+          <w:sz w:val="21"/>
         </w:rPr>
         <w:t xml:space="preserve"> </w:t>
       </w:r>
-      <w:r>
-        <w:rPr>
-          <w:rFonts w:hint="eastAsia" w:ascii="Times New Roman" w:hAnsi="Times New Roman" w:eastAsia="宋体"/>
-          <w:color w:val="000000"/>
-          <w:sz w:val="24"/>
-        </w:rPr>
-        <w:t xml:space="preserve">车门店到达时刻、封闭弧剔除、正常与施工方案的零成本差，以及服务时长阈值。当前</w:t>
-      </w:r>
-      <w:r>
-        <w:rPr>
-          <w:rFonts w:ascii="Times New Roman" w:hAnsi="Times New Roman" w:eastAsia="宋体"/>
-          <w:color w:val="000000"/>
-          <w:sz w:val="24"/>
-        </w:rPr>
-        <w:t xml:space="preserve"> 7 </w:t>
-      </w:r>
-      <w:r>
-        <w:rPr>
-          <w:rFonts w:hint="eastAsia" w:ascii="Times New Roman" w:hAnsi="Times New Roman" w:eastAsia="宋体"/>
-          <w:color w:val="000000"/>
-          <w:sz w:val="24"/>
-        </w:rPr>
-        <w:t xml:space="preserve">项测试全部通过。</w:t>
+      <m:oMath>
+        <m:r>
+          <m:t>415.4852</m:t>
+        </m:r>
+      </m:oMath>
+      <w:r>
+        <w:rPr>
+          <w:rFonts w:ascii="Times New Roman" w:hAnsi="Times New Roman" w:eastAsia="宋体"/>
+          <w:color w:val="000000"/>
+          <w:sz w:val="21"/>
+        </w:rPr>
+        <w:t xml:space="preserve"> </w:t>
+      </w:r>
+      <w:r>
+        <w:rPr>
+          <w:rFonts w:hint="eastAsia" w:ascii="Times New Roman" w:hAnsi="Times New Roman" w:eastAsia="宋体"/>
+          <w:color w:val="000000"/>
+          <w:sz w:val="21"/>
+        </w:rPr>
+        <w:t xml:space="preserve">元，也与三车路线成本之和一致。</w:t>
       </w:r>
     </w:p>
     <w:p>
@@ -23363,23 +23591,23 @@
           <w:color w:val="000000"/>
           <w:sz w:val="24"/>
         </w:rPr>
-        <w:t xml:space="preserve">km。总里程乘以</w:t>
-      </w:r>
-      <w:r>
-        <w:rPr>
-          <w:rFonts w:ascii="Times New Roman" w:hAnsi="Times New Roman" w:eastAsia="宋体"/>
-          <w:color w:val="000000"/>
-          <w:sz w:val="24"/>
-        </w:rPr>
-        <w:t xml:space="preserve"> 4 </w:t>
-      </w:r>
-      <w:r>
-        <w:rPr>
-          <w:rFonts w:hint="eastAsia" w:ascii="Times New Roman" w:hAnsi="Times New Roman" w:eastAsia="宋体"/>
-          <w:color w:val="000000"/>
-          <w:sz w:val="24"/>
-        </w:rPr>
-        <w:t xml:space="preserve">元/km</w:t>
+        <w:t xml:space="preserve">km；表</w:t>
+      </w:r>
+      <w:r>
+        <w:rPr>
+          <w:rFonts w:ascii="Times New Roman" w:hAnsi="Times New Roman" w:eastAsia="宋体"/>
+          <w:color w:val="000000"/>
+          <w:sz w:val="24"/>
+        </w:rPr>
+        <w:t xml:space="preserve"> 5 </w:t>
+      </w:r>
+      <w:r>
+        <w:rPr>
+          <w:rFonts w:hint="eastAsia" w:ascii="Times New Roman" w:hAnsi="Times New Roman" w:eastAsia="宋体"/>
+          <w:color w:val="000000"/>
+          <w:sz w:val="24"/>
+        </w:rPr>
+        <w:t xml:space="preserve">的到达时刻全部位于相应窗口内。封路前后的候选集合差异与表</w:t>
       </w:r>
       <w:r>
         <w:rPr>
@@ -23395,36 +23623,23 @@
           <w:color w:val="000000"/>
           <w:sz w:val="24"/>
         </w:rPr>
-        <w:t xml:space="preserve">得</w:t>
-      </w:r>
-      <w:r>
-        <w:rPr>
-          <w:rFonts w:ascii="Times New Roman" w:hAnsi="Times New Roman" w:eastAsia="宋体"/>
-          <w:color w:val="000000"/>
-          <w:sz w:val="24"/>
-        </w:rPr>
-        <w:t xml:space="preserve"> </w:t>
-      </w:r>
-      <m:oMath>
-        <m:r>
-          <m:t>415.4852</m:t>
-        </m:r>
-      </m:oMath>
-      <w:r>
-        <w:rPr>
-          <w:rFonts w:ascii="Times New Roman" w:hAnsi="Times New Roman" w:eastAsia="宋体"/>
-          <w:color w:val="000000"/>
-          <w:sz w:val="24"/>
-        </w:rPr>
-        <w:t xml:space="preserve"> </w:t>
-      </w:r>
-      <w:r>
-        <w:rPr>
-          <w:rFonts w:hint="eastAsia" w:ascii="Times New Roman" w:hAnsi="Times New Roman" w:eastAsia="宋体"/>
-          <w:color w:val="000000"/>
-          <w:sz w:val="24"/>
-        </w:rPr>
-        <w:t xml:space="preserve">元，与路线成本之和一致；到达时刻全部位于相应窗口内。上述检查覆盖了本题结论依赖的容量、里程、时间递推、目标排序和扰动边界。</w:t>
+        <w:t xml:space="preserve">3、表</w:t>
+      </w:r>
+      <w:r>
+        <w:rPr>
+          <w:rFonts w:ascii="Times New Roman" w:hAnsi="Times New Roman" w:eastAsia="宋体"/>
+          <w:color w:val="000000"/>
+          <w:sz w:val="24"/>
+        </w:rPr>
+        <w:t xml:space="preserve"> 6 </w:t>
+      </w:r>
+      <w:r>
+        <w:rPr>
+          <w:rFonts w:hint="eastAsia" w:ascii="Times New Roman" w:hAnsi="Times New Roman" w:eastAsia="宋体"/>
+          <w:color w:val="000000"/>
+          <w:sz w:val="24"/>
+        </w:rPr>
+        <w:t xml:space="preserve">一致，服务时长的解析边界也由数值搜索复现。上述核验覆盖了容量、里程、时间递推、目标排序和扰动边界。</w:t>
       </w:r>
     </w:p>
     <w:bookmarkEnd w:id="36"/>
@@ -23492,7 +23707,7 @@
           <w:color w:val="000000"/>
           <w:sz w:val="24"/>
         </w:rPr>
-        <w:t xml:space="preserve">个组合及其封路可行性，能够给出当前小规模实例的全局最优性和零效应机制证据。任务三先声明发车前静态信息状态，再检查封闭弧是否命中基线并重优化，避免把题目叙述中的预期效果当成数值结论。服务时长阈值又给出了零服务时长假设的适用范围。</w:t>
+        <w:t xml:space="preserve">个组合及其封路可行性，能够给出当前小规模实例的全局最优性和零效应机制证据。任务三先检查封闭弧是否命中基线，再在静态施工情景中重优化；服务时长阈值则给出了零服务时长假设的适用范围。</w:t>
       </w:r>
     </w:p>
     <w:p>
@@ -23508,7 +23723,7 @@
           <w:color w:val="000000"/>
           <w:sz w:val="24"/>
         </w:rPr>
-        <w:t xml:space="preserve">模型也有明确限制。首先，欧氏距离没有反映真实道路绕行、单行线和拥堵，因而数值路线应视为坐标网络上的规划结果。其次，恒定速度和统一服务时长没有描述交通与装卸差异。再次，冷链温度只作为阈值可行性条件，缺少温度动态和能耗数据，不能评价制冷成本。最后，任务三把“4:30</w:t>
+        <w:t xml:space="preserve">模型也有明确限制。首先，欧氏距离没有反映真实道路绕行、单行线和拥堵，因而数值路线应视为坐标网络上的规划结果。其次，恒定速度和统一服务时长没有描述交通与装卸差异。再次，冷链温度只作为阈值可行性条件，缺少温度动态和能耗数据，不能评价制冷成本。最后，任务三只能回答发车前静态重优化；在途动态重路由还需要事件发生时刻、车辆位置、已服务节点、剩余载荷和实时路网状态</w:t>
       </w:r>
       <w:r>
         <w:rPr>
@@ -23524,23 +23739,7 @@
           <w:color w:val="000000"/>
           <w:sz w:val="24"/>
         </w:rPr>
-        <w:t xml:space="preserve">发车前已知封路”作为补充建模假设，只能回答发车前静态重优化；真正的在途动态重路由还需要事件发生时刻、车辆位置、已服务节点、剩余载荷和实时路网状态</w:t>
-      </w:r>
-      <w:r>
-        <w:rPr>
-          <w:rFonts w:ascii="Times New Roman" w:hAnsi="Times New Roman" w:eastAsia="宋体"/>
-          <w:color w:val="000000"/>
-          <w:sz w:val="24"/>
-        </w:rPr>
-        <w:t xml:space="preserve"> </w:t>
-      </w:r>
-      <w:r>
-        <w:rPr>
-          <w:rFonts w:hint="eastAsia" w:ascii="Times New Roman" w:hAnsi="Times New Roman" w:eastAsia="宋体"/>
-          <w:color w:val="000000"/>
-          <w:sz w:val="24"/>
-        </w:rPr>
-        <w:t xml:space="preserve">[3]。本文不补造这些状态，也不把静态零增量外推到动态情形。</w:t>
+        <w:t xml:space="preserve">[3]，现有数据不足以支持这类计算。</w:t>
       </w:r>
     </w:p>
     <w:p>
@@ -23703,23 +23902,7 @@
           <w:color w:val="000000"/>
           <w:sz w:val="24"/>
         </w:rPr>
-        <w:t xml:space="preserve">个零迟到组合中成本最低。对于“4:30</w:t>
-      </w:r>
-      <w:r>
-        <w:rPr>
-          <w:rFonts w:ascii="Times New Roman" w:hAnsi="Times New Roman" w:eastAsia="宋体"/>
-          <w:color w:val="000000"/>
-          <w:sz w:val="24"/>
-        </w:rPr>
-        <w:t xml:space="preserve"> </w:t>
-      </w:r>
-      <w:r>
-        <w:rPr>
-          <w:rFonts w:hint="eastAsia" w:ascii="Times New Roman" w:hAnsi="Times New Roman" w:eastAsia="宋体"/>
-          <w:color w:val="000000"/>
-          <w:sz w:val="24"/>
-        </w:rPr>
-        <w:t xml:space="preserve">发车前已经知道有向弧</w:t>
+        <w:t xml:space="preserve">个零迟到组合中成本最低。对于发车前已知有向弧</w:t>
       </w:r>
       <w:r>
         <w:rPr>
@@ -23757,7 +23940,7 @@
           <w:color w:val="000000"/>
           <w:sz w:val="24"/>
         </w:rPr>
-        <w:t xml:space="preserve">封闭”的静态主场景，禁弧删除</w:t>
+        <w:t xml:space="preserve">封闭的静态情景，禁弧删除</w:t>
       </w:r>
       <w:r>
         <w:rPr>
@@ -23789,7 +23972,7 @@
           <w:color w:val="000000"/>
           <w:sz w:val="24"/>
         </w:rPr>
-        <w:t xml:space="preserve">分钟/店时保持成立，但仅适用于上述信息状态，不能代表在途动态重路由。</w:t>
+        <w:t xml:space="preserve">分钟/店时保持成立，但不适用于数据条件不同的在途动态重路由。</w:t>
       </w:r>
     </w:p>
     <w:p>
@@ -23908,586 +24091,7 @@
       </w:r>
     </w:p>
     <w:bookmarkEnd w:id="40"/>
-    <w:bookmarkStart w:id="41" w:name="附录复现入口"/>
-    <w:p>
-      <w:pPr>
-        <w:pStyle w:val="Heading2"/>
-        <w:spacing w:line="240" w:lineRule="auto" w:before="50" w:after="50"/>
-        <w:ind w:firstLine="0"/>
-        <w:jc w:val="center"/>
-      </w:pPr>
-      <w:r>
-        <w:rPr>
-          <w:rFonts w:hint="eastAsia" w:ascii="Times New Roman" w:hAnsi="Times New Roman" w:eastAsia="黑体"/>
-          <w:b/>
-          <w:color w:val="000000"/>
-          <w:sz w:val="28"/>
-        </w:rPr>
-        <w:t xml:space="preserve">附录：复现入口</w:t>
-      </w:r>
-    </w:p>
-    <w:p>
-      <w:pPr>
-        <w:pStyle w:val="FirstParagraph"/>
-        <w:spacing w:line="300" w:lineRule="auto" w:before="0" w:after="0"/>
-        <w:ind w:firstLine="0"/>
-        <w:jc w:val="left"/>
-      </w:pPr>
-      <w:r>
-        <w:rPr>
-          <w:rFonts w:hint="eastAsia" w:ascii="Times New Roman" w:hAnsi="Times New Roman" w:eastAsia="宋体"/>
-          <w:color w:val="000000"/>
-          <w:sz w:val="21"/>
-        </w:rPr>
-        <w:t xml:space="preserve">在项目目录使用仓库解释器运行：</w:t>
-      </w:r>
-    </w:p>
-    <w:p>
-      <w:pPr>
-        <w:pStyle w:val="SourceCode"/>
-        <w:spacing w:line="300" w:lineRule="auto" w:before="0" w:after="0"/>
-        <w:ind w:firstLine="0"/>
-        <w:jc w:val="left"/>
-      </w:pPr>
-      <w:r>
-        <w:rPr>
-          <w:rStyle w:val="NormalTok"/>
-          <w:rFonts w:ascii="Times New Roman" w:hAnsi="Times New Roman" w:eastAsia="宋体"/>
-          <w:color w:val="000000"/>
-          <w:sz w:val="21"/>
-        </w:rPr>
-        <w:t xml:space="preserve">python </w:t>
-      </w:r>
-      <w:r>
-        <w:rPr>
-          <w:rStyle w:val="OperatorTok"/>
-          <w:rFonts w:ascii="Times New Roman" w:hAnsi="Times New Roman" w:eastAsia="宋体"/>
-          <w:color w:val="000000"/>
-          <w:sz w:val="21"/>
-        </w:rPr>
-        <w:t xml:space="preserve">-</w:t>
-      </w:r>
-      <w:r>
-        <w:rPr>
-          <w:rStyle w:val="NormalTok"/>
-          <w:rFonts w:ascii="Times New Roman" w:hAnsi="Times New Roman" w:eastAsia="宋体"/>
-          <w:color w:val="000000"/>
-          <w:sz w:val="21"/>
-        </w:rPr>
-        <w:t xml:space="preserve">m pip install </w:t>
-      </w:r>
-      <w:r>
-        <w:rPr>
-          <w:rStyle w:val="OperatorTok"/>
-          <w:rFonts w:ascii="Times New Roman" w:hAnsi="Times New Roman" w:eastAsia="宋体"/>
-          <w:color w:val="000000"/>
-          <w:sz w:val="21"/>
-        </w:rPr>
-        <w:t xml:space="preserve">-</w:t>
-      </w:r>
-      <w:r>
-        <w:rPr>
-          <w:rStyle w:val="NormalTok"/>
-          <w:rFonts w:ascii="Times New Roman" w:hAnsi="Times New Roman" w:eastAsia="宋体"/>
-          <w:color w:val="000000"/>
-          <w:sz w:val="21"/>
-        </w:rPr>
-        <w:t xml:space="preserve">r requirements</w:t>
-      </w:r>
-      <w:r>
-        <w:rPr>
-          <w:rStyle w:val="OperatorTok"/>
-          <w:rFonts w:ascii="Times New Roman" w:hAnsi="Times New Roman" w:eastAsia="宋体"/>
-          <w:color w:val="000000"/>
-          <w:sz w:val="21"/>
-        </w:rPr>
-        <w:t xml:space="preserve">.</w:t>
-      </w:r>
-      <w:r>
-        <w:rPr>
-          <w:rStyle w:val="FunctionTok"/>
-          <w:rFonts w:ascii="Times New Roman" w:hAnsi="Times New Roman" w:eastAsia="宋体"/>
-          <w:color w:val="000000"/>
-          <w:sz w:val="21"/>
-        </w:rPr>
-        <w:t xml:space="preserve">txt</w:t>
-      </w:r>
-      <w:r>
-        <w:rPr>
-          <w:rFonts w:ascii="Times New Roman" w:hAnsi="Times New Roman" w:eastAsia="宋体"/>
-          <w:color w:val="000000"/>
-          <w:sz w:val="21"/>
-        </w:rPr>
-        <w:br/>
-      </w:r>
-      <w:r>
-        <w:rPr>
-          <w:rStyle w:val="NormalTok"/>
-          <w:rFonts w:ascii="Times New Roman" w:hAnsi="Times New Roman" w:eastAsia="宋体"/>
-          <w:color w:val="000000"/>
-          <w:sz w:val="21"/>
-        </w:rPr>
-        <w:t xml:space="preserve">python src\solve_problem_b</w:t>
-      </w:r>
-      <w:r>
-        <w:rPr>
-          <w:rStyle w:val="OperatorTok"/>
-          <w:rFonts w:ascii="Times New Roman" w:hAnsi="Times New Roman" w:eastAsia="宋体"/>
-          <w:color w:val="000000"/>
-          <w:sz w:val="21"/>
-        </w:rPr>
-        <w:t xml:space="preserve">.</w:t>
-      </w:r>
-      <w:r>
-        <w:rPr>
-          <w:rStyle w:val="FunctionTok"/>
-          <w:rFonts w:ascii="Times New Roman" w:hAnsi="Times New Roman" w:eastAsia="宋体"/>
-          <w:color w:val="000000"/>
-          <w:sz w:val="21"/>
-        </w:rPr>
-        <w:t xml:space="preserve">py</w:t>
-      </w:r>
-      <w:r>
-        <w:rPr>
-          <w:rFonts w:ascii="Times New Roman" w:hAnsi="Times New Roman" w:eastAsia="宋体"/>
-          <w:color w:val="000000"/>
-          <w:sz w:val="21"/>
-        </w:rPr>
-        <w:br/>
-      </w:r>
-      <w:r>
-        <w:rPr>
-          <w:rStyle w:val="NormalTok"/>
-          <w:rFonts w:ascii="Times New Roman" w:hAnsi="Times New Roman" w:eastAsia="宋体"/>
-          <w:color w:val="000000"/>
-          <w:sz w:val="21"/>
-        </w:rPr>
-        <w:t xml:space="preserve">python src\plot_problem_b</w:t>
-      </w:r>
-      <w:r>
-        <w:rPr>
-          <w:rStyle w:val="OperatorTok"/>
-          <w:rFonts w:ascii="Times New Roman" w:hAnsi="Times New Roman" w:eastAsia="宋体"/>
-          <w:color w:val="000000"/>
-          <w:sz w:val="21"/>
-        </w:rPr>
-        <w:t xml:space="preserve">.</w:t>
-      </w:r>
-      <w:r>
-        <w:rPr>
-          <w:rStyle w:val="FunctionTok"/>
-          <w:rFonts w:ascii="Times New Roman" w:hAnsi="Times New Roman" w:eastAsia="宋体"/>
-          <w:color w:val="000000"/>
-          <w:sz w:val="21"/>
-        </w:rPr>
-        <w:t xml:space="preserve">py</w:t>
-      </w:r>
-      <w:r>
-        <w:rPr>
-          <w:rFonts w:ascii="Times New Roman" w:hAnsi="Times New Roman" w:eastAsia="宋体"/>
-          <w:color w:val="000000"/>
-          <w:sz w:val="21"/>
-        </w:rPr>
-        <w:br/>
-      </w:r>
-      <w:r>
-        <w:rPr>
-          <w:rStyle w:val="NormalTok"/>
-          <w:rFonts w:ascii="Times New Roman" w:hAnsi="Times New Roman" w:eastAsia="宋体"/>
-          <w:color w:val="000000"/>
-          <w:sz w:val="21"/>
-        </w:rPr>
-        <w:t xml:space="preserve">python </w:t>
-      </w:r>
-      <w:r>
-        <w:rPr>
-          <w:rStyle w:val="OperatorTok"/>
-          <w:rFonts w:ascii="Times New Roman" w:hAnsi="Times New Roman" w:eastAsia="宋体"/>
-          <w:color w:val="000000"/>
-          <w:sz w:val="21"/>
-        </w:rPr>
-        <w:t xml:space="preserve">-</w:t>
-      </w:r>
-      <w:r>
-        <w:rPr>
-          <w:rStyle w:val="NormalTok"/>
-          <w:rFonts w:ascii="Times New Roman" w:hAnsi="Times New Roman" w:eastAsia="宋体"/>
-          <w:color w:val="000000"/>
-          <w:sz w:val="21"/>
-        </w:rPr>
-        <w:t xml:space="preserve">m unittest discover </w:t>
-      </w:r>
-      <w:r>
-        <w:rPr>
-          <w:rStyle w:val="OperatorTok"/>
-          <w:rFonts w:ascii="Times New Roman" w:hAnsi="Times New Roman" w:eastAsia="宋体"/>
-          <w:color w:val="000000"/>
-          <w:sz w:val="21"/>
-        </w:rPr>
-        <w:t xml:space="preserve">-</w:t>
-      </w:r>
-      <w:r>
-        <w:rPr>
-          <w:rStyle w:val="NormalTok"/>
-          <w:rFonts w:ascii="Times New Roman" w:hAnsi="Times New Roman" w:eastAsia="宋体"/>
-          <w:color w:val="000000"/>
-          <w:sz w:val="21"/>
-        </w:rPr>
-        <w:t xml:space="preserve">s tests </w:t>
-      </w:r>
-      <w:r>
-        <w:rPr>
-          <w:rStyle w:val="OperatorTok"/>
-          <w:rFonts w:ascii="Times New Roman" w:hAnsi="Times New Roman" w:eastAsia="宋体"/>
-          <w:color w:val="000000"/>
-          <w:sz w:val="21"/>
-        </w:rPr>
-        <w:t xml:space="preserve">-</w:t>
-      </w:r>
-      <w:r>
-        <w:rPr>
-          <w:rStyle w:val="NormalTok"/>
-          <w:rFonts w:ascii="Times New Roman" w:hAnsi="Times New Roman" w:eastAsia="宋体"/>
-          <w:color w:val="000000"/>
-          <w:sz w:val="21"/>
-        </w:rPr>
-        <w:t xml:space="preserve">p </w:t>
-      </w:r>
-      <w:r>
-        <w:rPr>
-          <w:rStyle w:val="StringTok"/>
-          <w:rFonts w:ascii="Times New Roman" w:hAnsi="Times New Roman" w:eastAsia="宋体"/>
-          <w:color w:val="000000"/>
-          <w:sz w:val="21"/>
-        </w:rPr>
-        <w:t xml:space="preserve">'test_solver.py'</w:t>
-      </w:r>
-      <w:r>
-        <w:rPr>
-          <w:rStyle w:val="NormalTok"/>
-          <w:rFonts w:ascii="Times New Roman" w:hAnsi="Times New Roman" w:eastAsia="宋体"/>
-          <w:color w:val="000000"/>
-          <w:sz w:val="21"/>
-        </w:rPr>
-        <w:t xml:space="preserve"> </w:t>
-      </w:r>
-      <w:r>
-        <w:rPr>
-          <w:rStyle w:val="OperatorTok"/>
-          <w:rFonts w:ascii="Times New Roman" w:hAnsi="Times New Roman" w:eastAsia="宋体"/>
-          <w:color w:val="000000"/>
-          <w:sz w:val="21"/>
-        </w:rPr>
-        <w:t xml:space="preserve">-</w:t>
-      </w:r>
-      <w:r>
-        <w:rPr>
-          <w:rStyle w:val="NormalTok"/>
-          <w:rFonts w:ascii="Times New Roman" w:hAnsi="Times New Roman" w:eastAsia="宋体"/>
-          <w:color w:val="000000"/>
-          <w:sz w:val="21"/>
-        </w:rPr>
-        <w:t xml:space="preserve">v</w:t>
-      </w:r>
-      <w:r>
-        <w:rPr>
-          <w:rFonts w:ascii="Times New Roman" w:hAnsi="Times New Roman" w:eastAsia="宋体"/>
-          <w:color w:val="000000"/>
-          <w:sz w:val="21"/>
-        </w:rPr>
-        <w:br/>
-      </w:r>
-      <w:r>
-        <w:rPr>
-          <w:rStyle w:val="NormalTok"/>
-          <w:rFonts w:ascii="Times New Roman" w:hAnsi="Times New Roman" w:eastAsia="宋体"/>
-          <w:color w:val="000000"/>
-          <w:sz w:val="21"/>
-        </w:rPr>
-        <w:t xml:space="preserve">python src\build_paper</w:t>
-      </w:r>
-      <w:r>
-        <w:rPr>
-          <w:rStyle w:val="OperatorTok"/>
-          <w:rFonts w:ascii="Times New Roman" w:hAnsi="Times New Roman" w:eastAsia="宋体"/>
-          <w:color w:val="000000"/>
-          <w:sz w:val="21"/>
-        </w:rPr>
-        <w:t xml:space="preserve">.</w:t>
-      </w:r>
-      <w:r>
-        <w:rPr>
-          <w:rStyle w:val="FunctionTok"/>
-          <w:rFonts w:ascii="Times New Roman" w:hAnsi="Times New Roman" w:eastAsia="宋体"/>
-          <w:color w:val="000000"/>
-          <w:sz w:val="21"/>
-        </w:rPr>
-        <w:t xml:space="preserve">py</w:t>
-      </w:r>
-    </w:p>
-    <w:p>
-      <w:pPr>
-        <w:pStyle w:val="FirstParagraph"/>
-        <w:spacing w:line="300" w:lineRule="auto" w:before="0" w:after="0"/>
-        <w:ind w:firstLine="0"/>
-        <w:jc w:val="left"/>
-      </w:pPr>
-      <w:r>
-        <w:rPr>
-          <w:rFonts w:hint="eastAsia" w:ascii="Times New Roman" w:hAnsi="Times New Roman" w:eastAsia="宋体"/>
-          <w:color w:val="000000"/>
-          <w:sz w:val="21"/>
-        </w:rPr>
-        <w:t xml:space="preserve">求解器把正式结果写入</w:t>
-      </w:r>
-      <w:r>
-        <w:rPr>
-          <w:rFonts w:ascii="Times New Roman" w:hAnsi="Times New Roman" w:eastAsia="宋体"/>
-          <w:color w:val="000000"/>
-          <w:sz w:val="21"/>
-        </w:rPr>
-        <w:t xml:space="preserve"> </w:t>
-      </w:r>
-      <w:r>
-        <w:rPr>
-          <w:rStyle w:val="VerbatimChar"/>
-          <w:rFonts w:ascii="Times New Roman" w:hAnsi="Times New Roman" w:eastAsia="宋体"/>
-          <w:color w:val="000000"/>
-          <w:sz w:val="21"/>
-        </w:rPr>
-        <w:t xml:space="preserve">results/</w:t>
-      </w:r>
-      <w:r>
-        <w:rPr>
-          <w:rFonts w:hint="eastAsia" w:ascii="Times New Roman" w:hAnsi="Times New Roman" w:eastAsia="宋体"/>
-          <w:color w:val="000000"/>
-          <w:sz w:val="21"/>
-        </w:rPr>
-        <w:t xml:space="preserve">，绘图脚本生成正文所用</w:t>
-      </w:r>
-      <w:r>
-        <w:rPr>
-          <w:rFonts w:ascii="Times New Roman" w:hAnsi="Times New Roman" w:eastAsia="宋体"/>
-          <w:color w:val="000000"/>
-          <w:sz w:val="21"/>
-        </w:rPr>
-        <w:t xml:space="preserve"> 3 </w:t>
-      </w:r>
-      <w:r>
-        <w:rPr>
-          <w:rFonts w:hint="eastAsia" w:ascii="Times New Roman" w:hAnsi="Times New Roman" w:eastAsia="宋体"/>
-          <w:color w:val="000000"/>
-          <w:sz w:val="21"/>
-        </w:rPr>
-        <w:t xml:space="preserve">张</w:t>
-      </w:r>
-      <w:r>
-        <w:rPr>
-          <w:rFonts w:ascii="Times New Roman" w:hAnsi="Times New Roman" w:eastAsia="宋体"/>
-          <w:color w:val="000000"/>
-          <w:sz w:val="21"/>
-        </w:rPr>
-        <w:t xml:space="preserve"> PNG。</w:t>
-      </w:r>
-      <w:r>
-        <w:rPr>
-          <w:rStyle w:val="VerbatimChar"/>
-          <w:rFonts w:ascii="Times New Roman" w:hAnsi="Times New Roman" w:eastAsia="宋体"/>
-          <w:color w:val="000000"/>
-          <w:sz w:val="21"/>
-        </w:rPr>
-        <w:t xml:space="preserve">build_paper.py</w:t>
-      </w:r>
-      <w:r>
-        <w:rPr>
-          <w:rFonts w:ascii="Times New Roman" w:hAnsi="Times New Roman" w:eastAsia="宋体"/>
-          <w:color w:val="000000"/>
-          <w:sz w:val="21"/>
-        </w:rPr>
-        <w:t xml:space="preserve"> </w:t>
-      </w:r>
-      <w:r>
-        <w:rPr>
-          <w:rFonts w:hint="eastAsia" w:ascii="Times New Roman" w:hAnsi="Times New Roman" w:eastAsia="宋体"/>
-          <w:color w:val="000000"/>
-          <w:sz w:val="21"/>
-        </w:rPr>
-        <w:t xml:space="preserve">要求</w:t>
-      </w:r>
-      <w:r>
-        <w:rPr>
-          <w:rFonts w:ascii="Times New Roman" w:hAnsi="Times New Roman" w:eastAsia="宋体"/>
-          <w:color w:val="000000"/>
-          <w:sz w:val="21"/>
-        </w:rPr>
-        <w:t xml:space="preserve"> Pandoc 3.x </w:t>
-      </w:r>
-      <w:r>
-        <w:rPr>
-          <w:rFonts w:hint="eastAsia" w:ascii="Times New Roman" w:hAnsi="Times New Roman" w:eastAsia="宋体"/>
-          <w:color w:val="000000"/>
-          <w:sz w:val="21"/>
-        </w:rPr>
-        <w:t xml:space="preserve">已加入</w:t>
-      </w:r>
-      <w:r>
-        <w:rPr>
-          <w:rFonts w:ascii="Times New Roman" w:hAnsi="Times New Roman" w:eastAsia="宋体"/>
-          <w:color w:val="000000"/>
-          <w:sz w:val="21"/>
-        </w:rPr>
-        <w:t xml:space="preserve"> </w:t>
-      </w:r>
-      <w:r>
-        <w:rPr>
-          <w:rStyle w:val="VerbatimChar"/>
-          <w:rFonts w:ascii="Times New Roman" w:hAnsi="Times New Roman" w:eastAsia="宋体"/>
-          <w:color w:val="000000"/>
-          <w:sz w:val="21"/>
-        </w:rPr>
-        <w:t xml:space="preserve">PATH</w:t>
-      </w:r>
-      <w:r>
-        <w:rPr>
-          <w:rFonts w:hint="eastAsia" w:ascii="Times New Roman" w:hAnsi="Times New Roman" w:eastAsia="宋体"/>
-          <w:color w:val="000000"/>
-          <w:sz w:val="21"/>
-        </w:rPr>
-        <w:t xml:space="preserve">：先从</w:t>
-      </w:r>
-      <w:r>
-        <w:rPr>
-          <w:rFonts w:ascii="Times New Roman" w:hAnsi="Times New Roman" w:eastAsia="宋体"/>
-          <w:color w:val="000000"/>
-          <w:sz w:val="21"/>
-        </w:rPr>
-        <w:t xml:space="preserve"> </w:t>
-      </w:r>
-      <w:r>
-        <w:rPr>
-          <w:rStyle w:val="VerbatimChar"/>
-          <w:rFonts w:ascii="Times New Roman" w:hAnsi="Times New Roman" w:eastAsia="宋体"/>
-          <w:color w:val="000000"/>
-          <w:sz w:val="21"/>
-        </w:rPr>
-        <w:t xml:space="preserve">paper.md</w:t>
-      </w:r>
-      <w:r>
-        <w:rPr>
-          <w:rFonts w:ascii="Times New Roman" w:hAnsi="Times New Roman" w:eastAsia="宋体"/>
-          <w:color w:val="000000"/>
-          <w:sz w:val="21"/>
-        </w:rPr>
-        <w:t xml:space="preserve"> </w:t>
-      </w:r>
-      <w:r>
-        <w:rPr>
-          <w:rFonts w:hint="eastAsia" w:ascii="Times New Roman" w:hAnsi="Times New Roman" w:eastAsia="宋体"/>
-          <w:color w:val="000000"/>
-          <w:sz w:val="21"/>
-        </w:rPr>
-        <w:t xml:space="preserve">生成默认</w:t>
-      </w:r>
-      <w:r>
-        <w:rPr>
-          <w:rFonts w:ascii="Times New Roman" w:hAnsi="Times New Roman" w:eastAsia="宋体"/>
-          <w:color w:val="000000"/>
-          <w:sz w:val="21"/>
-        </w:rPr>
-        <w:t xml:space="preserve"> Word </w:t>
-      </w:r>
-      <w:r>
-        <w:rPr>
-          <w:rFonts w:hint="eastAsia" w:ascii="Times New Roman" w:hAnsi="Times New Roman" w:eastAsia="宋体"/>
-          <w:color w:val="000000"/>
-          <w:sz w:val="21"/>
-        </w:rPr>
-        <w:t xml:space="preserve">文档，再由</w:t>
-      </w:r>
-      <w:r>
-        <w:rPr>
-          <w:rFonts w:ascii="Times New Roman" w:hAnsi="Times New Roman" w:eastAsia="宋体"/>
-          <w:color w:val="000000"/>
-          <w:sz w:val="21"/>
-        </w:rPr>
-        <w:t xml:space="preserve"> </w:t>
-      </w:r>
-      <w:r>
-        <w:rPr>
-          <w:rStyle w:val="VerbatimChar"/>
-          <w:rFonts w:ascii="Times New Roman" w:hAnsi="Times New Roman" w:eastAsia="宋体"/>
-          <w:color w:val="000000"/>
-          <w:sz w:val="21"/>
-        </w:rPr>
-        <w:t xml:space="preserve">shared/paper_format.py</w:t>
-      </w:r>
-      <w:r>
-        <w:rPr>
-          <w:rFonts w:ascii="Times New Roman" w:hAnsi="Times New Roman" w:eastAsia="宋体"/>
-          <w:color w:val="000000"/>
-          <w:sz w:val="21"/>
-        </w:rPr>
-        <w:t xml:space="preserve"> </w:t>
-      </w:r>
-      <w:r>
-        <w:rPr>
-          <w:rFonts w:hint="eastAsia" w:ascii="Times New Roman" w:hAnsi="Times New Roman" w:eastAsia="宋体"/>
-          <w:color w:val="000000"/>
-          <w:sz w:val="21"/>
-        </w:rPr>
-        <w:t xml:space="preserve">读取</w:t>
-      </w:r>
-      <w:r>
-        <w:rPr>
-          <w:rFonts w:ascii="Times New Roman" w:hAnsi="Times New Roman" w:eastAsia="宋体"/>
-          <w:color w:val="000000"/>
-          <w:sz w:val="21"/>
-        </w:rPr>
-        <w:t xml:space="preserve"> profile YAML </w:t>
-      </w:r>
-      <w:r>
-        <w:rPr>
-          <w:rFonts w:hint="eastAsia" w:ascii="Times New Roman" w:hAnsi="Times New Roman" w:eastAsia="宋体"/>
-          <w:color w:val="000000"/>
-          <w:sz w:val="21"/>
-        </w:rPr>
-        <w:t xml:space="preserve">应用通用排版，最后由本题</w:t>
-      </w:r>
-      <w:r>
-        <w:rPr>
-          <w:rFonts w:ascii="Times New Roman" w:hAnsi="Times New Roman" w:eastAsia="宋体"/>
-          <w:color w:val="000000"/>
-          <w:sz w:val="21"/>
-        </w:rPr>
-        <w:t xml:space="preserve"> postprocess </w:t>
-      </w:r>
-      <w:r>
-        <w:rPr>
-          <w:rFonts w:hint="eastAsia" w:ascii="Times New Roman" w:hAnsi="Times New Roman" w:eastAsia="宋体"/>
-          <w:color w:val="000000"/>
-          <w:sz w:val="21"/>
-        </w:rPr>
-        <w:t xml:space="preserve">设置表格列宽和局部分页。构建不生成含本机路径的转换清单；实际分页仍依赖本机字体与</w:t>
-      </w:r>
-      <w:r>
-        <w:rPr>
-          <w:rFonts w:ascii="Times New Roman" w:hAnsi="Times New Roman" w:eastAsia="宋体"/>
-          <w:color w:val="000000"/>
-          <w:sz w:val="21"/>
-        </w:rPr>
-        <w:t xml:space="preserve"> Word/LibreOffice </w:t>
-      </w:r>
-      <w:r>
-        <w:rPr>
-          <w:rFonts w:hint="eastAsia" w:ascii="Times New Roman" w:hAnsi="Times New Roman" w:eastAsia="宋体"/>
-          <w:color w:val="000000"/>
-          <w:sz w:val="21"/>
-        </w:rPr>
-        <w:t xml:space="preserve">渲染环境。</w:t>
-      </w:r>
-    </w:p>
     <w:bookmarkEnd w:id="41"/>
-    <w:bookmarkEnd w:id="42"/>
     <w:sectPr>
       <w:footerReference w:type="default" r:id="rId9"/>
       <w:footerReference w:type="first" r:id="rId10"/>

</xml_diff>

<commit_message>
finalize Problem B abstract and submission docx
</commit_message>
<xml_diff>
--- a/projects/2026-summer-assignment/solutions/problem-b-cold-chain-routing/paper/paper.docx
+++ b/projects/2026-summer-assignment/solutions/problem-b-cold-chain-routing/paper/paper.docx
@@ -69,7 +69,7 @@
           <w:color w:val="000000"/>
           <w:sz w:val="24"/>
         </w:rPr>
-        <w:t xml:space="preserve">针对一个中央厨房、3</w:t>
+        <w:t xml:space="preserve">本文研究一个由中央厨房、3</w:t>
       </w:r>
       <w:r>
         <w:rPr>
@@ -101,39 +101,7 @@
           <w:color w:val="000000"/>
           <w:sz w:val="24"/>
         </w:rPr>
-        <w:t xml:space="preserve">家门店组成的冷链配送网络，任务一建立固定分区、配送站必经的路线型</w:t>
-      </w:r>
-      <w:r>
-        <w:rPr>
-          <w:rFonts w:ascii="Times New Roman" w:hAnsi="Times New Roman" w:eastAsia="宋体"/>
-          <w:color w:val="000000"/>
-          <w:sz w:val="24"/>
-        </w:rPr>
-        <w:t xml:space="preserve"> 0-1 </w:t>
-      </w:r>
-      <w:r>
-        <w:rPr>
-          <w:rFonts w:hint="eastAsia" w:ascii="Times New Roman" w:hAnsi="Times New Roman" w:eastAsia="宋体"/>
-          <w:color w:val="000000"/>
-          <w:sz w:val="24"/>
-        </w:rPr>
-        <w:t xml:space="preserve">车辆路径模型，按词典序先最小化迟到门店数，再最小化运输成本与时间窗事件罚。固定分区后完整方案仅有</w:t>
-      </w:r>
-      <w:r>
-        <w:rPr>
-          <w:rFonts w:ascii="Times New Roman" w:hAnsi="Times New Roman" w:eastAsia="宋体"/>
-          <w:color w:val="000000"/>
-          <w:sz w:val="24"/>
-        </w:rPr>
-        <w:t xml:space="preserve"> 2³=8 </w:t>
-      </w:r>
-      <w:r>
-        <w:rPr>
-          <w:rFonts w:hint="eastAsia" w:ascii="Times New Roman" w:hAnsi="Times New Roman" w:eastAsia="宋体"/>
-          <w:color w:val="000000"/>
-          <w:sz w:val="24"/>
-        </w:rPr>
-        <w:t xml:space="preserve">种，完整枚举可得到当前模型下的精确最优解。</w:t>
+        <w:t xml:space="preserve">家门店组成的冷链配送网络，在固定分区、配送站必经和时间窗约束下，优先减少迟到门店，再比较配送成本。</w:t>
       </w:r>
     </w:p>
     <w:p>
@@ -149,7 +117,7 @@
           <w:color w:val="000000"/>
           <w:sz w:val="24"/>
         </w:rPr>
-        <w:t xml:space="preserve">任务二得到</w:t>
+        <w:t xml:space="preserve">针对任务一，依据固定分区和配送站前序，将每辆车的两种门店访问次序构造为候选闭合路线，建立先最小化迟到门店数、再最小化综合成本的词典序路线型</w:t>
       </w:r>
       <w:r>
         <w:rPr>
@@ -157,15 +125,15 @@
           <w:color w:val="000000"/>
           <w:sz w:val="24"/>
         </w:rPr>
-        <w:t xml:space="preserve"> A、B、C </w:t>
-      </w:r>
-      <w:r>
-        <w:rPr>
-          <w:rFonts w:hint="eastAsia" w:ascii="Times New Roman" w:hAnsi="Times New Roman" w:eastAsia="宋体"/>
-          <w:color w:val="000000"/>
-          <w:sz w:val="24"/>
-        </w:rPr>
-        <w:t xml:space="preserve">车路线分别为</w:t>
+        <w:t xml:space="preserve"> VRPTW </w:t>
+      </w:r>
+      <w:r>
+        <w:rPr>
+          <w:rFonts w:hint="eastAsia" w:ascii="Times New Roman" w:hAnsi="Times New Roman" w:eastAsia="宋体"/>
+          <w:color w:val="000000"/>
+          <w:sz w:val="24"/>
+        </w:rPr>
+        <w:t xml:space="preserve">模型。全部许可组合仅有</w:t>
       </w:r>
       <w:r>
         <w:rPr>
@@ -173,6 +141,102 @@
           <w:color w:val="000000"/>
           <w:sz w:val="24"/>
         </w:rPr>
+        <w:t xml:space="preserve"> 2³=8 </w:t>
+      </w:r>
+      <w:r>
+        <w:rPr>
+          <w:rFonts w:hint="eastAsia" w:ascii="Times New Roman" w:hAnsi="Times New Roman" w:eastAsia="宋体"/>
+          <w:color w:val="000000"/>
+          <w:sz w:val="24"/>
+        </w:rPr>
+        <w:t xml:space="preserve">种，完整枚举因而给出该模型下的精确全局最优解。</w:t>
+      </w:r>
+    </w:p>
+    <w:p>
+      <w:pPr>
+        <w:pStyle w:val="BodyText"/>
+        <w:spacing w:line="360" w:lineRule="auto" w:before="0" w:after="0"/>
+        <w:ind w:firstLine="480"/>
+        <w:jc w:val="both"/>
+      </w:pPr>
+      <w:r>
+        <w:rPr>
+          <w:rFonts w:hint="eastAsia" w:ascii="Times New Roman" w:hAnsi="Times New Roman" w:eastAsia="宋体"/>
+          <w:color w:val="000000"/>
+          <w:sz w:val="24"/>
+        </w:rPr>
+        <w:t xml:space="preserve">针对任务二，正常场景的最优路线分别为</w:t>
+      </w:r>
+      <w:r>
+        <w:rPr>
+          <w:rFonts w:ascii="Times New Roman" w:hAnsi="Times New Roman" w:eastAsia="宋体"/>
+          <w:color w:val="000000"/>
+          <w:sz w:val="24"/>
+        </w:rPr>
+        <w:t xml:space="preserve"> A </w:t>
+      </w:r>
+      <w:r>
+        <w:rPr>
+          <w:rFonts w:hint="eastAsia" w:ascii="Times New Roman" w:hAnsi="Times New Roman" w:eastAsia="宋体"/>
+          <w:color w:val="000000"/>
+          <w:sz w:val="24"/>
+        </w:rPr>
+        <w:t xml:space="preserve">车</w:t>
+      </w:r>
+      <w:r>
+        <w:rPr>
+          <w:rFonts w:ascii="Times New Roman" w:hAnsi="Times New Roman" w:eastAsia="宋体"/>
+          <w:color w:val="000000"/>
+          <w:sz w:val="24"/>
+        </w:rPr>
+        <w:t xml:space="preserve"> 0→1→4→6→0、B </w:t>
+      </w:r>
+      <w:r>
+        <w:rPr>
+          <w:rFonts w:hint="eastAsia" w:ascii="Times New Roman" w:hAnsi="Times New Roman" w:eastAsia="宋体"/>
+          <w:color w:val="000000"/>
+          <w:sz w:val="24"/>
+        </w:rPr>
+        <w:t xml:space="preserve">车</w:t>
+      </w:r>
+      <w:r>
+        <w:rPr>
+          <w:rFonts w:ascii="Times New Roman" w:hAnsi="Times New Roman" w:eastAsia="宋体"/>
+          <w:color w:val="000000"/>
+          <w:sz w:val="24"/>
+        </w:rPr>
+        <w:t xml:space="preserve"> 0→2→5→8→0 </w:t>
+      </w:r>
+      <w:r>
+        <w:rPr>
+          <w:rFonts w:hint="eastAsia" w:ascii="Times New Roman" w:hAnsi="Times New Roman" w:eastAsia="宋体"/>
+          <w:color w:val="000000"/>
+          <w:sz w:val="24"/>
+        </w:rPr>
+        <w:t xml:space="preserve">和</w:t>
+      </w:r>
+      <w:r>
+        <w:rPr>
+          <w:rFonts w:ascii="Times New Roman" w:hAnsi="Times New Roman" w:eastAsia="宋体"/>
+          <w:color w:val="000000"/>
+          <w:sz w:val="24"/>
+        </w:rPr>
+        <w:t xml:space="preserve"> C </w:t>
+      </w:r>
+      <w:r>
+        <w:rPr>
+          <w:rFonts w:hint="eastAsia" w:ascii="Times New Roman" w:hAnsi="Times New Roman" w:eastAsia="宋体"/>
+          <w:color w:val="000000"/>
+          <w:sz w:val="24"/>
+        </w:rPr>
+        <w:t xml:space="preserve">车</w:t>
+      </w:r>
+      <w:r>
+        <w:rPr>
+          <w:rFonts w:ascii="Times New Roman" w:hAnsi="Times New Roman" w:eastAsia="宋体"/>
+          <w:color w:val="000000"/>
+          <w:sz w:val="24"/>
+        </w:rPr>
         <w:t xml:space="preserve"> </w:t>
       </w:r>
       <w:r>
@@ -181,7 +245,7 @@
           <w:color w:val="000000"/>
           <w:sz w:val="24"/>
         </w:rPr>
-        <w:t xml:space="preserve">0→1→4→6→0、0→2→5→8→0、0→3→9→7→0；总里程为</w:t>
+        <w:t xml:space="preserve">0→3→9→7→0。三车总里程为</w:t>
       </w:r>
       <w:r>
         <w:rPr>
@@ -229,7 +293,7 @@
           <w:color w:val="000000"/>
           <w:sz w:val="24"/>
         </w:rPr>
-        <w:t xml:space="preserve">家门店均按时到达。任务三将“4:30</w:t>
+        <w:t xml:space="preserve">家门店均按时到达，时间窗惩罚为</w:t>
       </w:r>
       <w:r>
         <w:rPr>
@@ -237,6 +301,30 @@
           <w:color w:val="000000"/>
           <w:sz w:val="24"/>
         </w:rPr>
+        <w:t xml:space="preserve"> 0。</w:t>
+      </w:r>
+    </w:p>
+    <w:p>
+      <w:pPr>
+        <w:pStyle w:val="BodyText"/>
+        <w:spacing w:line="360" w:lineRule="auto" w:before="0" w:after="0"/>
+        <w:ind w:firstLine="480"/>
+        <w:jc w:val="both"/>
+      </w:pPr>
+      <w:r>
+        <w:rPr>
+          <w:rFonts w:hint="eastAsia" w:ascii="Times New Roman" w:hAnsi="Times New Roman" w:eastAsia="宋体"/>
+          <w:color w:val="000000"/>
+          <w:sz w:val="24"/>
+        </w:rPr>
+        <w:t xml:space="preserve">针对任务三，在“4:30</w:t>
+      </w:r>
+      <w:r>
+        <w:rPr>
+          <w:rFonts w:ascii="Times New Roman" w:hAnsi="Times New Roman" w:eastAsia="宋体"/>
+          <w:color w:val="000000"/>
+          <w:sz w:val="24"/>
+        </w:rPr>
         <w:t xml:space="preserve"> </w:t>
       </w:r>
       <w:r>
@@ -261,7 +349,7 @@
           <w:color w:val="000000"/>
           <w:sz w:val="24"/>
         </w:rPr>
-        <w:t xml:space="preserve">封闭”作为可复现的静态主场景。枚举结果表明，封路删除</w:t>
+        <w:t xml:space="preserve">封闭”的静态施工情景下，于禁弧后的候选集上按相同词典序目标重优化。封路使可行完整组合由</w:t>
       </w:r>
       <w:r>
         <w:rPr>
@@ -269,6 +357,22 @@
           <w:color w:val="000000"/>
           <w:sz w:val="24"/>
         </w:rPr>
+        <w:t xml:space="preserve"> 8 </w:t>
+      </w:r>
+      <w:r>
+        <w:rPr>
+          <w:rFonts w:hint="eastAsia" w:ascii="Times New Roman" w:hAnsi="Times New Roman" w:eastAsia="宋体"/>
+          <w:color w:val="000000"/>
+          <w:sz w:val="24"/>
+        </w:rPr>
+        <w:t xml:space="preserve">个减至</w:t>
+      </w:r>
+      <w:r>
+        <w:rPr>
+          <w:rFonts w:ascii="Times New Roman" w:hAnsi="Times New Roman" w:eastAsia="宋体"/>
+          <w:color w:val="000000"/>
+          <w:sz w:val="24"/>
+        </w:rPr>
         <w:t xml:space="preserve"> 4 </w:t>
       </w:r>
       <w:r>
@@ -277,7 +381,7 @@
           <w:color w:val="000000"/>
           <w:sz w:val="24"/>
         </w:rPr>
-        <w:t xml:space="preserve">个本已迟到的组合，而正常最优路线未使用该弧；重优化后路线和成本不变，增量为</w:t>
+        <w:t xml:space="preserve">个，被删除的</w:t>
       </w:r>
       <w:r>
         <w:rPr>
@@ -285,6 +389,38 @@
           <w:color w:val="000000"/>
           <w:sz w:val="24"/>
         </w:rPr>
+        <w:t xml:space="preserve"> 4 </w:t>
+      </w:r>
+      <w:r>
+        <w:rPr>
+          <w:rFonts w:hint="eastAsia" w:ascii="Times New Roman" w:hAnsi="Times New Roman" w:eastAsia="宋体"/>
+          <w:color w:val="000000"/>
+          <w:sz w:val="24"/>
+        </w:rPr>
+        <w:t xml:space="preserve">个组合在正常场景中均迟到</w:t>
+      </w:r>
+      <w:r>
+        <w:rPr>
+          <w:rFonts w:ascii="Times New Roman" w:hAnsi="Times New Roman" w:eastAsia="宋体"/>
+          <w:color w:val="000000"/>
+          <w:sz w:val="24"/>
+        </w:rPr>
+        <w:t xml:space="preserve"> 1 </w:t>
+      </w:r>
+      <w:r>
+        <w:rPr>
+          <w:rFonts w:hint="eastAsia" w:ascii="Times New Roman" w:hAnsi="Times New Roman" w:eastAsia="宋体"/>
+          <w:color w:val="000000"/>
+          <w:sz w:val="24"/>
+        </w:rPr>
+        <w:t xml:space="preserve">家门店，而正常最优路线不含该封闭弧，因此重优化后路线、里程和成本均不变，成本增量为</w:t>
+      </w:r>
+      <w:r>
+        <w:rPr>
+          <w:rFonts w:ascii="Times New Roman" w:hAnsi="Times New Roman" w:eastAsia="宋体"/>
+          <w:color w:val="000000"/>
+          <w:sz w:val="24"/>
+        </w:rPr>
         <w:t xml:space="preserve"> </w:t>
       </w:r>
       <w:r>
@@ -293,7 +429,7 @@
           <w:color w:val="000000"/>
           <w:sz w:val="24"/>
         </w:rPr>
-        <w:t xml:space="preserve">0。统一门店服务时长不超过</w:t>
+        <w:t xml:space="preserve">0。该零增量结论仅适用于当前固定分区、坐标距离代理和发车前静态重优化情景，且在统一门店服务时长不超过</w:t>
       </w:r>
       <w:r>
         <w:rPr>
@@ -309,7 +445,7 @@
           <w:color w:val="000000"/>
           <w:sz w:val="24"/>
         </w:rPr>
-        <w:t xml:space="preserve">分钟/店时，该结论保持成立。真正的在途动态重路由还需要事件时刻和车辆状态数据。</w:t>
+        <w:t xml:space="preserve">分钟/店时保持成立；在途动态重路由还需要事件时刻和车辆状态数据。</w:t>
       </w:r>
     </w:p>
     <w:p>

</xml_diff>